<commit_message>
Deploying to gh-pages from @ Morrison-Lab/mds@8e3bbf48d0241b58050352451e3d8ab8974b5337 🚀
</commit_message>
<xml_diff>
--- a/calculus.docx
+++ b/calculus.docx
@@ -15,10 +15,10 @@
         <w:pStyle w:val="Date"/>
       </w:pPr>
       <w:r>
-        <w:t xml:space="preserve">Last modified: 2026-09-28 23:45:45 (PDT)</w:t>
+        <w:t xml:space="preserve">Last modified: 2026-09-29 21:33:59 (PDT)</w:t>
       </w:r>
     </w:p>
-    <w:bookmarkStart w:id="19" w:name="sec-derivatives"/>
+    <w:bookmarkStart w:id="24" w:name="sec-derivatives"/>
     <w:p>
       <w:pPr>
         <w:pStyle w:val="Heading2"/>
@@ -2243,14 +2243,13 @@
         </m:oMath>
       </m:oMathPara>
     </w:p>
-    <w:bookmarkEnd w:id="19"/>
-    <w:bookmarkStart w:id="96" w:name="sec-integration"/>
+    <w:bookmarkStart w:id="23" w:name="linear-approximation"/>
     <w:p>
       <w:pPr>
-        <w:pStyle w:val="Heading2"/>
+        <w:pStyle w:val="Heading3"/>
       </w:pPr>
       <w:r>
-        <w:t xml:space="preserve">2 Integration</w:t>
+        <w:t xml:space="preserve">1.1 Linear approximation</w:t>
       </w:r>
     </w:p>
     <w:p>
@@ -2258,6 +2257,1215 @@
         <w:pStyle w:val="FirstParagraph"/>
       </w:pPr>
       <w:r>
+        <w:t xml:space="preserve">For a differentiable function</w:t>
+      </w:r>
+      <w:r>
+        <w:t xml:space="preserve"> </w:t>
+      </w:r>
+      <m:oMath>
+        <m:r>
+          <m:t>f</m:t>
+        </m:r>
+      </m:oMath>
+      <w:r>
+        <w:t xml:space="preserve"> </w:t>
+      </w:r>
+      <w:r>
+        <w:t xml:space="preserve">and a small step</w:t>
+      </w:r>
+      <w:r>
+        <w:t xml:space="preserve"> </w:t>
+      </w:r>
+      <m:oMath>
+        <m:r>
+          <m:t>ϵ</m:t>
+        </m:r>
+      </m:oMath>
+      <w:r>
+        <w:t xml:space="preserve">,</w:t>
+      </w:r>
+    </w:p>
+    <w:p>
+      <w:pPr>
+        <w:pStyle w:val="BodyText"/>
+      </w:pPr>
+      <w:bookmarkStart w:id="19" w:name="eq-linear-approx"/>
+      <m:oMathPara>
+        <m:oMathParaPr>
+          <m:jc m:val="center"/>
+        </m:oMathParaPr>
+        <m:oMath>
+          <m:r>
+            <m:t>f</m:t>
+          </m:r>
+          <m:r>
+            <m:rPr>
+              <m:sty m:val="p"/>
+            </m:rPr>
+            <m:t>(</m:t>
+          </m:r>
+          <m:r>
+            <m:t>w</m:t>
+          </m:r>
+          <m:r>
+            <m:rPr>
+              <m:sty m:val="p"/>
+            </m:rPr>
+            <m:t>+</m:t>
+          </m:r>
+          <m:r>
+            <m:t>ϵ</m:t>
+          </m:r>
+          <m:r>
+            <m:rPr>
+              <m:sty m:val="p"/>
+            </m:rPr>
+            <m:t>)</m:t>
+          </m:r>
+          <m:r>
+            <m:rPr>
+              <m:sty m:val="p"/>
+            </m:rPr>
+            <m:t>≈</m:t>
+          </m:r>
+          <m:r>
+            <m:t>f</m:t>
+          </m:r>
+          <m:r>
+            <m:rPr>
+              <m:sty m:val="p"/>
+            </m:rPr>
+            <m:t>(</m:t>
+          </m:r>
+          <m:r>
+            <m:t>w</m:t>
+          </m:r>
+          <m:r>
+            <m:rPr>
+              <m:sty m:val="p"/>
+            </m:rPr>
+            <m:t>)</m:t>
+          </m:r>
+          <m:r>
+            <m:rPr>
+              <m:sty m:val="p"/>
+            </m:rPr>
+            <m:t>+</m:t>
+          </m:r>
+          <m:r>
+            <m:t>ϵ</m:t>
+          </m:r>
+          <m:r>
+            <m:t> </m:t>
+          </m:r>
+          <m:f>
+            <m:fPr>
+              <m:type m:val="bar"/>
+            </m:fPr>
+            <m:num>
+              <m:r>
+                <m:t>d</m:t>
+              </m:r>
+            </m:num>
+            <m:den>
+              <m:r>
+                <m:t>d</m:t>
+              </m:r>
+              <m:r>
+                <m:t>w</m:t>
+              </m:r>
+            </m:den>
+          </m:f>
+          <m:r>
+            <m:t>f</m:t>
+          </m:r>
+          <m:r>
+            <m:rPr>
+              <m:sty m:val="p"/>
+            </m:rPr>
+            <m:t>(</m:t>
+          </m:r>
+          <m:r>
+            <m:t>w</m:t>
+          </m:r>
+          <m:r>
+            <m:rPr>
+              <m:sty m:val="p"/>
+            </m:rPr>
+            <m:t>)</m:t>
+          </m:r>
+          <m:r>
+            <m:t>  </m:t>
+          </m:r>
+          <m:r>
+            <m:rPr>
+              <m:sty m:val="p"/>
+            </m:rPr>
+            <m:t>(</m:t>
+          </m:r>
+          <m:r>
+            <m:t>1</m:t>
+          </m:r>
+          <m:r>
+            <m:rPr>
+              <m:sty m:val="p"/>
+            </m:rPr>
+            <m:t>)</m:t>
+          </m:r>
+        </m:oMath>
+      </m:oMathPara>
+      <w:bookmarkEnd w:id="19"/>
+    </w:p>
+    <w:bookmarkStart w:id="20" w:name="def-flat-point"/>
+    <w:p>
+      <w:pPr>
+        <w:pStyle w:val="FirstParagraph"/>
+      </w:pPr>
+      <w:r>
+        <w:rPr>
+          <w:b/>
+          <w:bCs/>
+        </w:rPr>
+        <w:t xml:space="preserve">Definition 1 (Flat point)</w:t>
+      </w:r>
+      <w:r>
+        <w:t xml:space="preserve"> </w:t>
+      </w:r>
+      <w:r>
+        <w:t xml:space="preserve">A derivative of zero marks a</w:t>
+      </w:r>
+      <w:r>
+        <w:t xml:space="preserve"> </w:t>
+      </w:r>
+      <w:r>
+        <w:rPr>
+          <w:b/>
+          <w:bCs/>
+        </w:rPr>
+        <w:t xml:space="preserve">flat point</w:t>
+      </w:r>
+      <w:r>
+        <w:t xml:space="preserve"> </w:t>
+      </w:r>
+      <w:r>
+        <w:t xml:space="preserve">(also called a</w:t>
+      </w:r>
+      <w:r>
+        <w:t xml:space="preserve"> </w:t>
+      </w:r>
+      <w:r>
+        <w:rPr>
+          <w:i/>
+          <w:iCs/>
+        </w:rPr>
+        <w:t xml:space="preserve">stationary point</w:t>
+      </w:r>
+      <w:r>
+        <w:t xml:space="preserve">).</w:t>
+      </w:r>
+      <w:r>
+        <w:t xml:space="preserve"> </w:t>
+      </w:r>
+      <w:r>
+        <w:t xml:space="preserve">A point where the derivative is zero or does not exist is a</w:t>
+      </w:r>
+      <w:r>
+        <w:t xml:space="preserve"> </w:t>
+      </w:r>
+      <w:r>
+        <w:rPr>
+          <w:i/>
+          <w:iCs/>
+        </w:rPr>
+        <w:t xml:space="preserve">critical point</w:t>
+      </w:r>
+      <w:r>
+        <w:t xml:space="preserve">.</w:t>
+      </w:r>
+    </w:p>
+    <w:bookmarkEnd w:id="20"/>
+    <w:bookmarkStart w:id="21" w:name="exr-flat-point"/>
+    <w:p>
+      <w:pPr>
+        <w:pStyle w:val="BodyText"/>
+      </w:pPr>
+      <w:r>
+        <w:rPr>
+          <w:b/>
+          <w:bCs/>
+        </w:rPr>
+        <w:t xml:space="preserve">Exercise 1 (Find the flat point, and check the approximation)</w:t>
+      </w:r>
+      <w:r>
+        <w:t xml:space="preserve"> </w:t>
+      </w:r>
+      <w:r>
+        <w:t xml:space="preserve">Let</w:t>
+      </w:r>
+      <w:r>
+        <w:t xml:space="preserve"> </w:t>
+      </w:r>
+      <m:oMath>
+        <m:r>
+          <m:t>f</m:t>
+        </m:r>
+        <m:r>
+          <m:rPr>
+            <m:sty m:val="p"/>
+          </m:rPr>
+          <m:t>(</m:t>
+        </m:r>
+        <m:r>
+          <m:t>w</m:t>
+        </m:r>
+        <m:r>
+          <m:rPr>
+            <m:sty m:val="p"/>
+          </m:rPr>
+          <m:t>)</m:t>
+        </m:r>
+        <m:r>
+          <m:rPr>
+            <m:sty m:val="p"/>
+          </m:rPr>
+          <m:t>=</m:t>
+        </m:r>
+        <m:sSup>
+          <m:e>
+            <m:r>
+              <m:t>w</m:t>
+            </m:r>
+          </m:e>
+          <m:sup>
+            <m:r>
+              <m:t>2</m:t>
+            </m:r>
+          </m:sup>
+        </m:sSup>
+        <m:r>
+          <m:rPr>
+            <m:sty m:val="p"/>
+          </m:rPr>
+          <m:t>−</m:t>
+        </m:r>
+        <m:r>
+          <m:t>4</m:t>
+        </m:r>
+        <m:r>
+          <m:t>w</m:t>
+        </m:r>
+        <m:r>
+          <m:rPr>
+            <m:sty m:val="p"/>
+          </m:rPr>
+          <m:t>+</m:t>
+        </m:r>
+        <m:r>
+          <m:t>7</m:t>
+        </m:r>
+      </m:oMath>
+      <w:r>
+        <w:t xml:space="preserve">.</w:t>
+      </w:r>
+    </w:p>
+    <w:p>
+      <w:pPr>
+        <w:pStyle w:val="Compact"/>
+        <w:numPr>
+          <w:ilvl w:val="0"/>
+          <w:numId w:val="1001"/>
+        </w:numPr>
+      </w:pPr>
+      <w:r>
+        <w:t xml:space="preserve">Differentiate</w:t>
+      </w:r>
+      <w:r>
+        <w:t xml:space="preserve"> </w:t>
+      </w:r>
+      <m:oMath>
+        <m:r>
+          <m:t>f</m:t>
+        </m:r>
+      </m:oMath>
+      <w:r>
+        <w:t xml:space="preserve">.</w:t>
+      </w:r>
+    </w:p>
+    <w:p>
+      <w:pPr>
+        <w:pStyle w:val="Compact"/>
+        <w:numPr>
+          <w:ilvl w:val="0"/>
+          <w:numId w:val="1001"/>
+        </w:numPr>
+      </w:pPr>
+      <w:r>
+        <w:t xml:space="preserve">Find the</w:t>
+      </w:r>
+      <w:r>
+        <w:t xml:space="preserve"> </w:t>
+      </w:r>
+      <m:oMath>
+        <m:r>
+          <m:t>w</m:t>
+        </m:r>
+      </m:oMath>
+      <w:r>
+        <w:t xml:space="preserve"> </w:t>
+      </w:r>
+      <w:r>
+        <w:t xml:space="preserve">at which</w:t>
+      </w:r>
+      <w:r>
+        <w:t xml:space="preserve"> </w:t>
+      </w:r>
+      <m:oMath>
+        <m:r>
+          <m:t>f</m:t>
+        </m:r>
+      </m:oMath>
+      <w:r>
+        <w:t xml:space="preserve"> </w:t>
+      </w:r>
+      <w:r>
+        <w:t xml:space="preserve">is flat, and say whether it is a minimum or a</w:t>
+      </w:r>
+      <w:r>
+        <w:t xml:space="preserve"> </w:t>
+      </w:r>
+      <w:r>
+        <w:t xml:space="preserve">maximum.</w:t>
+      </w:r>
+    </w:p>
+    <w:p>
+      <w:pPr>
+        <w:pStyle w:val="Compact"/>
+        <w:numPr>
+          <w:ilvl w:val="0"/>
+          <w:numId w:val="1001"/>
+        </w:numPr>
+      </w:pPr>
+      <w:r>
+        <w:t xml:space="preserve">Evaluate the derivative at</w:t>
+      </w:r>
+      <w:r>
+        <w:t xml:space="preserve"> </w:t>
+      </w:r>
+      <m:oMath>
+        <m:r>
+          <m:t>w</m:t>
+        </m:r>
+        <m:r>
+          <m:rPr>
+            <m:sty m:val="p"/>
+          </m:rPr>
+          <m:t>=</m:t>
+        </m:r>
+        <m:r>
+          <m:t>1</m:t>
+        </m:r>
+      </m:oMath>
+      <w:r>
+        <w:t xml:space="preserve">, use</w:t>
+      </w:r>
+      <w:r>
+        <w:t xml:space="preserve"> </w:t>
+      </w:r>
+      <w:hyperlink w:anchor="eq-linear-approx">
+        <w:r>
+          <w:rPr>
+            <w:rStyle w:val="Hyperlink"/>
+          </w:rPr>
+          <w:t xml:space="preserve">Equation 1</w:t>
+        </w:r>
+      </w:hyperlink>
+      <w:r>
+        <w:t xml:space="preserve"> </w:t>
+      </w:r>
+      <w:r>
+        <w:t xml:space="preserve">to predict</w:t>
+      </w:r>
+      <w:r>
+        <w:t xml:space="preserve"> </w:t>
+      </w:r>
+      <m:oMath>
+        <m:r>
+          <m:t>f</m:t>
+        </m:r>
+        <m:r>
+          <m:rPr>
+            <m:sty m:val="p"/>
+          </m:rPr>
+          <m:t>(</m:t>
+        </m:r>
+        <m:r>
+          <m:t>1.01</m:t>
+        </m:r>
+        <m:r>
+          <m:rPr>
+            <m:sty m:val="p"/>
+          </m:rPr>
+          <m:t>)</m:t>
+        </m:r>
+      </m:oMath>
+      <w:r>
+        <w:t xml:space="preserve">, and compare that prediction with the exact value.</w:t>
+      </w:r>
+    </w:p>
+    <w:bookmarkEnd w:id="21"/>
+    <w:bookmarkStart w:id="22" w:name="sol-flat-point"/>
+    <w:p>
+      <w:pPr>
+        <w:pStyle w:val="FirstParagraph"/>
+      </w:pPr>
+      <w:r>
+        <w:rPr>
+          <w:i/>
+          <w:iCs/>
+        </w:rPr>
+        <w:t xml:space="preserve">Solution 1</w:t>
+      </w:r>
+      <w:r>
+        <w:t xml:space="preserve">. </w:t>
+      </w:r>
+      <w:r>
+        <w:rPr>
+          <w:b/>
+          <w:bCs/>
+        </w:rPr>
+        <w:t xml:space="preserve">1.</w:t>
+      </w:r>
+      <w:r>
+        <w:t xml:space="preserve"> </w:t>
+      </w:r>
+      <w:r>
+        <w:t xml:space="preserve">Term by term:</w:t>
+      </w:r>
+    </w:p>
+    <w:p>
+      <w:pPr>
+        <w:pStyle w:val="BodyText"/>
+      </w:pPr>
+      <m:oMathPara>
+        <m:oMathParaPr>
+          <m:jc m:val="center"/>
+        </m:oMathParaPr>
+        <m:oMath>
+          <m:f>
+            <m:fPr>
+              <m:type m:val="bar"/>
+            </m:fPr>
+            <m:num>
+              <m:r>
+                <m:t>d</m:t>
+              </m:r>
+              <m:r>
+                <m:t>f</m:t>
+              </m:r>
+            </m:num>
+            <m:den>
+              <m:r>
+                <m:t>d</m:t>
+              </m:r>
+              <m:r>
+                <m:t>w</m:t>
+              </m:r>
+            </m:den>
+          </m:f>
+          <m:r>
+            <m:rPr>
+              <m:sty m:val="p"/>
+            </m:rPr>
+            <m:t>=</m:t>
+          </m:r>
+          <m:r>
+            <m:t>2</m:t>
+          </m:r>
+          <m:r>
+            <m:t>w</m:t>
+          </m:r>
+          <m:r>
+            <m:rPr>
+              <m:sty m:val="p"/>
+            </m:rPr>
+            <m:t>−</m:t>
+          </m:r>
+          <m:r>
+            <m:t>4</m:t>
+          </m:r>
+        </m:oMath>
+      </m:oMathPara>
+    </w:p>
+    <w:p>
+      <w:pPr>
+        <w:pStyle w:val="FirstParagraph"/>
+      </w:pPr>
+      <w:r>
+        <w:rPr>
+          <w:b/>
+          <w:bCs/>
+        </w:rPr>
+        <w:t xml:space="preserve">2.</w:t>
+      </w:r>
+      <w:r>
+        <w:t xml:space="preserve"> </w:t>
+      </w:r>
+      <w:r>
+        <w:t xml:space="preserve">Set it to zero:</w:t>
+      </w:r>
+      <w:r>
+        <w:t xml:space="preserve"> </w:t>
+      </w:r>
+      <m:oMath>
+        <m:r>
+          <m:t>2</m:t>
+        </m:r>
+        <m:r>
+          <m:t>w</m:t>
+        </m:r>
+        <m:r>
+          <m:rPr>
+            <m:sty m:val="p"/>
+          </m:rPr>
+          <m:t>−</m:t>
+        </m:r>
+        <m:r>
+          <m:t>4</m:t>
+        </m:r>
+        <m:r>
+          <m:rPr>
+            <m:sty m:val="p"/>
+          </m:rPr>
+          <m:t>=</m:t>
+        </m:r>
+        <m:r>
+          <m:t>0</m:t>
+        </m:r>
+      </m:oMath>
+      <w:r>
+        <w:t xml:space="preserve"> </w:t>
+      </w:r>
+      <w:r>
+        <w:t xml:space="preserve">gives</w:t>
+      </w:r>
+      <w:r>
+        <w:t xml:space="preserve"> </w:t>
+      </w:r>
+      <m:oMath>
+        <m:r>
+          <m:t>w</m:t>
+        </m:r>
+        <m:r>
+          <m:rPr>
+            <m:sty m:val="p"/>
+          </m:rPr>
+          <m:t>=</m:t>
+        </m:r>
+        <m:r>
+          <m:t>2</m:t>
+        </m:r>
+      </m:oMath>
+      <w:r>
+        <w:t xml:space="preserve">.</w:t>
+      </w:r>
+      <w:r>
+        <w:t xml:space="preserve"> </w:t>
+      </w:r>
+      <w:r>
+        <w:t xml:space="preserve">It is a minimum.</w:t>
+      </w:r>
+      <w:r>
+        <w:t xml:space="preserve"> </w:t>
+      </w:r>
+      <w:r>
+        <w:t xml:space="preserve">The coefficient on</w:t>
+      </w:r>
+      <w:r>
+        <w:t xml:space="preserve"> </w:t>
+      </w:r>
+      <m:oMath>
+        <m:sSup>
+          <m:e>
+            <m:r>
+              <m:t>w</m:t>
+            </m:r>
+          </m:e>
+          <m:sup>
+            <m:r>
+              <m:t>2</m:t>
+            </m:r>
+          </m:sup>
+        </m:sSup>
+      </m:oMath>
+      <w:r>
+        <w:t xml:space="preserve"> </w:t>
+      </w:r>
+      <w:r>
+        <w:t xml:space="preserve">is positive, so the parabola opens upward;</w:t>
+      </w:r>
+      <w:r>
+        <w:t xml:space="preserve"> </w:t>
+      </w:r>
+      <w:r>
+        <w:t xml:space="preserve">equivalently, the derivative is negative below</w:t>
+      </w:r>
+      <w:r>
+        <w:t xml:space="preserve"> </w:t>
+      </w:r>
+      <m:oMath>
+        <m:r>
+          <m:t>w</m:t>
+        </m:r>
+        <m:r>
+          <m:rPr>
+            <m:sty m:val="p"/>
+          </m:rPr>
+          <m:t>=</m:t>
+        </m:r>
+        <m:r>
+          <m:t>2</m:t>
+        </m:r>
+      </m:oMath>
+      <w:r>
+        <w:t xml:space="preserve"> </w:t>
+      </w:r>
+      <w:r>
+        <w:t xml:space="preserve">and positive above it,</w:t>
+      </w:r>
+      <w:r>
+        <w:t xml:space="preserve"> </w:t>
+      </w:r>
+      <w:r>
+        <w:t xml:space="preserve">so the function falls into that point and rises out of it.</w:t>
+      </w:r>
+    </w:p>
+    <w:p>
+      <w:pPr>
+        <w:pStyle w:val="BodyText"/>
+      </w:pPr>
+      <w:r>
+        <w:rPr>
+          <w:b/>
+          <w:bCs/>
+        </w:rPr>
+        <w:t xml:space="preserve">3.</w:t>
+      </w:r>
+      <w:r>
+        <w:t xml:space="preserve"> </w:t>
+      </w:r>
+      <w:r>
+        <w:t xml:space="preserve">At</w:t>
+      </w:r>
+      <w:r>
+        <w:t xml:space="preserve"> </w:t>
+      </w:r>
+      <m:oMath>
+        <m:r>
+          <m:t>w</m:t>
+        </m:r>
+        <m:r>
+          <m:rPr>
+            <m:sty m:val="p"/>
+          </m:rPr>
+          <m:t>=</m:t>
+        </m:r>
+        <m:r>
+          <m:t>1</m:t>
+        </m:r>
+      </m:oMath>
+      <w:r>
+        <w:t xml:space="preserve"> </w:t>
+      </w:r>
+      <w:r>
+        <w:t xml:space="preserve">the derivative is</w:t>
+      </w:r>
+      <w:r>
+        <w:t xml:space="preserve"> </w:t>
+      </w:r>
+      <m:oMath>
+        <m:r>
+          <m:t>2</m:t>
+        </m:r>
+        <m:r>
+          <m:rPr>
+            <m:sty m:val="p"/>
+          </m:rPr>
+          <m:t>(</m:t>
+        </m:r>
+        <m:r>
+          <m:t>1</m:t>
+        </m:r>
+        <m:r>
+          <m:rPr>
+            <m:sty m:val="p"/>
+          </m:rPr>
+          <m:t>)</m:t>
+        </m:r>
+        <m:r>
+          <m:rPr>
+            <m:sty m:val="p"/>
+          </m:rPr>
+          <m:t>−</m:t>
+        </m:r>
+        <m:r>
+          <m:t>4</m:t>
+        </m:r>
+        <m:r>
+          <m:rPr>
+            <m:sty m:val="p"/>
+          </m:rPr>
+          <m:t>=</m:t>
+        </m:r>
+        <m:r>
+          <m:rPr>
+            <m:sty m:val="p"/>
+          </m:rPr>
+          <m:t>−</m:t>
+        </m:r>
+        <m:r>
+          <m:t>2</m:t>
+        </m:r>
+      </m:oMath>
+      <w:r>
+        <w:t xml:space="preserve">, so</w:t>
+      </w:r>
+      <w:r>
+        <w:t xml:space="preserve"> </w:t>
+      </w:r>
+      <m:oMath>
+        <m:r>
+          <m:t>f</m:t>
+        </m:r>
+      </m:oMath>
+      <w:r>
+        <w:t xml:space="preserve"> </w:t>
+      </w:r>
+      <w:r>
+        <w:t xml:space="preserve">is falling there.</w:t>
+      </w:r>
+      <w:r>
+        <w:t xml:space="preserve"> </w:t>
+      </w:r>
+      <w:r>
+        <w:t xml:space="preserve">With</w:t>
+      </w:r>
+      <w:r>
+        <w:t xml:space="preserve"> </w:t>
+      </w:r>
+      <m:oMath>
+        <m:r>
+          <m:t>ϵ</m:t>
+        </m:r>
+        <m:r>
+          <m:rPr>
+            <m:sty m:val="p"/>
+          </m:rPr>
+          <m:t>=</m:t>
+        </m:r>
+        <m:r>
+          <m:t>0.01</m:t>
+        </m:r>
+      </m:oMath>
+      <w:r>
+        <w:t xml:space="preserve">,</w:t>
+      </w:r>
+      <w:r>
+        <w:t xml:space="preserve"> </w:t>
+      </w:r>
+      <w:hyperlink w:anchor="eq-linear-approx">
+        <w:r>
+          <w:rPr>
+            <w:rStyle w:val="Hyperlink"/>
+          </w:rPr>
+          <w:t xml:space="preserve">Equation 1</w:t>
+        </w:r>
+      </w:hyperlink>
+      <w:r>
+        <w:t xml:space="preserve"> </w:t>
+      </w:r>
+      <w:r>
+        <w:t xml:space="preserve">predicts a change of</w:t>
+      </w:r>
+      <w:r>
+        <w:t xml:space="preserve"> </w:t>
+      </w:r>
+      <m:oMath>
+        <m:r>
+          <m:rPr>
+            <m:sty m:val="p"/>
+          </m:rPr>
+          <m:t>(</m:t>
+        </m:r>
+        <m:r>
+          <m:t>0.01</m:t>
+        </m:r>
+        <m:r>
+          <m:rPr>
+            <m:sty m:val="p"/>
+          </m:rPr>
+          <m:t>)</m:t>
+        </m:r>
+        <m:r>
+          <m:rPr>
+            <m:sty m:val="p"/>
+          </m:rPr>
+          <m:t>(</m:t>
+        </m:r>
+        <m:r>
+          <m:rPr>
+            <m:sty m:val="p"/>
+          </m:rPr>
+          <m:t>−</m:t>
+        </m:r>
+        <m:r>
+          <m:t>2</m:t>
+        </m:r>
+        <m:r>
+          <m:rPr>
+            <m:sty m:val="p"/>
+          </m:rPr>
+          <m:t>)</m:t>
+        </m:r>
+        <m:r>
+          <m:rPr>
+            <m:sty m:val="p"/>
+          </m:rPr>
+          <m:t>=</m:t>
+        </m:r>
+        <m:r>
+          <m:rPr>
+            <m:sty m:val="p"/>
+          </m:rPr>
+          <m:t>−</m:t>
+        </m:r>
+        <m:r>
+          <m:t>0.02</m:t>
+        </m:r>
+      </m:oMath>
+      <w:r>
+        <w:t xml:space="preserve">, from</w:t>
+      </w:r>
+      <w:r>
+        <w:t xml:space="preserve"> </w:t>
+      </w:r>
+      <m:oMath>
+        <m:r>
+          <m:t>f</m:t>
+        </m:r>
+        <m:r>
+          <m:rPr>
+            <m:sty m:val="p"/>
+          </m:rPr>
+          <m:t>(</m:t>
+        </m:r>
+        <m:r>
+          <m:t>1</m:t>
+        </m:r>
+        <m:r>
+          <m:rPr>
+            <m:sty m:val="p"/>
+          </m:rPr>
+          <m:t>)</m:t>
+        </m:r>
+        <m:r>
+          <m:rPr>
+            <m:sty m:val="p"/>
+          </m:rPr>
+          <m:t>=</m:t>
+        </m:r>
+        <m:r>
+          <m:t>1</m:t>
+        </m:r>
+        <m:r>
+          <m:rPr>
+            <m:sty m:val="p"/>
+          </m:rPr>
+          <m:t>−</m:t>
+        </m:r>
+        <m:r>
+          <m:t>4</m:t>
+        </m:r>
+        <m:r>
+          <m:rPr>
+            <m:sty m:val="p"/>
+          </m:rPr>
+          <m:t>+</m:t>
+        </m:r>
+        <m:r>
+          <m:t>7</m:t>
+        </m:r>
+        <m:r>
+          <m:rPr>
+            <m:sty m:val="p"/>
+          </m:rPr>
+          <m:t>=</m:t>
+        </m:r>
+        <m:r>
+          <m:t>4</m:t>
+        </m:r>
+      </m:oMath>
+      <w:r>
+        <w:t xml:space="preserve"> </w:t>
+      </w:r>
+      <w:r>
+        <w:t xml:space="preserve">to</w:t>
+      </w:r>
+      <w:r>
+        <w:t xml:space="preserve"> </w:t>
+      </w:r>
+      <m:oMath>
+        <m:r>
+          <m:t>3.98</m:t>
+        </m:r>
+      </m:oMath>
+      <w:r>
+        <w:t xml:space="preserve">.</w:t>
+      </w:r>
+      <w:r>
+        <w:t xml:space="preserve"> </w:t>
+      </w:r>
+      <w:r>
+        <w:t xml:space="preserve">The exact value is</w:t>
+      </w:r>
+    </w:p>
+    <w:p>
+      <w:pPr>
+        <w:pStyle w:val="BodyText"/>
+      </w:pPr>
+      <m:oMathPara>
+        <m:oMathParaPr>
+          <m:jc m:val="center"/>
+        </m:oMathParaPr>
+        <m:oMath>
+          <m:r>
+            <m:t>f</m:t>
+          </m:r>
+          <m:r>
+            <m:rPr>
+              <m:sty m:val="p"/>
+            </m:rPr>
+            <m:t>(</m:t>
+          </m:r>
+          <m:r>
+            <m:t>1.01</m:t>
+          </m:r>
+          <m:r>
+            <m:rPr>
+              <m:sty m:val="p"/>
+            </m:rPr>
+            <m:t>)</m:t>
+          </m:r>
+          <m:r>
+            <m:rPr>
+              <m:sty m:val="p"/>
+            </m:rPr>
+            <m:t>=</m:t>
+          </m:r>
+          <m:r>
+            <m:rPr>
+              <m:sty m:val="p"/>
+            </m:rPr>
+            <m:t>(</m:t>
+          </m:r>
+          <m:r>
+            <m:t>1.01</m:t>
+          </m:r>
+          <m:sSup>
+            <m:e>
+              <m:r>
+                <m:rPr>
+                  <m:sty m:val="p"/>
+                </m:rPr>
+                <m:t>)</m:t>
+              </m:r>
+            </m:e>
+            <m:sup>
+              <m:r>
+                <m:t>2</m:t>
+              </m:r>
+            </m:sup>
+          </m:sSup>
+          <m:r>
+            <m:rPr>
+              <m:sty m:val="p"/>
+            </m:rPr>
+            <m:t>−</m:t>
+          </m:r>
+          <m:r>
+            <m:t>4</m:t>
+          </m:r>
+          <m:r>
+            <m:rPr>
+              <m:sty m:val="p"/>
+            </m:rPr>
+            <m:t>(</m:t>
+          </m:r>
+          <m:r>
+            <m:t>1.01</m:t>
+          </m:r>
+          <m:r>
+            <m:rPr>
+              <m:sty m:val="p"/>
+            </m:rPr>
+            <m:t>)</m:t>
+          </m:r>
+          <m:r>
+            <m:rPr>
+              <m:sty m:val="p"/>
+            </m:rPr>
+            <m:t>+</m:t>
+          </m:r>
+          <m:r>
+            <m:t>7</m:t>
+          </m:r>
+          <m:r>
+            <m:rPr>
+              <m:sty m:val="p"/>
+            </m:rPr>
+            <m:t>=</m:t>
+          </m:r>
+          <m:r>
+            <m:t>1.0201</m:t>
+          </m:r>
+          <m:r>
+            <m:rPr>
+              <m:sty m:val="p"/>
+            </m:rPr>
+            <m:t>−</m:t>
+          </m:r>
+          <m:r>
+            <m:t>4.04</m:t>
+          </m:r>
+          <m:r>
+            <m:rPr>
+              <m:sty m:val="p"/>
+            </m:rPr>
+            <m:t>+</m:t>
+          </m:r>
+          <m:r>
+            <m:t>7</m:t>
+          </m:r>
+          <m:r>
+            <m:rPr>
+              <m:sty m:val="p"/>
+            </m:rPr>
+            <m:t>=</m:t>
+          </m:r>
+          <m:r>
+            <m:t>3.9801</m:t>
+          </m:r>
+        </m:oMath>
+      </m:oMathPara>
+    </w:p>
+    <w:p>
+      <w:pPr>
+        <w:pStyle w:val="FirstParagraph"/>
+      </w:pPr>
+      <w:r>
+        <w:t xml:space="preserve">a change of</w:t>
+      </w:r>
+      <w:r>
+        <w:t xml:space="preserve"> </w:t>
+      </w:r>
+      <m:oMath>
+        <m:r>
+          <m:rPr>
+            <m:sty m:val="p"/>
+          </m:rPr>
+          <m:t>−</m:t>
+        </m:r>
+        <m:r>
+          <m:t>0.0199</m:t>
+        </m:r>
+      </m:oMath>
+      <w:r>
+        <w:t xml:space="preserve">.</w:t>
+      </w:r>
+      <w:r>
+        <w:t xml:space="preserve"> </w:t>
+      </w:r>
+      <w:r>
+        <w:t xml:space="preserve">The prediction is off by</w:t>
+      </w:r>
+      <w:r>
+        <w:t xml:space="preserve"> </w:t>
+      </w:r>
+      <m:oMath>
+        <m:r>
+          <m:t>0.0001</m:t>
+        </m:r>
+      </m:oMath>
+      <w:r>
+        <w:t xml:space="preserve">, which is</w:t>
+      </w:r>
+      <w:r>
+        <w:t xml:space="preserve"> </w:t>
+      </w:r>
+      <m:oMath>
+        <m:sSup>
+          <m:e>
+            <m:r>
+              <m:t>ϵ</m:t>
+            </m:r>
+          </m:e>
+          <m:sup>
+            <m:r>
+              <m:t>2</m:t>
+            </m:r>
+          </m:sup>
+        </m:sSup>
+      </m:oMath>
+      <w:r>
+        <w:t xml:space="preserve">:</w:t>
+      </w:r>
+      <w:r>
+        <w:t xml:space="preserve"> </w:t>
+      </w:r>
+      <w:r>
+        <w:t xml:space="preserve">the linear approximation drops everything of that order and smaller,</w:t>
+      </w:r>
+      <w:r>
+        <w:t xml:space="preserve"> </w:t>
+      </w:r>
+      <w:r>
+        <w:t xml:space="preserve">so halving the step quarters the error.</w:t>
+      </w:r>
+      <w:r>
+        <w:t xml:space="preserve"> </w:t>
+      </w:r>
+      <w:r>
+        <w:t xml:space="preserve">That trade is the whole bargain of gradient-based fitting.</w:t>
+      </w:r>
+      <w:r>
+        <w:t xml:space="preserve"> </w:t>
+      </w:r>
+      <w:r>
+        <w:t xml:space="preserve">We take a step in the direction the derivative recommends,</w:t>
+      </w:r>
+      <w:r>
+        <w:t xml:space="preserve"> </w:t>
+      </w:r>
+      <w:r>
+        <w:t xml:space="preserve">and the recommendation is trustworthy only as far as the step is small.</w:t>
+      </w:r>
+    </w:p>
+    <w:bookmarkEnd w:id="22"/>
+    <w:bookmarkEnd w:id="23"/>
+    <w:bookmarkEnd w:id="24"/>
+    <w:bookmarkStart w:id="101" w:name="sec-integration"/>
+    <w:p>
+      <w:pPr>
+        <w:pStyle w:val="Heading2"/>
+      </w:pPr>
+      <w:r>
+        <w:t xml:space="preserve">2 Integration</w:t>
+      </w:r>
+    </w:p>
+    <w:p>
+      <w:pPr>
+        <w:pStyle w:val="FirstParagraph"/>
+      </w:pPr>
+      <w:r>
         <w:t xml:space="preserve">Integration is the inverse operation of differentiation: it recovers a</w:t>
       </w:r>
       <w:r>
@@ -2285,7 +3493,7 @@
         <w:t xml:space="preserve">Calculus and a worked example from probability.</w:t>
       </w:r>
     </w:p>
-    <w:bookmarkStart w:id="34" w:name="antiderivatives"/>
+    <w:bookmarkStart w:id="39" w:name="antiderivatives"/>
     <w:p>
       <w:pPr>
         <w:pStyle w:val="Heading3"/>
@@ -2294,7 +3502,7 @@
         <w:t xml:space="preserve">2.1 Antiderivatives</w:t>
       </w:r>
     </w:p>
-    <w:bookmarkStart w:id="20" w:name="def-antiderivative"/>
+    <w:bookmarkStart w:id="25" w:name="def-antiderivative"/>
     <w:p>
       <w:pPr>
         <w:pStyle w:val="FirstParagraph"/>
@@ -2304,7 +3512,7 @@
           <w:b/>
           <w:bCs/>
         </w:rPr>
-        <w:t xml:space="preserve">Definition 1 (Antiderivative)</w:t>
+        <w:t xml:space="preserve">Definition 2 (Antiderivative)</w:t>
       </w:r>
       <w:r>
         <w:t xml:space="preserve"> </w:t>
@@ -2484,8 +3692,8 @@
         <w:t xml:space="preserve">(Larson and Edwards 2018, sec. 4.1, pp. 248–249)</w:t>
       </w:r>
     </w:p>
-    <w:bookmarkEnd w:id="20"/>
-    <w:bookmarkStart w:id="21" w:name="def-indefinite-integral"/>
+    <w:bookmarkEnd w:id="25"/>
+    <w:bookmarkStart w:id="26" w:name="def-indefinite-integral"/>
     <w:p>
       <w:pPr>
         <w:pStyle w:val="BodyText"/>
@@ -2495,7 +3703,7 @@
           <w:b/>
           <w:bCs/>
         </w:rPr>
-        <w:t xml:space="preserve">Definition 2 (Indefinite integral)</w:t>
+        <w:t xml:space="preserve">Definition 3 (Indefinite integral)</w:t>
       </w:r>
       <w:r>
         <w:t xml:space="preserve"> </w:t>
@@ -2544,7 +3752,7 @@
           <w:rPr>
             <w:rStyle w:val="Hyperlink"/>
           </w:rPr>
-          <w:t xml:space="preserve">Definition 1</w:t>
+          <w:t xml:space="preserve">Definition 2</w:t>
         </w:r>
       </w:hyperlink>
       <w:r>
@@ -2698,8 +3906,8 @@
         <w:t xml:space="preserve">(Larson and Edwards 2018, sec. 4.1, pp. 248–249)</w:t>
       </w:r>
     </w:p>
-    <w:bookmarkEnd w:id="21"/>
-    <w:bookmarkStart w:id="31" w:name="exm-antiderivative-power"/>
+    <w:bookmarkEnd w:id="26"/>
+    <w:bookmarkStart w:id="36" w:name="exm-antiderivative-power"/>
     <w:p>
       <w:pPr>
         <w:pStyle w:val="BodyText"/>
@@ -3114,7 +4322,7 @@
         <w:t xml:space="preserve">.</w:t>
       </w:r>
     </w:p>
-    <w:bookmarkStart w:id="30" w:name="fig-antiderivatives"/>
+    <w:bookmarkStart w:id="35" w:name="fig-antiderivatives"/>
     <w:tbl>
       <w:tblPr>
         <w:tblStyle w:val="Table"/>
@@ -3142,7 +4350,7 @@
             <w:tr>
               <w:tc>
                 <w:tcPr/>
-                <w:bookmarkStart w:id="25" w:name="fig-antiderivatives-f"/>
+                <w:bookmarkStart w:id="30" w:name="fig-antiderivatives-f"/>
                 <w:p>
                   <w:pPr>
                     <w:pStyle w:val="SourceCode"/>
@@ -3409,18 +4617,18 @@
                       <wp:inline>
                         <wp:extent cx="2971800" cy="2377440"/>
                         <wp:effectExtent b="0" l="0" r="0" t="0"/>
-                        <wp:docPr descr="" title="" id="23" name="Picture"/>
+                        <wp:docPr descr="" title="" id="28" name="Picture"/>
                         <a:graphic>
                           <a:graphicData uri="http://schemas.openxmlformats.org/drawingml/2006/picture">
                             <pic:pic>
                               <pic:nvPicPr>
-                                <pic:cNvPr descr="calculus_files/figure-docx/antiderivatives-f-code-1.png" id="24" name="Picture"/>
+                                <pic:cNvPr descr="calculus_files/figure-docx/antiderivatives-f-code-1.png" id="29" name="Picture"/>
                                 <pic:cNvPicPr>
                                   <a:picLocks noChangeArrowheads="1" noChangeAspect="1"/>
                                 </pic:cNvPicPr>
                               </pic:nvPicPr>
                               <pic:blipFill>
-                                <a:blip r:embed="rId22"/>
+                                <a:blip r:embed="rId27"/>
                                 <a:stretch>
                                   <a:fillRect/>
                                 </a:stretch>
@@ -3505,7 +4713,7 @@
                     <w:t xml:space="preserve">.</w:t>
                   </w:r>
                 </w:p>
-                <w:bookmarkEnd w:id="25"/>
+                <w:bookmarkEnd w:id="30"/>
               </w:tc>
             </w:tr>
           </w:tbl>
@@ -3555,7 +4763,7 @@
             <w:tr>
               <w:tc>
                 <w:tcPr/>
-                <w:bookmarkStart w:id="29" w:name="fig-antiderivatives-F"/>
+                <w:bookmarkStart w:id="34" w:name="fig-antiderivatives-F"/>
                 <w:p>
                   <w:pPr>
                     <w:pStyle w:val="SourceCode"/>
@@ -4155,18 +5363,18 @@
                       <wp:inline>
                         <wp:extent cx="2971800" cy="2377440"/>
                         <wp:effectExtent b="0" l="0" r="0" t="0"/>
-                        <wp:docPr descr="" title="" id="27" name="Picture"/>
+                        <wp:docPr descr="" title="" id="32" name="Picture"/>
                         <a:graphic>
                           <a:graphicData uri="http://schemas.openxmlformats.org/drawingml/2006/picture">
                             <pic:pic>
                               <pic:nvPicPr>
-                                <pic:cNvPr descr="calculus_files/figure-docx/antiderivatives-F-code-1.png" id="28" name="Picture"/>
+                                <pic:cNvPr descr="calculus_files/figure-docx/antiderivatives-F-code-1.png" id="33" name="Picture"/>
                                 <pic:cNvPicPr>
                                   <a:picLocks noChangeArrowheads="1" noChangeAspect="1"/>
                                 </pic:cNvPicPr>
                               </pic:nvPicPr>
                               <pic:blipFill>
-                                <a:blip r:embed="rId26"/>
+                                <a:blip r:embed="rId31"/>
                                 <a:stretch>
                                   <a:fillRect/>
                                 </a:stretch>
@@ -4269,7 +5477,7 @@
                     <w:t xml:space="preserve">.</w:t>
                   </w:r>
                 </w:p>
-                <w:bookmarkEnd w:id="29"/>
+                <w:bookmarkEnd w:id="34"/>
               </w:tc>
             </w:tr>
           </w:tbl>
@@ -4498,9 +5706,9 @@
         <w:t xml:space="preserve">; they differ only by a vertical shift.</w:t>
       </w:r>
     </w:p>
-    <w:bookmarkEnd w:id="30"/>
-    <w:bookmarkEnd w:id="31"/>
-    <w:bookmarkStart w:id="32" w:name="thm-integral-rules"/>
+    <w:bookmarkEnd w:id="35"/>
+    <w:bookmarkEnd w:id="36"/>
+    <w:bookmarkStart w:id="37" w:name="thm-integral-rules"/>
     <w:p>
       <w:pPr>
         <w:pStyle w:val="BodyText"/>
@@ -4540,7 +5748,7 @@
           <w:rPr>
             <w:rStyle w:val="Hyperlink"/>
           </w:rPr>
-          <w:t xml:space="preserve">Definition 1</w:t>
+          <w:t xml:space="preserve">Definition 2</w:t>
         </w:r>
       </w:hyperlink>
       <w:r>
@@ -5480,8 +6688,8 @@
         <w:t xml:space="preserve">.</w:t>
       </w:r>
     </w:p>
-    <w:bookmarkEnd w:id="32"/>
-    <w:bookmarkStart w:id="33" w:name="exm-integral-rules-quadratic"/>
+    <w:bookmarkEnd w:id="37"/>
+    <w:bookmarkStart w:id="38" w:name="exm-integral-rules-quadratic"/>
     <w:p>
       <w:pPr>
         <w:pStyle w:val="BodyText"/>
@@ -5877,9 +7085,9 @@
         <w:t xml:space="preserve">, as required.</w:t>
       </w:r>
     </w:p>
-    <w:bookmarkEnd w:id="33"/>
-    <w:bookmarkEnd w:id="34"/>
-    <w:bookmarkStart w:id="64" w:name="regularity-conditions"/>
+    <w:bookmarkEnd w:id="38"/>
+    <w:bookmarkEnd w:id="39"/>
+    <w:bookmarkStart w:id="69" w:name="regularity-conditions"/>
     <w:p>
       <w:pPr>
         <w:pStyle w:val="Heading3"/>
@@ -5888,7 +7096,7 @@
         <w:t xml:space="preserve">2.2 Regularity Conditions</w:t>
       </w:r>
     </w:p>
-    <w:bookmarkStart w:id="35" w:name="def-differentiable"/>
+    <w:bookmarkStart w:id="40" w:name="def-differentiable"/>
     <w:p>
       <w:pPr>
         <w:pStyle w:val="FirstParagraph"/>
@@ -5898,7 +7106,7 @@
           <w:b/>
           <w:bCs/>
         </w:rPr>
-        <w:t xml:space="preserve">Definition 3 (Differentiable function)</w:t>
+        <w:t xml:space="preserve">Definition 4 (Differentiable function)</w:t>
       </w:r>
       <w:r>
         <w:t xml:space="preserve"> </w:t>
@@ -6118,8 +7326,8 @@
         <w:t xml:space="preserve">(Larson and Edwards 2018, sec. 2.1, p. 100)</w:t>
       </w:r>
     </w:p>
-    <w:bookmarkEnd w:id="35"/>
-    <w:bookmarkStart w:id="36" w:name="def-differentiable-on"/>
+    <w:bookmarkEnd w:id="40"/>
+    <w:bookmarkStart w:id="41" w:name="def-differentiable-on"/>
     <w:p>
       <w:pPr>
         <w:pStyle w:val="BodyText"/>
@@ -6129,7 +7337,7 @@
           <w:b/>
           <w:bCs/>
         </w:rPr>
-        <w:t xml:space="preserve">Definition 4 (Differentiable on an interval)</w:t>
+        <w:t xml:space="preserve">Definition 5 (Differentiable on an interval)</w:t>
       </w:r>
       <w:r>
         <w:t xml:space="preserve"> </w:t>
@@ -6178,7 +7386,7 @@
           <w:rPr>
             <w:rStyle w:val="Hyperlink"/>
           </w:rPr>
-          <w:t xml:space="preserve">Definition 3</w:t>
+          <w:t xml:space="preserve">Definition 4</w:t>
         </w:r>
       </w:hyperlink>
       <w:r>
@@ -6199,8 +7407,8 @@
         <w:t xml:space="preserve">(Larson and Edwards 2018, sec. 2.1, p. 100)</w:t>
       </w:r>
     </w:p>
-    <w:bookmarkEnd w:id="36"/>
-    <w:bookmarkStart w:id="37" w:name="def-continuous"/>
+    <w:bookmarkEnd w:id="41"/>
+    <w:bookmarkStart w:id="42" w:name="def-continuous"/>
     <w:p>
       <w:pPr>
         <w:pStyle w:val="BodyText"/>
@@ -6210,7 +7418,7 @@
           <w:b/>
           <w:bCs/>
         </w:rPr>
-        <w:t xml:space="preserve">Definition 5 (Continuous function)</w:t>
+        <w:t xml:space="preserve">Definition 6 (Continuous function)</w:t>
       </w:r>
       <w:r>
         <w:t xml:space="preserve"> </w:t>
@@ -6271,7 +7479,7 @@
         <w:pStyle w:val="Compact"/>
         <w:numPr>
           <w:ilvl w:val="0"/>
-          <w:numId w:val="1001"/>
+          <w:numId w:val="1002"/>
         </w:numPr>
       </w:pPr>
       <m:oMath>
@@ -6306,7 +7514,7 @@
         <w:pStyle w:val="Compact"/>
         <w:numPr>
           <w:ilvl w:val="0"/>
-          <w:numId w:val="1001"/>
+          <w:numId w:val="1002"/>
         </w:numPr>
       </w:pPr>
       <m:oMath>
@@ -6365,7 +7573,7 @@
         <w:pStyle w:val="Compact"/>
         <w:numPr>
           <w:ilvl w:val="0"/>
-          <w:numId w:val="1001"/>
+          <w:numId w:val="1002"/>
         </w:numPr>
       </w:pPr>
       <m:oMath>
@@ -6448,8 +7656,8 @@
         <w:t xml:space="preserve">(Larson and Edwards 2018, sec. 1.4, p. 73)</w:t>
       </w:r>
     </w:p>
-    <w:bookmarkEnd w:id="37"/>
-    <w:bookmarkStart w:id="38" w:name="def-continuous-on"/>
+    <w:bookmarkEnd w:id="42"/>
+    <w:bookmarkStart w:id="43" w:name="def-continuous-on"/>
     <w:p>
       <w:pPr>
         <w:pStyle w:val="BodyText"/>
@@ -6459,7 +7667,7 @@
           <w:b/>
           <w:bCs/>
         </w:rPr>
-        <w:t xml:space="preserve">Definition 6 (Continuous on a closed interval)</w:t>
+        <w:t xml:space="preserve">Definition 7 (Continuous on a closed interval)</w:t>
       </w:r>
       <w:r>
         <w:t xml:space="preserve"> </w:t>
@@ -6538,7 +7746,7 @@
         <w:pStyle w:val="Compact"/>
         <w:numPr>
           <w:ilvl w:val="0"/>
-          <w:numId w:val="1002"/>
+          <w:numId w:val="1003"/>
         </w:numPr>
       </w:pPr>
       <m:oMath>
@@ -6557,7 +7765,7 @@
           <w:rPr>
             <w:rStyle w:val="Hyperlink"/>
           </w:rPr>
-          <w:t xml:space="preserve">Definition 5</w:t>
+          <w:t xml:space="preserve">Definition 6</w:t>
         </w:r>
       </w:hyperlink>
       <w:r>
@@ -6601,7 +7809,7 @@
         <w:pStyle w:val="Compact"/>
         <w:numPr>
           <w:ilvl w:val="0"/>
-          <w:numId w:val="1002"/>
+          <w:numId w:val="1003"/>
         </w:numPr>
       </w:pPr>
       <m:oMath>
@@ -6693,7 +7901,7 @@
         <w:pStyle w:val="Compact"/>
         <w:numPr>
           <w:ilvl w:val="0"/>
-          <w:numId w:val="1002"/>
+          <w:numId w:val="1003"/>
         </w:numPr>
       </w:pPr>
       <m:oMath>
@@ -6788,8 +7996,8 @@
         <w:t xml:space="preserve">(Larson and Edwards 2018, sec. 1.4, p. 73)</w:t>
       </w:r>
     </w:p>
-    <w:bookmarkEnd w:id="38"/>
-    <w:bookmarkStart w:id="39" w:name="exm-continuous-on-sqrt"/>
+    <w:bookmarkEnd w:id="43"/>
+    <w:bookmarkStart w:id="44" w:name="exm-continuous-on-sqrt"/>
     <w:p>
       <w:pPr>
         <w:pStyle w:val="BodyText"/>
@@ -7005,7 +8213,7 @@
           <w:rPr>
             <w:rStyle w:val="Hyperlink"/>
           </w:rPr>
-          <w:t xml:space="preserve">Definition 6</w:t>
+          <w:t xml:space="preserve">Definition 7</w:t>
         </w:r>
       </w:hyperlink>
       <w:r>
@@ -7319,15 +8527,15 @@
           <w:rPr>
             <w:rStyle w:val="Hyperlink"/>
           </w:rPr>
-          <w:t xml:space="preserve">Definition 6</w:t>
+          <w:t xml:space="preserve">Definition 7</w:t>
         </w:r>
       </w:hyperlink>
       <w:r>
         <w:t xml:space="preserve">).</w:t>
       </w:r>
     </w:p>
-    <w:bookmarkEnd w:id="39"/>
-    <w:bookmarkStart w:id="40" w:name="def-partition"/>
+    <w:bookmarkEnd w:id="44"/>
+    <w:bookmarkStart w:id="45" w:name="def-partition"/>
     <w:p>
       <w:pPr>
         <w:pStyle w:val="BodyText"/>
@@ -7337,7 +8545,7 @@
           <w:b/>
           <w:bCs/>
         </w:rPr>
-        <w:t xml:space="preserve">Definition 7 (Partition of an interval)</w:t>
+        <w:t xml:space="preserve">Definition 8 (Partition of an interval)</w:t>
       </w:r>
       <w:r>
         <w:t xml:space="preserve"> </w:t>
@@ -7719,8 +8927,8 @@
         <w:t xml:space="preserve">(Larson and Edwards 2018, sec. 4.3)</w:t>
       </w:r>
     </w:p>
-    <w:bookmarkEnd w:id="40"/>
-    <w:bookmarkStart w:id="41" w:name="exm-partition"/>
+    <w:bookmarkEnd w:id="45"/>
+    <w:bookmarkStart w:id="46" w:name="exm-partition"/>
     <w:p>
       <w:pPr>
         <w:pStyle w:val="BodyText"/>
@@ -7989,8 +9197,8 @@
         <w:t xml:space="preserve">.</w:t>
       </w:r>
     </w:p>
-    <w:bookmarkEnd w:id="41"/>
-    <w:bookmarkStart w:id="42" w:name="def-mesh"/>
+    <w:bookmarkEnd w:id="46"/>
+    <w:bookmarkStart w:id="47" w:name="def-mesh"/>
     <w:p>
       <w:pPr>
         <w:pStyle w:val="BodyText"/>
@@ -8000,7 +9208,7 @@
           <w:b/>
           <w:bCs/>
         </w:rPr>
-        <w:t xml:space="preserve">Definition 8 (Mesh of a partition)</w:t>
+        <w:t xml:space="preserve">Definition 9 (Mesh of a partition)</w:t>
       </w:r>
       <w:r>
         <w:t xml:space="preserve"> </w:t>
@@ -8047,7 +9255,7 @@
           <w:rPr>
             <w:rStyle w:val="Hyperlink"/>
           </w:rPr>
-          <w:t xml:space="preserve">Definition 7</w:t>
+          <w:t xml:space="preserve">Definition 8</w:t>
         </w:r>
       </w:hyperlink>
       <w:r>
@@ -8151,8 +9359,8 @@
         <w:t xml:space="preserve">(Larson and Edwards 2018, sec. 4.3)</w:t>
       </w:r>
     </w:p>
-    <w:bookmarkEnd w:id="42"/>
-    <w:bookmarkStart w:id="43" w:name="exm-mesh"/>
+    <w:bookmarkEnd w:id="47"/>
+    <w:bookmarkStart w:id="48" w:name="exm-mesh"/>
     <w:p>
       <w:pPr>
         <w:pStyle w:val="BodyText"/>
@@ -8413,8 +9621,8 @@
         <w:t xml:space="preserve">.</w:t>
       </w:r>
     </w:p>
-    <w:bookmarkEnd w:id="43"/>
-    <w:bookmarkStart w:id="44" w:name="def-riemann-integral"/>
+    <w:bookmarkEnd w:id="48"/>
+    <w:bookmarkStart w:id="49" w:name="def-riemann-integral"/>
     <w:p>
       <w:pPr>
         <w:pStyle w:val="BodyText"/>
@@ -8424,7 +9632,7 @@
           <w:b/>
           <w:bCs/>
         </w:rPr>
-        <w:t xml:space="preserve">Definition 9 (Riemann integral)</w:t>
+        <w:t xml:space="preserve">Definition 10 (Riemann integral)</w:t>
       </w:r>
       <w:r>
         <w:t xml:space="preserve"> </w:t>
@@ -8542,7 +9750,7 @@
           <w:rPr>
             <w:rStyle w:val="Hyperlink"/>
           </w:rPr>
-          <w:t xml:space="preserve">Definition 7</w:t>
+          <w:t xml:space="preserve">Definition 8</w:t>
         </w:r>
       </w:hyperlink>
       <w:r>
@@ -8720,7 +9928,7 @@
           <w:rPr>
             <w:rStyle w:val="Hyperlink"/>
           </w:rPr>
-          <w:t xml:space="preserve">Definition 8</w:t>
+          <w:t xml:space="preserve">Definition 9</w:t>
         </w:r>
       </w:hyperlink>
       <w:r>
@@ -8986,8 +10194,8 @@
         <w:t xml:space="preserve">(Larson and Edwards 2018, sec. 4.3, p. 272)</w:t>
       </w:r>
     </w:p>
-    <w:bookmarkEnd w:id="44"/>
-    <w:bookmarkStart w:id="45" w:name="def-integrable"/>
+    <w:bookmarkEnd w:id="49"/>
+    <w:bookmarkStart w:id="50" w:name="def-integrable"/>
     <w:p>
       <w:pPr>
         <w:pStyle w:val="BodyText"/>
@@ -8997,7 +10205,7 @@
           <w:b/>
           <w:bCs/>
         </w:rPr>
-        <w:t xml:space="preserve">Definition 10 (Riemann integrable)</w:t>
+        <w:t xml:space="preserve">Definition 11 (Riemann integrable)</w:t>
       </w:r>
       <w:r>
         <w:t xml:space="preserve"> </w:t>
@@ -9069,7 +10277,7 @@
           <w:rPr>
             <w:rStyle w:val="Hyperlink"/>
           </w:rPr>
-          <w:t xml:space="preserve">Definition 9</w:t>
+          <w:t xml:space="preserve">Definition 10</w:t>
         </w:r>
       </w:hyperlink>
       <w:r>
@@ -9119,8 +10327,8 @@
         <w:t xml:space="preserve">(Larson and Edwards 2018, sec. 4.3, p. 272)</w:t>
       </w:r>
     </w:p>
-    <w:bookmarkEnd w:id="45"/>
-    <w:bookmarkStart w:id="46" w:name="def-riemann-sum-equal-width"/>
+    <w:bookmarkEnd w:id="50"/>
+    <w:bookmarkStart w:id="51" w:name="def-riemann-sum-equal-width"/>
     <w:p>
       <w:pPr>
         <w:pStyle w:val="BodyText"/>
@@ -9130,7 +10338,7 @@
           <w:b/>
           <w:bCs/>
         </w:rPr>
-        <w:t xml:space="preserve">Definition 11 (Equal-width Riemann sum)</w:t>
+        <w:t xml:space="preserve">Definition 12 (Equal-width Riemann sum)</w:t>
       </w:r>
       <w:r>
         <w:t xml:space="preserve"> </w:t>
@@ -9518,8 +10726,8 @@
         </m:oMath>
       </m:oMathPara>
     </w:p>
-    <w:bookmarkEnd w:id="46"/>
-    <w:bookmarkStart w:id="47" w:name="exm-equal-width-sum"/>
+    <w:bookmarkEnd w:id="51"/>
+    <w:bookmarkStart w:id="52" w:name="exm-equal-width-sum"/>
     <w:p>
       <w:pPr>
         <w:pStyle w:val="FirstParagraph"/>
@@ -10120,7 +11328,7 @@
         </m:oMath>
       </m:oMathPara>
     </w:p>
-    <w:bookmarkEnd w:id="47"/>
+    <w:bookmarkEnd w:id="52"/>
     <w:p>
       <w:pPr>
         <w:pStyle w:val="FirstParagraph"/>
@@ -10241,7 +11449,7 @@
         <w:t xml:space="preserve">which says what continuity buys us.</w:t>
       </w:r>
     </w:p>
-    <w:bookmarkStart w:id="48" w:name="thm-diff-implies-cont"/>
+    <w:bookmarkStart w:id="53" w:name="thm-diff-implies-cont"/>
     <w:p>
       <w:pPr>
         <w:pStyle w:val="BodyText"/>
@@ -10336,7 +11544,7 @@
         <w:t xml:space="preserve">(Larson and Edwards 2018, Theorem 2.1, p. 106)</w:t>
       </w:r>
     </w:p>
-    <w:bookmarkEnd w:id="48"/>
+    <w:bookmarkEnd w:id="53"/>
     <w:p>
       <w:pPr>
         <w:pStyle w:val="BodyText"/>
@@ -11204,7 +12412,7 @@
           <w:rPr>
             <w:rStyle w:val="Hyperlink"/>
           </w:rPr>
-          <w:t xml:space="preserve">Definition 5</w:t>
+          <w:t xml:space="preserve">Definition 6</w:t>
         </w:r>
       </w:hyperlink>
       <w:r>
@@ -11214,7 +12422,7 @@
         <w:t xml:space="preserve">hold.</w:t>
       </w:r>
     </w:p>
-    <w:bookmarkStart w:id="49" w:name="exm-diff-implies-cont"/>
+    <w:bookmarkStart w:id="54" w:name="exm-diff-implies-cont"/>
     <w:p>
       <w:pPr>
         <w:pStyle w:val="BodyText"/>
@@ -11417,8 +12625,8 @@
         <w:t xml:space="preserve">it is continuous everywhere.</w:t>
       </w:r>
     </w:p>
-    <w:bookmarkEnd w:id="49"/>
-    <w:bookmarkStart w:id="54" w:name="exm-cont-not-diff"/>
+    <w:bookmarkEnd w:id="54"/>
+    <w:bookmarkStart w:id="59" w:name="exm-cont-not-diff"/>
     <w:p>
       <w:pPr>
         <w:pStyle w:val="BodyText"/>
@@ -11764,7 +12972,7 @@
       <w:tr>
         <w:tc>
           <w:tcPr/>
-          <w:bookmarkStart w:id="53" w:name="fig-abs-value"/>
+          <w:bookmarkStart w:id="58" w:name="fig-abs-value"/>
           <w:p>
             <w:pPr>
               <w:pStyle w:val="SourceCode"/>
@@ -12200,18 +13408,18 @@
                 <wp:inline>
                   <wp:extent cx="4620126" cy="3696101"/>
                   <wp:effectExtent b="0" l="0" r="0" t="0"/>
-                  <wp:docPr descr="" title="" id="51" name="Picture"/>
+                  <wp:docPr descr="" title="" id="56" name="Picture"/>
                   <a:graphic>
                     <a:graphicData uri="http://schemas.openxmlformats.org/drawingml/2006/picture">
                       <pic:pic>
                         <pic:nvPicPr>
-                          <pic:cNvPr descr="calculus_files/figure-docx/abs-value-code-1.png" id="52" name="Picture"/>
+                          <pic:cNvPr descr="calculus_files/figure-docx/abs-value-code-1.png" id="57" name="Picture"/>
                           <pic:cNvPicPr>
                             <a:picLocks noChangeArrowheads="1" noChangeAspect="1"/>
                           </pic:cNvPicPr>
                         </pic:nvPicPr>
                         <pic:blipFill>
-                          <a:blip r:embed="rId50"/>
+                          <a:blip r:embed="rId55"/>
                           <a:stretch>
                             <a:fillRect/>
                           </a:stretch>
@@ -12334,12 +13542,12 @@
               <w:t xml:space="preserve">but is continuous everywhere: no gaps or jumps.</w:t>
             </w:r>
           </w:p>
-          <w:bookmarkEnd w:id="53"/>
+          <w:bookmarkEnd w:id="58"/>
         </w:tc>
       </w:tr>
     </w:tbl>
-    <w:bookmarkEnd w:id="54"/>
-    <w:bookmarkStart w:id="55" w:name="thm-cont-implies-int"/>
+    <w:bookmarkEnd w:id="59"/>
+    <w:bookmarkStart w:id="60" w:name="thm-cont-implies-int"/>
     <w:p>
       <w:pPr>
         <w:pStyle w:val="BodyText"/>
@@ -12525,8 +13733,8 @@
         <w:t xml:space="preserve">(Larson and Edwards 2018, Theorem 4.4, p. 272)</w:t>
       </w:r>
     </w:p>
-    <w:bookmarkEnd w:id="55"/>
-    <w:bookmarkStart w:id="56" w:name="exm-cont-implies-int"/>
+    <w:bookmarkEnd w:id="60"/>
+    <w:bookmarkStart w:id="61" w:name="exm-cont-implies-int"/>
     <w:p>
       <w:pPr>
         <w:pStyle w:val="BodyText"/>
@@ -12621,8 +13829,8 @@
         <w:t xml:space="preserve">.</w:t>
       </w:r>
     </w:p>
-    <w:bookmarkEnd w:id="56"/>
-    <w:bookmarkStart w:id="61" w:name="exm-int-not-cont"/>
+    <w:bookmarkEnd w:id="61"/>
+    <w:bookmarkStart w:id="66" w:name="exm-int-not-cont"/>
     <w:p>
       <w:pPr>
         <w:pStyle w:val="BodyText"/>
@@ -13148,7 +14356,7 @@
       <w:tr>
         <w:tc>
           <w:tcPr/>
-          <w:bookmarkStart w:id="60" w:name="fig-step"/>
+          <w:bookmarkStart w:id="65" w:name="fig-step"/>
           <w:p>
             <w:pPr>
               <w:pStyle w:val="SourceCode"/>
@@ -14520,18 +15728,18 @@
                 <wp:inline>
                   <wp:extent cx="4620126" cy="3696101"/>
                   <wp:effectExtent b="0" l="0" r="0" t="0"/>
-                  <wp:docPr descr="" title="" id="58" name="Picture"/>
+                  <wp:docPr descr="" title="" id="63" name="Picture"/>
                   <a:graphic>
                     <a:graphicData uri="http://schemas.openxmlformats.org/drawingml/2006/picture">
                       <pic:pic>
                         <pic:nvPicPr>
-                          <pic:cNvPr descr="calculus_files/figure-docx/step-code-1.png" id="59" name="Picture"/>
+                          <pic:cNvPr descr="calculus_files/figure-docx/step-code-1.png" id="64" name="Picture"/>
                           <pic:cNvPicPr>
                             <a:picLocks noChangeArrowheads="1" noChangeAspect="1"/>
                           </pic:cNvPicPr>
                         </pic:nvPicPr>
                         <pic:blipFill>
-                          <a:blip r:embed="rId57"/>
+                          <a:blip r:embed="rId62"/>
                           <a:stretch>
                             <a:fillRect/>
                           </a:stretch>
@@ -14796,11 +16004,11 @@
               <w:t xml:space="preserve">.</w:t>
             </w:r>
           </w:p>
-          <w:bookmarkEnd w:id="60"/>
+          <w:bookmarkEnd w:id="65"/>
         </w:tc>
       </w:tr>
     </w:tbl>
-    <w:bookmarkEnd w:id="61"/>
+    <w:bookmarkEnd w:id="66"/>
     <w:p>
       <w:pPr>
         <w:pStyle w:val="BodyText"/>
@@ -15008,7 +16216,7 @@
         <w:t xml:space="preserve">show that neither implication reverses in general.</w:t>
       </w:r>
     </w:p>
-    <w:bookmarkStart w:id="62" w:name="thm-riemann-general"/>
+    <w:bookmarkStart w:id="67" w:name="thm-riemann-general"/>
     <w:p>
       <w:pPr>
         <w:pStyle w:val="BodyText"/>
@@ -15080,7 +16288,7 @@
           <w:rPr>
             <w:rStyle w:val="Hyperlink"/>
           </w:rPr>
-          <w:t xml:space="preserve">Definition 10</w:t>
+          <w:t xml:space="preserve">Definition 11</w:t>
         </w:r>
       </w:hyperlink>
       <w:r>
@@ -15131,7 +16339,7 @@
           <w:rPr>
             <w:rStyle w:val="Hyperlink"/>
           </w:rPr>
-          <w:t xml:space="preserve">Definition 11</w:t>
+          <w:t xml:space="preserve">Definition 12</w:t>
         </w:r>
       </w:hyperlink>
       <w:r>
@@ -15248,7 +16456,7 @@
         </m:oMath>
       </m:oMathPara>
     </w:p>
-    <w:bookmarkEnd w:id="62"/>
+    <w:bookmarkEnd w:id="67"/>
     <w:p>
       <w:pPr>
         <w:pStyle w:val="FirstParagraph"/>
@@ -15320,7 +16528,7 @@
           <w:rPr>
             <w:rStyle w:val="Hyperlink"/>
           </w:rPr>
-          <w:t xml:space="preserve">Definition 8</w:t>
+          <w:t xml:space="preserve">Definition 9</w:t>
         </w:r>
       </w:hyperlink>
       <w:r>
@@ -15450,7 +16658,7 @@
           <w:rPr>
             <w:rStyle w:val="Hyperlink"/>
           </w:rPr>
-          <w:t xml:space="preserve">Definition 9</w:t>
+          <w:t xml:space="preserve">Definition 10</w:t>
         </w:r>
       </w:hyperlink>
       <w:r>
@@ -15486,7 +16694,7 @@
         <w:t xml:space="preserve">has that value along this sequence too.</w:t>
       </w:r>
     </w:p>
-    <w:bookmarkStart w:id="63" w:name="exm-riemann-equal-width"/>
+    <w:bookmarkStart w:id="68" w:name="exm-riemann-equal-width"/>
     <w:p>
       <w:pPr>
         <w:pStyle w:val="BodyText"/>
@@ -16414,9 +17622,9 @@
         <w:t xml:space="preserve">.</w:t>
       </w:r>
     </w:p>
-    <w:bookmarkEnd w:id="63"/>
-    <w:bookmarkEnd w:id="64"/>
-    <w:bookmarkStart w:id="95" w:name="fundamental-theorem-of-calculus"/>
+    <w:bookmarkEnd w:id="68"/>
+    <w:bookmarkEnd w:id="69"/>
+    <w:bookmarkStart w:id="100" w:name="fundamental-theorem-of-calculus"/>
     <w:p>
       <w:pPr>
         <w:pStyle w:val="Heading3"/>
@@ -16425,7 +17633,7 @@
         <w:t xml:space="preserve">2.3 Fundamental Theorem of Calculus</w:t>
       </w:r>
     </w:p>
-    <w:bookmarkStart w:id="71" w:name="thm-ftc"/>
+    <w:bookmarkStart w:id="76" w:name="thm-ftc"/>
     <w:p>
       <w:pPr>
         <w:pStyle w:val="FirstParagraph"/>
@@ -16655,7 +17863,7 @@
       <w:pPr>
         <w:pStyle w:val="BodyText"/>
       </w:pPr>
-      <w:bookmarkStart w:id="65" w:name="eq-ftc-deriv-of-integral"/>
+      <w:bookmarkStart w:id="70" w:name="eq-ftc-deriv-of-integral"/>
       <m:oMathPara>
         <m:oMathParaPr>
           <m:jc m:val="center"/>
@@ -16766,7 +17974,7 @@
             <m:t>(</m:t>
           </m:r>
           <m:r>
-            <m:t>1</m:t>
+            <m:t>2</m:t>
           </m:r>
           <m:r>
             <m:rPr>
@@ -16776,7 +17984,7 @@
           </m:r>
         </m:oMath>
       </m:oMathPara>
-      <w:bookmarkEnd w:id="65"/>
+      <w:bookmarkEnd w:id="70"/>
     </w:p>
     <w:tbl>
       <w:tblPr>
@@ -16819,18 +18027,18 @@
                 <wp:inline>
                   <wp:extent cx="152400" cy="152400"/>
                   <wp:effectExtent b="0" l="0" r="0" t="0"/>
-                  <wp:docPr descr="" title="" id="67" name="Picture"/>
+                  <wp:docPr descr="" title="" id="72" name="Picture"/>
                   <a:graphic>
                     <a:graphicData uri="http://schemas.openxmlformats.org/drawingml/2006/picture">
                       <pic:pic>
                         <pic:nvPicPr>
-                          <pic:cNvPr descr="/opt/quarto/share/formats/docx/note.png" id="68" name="Picture"/>
+                          <pic:cNvPr descr="/opt/quarto/share/formats/docx/note.png" id="73" name="Picture"/>
                           <pic:cNvPicPr>
                             <a:picLocks noChangeArrowheads="1" noChangeAspect="1"/>
                           </pic:cNvPicPr>
                         </pic:nvPicPr>
                         <pic:blipFill>
-                          <a:blip r:embed="rId66"/>
+                          <a:blip r:embed="rId71"/>
                           <a:stretch>
                             <a:fillRect/>
                           </a:stretch>
@@ -17007,7 +18215,7 @@
                 <w:rPr>
                   <w:rStyle w:val="Hyperlink"/>
                 </w:rPr>
-                <w:t xml:space="preserve">Definition 10</w:t>
+                <w:t xml:space="preserve">Definition 11</w:t>
               </w:r>
             </w:hyperlink>
             <w:r>
@@ -17035,7 +18243,7 @@
                 <w:rPr>
                   <w:rStyle w:val="Hyperlink"/>
                 </w:rPr>
-                <w:t xml:space="preserve">Definition 5</w:t>
+                <w:t xml:space="preserve">Definition 6</w:t>
               </w:r>
             </w:hyperlink>
             <w:r>
@@ -17336,7 +18544,7 @@
       <w:pPr>
         <w:pStyle w:val="BodyText"/>
       </w:pPr>
-      <w:bookmarkStart w:id="69" w:name="eq-ftc-part2"/>
+      <w:bookmarkStart w:id="74" w:name="eq-ftc-part2"/>
       <m:oMathPara>
         <m:oMathParaPr>
           <m:jc m:val="center"/>
@@ -17447,7 +18655,7 @@
             <m:t>(</m:t>
           </m:r>
           <m:r>
-            <m:t>2</m:t>
+            <m:t>3</m:t>
           </m:r>
           <m:r>
             <m:rPr>
@@ -17457,7 +18665,7 @@
           </m:r>
         </m:oMath>
       </m:oMathPara>
-      <w:bookmarkEnd w:id="69"/>
+      <w:bookmarkEnd w:id="74"/>
     </w:p>
     <w:p>
       <w:pPr>
@@ -17527,7 +18735,7 @@
       <w:pPr>
         <w:pStyle w:val="BodyText"/>
       </w:pPr>
-      <w:bookmarkStart w:id="70" w:name="eq-ftc-integral-of-deriv"/>
+      <w:bookmarkStart w:id="75" w:name="eq-ftc-integral-of-deriv"/>
       <m:oMathPara>
         <m:oMathParaPr>
           <m:jc m:val="center"/>
@@ -17650,7 +18858,7 @@
             <m:t>(</m:t>
           </m:r>
           <m:r>
-            <m:t>3</m:t>
+            <m:t>4</m:t>
           </m:r>
           <m:r>
             <m:rPr>
@@ -17660,7 +18868,7 @@
           </m:r>
         </m:oMath>
       </m:oMathPara>
-      <w:bookmarkEnd w:id="70"/>
+      <w:bookmarkEnd w:id="75"/>
     </w:p>
     <w:p>
       <w:pPr>
@@ -17788,7 +18996,7 @@
         <w:t xml:space="preserve">(Banner 2007, chap. 18; Larson and Edwards 2018, Theorem 4.9, p. 282)</w:t>
       </w:r>
     </w:p>
-    <w:bookmarkEnd w:id="71"/>
+    <w:bookmarkEnd w:id="76"/>
     <w:p>
       <w:pPr>
         <w:pStyle w:val="BodyText"/>
@@ -17829,7 +19037,7 @@
         <w:pStyle w:val="Compact"/>
         <w:numPr>
           <w:ilvl w:val="0"/>
-          <w:numId w:val="1003"/>
+          <w:numId w:val="1004"/>
         </w:numPr>
       </w:pPr>
       <w:r>
@@ -17864,84 +19072,6 @@
         <w:t xml:space="preserve">(</w:t>
       </w:r>
       <w:hyperlink w:anchor="eq-ftc-deriv-of-integral">
-        <w:r>
-          <w:rPr>
-            <w:rStyle w:val="Hyperlink"/>
-          </w:rPr>
-          <w:t xml:space="preserve">Equation 1</w:t>
-        </w:r>
-      </w:hyperlink>
-      <w:r>
-        <w:t xml:space="preserve">).</w:t>
-      </w:r>
-    </w:p>
-    <w:p>
-      <w:pPr>
-        <w:pStyle w:val="Compact"/>
-        <w:numPr>
-          <w:ilvl w:val="0"/>
-          <w:numId w:val="1003"/>
-        </w:numPr>
-      </w:pPr>
-      <w:r>
-        <w:t xml:space="preserve">Part 2: the integral of</w:t>
-      </w:r>
-      <w:r>
-        <w:t xml:space="preserve"> </w:t>
-      </w:r>
-      <m:oMath>
-        <m:r>
-          <m:t>f</m:t>
-        </m:r>
-      </m:oMath>
-      <w:r>
-        <w:t xml:space="preserve"> </w:t>
-      </w:r>
-      <w:r>
-        <w:t xml:space="preserve">over</w:t>
-      </w:r>
-      <w:r>
-        <w:t xml:space="preserve"> </w:t>
-      </w:r>
-      <m:oMath>
-        <m:r>
-          <m:rPr>
-            <m:sty m:val="p"/>
-          </m:rPr>
-          <m:t>[</m:t>
-        </m:r>
-        <m:r>
-          <m:t>a</m:t>
-        </m:r>
-        <m:r>
-          <m:rPr>
-            <m:sty m:val="p"/>
-          </m:rPr>
-          <m:t>,</m:t>
-        </m:r>
-        <m:r>
-          <m:t>b</m:t>
-        </m:r>
-        <m:r>
-          <m:rPr>
-            <m:sty m:val="p"/>
-          </m:rPr>
-          <m:t>]</m:t>
-        </m:r>
-      </m:oMath>
-      <w:r>
-        <w:t xml:space="preserve"> </w:t>
-      </w:r>
-      <w:r>
-        <w:t xml:space="preserve">equals the difference of</w:t>
-      </w:r>
-      <w:r>
-        <w:t xml:space="preserve"> </w:t>
-      </w:r>
-      <w:r>
-        <w:t xml:space="preserve">any antiderivative’s values at the endpoints (</w:t>
-      </w:r>
-      <w:hyperlink w:anchor="eq-ftc-part2">
         <w:r>
           <w:rPr>
             <w:rStyle w:val="Hyperlink"/>
@@ -17950,6 +19080,84 @@
         </w:r>
       </w:hyperlink>
       <w:r>
+        <w:t xml:space="preserve">).</w:t>
+      </w:r>
+    </w:p>
+    <w:p>
+      <w:pPr>
+        <w:pStyle w:val="Compact"/>
+        <w:numPr>
+          <w:ilvl w:val="0"/>
+          <w:numId w:val="1004"/>
+        </w:numPr>
+      </w:pPr>
+      <w:r>
+        <w:t xml:space="preserve">Part 2: the integral of</w:t>
+      </w:r>
+      <w:r>
+        <w:t xml:space="preserve"> </w:t>
+      </w:r>
+      <m:oMath>
+        <m:r>
+          <m:t>f</m:t>
+        </m:r>
+      </m:oMath>
+      <w:r>
+        <w:t xml:space="preserve"> </w:t>
+      </w:r>
+      <w:r>
+        <w:t xml:space="preserve">over</w:t>
+      </w:r>
+      <w:r>
+        <w:t xml:space="preserve"> </w:t>
+      </w:r>
+      <m:oMath>
+        <m:r>
+          <m:rPr>
+            <m:sty m:val="p"/>
+          </m:rPr>
+          <m:t>[</m:t>
+        </m:r>
+        <m:r>
+          <m:t>a</m:t>
+        </m:r>
+        <m:r>
+          <m:rPr>
+            <m:sty m:val="p"/>
+          </m:rPr>
+          <m:t>,</m:t>
+        </m:r>
+        <m:r>
+          <m:t>b</m:t>
+        </m:r>
+        <m:r>
+          <m:rPr>
+            <m:sty m:val="p"/>
+          </m:rPr>
+          <m:t>]</m:t>
+        </m:r>
+      </m:oMath>
+      <w:r>
+        <w:t xml:space="preserve"> </w:t>
+      </w:r>
+      <w:r>
+        <w:t xml:space="preserve">equals the difference of</w:t>
+      </w:r>
+      <w:r>
+        <w:t xml:space="preserve"> </w:t>
+      </w:r>
+      <w:r>
+        <w:t xml:space="preserve">any antiderivative’s values at the endpoints (</w:t>
+      </w:r>
+      <w:hyperlink w:anchor="eq-ftc-part2">
+        <w:r>
+          <w:rPr>
+            <w:rStyle w:val="Hyperlink"/>
+          </w:rPr>
+          <w:t xml:space="preserve">Equation 3</w:t>
+        </w:r>
+      </w:hyperlink>
+      <w:r>
         <w:t xml:space="preserve">),</w:t>
       </w:r>
       <w:r>
@@ -18006,7 +19214,7 @@
           <w:rPr>
             <w:rStyle w:val="Hyperlink"/>
           </w:rPr>
-          <w:t xml:space="preserve">Equation 3</w:t>
+          <w:t xml:space="preserve">Equation 4</w:t>
         </w:r>
       </w:hyperlink>
       <w:r>
@@ -18155,7 +19363,7 @@
         <w:t xml:space="preserve">a common situation in applied statistics.</w:t>
       </w:r>
     </w:p>
-    <w:bookmarkStart w:id="81" w:name="exm-ftc-part1-accumulation"/>
+    <w:bookmarkStart w:id="86" w:name="exm-ftc-part1-accumulation"/>
     <w:p>
       <w:pPr>
         <w:pStyle w:val="BodyText"/>
@@ -18864,7 +20072,7 @@
         <w:t xml:space="preserve">).</w:t>
       </w:r>
     </w:p>
-    <w:bookmarkStart w:id="80" w:name="fig-ftc-part1"/>
+    <w:bookmarkStart w:id="85" w:name="fig-ftc-part1"/>
     <w:tbl>
       <w:tblPr>
         <w:tblStyle w:val="Table"/>
@@ -18892,7 +20100,7 @@
             <w:tr>
               <w:tc>
                 <w:tcPr/>
-                <w:bookmarkStart w:id="75" w:name="fig-ftc-part1-left"/>
+                <w:bookmarkStart w:id="80" w:name="fig-ftc-part1-left"/>
                 <w:p>
                   <w:pPr>
                     <w:pStyle w:val="SourceCode"/>
@@ -19732,18 +20940,18 @@
                       <wp:inline>
                         <wp:extent cx="2971800" cy="2377440"/>
                         <wp:effectExtent b="0" l="0" r="0" t="0"/>
-                        <wp:docPr descr="" title="" id="73" name="Picture"/>
+                        <wp:docPr descr="" title="" id="78" name="Picture"/>
                         <a:graphic>
                           <a:graphicData uri="http://schemas.openxmlformats.org/drawingml/2006/picture">
                             <pic:pic>
                               <pic:nvPicPr>
-                                <pic:cNvPr descr="calculus_files/figure-docx/ftc-part1-left-code-1.png" id="74" name="Picture"/>
+                                <pic:cNvPr descr="calculus_files/figure-docx/ftc-part1-left-code-1.png" id="79" name="Picture"/>
                                 <pic:cNvPicPr>
                                   <a:picLocks noChangeArrowheads="1" noChangeAspect="1"/>
                                 </pic:cNvPicPr>
                               </pic:nvPicPr>
                               <pic:blipFill>
-                                <a:blip r:embed="rId72"/>
+                                <a:blip r:embed="rId77"/>
                                 <a:stretch>
                                   <a:fillRect/>
                                 </a:stretch>
@@ -19907,7 +21115,7 @@
                     <w:t xml:space="preserve">.</w:t>
                   </w:r>
                 </w:p>
-                <w:bookmarkEnd w:id="75"/>
+                <w:bookmarkEnd w:id="80"/>
               </w:tc>
             </w:tr>
           </w:tbl>
@@ -19957,7 +21165,7 @@
             <w:tr>
               <w:tc>
                 <w:tcPr/>
-                <w:bookmarkStart w:id="79" w:name="fig-ftc-part1-right"/>
+                <w:bookmarkStart w:id="84" w:name="fig-ftc-part1-right"/>
                 <w:p>
                   <w:pPr>
                     <w:pStyle w:val="SourceCode"/>
@@ -21031,18 +22239,18 @@
                       <wp:inline>
                         <wp:extent cx="2971800" cy="2377440"/>
                         <wp:effectExtent b="0" l="0" r="0" t="0"/>
-                        <wp:docPr descr="" title="" id="77" name="Picture"/>
+                        <wp:docPr descr="" title="" id="82" name="Picture"/>
                         <a:graphic>
                           <a:graphicData uri="http://schemas.openxmlformats.org/drawingml/2006/picture">
                             <pic:pic>
                               <pic:nvPicPr>
-                                <pic:cNvPr descr="calculus_files/figure-docx/ftc-part1-right-code-1.png" id="78" name="Picture"/>
+                                <pic:cNvPr descr="calculus_files/figure-docx/ftc-part1-right-code-1.png" id="83" name="Picture"/>
                                 <pic:cNvPicPr>
                                   <a:picLocks noChangeArrowheads="1" noChangeAspect="1"/>
                                 </pic:cNvPicPr>
                               </pic:nvPicPr>
                               <pic:blipFill>
-                                <a:blip r:embed="rId76"/>
+                                <a:blip r:embed="rId81"/>
                                 <a:stretch>
                                   <a:fillRect/>
                                 </a:stretch>
@@ -21179,7 +22387,7 @@
                     <w:t xml:space="preserve">.</w:t>
                   </w:r>
                 </w:p>
-                <w:bookmarkEnd w:id="79"/>
+                <w:bookmarkEnd w:id="84"/>
               </w:tc>
             </w:tr>
           </w:tbl>
@@ -21462,9 +22670,9 @@
         <w:t xml:space="preserve">.</w:t>
       </w:r>
     </w:p>
-    <w:bookmarkEnd w:id="80"/>
-    <w:bookmarkEnd w:id="81"/>
-    <w:bookmarkStart w:id="94" w:name="exm-ftc-cdf-pdf"/>
+    <w:bookmarkEnd w:id="85"/>
+    <w:bookmarkEnd w:id="86"/>
+    <w:bookmarkStart w:id="99" w:name="exm-ftc-cdf-pdf"/>
     <w:p>
       <w:pPr>
         <w:pStyle w:val="BodyText"/>
@@ -21524,7 +22732,7 @@
           <w:rPr>
             <w:rStyle w:val="Hyperlink"/>
           </w:rPr>
-          <w:t xml:space="preserve">Definition 1</w:t>
+          <w:t xml:space="preserve">Definition 2</w:t>
         </w:r>
       </w:hyperlink>
       <w:r>
@@ -21586,7 +22794,7 @@
       <w:r>
         <w:t xml:space="preserve"> </w:t>
       </w:r>
-      <w:hyperlink r:id="rId82">
+      <w:hyperlink r:id="rId87">
         <w:r>
           <w:rPr>
             <w:rStyle w:val="Hyperlink"/>
@@ -21629,7 +22837,7 @@
       <w:r>
         <w:t xml:space="preserve"> </w:t>
       </w:r>
-      <w:hyperlink r:id="rId83">
+      <w:hyperlink r:id="rId88">
         <w:r>
           <w:rPr>
             <w:rStyle w:val="Hyperlink"/>
@@ -21773,7 +22981,7 @@
       <w:r>
         <w:t xml:space="preserve"> </w:t>
       </w:r>
-      <w:hyperlink r:id="rId84">
+      <w:hyperlink r:id="rId89">
         <w:r>
           <w:rPr>
             <w:rStyle w:val="Hyperlink"/>
@@ -23670,7 +24878,7 @@
         <w:t xml:space="preserve">.</w:t>
       </w:r>
     </w:p>
-    <w:bookmarkStart w:id="93" w:name="fig-exp-pdf-cdf"/>
+    <w:bookmarkStart w:id="98" w:name="fig-exp-pdf-cdf"/>
     <w:tbl>
       <w:tblPr>
         <w:tblStyle w:val="Table"/>
@@ -23698,7 +24906,7 @@
             <w:tr>
               <w:tc>
                 <w:tcPr/>
-                <w:bookmarkStart w:id="88" w:name="fig-exp-pdf-cdf-pdf"/>
+                <w:bookmarkStart w:id="93" w:name="fig-exp-pdf-cdf-pdf"/>
                 <w:p>
                   <w:pPr>
                     <w:pStyle w:val="SourceCode"/>
@@ -24313,18 +25521,18 @@
                       <wp:inline>
                         <wp:extent cx="2971800" cy="2377440"/>
                         <wp:effectExtent b="0" l="0" r="0" t="0"/>
-                        <wp:docPr descr="" title="" id="86" name="Picture"/>
+                        <wp:docPr descr="" title="" id="91" name="Picture"/>
                         <a:graphic>
                           <a:graphicData uri="http://schemas.openxmlformats.org/drawingml/2006/picture">
                             <pic:pic>
                               <pic:nvPicPr>
-                                <pic:cNvPr descr="calculus_files/figure-docx/exp-pdf-cdf-pdf-code-1.png" id="87" name="Picture"/>
+                                <pic:cNvPr descr="calculus_files/figure-docx/exp-pdf-cdf-pdf-code-1.png" id="92" name="Picture"/>
                                 <pic:cNvPicPr>
                                   <a:picLocks noChangeArrowheads="1" noChangeAspect="1"/>
                                 </pic:cNvPicPr>
                               </pic:nvPicPr>
                               <pic:blipFill>
-                                <a:blip r:embed="rId85"/>
+                                <a:blip r:embed="rId90"/>
                                 <a:stretch>
                                   <a:fillRect/>
                                 </a:stretch>
@@ -24420,7 +25628,7 @@
                     <w:t xml:space="preserve">.</w:t>
                   </w:r>
                 </w:p>
-                <w:bookmarkEnd w:id="88"/>
+                <w:bookmarkEnd w:id="93"/>
               </w:tc>
             </w:tr>
           </w:tbl>
@@ -24470,7 +25678,7 @@
             <w:tr>
               <w:tc>
                 <w:tcPr/>
-                <w:bookmarkStart w:id="92" w:name="fig-exp-pdf-cdf-cdf"/>
+                <w:bookmarkStart w:id="97" w:name="fig-exp-pdf-cdf-cdf"/>
                 <w:p>
                   <w:pPr>
                     <w:pStyle w:val="SourceCode"/>
@@ -25316,18 +26524,18 @@
                       <wp:inline>
                         <wp:extent cx="2971800" cy="2377440"/>
                         <wp:effectExtent b="0" l="0" r="0" t="0"/>
-                        <wp:docPr descr="" title="" id="90" name="Picture"/>
+                        <wp:docPr descr="" title="" id="95" name="Picture"/>
                         <a:graphic>
                           <a:graphicData uri="http://schemas.openxmlformats.org/drawingml/2006/picture">
                             <pic:pic>
                               <pic:nvPicPr>
-                                <pic:cNvPr descr="calculus_files/figure-docx/exp-pdf-cdf-cdf-code-1.png" id="91" name="Picture"/>
+                                <pic:cNvPr descr="calculus_files/figure-docx/exp-pdf-cdf-cdf-code-1.png" id="96" name="Picture"/>
                                 <pic:cNvPicPr>
                                   <a:picLocks noChangeArrowheads="1" noChangeAspect="1"/>
                                 </pic:cNvPicPr>
                               </pic:nvPicPr>
                               <pic:blipFill>
-                                <a:blip r:embed="rId89"/>
+                                <a:blip r:embed="rId94"/>
                                 <a:stretch>
                                   <a:fillRect/>
                                 </a:stretch>
@@ -25423,7 +26631,7 @@
                     <w:t xml:space="preserve">.</w:t>
                   </w:r>
                 </w:p>
-                <w:bookmarkEnd w:id="92"/>
+                <w:bookmarkEnd w:id="97"/>
               </w:tc>
             </w:tr>
           </w:tbl>
@@ -25693,11 +26901,11 @@
         <w:t xml:space="preserve">computed via FTC Part 2.</w:t>
       </w:r>
     </w:p>
-    <w:bookmarkEnd w:id="93"/>
-    <w:bookmarkEnd w:id="94"/>
-    <w:bookmarkEnd w:id="95"/>
-    <w:bookmarkEnd w:id="96"/>
-    <w:bookmarkStart w:id="120" w:name="sec-double-integrals"/>
+    <w:bookmarkEnd w:id="98"/>
+    <w:bookmarkEnd w:id="99"/>
+    <w:bookmarkEnd w:id="100"/>
+    <w:bookmarkEnd w:id="101"/>
+    <w:bookmarkStart w:id="125" w:name="sec-double-integrals"/>
     <w:p>
       <w:pPr>
         <w:pStyle w:val="Heading2"/>
@@ -25801,7 +27009,7 @@
       <w:r>
         <w:t xml:space="preserve"> </w:t>
       </w:r>
-      <w:hyperlink r:id="rId97">
+      <w:hyperlink r:id="rId102">
         <w:r>
           <w:rPr>
             <w:rStyle w:val="Hyperlink"/>
@@ -25832,7 +27040,7 @@
         <w:t xml:space="preserve">follow from a stated theorem rather than from an aside.</w:t>
       </w:r>
     </w:p>
-    <w:bookmarkStart w:id="98" w:name="def-double-integral"/>
+    <w:bookmarkStart w:id="103" w:name="def-double-integral"/>
     <w:p>
       <w:pPr>
         <w:pStyle w:val="BodyText"/>
@@ -25842,7 +27050,7 @@
           <w:b/>
           <w:bCs/>
         </w:rPr>
-        <w:t xml:space="preserve">Definition 12 (Double integral)</w:t>
+        <w:t xml:space="preserve">Definition 13 (Double integral)</w:t>
       </w:r>
       <w:r>
         <w:t xml:space="preserve"> </w:t>
@@ -26485,7 +27693,7 @@
         <w:t xml:space="preserve">(Larson and Edwards 2018, sec. 14.2)</w:t>
       </w:r>
     </w:p>
-    <w:bookmarkEnd w:id="98"/>
+    <w:bookmarkEnd w:id="103"/>
     <w:p>
       <w:pPr>
         <w:pStyle w:val="BodyText"/>
@@ -26766,7 +27974,7 @@
         <w:t xml:space="preserve">) fixed.</w:t>
       </w:r>
     </w:p>
-    <w:bookmarkStart w:id="99" w:name="exm-double-integral-area"/>
+    <w:bookmarkStart w:id="104" w:name="exm-double-integral-area"/>
     <w:p>
       <w:pPr>
         <w:pStyle w:val="BodyText"/>
@@ -26942,7 +28150,7 @@
           <w:rPr>
             <w:rStyle w:val="Hyperlink"/>
           </w:rPr>
-          <w:t xml:space="preserve">Definition 12</w:t>
+          <w:t xml:space="preserve">Definition 13</w:t>
         </w:r>
       </w:hyperlink>
       <w:r>
@@ -27056,8 +28264,8 @@
         <w:t xml:space="preserve">.</w:t>
       </w:r>
     </w:p>
-    <w:bookmarkEnd w:id="99"/>
-    <w:bookmarkStart w:id="100" w:name="thm-fubini"/>
+    <w:bookmarkEnd w:id="104"/>
+    <w:bookmarkStart w:id="105" w:name="thm-fubini"/>
     <w:p>
       <w:pPr>
         <w:pStyle w:val="BodyText"/>
@@ -27143,7 +28351,7 @@
       <w:pPr>
         <w:numPr>
           <w:ilvl w:val="0"/>
-          <w:numId w:val="1004"/>
+          <w:numId w:val="1005"/>
         </w:numPr>
       </w:pPr>
       <w:r>
@@ -27591,7 +28799,7 @@
       <w:pPr>
         <w:numPr>
           <w:ilvl w:val="0"/>
-          <w:numId w:val="1004"/>
+          <w:numId w:val="1005"/>
         </w:numPr>
       </w:pPr>
       <w:r>
@@ -28071,8 +29279,8 @@
         <w:t xml:space="preserve">(Larson and Edwards 2018, Theorem 14.2, p. 982)</w:t>
       </w:r>
     </w:p>
-    <w:bookmarkEnd w:id="100"/>
-    <w:bookmarkStart w:id="107" w:name="exm-fubini-nonrect"/>
+    <w:bookmarkEnd w:id="105"/>
+    <w:bookmarkStart w:id="112" w:name="exm-fubini-nonrect"/>
     <w:p>
       <w:pPr>
         <w:pStyle w:val="BodyText"/>
@@ -28173,7 +29381,7 @@
       <w:r>
         <w:t xml:space="preserve"> </w:t>
       </w:r>
-      <w:hyperlink r:id="rId82">
+      <w:hyperlink r:id="rId87">
         <w:r>
           <w:rPr>
             <w:rStyle w:val="Hyperlink"/>
@@ -28193,7 +29401,7 @@
       <w:r>
         <w:t xml:space="preserve"> </w:t>
       </w:r>
-      <w:hyperlink r:id="rId83">
+      <w:hyperlink r:id="rId88">
         <w:r>
           <w:rPr>
             <w:rStyle w:val="Hyperlink"/>
@@ -28414,7 +29622,7 @@
       <w:r>
         <w:t xml:space="preserve"> </w:t>
       </w:r>
-      <w:hyperlink r:id="rId101">
+      <w:hyperlink r:id="rId106">
         <w:r>
           <w:rPr>
             <w:rStyle w:val="Hyperlink"/>
@@ -29217,7 +30425,7 @@
       <w:tr>
         <w:tc>
           <w:tcPr/>
-          <w:bookmarkStart w:id="105" w:name="fig-fubini-nonrect-region"/>
+          <w:bookmarkStart w:id="110" w:name="fig-fubini-nonrect-region"/>
           <w:p>
             <w:pPr>
               <w:pStyle w:val="SourceCode"/>
@@ -30766,18 +31974,18 @@
                 <wp:inline>
                   <wp:extent cx="4620126" cy="3696101"/>
                   <wp:effectExtent b="0" l="0" r="0" t="0"/>
-                  <wp:docPr descr="" title="" id="103" name="Picture"/>
+                  <wp:docPr descr="" title="" id="108" name="Picture"/>
                   <a:graphic>
                     <a:graphicData uri="http://schemas.openxmlformats.org/drawingml/2006/picture">
                       <pic:pic>
                         <pic:nvPicPr>
-                          <pic:cNvPr descr="calculus_files/figure-docx/unnamed-chunk-1-1.png" id="104" name="Picture"/>
+                          <pic:cNvPr descr="calculus_files/figure-docx/unnamed-chunk-5-1.png" id="109" name="Picture"/>
                           <pic:cNvPicPr>
                             <a:picLocks noChangeArrowheads="1" noChangeAspect="1"/>
                           </pic:cNvPicPr>
                         </pic:nvPicPr>
                         <pic:blipFill>
-                          <a:blip r:embed="rId102"/>
+                          <a:blip r:embed="rId107"/>
                           <a:stretch>
                             <a:fillRect/>
                           </a:stretch>
@@ -31017,7 +32225,7 @@
               <w:t xml:space="preserve">.</w:t>
             </w:r>
           </w:p>
-          <w:bookmarkEnd w:id="105"/>
+          <w:bookmarkEnd w:id="110"/>
         </w:tc>
       </w:tr>
     </w:tbl>
@@ -33374,7 +34582,7 @@
       <w:tr>
         <w:tc>
           <w:tcPr/>
-          <w:bookmarkStart w:id="106" w:name="fig-fubini-nonrect"/>
+          <w:bookmarkStart w:id="111" w:name="fig-fubini-nonrect"/>
           <w:p>
             <w:pPr>
               <w:pStyle w:val="Compact"/>
@@ -33721,12 +34929,12 @@
               <w:t xml:space="preserve">.</w:t>
             </w:r>
           </w:p>
-          <w:bookmarkEnd w:id="106"/>
+          <w:bookmarkEnd w:id="111"/>
         </w:tc>
       </w:tr>
     </w:tbl>
-    <w:bookmarkEnd w:id="107"/>
-    <w:bookmarkStart w:id="109" w:name="exm-fubini-fail"/>
+    <w:bookmarkEnd w:id="112"/>
+    <w:bookmarkStart w:id="114" w:name="exm-fubini-fail"/>
     <w:p>
       <w:pPr>
         <w:pStyle w:val="BodyText"/>
@@ -35786,7 +36994,7 @@
       <w:tr>
         <w:tc>
           <w:tcPr/>
-          <w:bookmarkStart w:id="108" w:name="fig-fubini-fail"/>
+          <w:bookmarkStart w:id="113" w:name="fig-fubini-fail"/>
           <w:p>
             <w:pPr>
               <w:pStyle w:val="Compact"/>
@@ -36338,12 +37546,12 @@
               <w:t xml:space="preserve">does not apply.</w:t>
             </w:r>
           </w:p>
-          <w:bookmarkEnd w:id="108"/>
+          <w:bookmarkEnd w:id="113"/>
         </w:tc>
       </w:tr>
     </w:tbl>
-    <w:bookmarkEnd w:id="109"/>
-    <w:bookmarkStart w:id="110" w:name="cor-fubini-rect"/>
+    <w:bookmarkEnd w:id="114"/>
+    <w:bookmarkStart w:id="115" w:name="cor-fubini-rect"/>
     <w:p>
       <w:pPr>
         <w:pStyle w:val="BodyText"/>
@@ -36916,7 +38124,7 @@
         <w:t xml:space="preserve">(Larson and Edwards 2018, Theorem 14.2, p. 982)</w:t>
       </w:r>
     </w:p>
-    <w:bookmarkEnd w:id="110"/>
+    <w:bookmarkEnd w:id="115"/>
     <w:p>
       <w:pPr>
         <w:pStyle w:val="BodyText"/>
@@ -37171,7 +38379,7 @@
         <w:t xml:space="preserve">two iterated forms shown.</w:t>
       </w:r>
     </w:p>
-    <w:bookmarkStart w:id="116" w:name="exm-fubini-rect"/>
+    <w:bookmarkStart w:id="121" w:name="exm-fubini-rect"/>
     <w:p>
       <w:pPr>
         <w:pStyle w:val="BodyText"/>
@@ -37450,7 +38658,7 @@
       <w:r>
         <w:t xml:space="preserve"> </w:t>
       </w:r>
-      <w:hyperlink r:id="rId82">
+      <w:hyperlink r:id="rId87">
         <w:r>
           <w:rPr>
             <w:rStyle w:val="Hyperlink"/>
@@ -37470,7 +38678,7 @@
       <w:r>
         <w:t xml:space="preserve"> </w:t>
       </w:r>
-      <w:hyperlink r:id="rId83">
+      <w:hyperlink r:id="rId88">
         <w:r>
           <w:rPr>
             <w:rStyle w:val="Hyperlink"/>
@@ -37759,7 +38967,7 @@
       <w:r>
         <w:t xml:space="preserve"> </w:t>
       </w:r>
-      <w:hyperlink r:id="rId101">
+      <w:hyperlink r:id="rId106">
         <w:r>
           <w:rPr>
             <w:rStyle w:val="Hyperlink"/>
@@ -38050,7 +39258,7 @@
       <w:tr>
         <w:tc>
           <w:tcPr/>
-          <w:bookmarkStart w:id="114" w:name="fig-fubini-rect-region"/>
+          <w:bookmarkStart w:id="119" w:name="fig-fubini-rect-region"/>
           <w:p>
             <w:pPr>
               <w:pStyle w:val="SourceCode"/>
@@ -38942,18 +40150,18 @@
                 <wp:inline>
                   <wp:extent cx="4620126" cy="3696101"/>
                   <wp:effectExtent b="0" l="0" r="0" t="0"/>
-                  <wp:docPr descr="" title="" id="112" name="Picture"/>
+                  <wp:docPr descr="" title="" id="117" name="Picture"/>
                   <a:graphic>
                     <a:graphicData uri="http://schemas.openxmlformats.org/drawingml/2006/picture">
                       <pic:pic>
                         <pic:nvPicPr>
-                          <pic:cNvPr descr="calculus_files/figure-docx/unnamed-chunk-6-1.png" id="113" name="Picture"/>
+                          <pic:cNvPr descr="calculus_files/figure-docx/unnamed-chunk-10-1.png" id="118" name="Picture"/>
                           <pic:cNvPicPr>
                             <a:picLocks noChangeArrowheads="1" noChangeAspect="1"/>
                           </pic:cNvPicPr>
                         </pic:nvPicPr>
                         <pic:blipFill>
-                          <a:blip r:embed="rId111"/>
+                          <a:blip r:embed="rId116"/>
                           <a:stretch>
                             <a:fillRect/>
                           </a:stretch>
@@ -39043,7 +40251,7 @@
               <w:t xml:space="preserve">, the unit square.</w:t>
             </w:r>
           </w:p>
-          <w:bookmarkEnd w:id="114"/>
+          <w:bookmarkEnd w:id="119"/>
         </w:tc>
       </w:tr>
     </w:tbl>
@@ -40675,7 +41883,7 @@
       <w:tr>
         <w:tc>
           <w:tcPr/>
-          <w:bookmarkStart w:id="115" w:name="fig-fubini-rect"/>
+          <w:bookmarkStart w:id="120" w:name="fig-fubini-rect"/>
           <w:p>
             <w:pPr>
               <w:pStyle w:val="Compact"/>
@@ -40899,12 +42107,12 @@
               <w:t xml:space="preserve">.</w:t>
             </w:r>
           </w:p>
-          <w:bookmarkEnd w:id="115"/>
+          <w:bookmarkEnd w:id="120"/>
         </w:tc>
       </w:tr>
     </w:tbl>
-    <w:bookmarkEnd w:id="116"/>
-    <w:bookmarkStart w:id="117" w:name="thm-fubini-tonelli"/>
+    <w:bookmarkEnd w:id="121"/>
+    <w:bookmarkStart w:id="122" w:name="thm-fubini-tonelli"/>
     <w:p>
       <w:pPr>
         <w:pStyle w:val="BodyText"/>
@@ -41248,7 +42456,7 @@
       <w:pPr>
         <w:numPr>
           <w:ilvl w:val="0"/>
-          <w:numId w:val="1005"/>
+          <w:numId w:val="1006"/>
         </w:numPr>
       </w:pPr>
       <m:oMath>
@@ -41327,7 +42535,7 @@
       <w:pPr>
         <w:numPr>
           <w:ilvl w:val="0"/>
-          <w:numId w:val="1005"/>
+          <w:numId w:val="1006"/>
         </w:numPr>
       </w:pPr>
       <m:oMath>
@@ -42067,7 +43275,7 @@
         <w:t xml:space="preserve">(Billingsley 1995, Theorem 18.3; Gut 2013, Theorem 9.1, p. 65; Fubini 1907; Wikipedia contributors 2024)</w:t>
       </w:r>
     </w:p>
-    <w:bookmarkEnd w:id="117"/>
+    <w:bookmarkEnd w:id="122"/>
     <w:p>
       <w:pPr>
         <w:pStyle w:val="BodyText"/>
@@ -42084,7 +43292,7 @@
       <w:r>
         <w:t xml:space="preserve"> </w:t>
       </w:r>
-      <w:hyperlink r:id="rId97">
+      <w:hyperlink r:id="rId102">
         <w:r>
           <w:rPr>
             <w:rStyle w:val="Hyperlink"/>
@@ -42158,7 +43366,7 @@
         <w:t xml:space="preserve">in each application.</w:t>
       </w:r>
     </w:p>
-    <w:bookmarkStart w:id="118" w:name="exm-fubini-tonelli-apply"/>
+    <w:bookmarkStart w:id="123" w:name="exm-fubini-tonelli-apply"/>
     <w:p>
       <w:pPr>
         <w:pStyle w:val="BodyText"/>
@@ -42257,7 +43465,7 @@
       <w:r>
         <w:t xml:space="preserve"> </w:t>
       </w:r>
-      <w:hyperlink r:id="rId82">
+      <w:hyperlink r:id="rId87">
         <w:r>
           <w:rPr>
             <w:rStyle w:val="Hyperlink"/>
@@ -42277,7 +43485,7 @@
       <w:r>
         <w:t xml:space="preserve"> </w:t>
       </w:r>
-      <w:hyperlink r:id="rId83">
+      <w:hyperlink r:id="rId88">
         <w:r>
           <w:rPr>
             <w:rStyle w:val="Hyperlink"/>
@@ -45266,8 +46474,8 @@
         <w:t xml:space="preserve">guarantees when condition (a) holds.</w:t>
       </w:r>
     </w:p>
-    <w:bookmarkEnd w:id="118"/>
-    <w:bookmarkStart w:id="119" w:name="exm-fubini-fail-tonelli"/>
+    <w:bookmarkEnd w:id="123"/>
+    <w:bookmarkStart w:id="124" w:name="exm-fubini-fail-tonelli"/>
     <w:p>
       <w:pPr>
         <w:pStyle w:val="BodyText"/>
@@ -46402,9 +47610,9 @@
         <w:t xml:space="preserve">(Wikipedia contributors 2024)</w:t>
       </w:r>
     </w:p>
-    <w:bookmarkEnd w:id="119"/>
-    <w:bookmarkEnd w:id="120"/>
-    <w:bookmarkStart w:id="123" w:name="sec-additional-resources"/>
+    <w:bookmarkEnd w:id="124"/>
+    <w:bookmarkEnd w:id="125"/>
+    <w:bookmarkStart w:id="128" w:name="sec-additional-resources"/>
     <w:p>
       <w:pPr>
         <w:pStyle w:val="Heading2"/>
@@ -46418,7 +47626,7 @@
         <w:pStyle w:val="Compact"/>
         <w:numPr>
           <w:ilvl w:val="0"/>
-          <w:numId w:val="1006"/>
+          <w:numId w:val="1007"/>
         </w:numPr>
       </w:pPr>
       <w:r>
@@ -46430,7 +47638,7 @@
         <w:pStyle w:val="Compact"/>
         <w:numPr>
           <w:ilvl w:val="0"/>
-          <w:numId w:val="1006"/>
+          <w:numId w:val="1007"/>
         </w:numPr>
       </w:pPr>
       <w:r>
@@ -46442,7 +47650,7 @@
         <w:pStyle w:val="Compact"/>
         <w:numPr>
           <w:ilvl w:val="0"/>
-          <w:numId w:val="1006"/>
+          <w:numId w:val="1007"/>
         </w:numPr>
       </w:pPr>
       <w:r>
@@ -46454,7 +47662,7 @@
         <w:pStyle w:val="Compact"/>
         <w:numPr>
           <w:ilvl w:val="0"/>
-          <w:numId w:val="1006"/>
+          <w:numId w:val="1007"/>
         </w:numPr>
       </w:pPr>
       <w:r>
@@ -46466,7 +47674,7 @@
         <w:pStyle w:val="Compact"/>
         <w:numPr>
           <w:ilvl w:val="0"/>
-          <w:numId w:val="1006"/>
+          <w:numId w:val="1007"/>
         </w:numPr>
       </w:pPr>
       <w:r>
@@ -46478,10 +47686,10 @@
         <w:pStyle w:val="Compact"/>
         <w:numPr>
           <w:ilvl w:val="1"/>
-          <w:numId w:val="1007"/>
+          <w:numId w:val="1008"/>
         </w:numPr>
       </w:pPr>
-      <w:hyperlink r:id="rId121">
+      <w:hyperlink r:id="rId126">
         <w:r>
           <w:rPr>
             <w:rStyle w:val="Hyperlink"/>
@@ -46495,10 +47703,10 @@
         <w:pStyle w:val="Compact"/>
         <w:numPr>
           <w:ilvl w:val="1"/>
-          <w:numId w:val="1007"/>
+          <w:numId w:val="1008"/>
         </w:numPr>
       </w:pPr>
-      <w:hyperlink r:id="rId122">
+      <w:hyperlink r:id="rId127">
         <w:r>
           <w:rPr>
             <w:rStyle w:val="Hyperlink"/>
@@ -46512,7 +47720,7 @@
         <w:pStyle w:val="Compact"/>
         <w:numPr>
           <w:ilvl w:val="0"/>
-          <w:numId w:val="1006"/>
+          <w:numId w:val="1007"/>
         </w:numPr>
       </w:pPr>
       <w:r>
@@ -46525,8 +47733,8 @@
         <w:t xml:space="preserve">(the rigorous foundations behind these results)</w:t>
       </w:r>
     </w:p>
-    <w:bookmarkEnd w:id="123"/>
-    <w:bookmarkStart w:id="146" w:name="references"/>
+    <w:bookmarkEnd w:id="128"/>
+    <w:bookmarkStart w:id="151" w:name="references"/>
     <w:p>
       <w:pPr>
         <w:pStyle w:val="Heading2"/>
@@ -46535,8 +47743,8 @@
         <w:t xml:space="preserve">References</w:t>
       </w:r>
     </w:p>
-    <w:bookmarkStart w:id="145" w:name="refs"/>
-    <w:bookmarkStart w:id="125" w:name="ref-calclifesaver"/>
+    <w:bookmarkStart w:id="150" w:name="refs"/>
+    <w:bookmarkStart w:id="130" w:name="ref-calclifesaver"/>
     <w:p>
       <w:pPr>
         <w:pStyle w:val="Bibliography"/>
@@ -46560,7 +47768,7 @@
       <w:r>
         <w:t xml:space="preserve"> </w:t>
       </w:r>
-      <w:hyperlink r:id="rId124">
+      <w:hyperlink r:id="rId129">
         <w:r>
           <w:rPr>
             <w:rStyle w:val="Hyperlink"/>
@@ -46572,8 +47780,8 @@
         <w:t xml:space="preserve">.</w:t>
       </w:r>
     </w:p>
-    <w:bookmarkEnd w:id="125"/>
-    <w:bookmarkStart w:id="126" w:name="ref-billingsley1995probability"/>
+    <w:bookmarkEnd w:id="130"/>
+    <w:bookmarkStart w:id="131" w:name="ref-billingsley1995probability"/>
     <w:p>
       <w:pPr>
         <w:pStyle w:val="Bibliography"/>
@@ -46595,8 +47803,8 @@
         <w:t xml:space="preserve">. 3rd ed. Wiley Series in Probability and Mathematical Statistics. Wiley.</w:t>
       </w:r>
     </w:p>
-    <w:bookmarkEnd w:id="126"/>
-    <w:bookmarkStart w:id="127" w:name="ref-fubini1907"/>
+    <w:bookmarkEnd w:id="131"/>
+    <w:bookmarkStart w:id="132" w:name="ref-fubini1907"/>
     <w:p>
       <w:pPr>
         <w:pStyle w:val="Bibliography"/>
@@ -46627,8 +47835,8 @@
         <w:t xml:space="preserve">16: 608–14.</w:t>
       </w:r>
     </w:p>
-    <w:bookmarkEnd w:id="127"/>
-    <w:bookmarkStart w:id="129" w:name="ref-realanalysislifesaver"/>
+    <w:bookmarkEnd w:id="132"/>
+    <w:bookmarkStart w:id="134" w:name="ref-realanalysislifesaver"/>
     <w:p>
       <w:pPr>
         <w:pStyle w:val="Bibliography"/>
@@ -46652,7 +47860,7 @@
       <w:r>
         <w:t xml:space="preserve"> </w:t>
       </w:r>
-      <w:hyperlink r:id="rId128">
+      <w:hyperlink r:id="rId133">
         <w:r>
           <w:rPr>
             <w:rStyle w:val="Hyperlink"/>
@@ -46664,8 +47872,8 @@
         <w:t xml:space="preserve">.</w:t>
       </w:r>
     </w:p>
-    <w:bookmarkEnd w:id="129"/>
-    <w:bookmarkStart w:id="131" w:name="ref-gut2013"/>
+    <w:bookmarkEnd w:id="134"/>
+    <w:bookmarkStart w:id="136" w:name="ref-gut2013"/>
     <w:p>
       <w:pPr>
         <w:pStyle w:val="Bibliography"/>
@@ -46689,7 +47897,7 @@
       <w:r>
         <w:t xml:space="preserve"> </w:t>
       </w:r>
-      <w:hyperlink r:id="rId130">
+      <w:hyperlink r:id="rId135">
         <w:r>
           <w:rPr>
             <w:rStyle w:val="Hyperlink"/>
@@ -46701,8 +47909,8 @@
         <w:t xml:space="preserve">.</w:t>
       </w:r>
     </w:p>
-    <w:bookmarkEnd w:id="131"/>
-    <w:bookmarkStart w:id="133" w:name="ref-mosaiccalc"/>
+    <w:bookmarkEnd w:id="136"/>
+    <w:bookmarkStart w:id="138" w:name="ref-mosaiccalc"/>
     <w:p>
       <w:pPr>
         <w:pStyle w:val="Bibliography"/>
@@ -46726,7 +47934,7 @@
       <w:r>
         <w:t xml:space="preserve"> </w:t>
       </w:r>
-      <w:hyperlink r:id="rId132">
+      <w:hyperlink r:id="rId137">
         <w:r>
           <w:rPr>
             <w:rStyle w:val="Hyperlink"/>
@@ -46738,8 +47946,8 @@
         <w:t xml:space="preserve">.</w:t>
       </w:r>
     </w:p>
-    <w:bookmarkEnd w:id="133"/>
-    <w:bookmarkStart w:id="135" w:name="ref-khuri2003advanced"/>
+    <w:bookmarkEnd w:id="138"/>
+    <w:bookmarkStart w:id="140" w:name="ref-khuri2003advanced"/>
     <w:p>
       <w:pPr>
         <w:pStyle w:val="Bibliography"/>
@@ -46763,7 +47971,7 @@
       <w:r>
         <w:t xml:space="preserve"> </w:t>
       </w:r>
-      <w:hyperlink r:id="rId134">
+      <w:hyperlink r:id="rId139">
         <w:r>
           <w:rPr>
             <w:rStyle w:val="Hyperlink"/>
@@ -46775,8 +47983,8 @@
         <w:t xml:space="preserve">.</w:t>
       </w:r>
     </w:p>
-    <w:bookmarkEnd w:id="135"/>
-    <w:bookmarkStart w:id="137" w:name="ref-kleinbaum2012survival"/>
+    <w:bookmarkEnd w:id="140"/>
+    <w:bookmarkStart w:id="142" w:name="ref-kleinbaum2012survival"/>
     <w:p>
       <w:pPr>
         <w:pStyle w:val="Bibliography"/>
@@ -46800,7 +48008,7 @@
       <w:r>
         <w:t xml:space="preserve"> </w:t>
       </w:r>
-      <w:hyperlink r:id="rId136">
+      <w:hyperlink r:id="rId141">
         <w:r>
           <w:rPr>
             <w:rStyle w:val="Hyperlink"/>
@@ -46812,8 +48020,8 @@
         <w:t xml:space="preserve">.</w:t>
       </w:r>
     </w:p>
-    <w:bookmarkEnd w:id="137"/>
-    <w:bookmarkStart w:id="139" w:name="ref-larsonCalc11e"/>
+    <w:bookmarkEnd w:id="142"/>
+    <w:bookmarkStart w:id="144" w:name="ref-larsonCalc11e"/>
     <w:p>
       <w:pPr>
         <w:pStyle w:val="Bibliography"/>
@@ -46837,7 +48045,7 @@
       <w:r>
         <w:t xml:space="preserve"> </w:t>
       </w:r>
-      <w:hyperlink r:id="rId138">
+      <w:hyperlink r:id="rId143">
         <w:r>
           <w:rPr>
             <w:rStyle w:val="Hyperlink"/>
@@ -46849,8 +48057,8 @@
         <w:t xml:space="preserve">.</w:t>
       </w:r>
     </w:p>
-    <w:bookmarkEnd w:id="139"/>
-    <w:bookmarkStart w:id="141" w:name="ref-problifesavercalc"/>
+    <w:bookmarkEnd w:id="144"/>
+    <w:bookmarkStart w:id="146" w:name="ref-problifesavercalc"/>
     <w:p>
       <w:pPr>
         <w:pStyle w:val="Bibliography"/>
@@ -46874,7 +48082,7 @@
       <w:r>
         <w:t xml:space="preserve"> </w:t>
       </w:r>
-      <w:hyperlink r:id="rId140">
+      <w:hyperlink r:id="rId145">
         <w:r>
           <w:rPr>
             <w:rStyle w:val="Hyperlink"/>
@@ -46886,8 +48094,8 @@
         <w:t xml:space="preserve">.</w:t>
       </w:r>
     </w:p>
-    <w:bookmarkEnd w:id="141"/>
-    <w:bookmarkStart w:id="142" w:name="ref-rudin1976principles"/>
+    <w:bookmarkEnd w:id="146"/>
+    <w:bookmarkStart w:id="147" w:name="ref-rudin1976principles"/>
     <w:p>
       <w:pPr>
         <w:pStyle w:val="Bibliography"/>
@@ -46909,8 +48117,8 @@
         <w:t xml:space="preserve">. 3rd ed. International Series in Pure and Applied Mathematics. McGraw-Hill.</w:t>
       </w:r>
     </w:p>
-    <w:bookmarkEnd w:id="142"/>
-    <w:bookmarkStart w:id="144" w:name="ref-wp:fubini"/>
+    <w:bookmarkEnd w:id="147"/>
+    <w:bookmarkStart w:id="149" w:name="ref-wp:fubini"/>
     <w:p>
       <w:pPr>
         <w:pStyle w:val="Bibliography"/>
@@ -46969,7 +48177,7 @@
       <w:r>
         <w:t xml:space="preserve"> </w:t>
       </w:r>
-      <w:hyperlink r:id="rId143">
+      <w:hyperlink r:id="rId148">
         <w:r>
           <w:rPr>
             <w:rStyle w:val="Hyperlink"/>
@@ -46981,9 +48189,9 @@
         <w:t xml:space="preserve">.</w:t>
       </w:r>
     </w:p>
-    <w:bookmarkEnd w:id="144"/>
-    <w:bookmarkEnd w:id="145"/>
-    <w:bookmarkEnd w:id="146"/>
+    <w:bookmarkEnd w:id="149"/>
+    <w:bookmarkEnd w:id="150"/>
+    <w:bookmarkEnd w:id="151"/>
     <w:sectPr>
       <w:footnotePr>
         <w:numRestart w:val="eachSect"/>
@@ -47431,9 +48639,6 @@
     </w:lvlOverride>
   </w:num>
   <w:num w:numId="1003">
-    <w:abstractNumId w:val="991"/>
-  </w:num>
-  <w:num w:numId="1004">
     <w:abstractNumId w:val="99411"/>
     <w:lvlOverride w:ilvl="0">
       <w:startOverride w:val="1"/>
@@ -47463,7 +48668,40 @@
       <w:startOverride w:val="1"/>
     </w:lvlOverride>
   </w:num>
+  <w:num w:numId="1004">
+    <w:abstractNumId w:val="991"/>
+  </w:num>
   <w:num w:numId="1005">
+    <w:abstractNumId w:val="99411"/>
+    <w:lvlOverride w:ilvl="0">
+      <w:startOverride w:val="1"/>
+    </w:lvlOverride>
+    <w:lvlOverride w:ilvl="1">
+      <w:startOverride w:val="1"/>
+    </w:lvlOverride>
+    <w:lvlOverride w:ilvl="2">
+      <w:startOverride w:val="1"/>
+    </w:lvlOverride>
+    <w:lvlOverride w:ilvl="3">
+      <w:startOverride w:val="1"/>
+    </w:lvlOverride>
+    <w:lvlOverride w:ilvl="4">
+      <w:startOverride w:val="1"/>
+    </w:lvlOverride>
+    <w:lvlOverride w:ilvl="5">
+      <w:startOverride w:val="1"/>
+    </w:lvlOverride>
+    <w:lvlOverride w:ilvl="6">
+      <w:startOverride w:val="1"/>
+    </w:lvlOverride>
+    <w:lvlOverride w:ilvl="7">
+      <w:startOverride w:val="1"/>
+    </w:lvlOverride>
+    <w:lvlOverride w:ilvl="8">
+      <w:startOverride w:val="1"/>
+    </w:lvlOverride>
+  </w:num>
+  <w:num w:numId="1006">
     <w:abstractNumId w:val="99731"/>
     <w:lvlOverride w:ilvl="0">
       <w:startOverride w:val="1"/>
@@ -47493,10 +48731,10 @@
       <w:startOverride w:val="1"/>
     </w:lvlOverride>
   </w:num>
-  <w:num w:numId="1006">
+  <w:num w:numId="1007">
     <w:abstractNumId w:val="991"/>
   </w:num>
-  <w:num w:numId="1007">
+  <w:num w:numId="1008">
     <w:abstractNumId w:val="991"/>
   </w:num>
 </w:numbering>

</xml_diff>

<commit_message>
Deploying to gh-pages from @ Morrison-Lab/mds@266ed75976f97ca2c629508f0992c76a5da5ed35 🚀
</commit_message>
<xml_diff>
--- a/calculus.docx
+++ b/calculus.docx
@@ -15,7 +15,7 @@
         <w:pStyle w:val="Date"/>
       </w:pPr>
       <w:r>
-        <w:t xml:space="preserve">Last modified: 2026-10-03 01:28:45 (PDT)</w:t>
+        <w:t xml:space="preserve">Last modified: 2026-10-03 01:36:11 (PDT)</w:t>
       </w:r>
     </w:p>
     <w:bookmarkStart w:id="24" w:name="sec-derivatives"/>
@@ -26905,7 +26905,7 @@
     <w:bookmarkEnd w:id="99"/>
     <w:bookmarkEnd w:id="100"/>
     <w:bookmarkEnd w:id="101"/>
-    <w:bookmarkStart w:id="125" w:name="sec-double-integrals"/>
+    <w:bookmarkStart w:id="128" w:name="sec-double-integrals"/>
     <w:p>
       <w:pPr>
         <w:pStyle w:val="Heading2"/>
@@ -27684,6 +27684,29 @@
       <w:r>
         <w:t xml:space="preserve">.</w:t>
       </w:r>
+      <w:r>
+        <w:t xml:space="preserve"> </w:t>
+      </w:r>
+      <w:r>
+        <w:t xml:space="preserve">The symbol</w:t>
+      </w:r>
+      <w:r>
+        <w:t xml:space="preserve"> </w:t>
+      </w:r>
+      <m:oMath>
+        <m:r>
+          <m:t>d</m:t>
+        </m:r>
+        <m:r>
+          <m:t>A</m:t>
+        </m:r>
+      </m:oMath>
+      <w:r>
+        <w:t xml:space="preserve"> </w:t>
+      </w:r>
+      <w:r>
+        <w:t xml:space="preserve">stands for an element of area.</w:t>
+      </w:r>
     </w:p>
     <w:p>
       <w:pPr>
@@ -27694,29 +27717,308 @@
       </w:r>
     </w:p>
     <w:bookmarkEnd w:id="103"/>
+    <w:bookmarkStart w:id="104" w:name="exm-double-integral-area"/>
     <w:p>
       <w:pPr>
         <w:pStyle w:val="BodyText"/>
       </w:pPr>
       <w:r>
-        <w:t xml:space="preserve">The symbol</w:t>
-      </w:r>
-      <w:r>
+        <w:rPr>
+          <w:b/>
+          <w:bCs/>
+        </w:rPr>
+        <w:t xml:space="preserve">Example 14 (The double integral of</w:t>
+      </w:r>
+      <w:r>
+        <w:rPr>
+          <w:b/>
+          <w:bCs/>
+        </w:rPr>
         <w:t xml:space="preserve"> </w:t>
       </w:r>
       <m:oMath>
         <m:r>
+          <m:t>1</m:t>
+        </m:r>
+      </m:oMath>
+      <w:r>
+        <w:rPr>
+          <w:b/>
+          <w:bCs/>
+        </w:rPr>
+        <w:t xml:space="preserve"> </w:t>
+      </w:r>
+      <w:r>
+        <w:rPr>
+          <w:b/>
+          <w:bCs/>
+        </w:rPr>
+        <w:t xml:space="preserve">is an area)</w:t>
+      </w:r>
+      <w:r>
+        <w:t xml:space="preserve"> </w:t>
+      </w:r>
+      <w:r>
+        <w:t xml:space="preserve">Let</w:t>
+      </w:r>
+      <w:r>
+        <w:t xml:space="preserve"> </w:t>
+      </w:r>
+      <m:oMath>
+        <m:r>
+          <m:t>f</m:t>
+        </m:r>
+        <m:r>
+          <m:rPr>
+            <m:sty m:val="p"/>
+          </m:rPr>
+          <m:t>(</m:t>
+        </m:r>
+        <m:r>
+          <m:t>x</m:t>
+        </m:r>
+        <m:r>
+          <m:rPr>
+            <m:sty m:val="p"/>
+          </m:rPr>
+          <m:t>,</m:t>
+        </m:r>
+        <m:r>
+          <m:t>y</m:t>
+        </m:r>
+        <m:r>
+          <m:rPr>
+            <m:sty m:val="p"/>
+          </m:rPr>
+          <m:t>)</m:t>
+        </m:r>
+        <m:r>
+          <m:rPr>
+            <m:sty m:val="p"/>
+          </m:rPr>
+          <m:t>=</m:t>
+        </m:r>
+        <m:r>
+          <m:t>1</m:t>
+        </m:r>
+      </m:oMath>
+      <w:r>
+        <w:t xml:space="preserve"> </w:t>
+      </w:r>
+      <w:r>
+        <w:t xml:space="preserve">on the rectangle</w:t>
+      </w:r>
+      <w:r>
+        <w:t xml:space="preserve"> </w:t>
+      </w:r>
+      <m:oMath>
+        <m:r>
+          <m:t>R</m:t>
+        </m:r>
+        <m:r>
+          <m:rPr>
+            <m:sty m:val="p"/>
+          </m:rPr>
+          <m:t>=</m:t>
+        </m:r>
+        <m:r>
+          <m:rPr>
+            <m:sty m:val="p"/>
+          </m:rPr>
+          <m:t>[</m:t>
+        </m:r>
+        <m:r>
+          <m:t>0</m:t>
+        </m:r>
+        <m:r>
+          <m:rPr>
+            <m:sty m:val="p"/>
+          </m:rPr>
+          <m:t>,</m:t>
+        </m:r>
+        <m:r>
+          <m:t>2</m:t>
+        </m:r>
+        <m:r>
+          <m:rPr>
+            <m:sty m:val="p"/>
+          </m:rPr>
+          <m:t>]</m:t>
+        </m:r>
+        <m:r>
+          <m:rPr>
+            <m:sty m:val="p"/>
+          </m:rPr>
+          <m:t>×</m:t>
+        </m:r>
+        <m:r>
+          <m:rPr>
+            <m:sty m:val="p"/>
+          </m:rPr>
+          <m:t>[</m:t>
+        </m:r>
+        <m:r>
+          <m:t>0</m:t>
+        </m:r>
+        <m:r>
+          <m:rPr>
+            <m:sty m:val="p"/>
+          </m:rPr>
+          <m:t>,</m:t>
+        </m:r>
+        <m:r>
+          <m:t>3</m:t>
+        </m:r>
+        <m:r>
+          <m:rPr>
+            <m:sty m:val="p"/>
+          </m:rPr>
+          <m:t>]</m:t>
+        </m:r>
+      </m:oMath>
+      <w:r>
+        <w:t xml:space="preserve">.</w:t>
+      </w:r>
+      <w:r>
+        <w:t xml:space="preserve"> </w:t>
+      </w:r>
+      <w:r>
+        <w:t xml:space="preserve">Every sum in</w:t>
+      </w:r>
+      <w:r>
+        <w:t xml:space="preserve"> </w:t>
+      </w:r>
+      <w:hyperlink w:anchor="def-double-integral">
+        <w:r>
+          <w:rPr>
+            <w:rStyle w:val="Hyperlink"/>
+          </w:rPr>
+          <w:t xml:space="preserve">Definition 13</w:t>
+        </w:r>
+      </w:hyperlink>
+      <w:r>
+        <w:t xml:space="preserve"> </w:t>
+      </w:r>
+      <w:r>
+        <w:t xml:space="preserve">adds up the areas of rectangles inside</w:t>
+      </w:r>
+      <w:r>
+        <w:t xml:space="preserve"> </w:t>
+      </w:r>
+      <m:oMath>
+        <m:r>
+          <m:t>R</m:t>
+        </m:r>
+      </m:oMath>
+      <w:r>
+        <w:t xml:space="preserve">,</w:t>
+      </w:r>
+      <w:r>
+        <w:t xml:space="preserve"> </w:t>
+      </w:r>
+      <w:r>
+        <w:t xml:space="preserve">and those sums approach the area of</w:t>
+      </w:r>
+      <w:r>
+        <w:t xml:space="preserve"> </w:t>
+      </w:r>
+      <m:oMath>
+        <m:r>
+          <m:t>R</m:t>
+        </m:r>
+      </m:oMath>
+      <w:r>
+        <w:t xml:space="preserve"> </w:t>
+      </w:r>
+      <w:r>
+        <w:t xml:space="preserve">as the grid gets finer,</w:t>
+      </w:r>
+      <w:r>
+        <w:t xml:space="preserve"> </w:t>
+      </w:r>
+      <w:r>
+        <w:t xml:space="preserve">so</w:t>
+      </w:r>
+      <w:r>
+        <w:t xml:space="preserve"> </w:t>
+      </w:r>
+      <m:oMath>
+        <m:nary>
+          <m:naryPr>
+            <m:chr m:val="∬"/>
+            <m:limLoc m:val="subSup"/>
+            <m:subHide m:val="off"/>
+            <m:supHide m:val="on"/>
+          </m:naryPr>
+          <m:sub>
+            <m:r>
+              <m:t>R</m:t>
+            </m:r>
+          </m:sub>
+          <m:sup>
+            <m:r>
+              <m:t>​</m:t>
+            </m:r>
+          </m:sup>
+          <m:e>
+            <m:r>
+              <m:t>1</m:t>
+            </m:r>
+          </m:e>
+        </m:nary>
+        <m:r>
+          <m:t> </m:t>
+        </m:r>
+        <m:r>
           <m:t>d</m:t>
         </m:r>
         <m:r>
           <m:t>A</m:t>
         </m:r>
+        <m:r>
+          <m:rPr>
+            <m:sty m:val="p"/>
+          </m:rPr>
+          <m:t>=</m:t>
+        </m:r>
+        <m:r>
+          <m:t>2</m:t>
+        </m:r>
+        <m:r>
+          <m:rPr>
+            <m:sty m:val="p"/>
+          </m:rPr>
+          <m:t>⋅</m:t>
+        </m:r>
+        <m:r>
+          <m:t>3</m:t>
+        </m:r>
+        <m:r>
+          <m:rPr>
+            <m:sty m:val="p"/>
+          </m:rPr>
+          <m:t>=</m:t>
+        </m:r>
+        <m:r>
+          <m:t>6</m:t>
+        </m:r>
       </m:oMath>
       <w:r>
-        <w:t xml:space="preserve"> </w:t>
-      </w:r>
-      <w:r>
-        <w:t xml:space="preserve">stands for an element of area.</w:t>
+        <w:t xml:space="preserve">.</w:t>
+      </w:r>
+    </w:p>
+    <w:bookmarkEnd w:id="104"/>
+    <w:bookmarkStart w:id="105" w:name="def-iterated-integral"/>
+    <w:p>
+      <w:pPr>
+        <w:pStyle w:val="BodyText"/>
+      </w:pPr>
+      <w:r>
+        <w:rPr>
+          <w:b/>
+          <w:bCs/>
+        </w:rPr>
+        <w:t xml:space="preserve">Definition 14 (Iterated integral)</w:t>
       </w:r>
       <w:r>
         <w:t xml:space="preserve"> </w:t>
@@ -27729,8 +28031,8 @@
       </w:r>
       <w:r>
         <w:rPr>
-          <w:i/>
-          <w:iCs/>
+          <w:b/>
+          <w:bCs/>
         </w:rPr>
         <w:t xml:space="preserve">iterated integral</w:t>
       </w:r>
@@ -27738,7 +28040,469 @@
         <w:t xml:space="preserve"> </w:t>
       </w:r>
       <w:r>
-        <w:t xml:space="preserve">such as</w:t>
+        <w:t xml:space="preserve">is an integral of an integral:</w:t>
+      </w:r>
+    </w:p>
+    <w:p>
+      <w:pPr>
+        <w:pStyle w:val="BodyText"/>
+      </w:pPr>
+      <m:oMathPara>
+        <m:oMathParaPr>
+          <m:jc m:val="center"/>
+        </m:oMathParaPr>
+        <m:oMath>
+          <m:nary>
+            <m:naryPr>
+              <m:chr m:val="∫"/>
+              <m:limLoc m:val="subSup"/>
+              <m:subHide m:val="off"/>
+              <m:supHide m:val="off"/>
+            </m:naryPr>
+            <m:sub>
+              <m:r>
+                <m:t>a</m:t>
+              </m:r>
+            </m:sub>
+            <m:sup>
+              <m:r>
+                <m:t>b</m:t>
+              </m:r>
+            </m:sup>
+            <m:e>
+              <m:nary>
+                <m:naryPr>
+                  <m:chr m:val="∫"/>
+                  <m:limLoc m:val="subSup"/>
+                  <m:subHide m:val="off"/>
+                  <m:supHide m:val="off"/>
+                </m:naryPr>
+                <m:sub>
+                  <m:sSub>
+                    <m:e>
+                      <m:r>
+                        <m:t>g</m:t>
+                      </m:r>
+                    </m:e>
+                    <m:sub>
+                      <m:r>
+                        <m:t>1</m:t>
+                      </m:r>
+                    </m:sub>
+                  </m:sSub>
+                  <m:r>
+                    <m:rPr>
+                      <m:sty m:val="p"/>
+                    </m:rPr>
+                    <m:t>(</m:t>
+                  </m:r>
+                  <m:r>
+                    <m:t>x</m:t>
+                  </m:r>
+                  <m:r>
+                    <m:rPr>
+                      <m:sty m:val="p"/>
+                    </m:rPr>
+                    <m:t>)</m:t>
+                  </m:r>
+                </m:sub>
+                <m:sup>
+                  <m:sSub>
+                    <m:e>
+                      <m:r>
+                        <m:t>g</m:t>
+                      </m:r>
+                    </m:e>
+                    <m:sub>
+                      <m:r>
+                        <m:t>2</m:t>
+                      </m:r>
+                    </m:sub>
+                  </m:sSub>
+                  <m:r>
+                    <m:rPr>
+                      <m:sty m:val="p"/>
+                    </m:rPr>
+                    <m:t>(</m:t>
+                  </m:r>
+                  <m:r>
+                    <m:t>x</m:t>
+                  </m:r>
+                  <m:r>
+                    <m:rPr>
+                      <m:sty m:val="p"/>
+                    </m:rPr>
+                    <m:t>)</m:t>
+                  </m:r>
+                </m:sup>
+                <m:e>
+                  <m:r>
+                    <m:t>f</m:t>
+                  </m:r>
+                </m:e>
+              </m:nary>
+            </m:e>
+          </m:nary>
+          <m:r>
+            <m:rPr>
+              <m:sty m:val="p"/>
+            </m:rPr>
+            <m:t>(</m:t>
+          </m:r>
+          <m:r>
+            <m:t>x</m:t>
+          </m:r>
+          <m:r>
+            <m:rPr>
+              <m:sty m:val="p"/>
+            </m:rPr>
+            <m:t>,</m:t>
+          </m:r>
+          <m:r>
+            <m:t>y</m:t>
+          </m:r>
+          <m:r>
+            <m:rPr>
+              <m:sty m:val="p"/>
+            </m:rPr>
+            <m:t>)</m:t>
+          </m:r>
+          <m:r>
+            <m:t> </m:t>
+          </m:r>
+          <m:r>
+            <m:t>d</m:t>
+          </m:r>
+          <m:r>
+            <m:t>y</m:t>
+          </m:r>
+          <m:r>
+            <m:t> </m:t>
+          </m:r>
+          <m:r>
+            <m:t>d</m:t>
+          </m:r>
+          <m:r>
+            <m:t>x</m:t>
+          </m:r>
+          <m:limUpp>
+            <m:e>
+              <m:r>
+                <m:rPr>
+                  <m:sty m:val="p"/>
+                </m:rPr>
+                <m:t>=</m:t>
+              </m:r>
+            </m:e>
+            <m:lim>
+              <m:r>
+                <m:rPr>
+                  <m:nor/>
+                  <m:sty m:val="p"/>
+                </m:rPr>
+                <m:t>def</m:t>
+              </m:r>
+            </m:lim>
+          </m:limUpp>
+          <m:nary>
+            <m:naryPr>
+              <m:chr m:val="∫"/>
+              <m:limLoc m:val="subSup"/>
+              <m:subHide m:val="off"/>
+              <m:supHide m:val="off"/>
+            </m:naryPr>
+            <m:sub>
+              <m:r>
+                <m:t>a</m:t>
+              </m:r>
+            </m:sub>
+            <m:sup>
+              <m:r>
+                <m:t>b</m:t>
+              </m:r>
+            </m:sup>
+            <m:e>
+              <m:r>
+                <m:t>​</m:t>
+              </m:r>
+            </m:e>
+          </m:nary>
+          <m:d>
+            <m:dPr>
+              <m:begChr m:val="("/>
+              <m:sepChr m:val=""/>
+              <m:endChr m:val=")"/>
+              <m:grow/>
+            </m:dPr>
+            <m:e>
+              <m:nary>
+                <m:naryPr>
+                  <m:chr m:val="∫"/>
+                  <m:limLoc m:val="subSup"/>
+                  <m:subHide m:val="off"/>
+                  <m:supHide m:val="off"/>
+                </m:naryPr>
+                <m:sub>
+                  <m:sSub>
+                    <m:e>
+                      <m:r>
+                        <m:t>g</m:t>
+                      </m:r>
+                    </m:e>
+                    <m:sub>
+                      <m:r>
+                        <m:t>1</m:t>
+                      </m:r>
+                    </m:sub>
+                  </m:sSub>
+                  <m:r>
+                    <m:rPr>
+                      <m:sty m:val="p"/>
+                    </m:rPr>
+                    <m:t>(</m:t>
+                  </m:r>
+                  <m:r>
+                    <m:t>x</m:t>
+                  </m:r>
+                  <m:r>
+                    <m:rPr>
+                      <m:sty m:val="p"/>
+                    </m:rPr>
+                    <m:t>)</m:t>
+                  </m:r>
+                </m:sub>
+                <m:sup>
+                  <m:sSub>
+                    <m:e>
+                      <m:r>
+                        <m:t>g</m:t>
+                      </m:r>
+                    </m:e>
+                    <m:sub>
+                      <m:r>
+                        <m:t>2</m:t>
+                      </m:r>
+                    </m:sub>
+                  </m:sSub>
+                  <m:r>
+                    <m:rPr>
+                      <m:sty m:val="p"/>
+                    </m:rPr>
+                    <m:t>(</m:t>
+                  </m:r>
+                  <m:r>
+                    <m:t>x</m:t>
+                  </m:r>
+                  <m:r>
+                    <m:rPr>
+                      <m:sty m:val="p"/>
+                    </m:rPr>
+                    <m:t>)</m:t>
+                  </m:r>
+                </m:sup>
+                <m:e>
+                  <m:r>
+                    <m:t>f</m:t>
+                  </m:r>
+                </m:e>
+              </m:nary>
+              <m:r>
+                <m:rPr>
+                  <m:sty m:val="p"/>
+                </m:rPr>
+                <m:t>(</m:t>
+              </m:r>
+              <m:r>
+                <m:t>x</m:t>
+              </m:r>
+              <m:r>
+                <m:rPr>
+                  <m:sty m:val="p"/>
+                </m:rPr>
+                <m:t>,</m:t>
+              </m:r>
+              <m:r>
+                <m:t>y</m:t>
+              </m:r>
+              <m:r>
+                <m:rPr>
+                  <m:sty m:val="p"/>
+                </m:rPr>
+                <m:t>)</m:t>
+              </m:r>
+              <m:r>
+                <m:t> </m:t>
+              </m:r>
+              <m:r>
+                <m:t>d</m:t>
+              </m:r>
+              <m:r>
+                <m:t>y</m:t>
+              </m:r>
+            </m:e>
+          </m:d>
+          <m:r>
+            <m:t>​</m:t>
+          </m:r>
+          <m:r>
+            <m:t> </m:t>
+          </m:r>
+          <m:r>
+            <m:t>d</m:t>
+          </m:r>
+          <m:r>
+            <m:t>x</m:t>
+          </m:r>
+        </m:oMath>
+      </m:oMathPara>
+    </w:p>
+    <w:p>
+      <w:pPr>
+        <w:pStyle w:val="FirstParagraph"/>
+      </w:pPr>
+      <w:r>
+        <w:t xml:space="preserve">That is, integrate over the inner variable (</w:t>
+      </w:r>
+      <m:oMath>
+        <m:r>
+          <m:t>y</m:t>
+        </m:r>
+      </m:oMath>
+      <w:r>
+        <w:t xml:space="preserve">) first,</w:t>
+      </w:r>
+      <w:r>
+        <w:t xml:space="preserve"> </w:t>
+      </w:r>
+      <w:r>
+        <w:t xml:space="preserve">holding the outer variable (</w:t>
+      </w:r>
+      <m:oMath>
+        <m:r>
+          <m:t>x</m:t>
+        </m:r>
+      </m:oMath>
+      <w:r>
+        <w:t xml:space="preserve">) fixed,</w:t>
+      </w:r>
+      <w:r>
+        <w:t xml:space="preserve"> </w:t>
+      </w:r>
+      <w:r>
+        <w:t xml:space="preserve">and then integrate the result over the outer variable.</w:t>
+      </w:r>
+      <w:r>
+        <w:t xml:space="preserve"> </w:t>
+      </w:r>
+      <w:r>
+        <w:t xml:space="preserve">The inner limits</w:t>
+      </w:r>
+      <w:r>
+        <w:t xml:space="preserve"> </w:t>
+      </w:r>
+      <m:oMath>
+        <m:sSub>
+          <m:e>
+            <m:r>
+              <m:t>g</m:t>
+            </m:r>
+          </m:e>
+          <m:sub>
+            <m:r>
+              <m:t>1</m:t>
+            </m:r>
+          </m:sub>
+        </m:sSub>
+        <m:r>
+          <m:rPr>
+            <m:sty m:val="p"/>
+          </m:rPr>
+          <m:t>(</m:t>
+        </m:r>
+        <m:r>
+          <m:t>x</m:t>
+        </m:r>
+        <m:r>
+          <m:rPr>
+            <m:sty m:val="p"/>
+          </m:rPr>
+          <m:t>)</m:t>
+        </m:r>
+      </m:oMath>
+      <w:r>
+        <w:t xml:space="preserve"> </w:t>
+      </w:r>
+      <w:r>
+        <w:t xml:space="preserve">and</w:t>
+      </w:r>
+      <w:r>
+        <w:t xml:space="preserve"> </w:t>
+      </w:r>
+      <m:oMath>
+        <m:sSub>
+          <m:e>
+            <m:r>
+              <m:t>g</m:t>
+            </m:r>
+          </m:e>
+          <m:sub>
+            <m:r>
+              <m:t>2</m:t>
+            </m:r>
+          </m:sub>
+        </m:sSub>
+        <m:r>
+          <m:rPr>
+            <m:sty m:val="p"/>
+          </m:rPr>
+          <m:t>(</m:t>
+        </m:r>
+        <m:r>
+          <m:t>x</m:t>
+        </m:r>
+        <m:r>
+          <m:rPr>
+            <m:sty m:val="p"/>
+          </m:rPr>
+          <m:t>)</m:t>
+        </m:r>
+      </m:oMath>
+      <w:r>
+        <w:t xml:space="preserve"> </w:t>
+      </w:r>
+      <w:r>
+        <w:t xml:space="preserve">may depend on the outer variable,</w:t>
+      </w:r>
+      <w:r>
+        <w:t xml:space="preserve"> </w:t>
+      </w:r>
+      <w:r>
+        <w:t xml:space="preserve">or be constants</w:t>
+      </w:r>
+      <w:r>
+        <w:t xml:space="preserve"> </w:t>
+      </w:r>
+      <m:oMath>
+        <m:r>
+          <m:t>c</m:t>
+        </m:r>
+      </m:oMath>
+      <w:r>
+        <w:t xml:space="preserve"> </w:t>
+      </w:r>
+      <w:r>
+        <w:t xml:space="preserve">and</w:t>
+      </w:r>
+      <w:r>
+        <w:t xml:space="preserve"> </w:t>
+      </w:r>
+      <m:oMath>
+        <m:r>
+          <m:t>d</m:t>
+        </m:r>
+      </m:oMath>
+      <w:r>
+        <w:t xml:space="preserve">, as in</w:t>
       </w:r>
       <w:r>
         <w:t xml:space="preserve"> </w:t>
@@ -27831,106 +28595,35 @@
         </m:r>
       </m:oMath>
       <w:r>
-        <w:t xml:space="preserve"> </w:t>
-      </w:r>
-      <w:r>
-        <w:t xml:space="preserve">means</w:t>
+        <w:t xml:space="preserve">.</w:t>
+      </w:r>
+      <w:r>
+        <w:t xml:space="preserve"> </w:t>
+      </w:r>
+      <w:r>
+        <w:t xml:space="preserve">Iterated integrals in the other order,</w:t>
       </w:r>
       <w:r>
         <w:t xml:space="preserve"> </w:t>
       </w:r>
       <m:oMath>
-        <m:nary>
-          <m:naryPr>
-            <m:chr m:val="∫"/>
-            <m:limLoc m:val="subSup"/>
-            <m:subHide m:val="off"/>
-            <m:supHide m:val="off"/>
-          </m:naryPr>
-          <m:sub>
-            <m:r>
-              <m:t>a</m:t>
-            </m:r>
-          </m:sub>
-          <m:sup>
-            <m:r>
-              <m:t>b</m:t>
-            </m:r>
-          </m:sup>
-          <m:e>
-            <m:r>
-              <m:t>​</m:t>
-            </m:r>
-          </m:e>
-        </m:nary>
-        <m:d>
-          <m:dPr>
-            <m:begChr m:val="("/>
-            <m:sepChr m:val=""/>
-            <m:endChr m:val=")"/>
-            <m:grow/>
-          </m:dPr>
-          <m:e>
-            <m:nary>
-              <m:naryPr>
-                <m:chr m:val="∫"/>
-                <m:limLoc m:val="subSup"/>
-                <m:subHide m:val="off"/>
-                <m:supHide m:val="off"/>
-              </m:naryPr>
-              <m:sub>
-                <m:r>
-                  <m:t>c</m:t>
-                </m:r>
-              </m:sub>
-              <m:sup>
-                <m:r>
-                  <m:t>d</m:t>
-                </m:r>
-              </m:sup>
-              <m:e>
-                <m:r>
-                  <m:t>f</m:t>
-                </m:r>
-              </m:e>
-            </m:nary>
-            <m:r>
-              <m:rPr>
-                <m:sty m:val="p"/>
-              </m:rPr>
-              <m:t>(</m:t>
-            </m:r>
-            <m:r>
-              <m:t>x</m:t>
-            </m:r>
-            <m:r>
-              <m:rPr>
-                <m:sty m:val="p"/>
-              </m:rPr>
-              <m:t>,</m:t>
-            </m:r>
-            <m:r>
-              <m:t>y</m:t>
-            </m:r>
-            <m:r>
-              <m:rPr>
-                <m:sty m:val="p"/>
-              </m:rPr>
-              <m:t>)</m:t>
-            </m:r>
-            <m:r>
-              <m:t> </m:t>
-            </m:r>
-            <m:r>
-              <m:t>d</m:t>
-            </m:r>
-            <m:r>
-              <m:t>y</m:t>
-            </m:r>
-          </m:e>
-        </m:d>
-        <m:r>
-          <m:t>​</m:t>
+        <m:r>
+          <m:rPr>
+            <m:sty m:val="p"/>
+          </m:rPr>
+          <m:t>∫</m:t>
+        </m:r>
+        <m:r>
+          <m:rPr>
+            <m:sty m:val="p"/>
+          </m:rPr>
+          <m:t>∫</m:t>
+        </m:r>
+        <m:r>
+          <m:rPr>
+            <m:sty m:val="p"/>
+          </m:rPr>
+          <m:t>⋯</m:t>
         </m:r>
         <m:r>
           <m:t> </m:t>
@@ -27941,40 +28634,56 @@
         <m:r>
           <m:t>x</m:t>
         </m:r>
+        <m:r>
+          <m:t> </m:t>
+        </m:r>
+        <m:r>
+          <m:t>d</m:t>
+        </m:r>
+        <m:r>
+          <m:t>y</m:t>
+        </m:r>
       </m:oMath>
       <w:r>
-        <w:t xml:space="preserve">:</w:t>
-      </w:r>
-      <w:r>
-        <w:t xml:space="preserve"> </w:t>
-      </w:r>
-      <w:r>
-        <w:t xml:space="preserve">integrate over the inner variable (</w:t>
+        <w:t xml:space="preserve">,</w:t>
+      </w:r>
+      <w:r>
+        <w:t xml:space="preserve"> </w:t>
+      </w:r>
+      <w:r>
+        <w:t xml:space="preserve">are defined the same way with the roles of</w:t>
+      </w:r>
+      <w:r>
+        <w:t xml:space="preserve"> </w:t>
       </w:r>
       <m:oMath>
         <m:r>
+          <m:t>x</m:t>
+        </m:r>
+      </m:oMath>
+      <w:r>
+        <w:t xml:space="preserve"> </w:t>
+      </w:r>
+      <w:r>
+        <w:t xml:space="preserve">and</w:t>
+      </w:r>
+      <w:r>
+        <w:t xml:space="preserve"> </w:t>
+      </w:r>
+      <m:oMath>
+        <m:r>
           <m:t>y</m:t>
         </m:r>
       </m:oMath>
       <w:r>
-        <w:t xml:space="preserve">) first,</w:t>
-      </w:r>
-      <w:r>
-        <w:t xml:space="preserve"> </w:t>
-      </w:r>
-      <w:r>
-        <w:t xml:space="preserve">holding the outer variable (</w:t>
-      </w:r>
-      <m:oMath>
-        <m:r>
-          <m:t>x</m:t>
-        </m:r>
-      </m:oMath>
-      <w:r>
-        <w:t xml:space="preserve">) fixed.</w:t>
+        <w:t xml:space="preserve"> </w:t>
+      </w:r>
+      <w:r>
+        <w:t xml:space="preserve">swapped.</w:t>
       </w:r>
     </w:p>
-    <w:bookmarkStart w:id="104" w:name="exm-double-integral-area"/>
+    <w:bookmarkEnd w:id="105"/>
+    <w:bookmarkStart w:id="106" w:name="exm-iterated-integral"/>
     <w:p>
       <w:pPr>
         <w:pStyle w:val="BodyText"/>
@@ -27984,291 +28693,672 @@
           <w:b/>
           <w:bCs/>
         </w:rPr>
-        <w:t xml:space="preserve">Example 14 (The double integral of</w:t>
-      </w:r>
-      <w:r>
-        <w:rPr>
-          <w:b/>
-          <w:bCs/>
-        </w:rPr>
+        <w:t xml:space="preserve">Example 15 (An iterated integral)</w:t>
+      </w:r>
+      <w:r>
+        <w:t xml:space="preserve"> </w:t>
+      </w:r>
+      <w:r>
+        <w:t xml:space="preserve">Integrating over</w:t>
+      </w:r>
+      <w:r>
         <w:t xml:space="preserve"> </w:t>
       </w:r>
       <m:oMath>
         <m:r>
-          <m:t>1</m:t>
+          <m:t>y</m:t>
         </m:r>
       </m:oMath>
       <w:r>
-        <w:rPr>
-          <w:b/>
-          <w:bCs/>
-        </w:rPr>
-        <w:t xml:space="preserve"> </w:t>
-      </w:r>
-      <w:r>
-        <w:rPr>
-          <w:b/>
-          <w:bCs/>
-        </w:rPr>
-        <w:t xml:space="preserve">is an area)</w:t>
-      </w:r>
-      <w:r>
-        <w:t xml:space="preserve"> </w:t>
-      </w:r>
-      <w:r>
-        <w:t xml:space="preserve">Let</w:t>
+        <w:t xml:space="preserve"> </w:t>
+      </w:r>
+      <w:r>
+        <w:t xml:space="preserve">first, then</w:t>
       </w:r>
       <w:r>
         <w:t xml:space="preserve"> </w:t>
       </w:r>
       <m:oMath>
         <m:r>
-          <m:t>f</m:t>
-        </m:r>
-        <m:r>
-          <m:rPr>
-            <m:sty m:val="p"/>
-          </m:rPr>
-          <m:t>(</m:t>
-        </m:r>
-        <m:r>
           <m:t>x</m:t>
         </m:r>
-        <m:r>
-          <m:rPr>
-            <m:sty m:val="p"/>
-          </m:rPr>
-          <m:t>,</m:t>
-        </m:r>
-        <m:r>
-          <m:t>y</m:t>
-        </m:r>
-        <m:r>
-          <m:rPr>
-            <m:sty m:val="p"/>
-          </m:rPr>
-          <m:t>)</m:t>
-        </m:r>
-        <m:r>
-          <m:rPr>
-            <m:sty m:val="p"/>
-          </m:rPr>
-          <m:t>=</m:t>
-        </m:r>
-        <m:r>
-          <m:t>1</m:t>
-        </m:r>
       </m:oMath>
       <w:r>
-        <w:t xml:space="preserve"> </w:t>
-      </w:r>
-      <w:r>
-        <w:t xml:space="preserve">on the rectangle</w:t>
-      </w:r>
-      <w:r>
-        <w:t xml:space="preserve"> </w:t>
-      </w:r>
-      <m:oMath>
-        <m:r>
-          <m:t>R</m:t>
-        </m:r>
-        <m:r>
-          <m:rPr>
-            <m:sty m:val="p"/>
-          </m:rPr>
-          <m:t>=</m:t>
-        </m:r>
-        <m:r>
-          <m:rPr>
-            <m:sty m:val="p"/>
-          </m:rPr>
-          <m:t>[</m:t>
-        </m:r>
-        <m:r>
-          <m:t>0</m:t>
-        </m:r>
-        <m:r>
-          <m:rPr>
-            <m:sty m:val="p"/>
-          </m:rPr>
-          <m:t>,</m:t>
-        </m:r>
-        <m:r>
-          <m:t>2</m:t>
-        </m:r>
-        <m:r>
-          <m:rPr>
-            <m:sty m:val="p"/>
-          </m:rPr>
-          <m:t>]</m:t>
-        </m:r>
-        <m:r>
-          <m:rPr>
-            <m:sty m:val="p"/>
-          </m:rPr>
-          <m:t>×</m:t>
-        </m:r>
-        <m:r>
-          <m:rPr>
-            <m:sty m:val="p"/>
-          </m:rPr>
-          <m:t>[</m:t>
-        </m:r>
-        <m:r>
-          <m:t>0</m:t>
-        </m:r>
-        <m:r>
-          <m:rPr>
-            <m:sty m:val="p"/>
-          </m:rPr>
-          <m:t>,</m:t>
-        </m:r>
-        <m:r>
-          <m:t>3</m:t>
-        </m:r>
-        <m:r>
-          <m:rPr>
-            <m:sty m:val="p"/>
-          </m:rPr>
-          <m:t>]</m:t>
-        </m:r>
-      </m:oMath>
-      <w:r>
-        <w:t xml:space="preserve">.</w:t>
-      </w:r>
-      <w:r>
-        <w:t xml:space="preserve"> </w:t>
-      </w:r>
-      <w:r>
-        <w:t xml:space="preserve">Every sum in</w:t>
-      </w:r>
-      <w:r>
-        <w:t xml:space="preserve"> </w:t>
-      </w:r>
-      <w:hyperlink w:anchor="def-double-integral">
-        <w:r>
-          <w:rPr>
-            <w:rStyle w:val="Hyperlink"/>
-          </w:rPr>
-          <w:t xml:space="preserve">Definition 13</w:t>
-        </w:r>
-      </w:hyperlink>
-      <w:r>
-        <w:t xml:space="preserve"> </w:t>
-      </w:r>
-      <w:r>
-        <w:t xml:space="preserve">adds up the areas of rectangles inside</w:t>
-      </w:r>
-      <w:r>
-        <w:t xml:space="preserve"> </w:t>
-      </w:r>
-      <m:oMath>
-        <m:r>
-          <m:t>R</m:t>
-        </m:r>
-      </m:oMath>
-      <w:r>
-        <w:t xml:space="preserve">,</w:t>
-      </w:r>
-      <w:r>
-        <w:t xml:space="preserve"> </w:t>
-      </w:r>
-      <w:r>
-        <w:t xml:space="preserve">and those sums approach the area of</w:t>
-      </w:r>
-      <w:r>
-        <w:t xml:space="preserve"> </w:t>
-      </w:r>
-      <m:oMath>
-        <m:r>
-          <m:t>R</m:t>
-        </m:r>
-      </m:oMath>
-      <w:r>
-        <w:t xml:space="preserve"> </w:t>
-      </w:r>
-      <w:r>
-        <w:t xml:space="preserve">as the grid gets finer,</w:t>
-      </w:r>
-      <w:r>
-        <w:t xml:space="preserve"> </w:t>
-      </w:r>
-      <w:r>
-        <w:t xml:space="preserve">so</w:t>
-      </w:r>
-      <w:r>
-        <w:t xml:space="preserve"> </w:t>
-      </w:r>
-      <m:oMath>
-        <m:nary>
-          <m:naryPr>
-            <m:chr m:val="∬"/>
-            <m:limLoc m:val="subSup"/>
-            <m:subHide m:val="off"/>
-            <m:supHide m:val="on"/>
-          </m:naryPr>
-          <m:sub>
-            <m:r>
-              <m:t>R</m:t>
-            </m:r>
-          </m:sub>
-          <m:sup>
-            <m:r>
-              <m:t>​</m:t>
-            </m:r>
-          </m:sup>
-          <m:e>
-            <m:r>
-              <m:t>1</m:t>
-            </m:r>
-          </m:e>
-        </m:nary>
-        <m:r>
-          <m:t> </m:t>
-        </m:r>
-        <m:r>
-          <m:t>d</m:t>
-        </m:r>
-        <m:r>
-          <m:t>A</m:t>
-        </m:r>
-        <m:r>
-          <m:rPr>
-            <m:sty m:val="p"/>
-          </m:rPr>
-          <m:t>=</m:t>
-        </m:r>
-        <m:r>
-          <m:t>2</m:t>
-        </m:r>
-        <m:r>
-          <m:rPr>
-            <m:sty m:val="p"/>
-          </m:rPr>
-          <m:t>⋅</m:t>
-        </m:r>
-        <m:r>
-          <m:t>3</m:t>
-        </m:r>
-        <m:r>
-          <m:rPr>
-            <m:sty m:val="p"/>
-          </m:rPr>
-          <m:t>=</m:t>
-        </m:r>
-        <m:r>
-          <m:t>6</m:t>
-        </m:r>
-      </m:oMath>
-      <w:r>
-        <w:t xml:space="preserve">.</w:t>
+        <w:t xml:space="preserve">:</w:t>
       </w:r>
     </w:p>
-    <w:bookmarkEnd w:id="104"/>
-    <w:bookmarkStart w:id="105" w:name="thm-fubini"/>
     <w:p>
       <w:pPr>
         <w:pStyle w:val="BodyText"/>
+      </w:pPr>
+      <m:oMathPara>
+        <m:oMathParaPr>
+          <m:jc m:val="center"/>
+        </m:oMathParaPr>
+        <m:oMath>
+          <m:eqArr>
+            <m:e>
+              <m:nary>
+                <m:naryPr>
+                  <m:chr m:val="∫"/>
+                  <m:limLoc m:val="subSup"/>
+                  <m:subHide m:val="off"/>
+                  <m:supHide m:val="off"/>
+                </m:naryPr>
+                <m:sub>
+                  <m:r>
+                    <m:t>0</m:t>
+                  </m:r>
+                </m:sub>
+                <m:sup>
+                  <m:r>
+                    <m:t>1</m:t>
+                  </m:r>
+                </m:sup>
+                <m:e>
+                  <m:nary>
+                    <m:naryPr>
+                      <m:chr m:val="∫"/>
+                      <m:limLoc m:val="subSup"/>
+                      <m:subHide m:val="off"/>
+                      <m:supHide m:val="off"/>
+                    </m:naryPr>
+                    <m:sub>
+                      <m:r>
+                        <m:t>0</m:t>
+                      </m:r>
+                    </m:sub>
+                    <m:sup>
+                      <m:r>
+                        <m:t>2</m:t>
+                      </m:r>
+                    </m:sup>
+                    <m:e>
+                      <m:r>
+                        <m:t>x</m:t>
+                      </m:r>
+                    </m:e>
+                  </m:nary>
+                </m:e>
+              </m:nary>
+              <m:r>
+                <m:t>y</m:t>
+              </m:r>
+              <m:r>
+                <m:t> </m:t>
+              </m:r>
+              <m:r>
+                <m:t>d</m:t>
+              </m:r>
+              <m:r>
+                <m:t>y</m:t>
+              </m:r>
+              <m:r>
+                <m:t> </m:t>
+              </m:r>
+              <m:r>
+                <m:t>d</m:t>
+              </m:r>
+              <m:r>
+                <m:t>x</m:t>
+              </m:r>
+              <m:r>
+                <m:t>&amp;</m:t>
+              </m:r>
+              <m:r>
+                <m:rPr>
+                  <m:sty m:val="p"/>
+                </m:rPr>
+                <m:t>=</m:t>
+              </m:r>
+              <m:nary>
+                <m:naryPr>
+                  <m:chr m:val="∫"/>
+                  <m:limLoc m:val="subSup"/>
+                  <m:subHide m:val="off"/>
+                  <m:supHide m:val="off"/>
+                </m:naryPr>
+                <m:sub>
+                  <m:r>
+                    <m:t>0</m:t>
+                  </m:r>
+                </m:sub>
+                <m:sup>
+                  <m:r>
+                    <m:t>1</m:t>
+                  </m:r>
+                </m:sup>
+                <m:e>
+                  <m:r>
+                    <m:t>​</m:t>
+                  </m:r>
+                </m:e>
+              </m:nary>
+              <m:d>
+                <m:dPr>
+                  <m:begChr m:val="("/>
+                  <m:sepChr m:val=""/>
+                  <m:endChr m:val=")"/>
+                  <m:grow/>
+                </m:dPr>
+                <m:e>
+                  <m:nary>
+                    <m:naryPr>
+                      <m:chr m:val="∫"/>
+                      <m:limLoc m:val="subSup"/>
+                      <m:subHide m:val="off"/>
+                      <m:supHide m:val="off"/>
+                    </m:naryPr>
+                    <m:sub>
+                      <m:r>
+                        <m:t>0</m:t>
+                      </m:r>
+                    </m:sub>
+                    <m:sup>
+                      <m:r>
+                        <m:t>2</m:t>
+                      </m:r>
+                    </m:sup>
+                    <m:e>
+                      <m:r>
+                        <m:t>x</m:t>
+                      </m:r>
+                    </m:e>
+                  </m:nary>
+                  <m:r>
+                    <m:t>y</m:t>
+                  </m:r>
+                  <m:r>
+                    <m:t> </m:t>
+                  </m:r>
+                  <m:r>
+                    <m:t>d</m:t>
+                  </m:r>
+                  <m:r>
+                    <m:t>y</m:t>
+                  </m:r>
+                </m:e>
+              </m:d>
+              <m:r>
+                <m:t>​</m:t>
+              </m:r>
+              <m:r>
+                <m:t> </m:t>
+              </m:r>
+              <m:r>
+                <m:t>d</m:t>
+              </m:r>
+              <m:r>
+                <m:t>x</m:t>
+              </m:r>
+              <m:r>
+                <m:t>&amp;</m:t>
+              </m:r>
+              <m:r>
+                <m:t>&amp;</m:t>
+              </m:r>
+              <m:r>
+                <m:rPr>
+                  <m:nor/>
+                  <m:sty m:val="p"/>
+                </m:rPr>
+                <m:t>(definition of the iterated integral)</m:t>
+              </m:r>
+            </m:e>
+            <m:e>
+              <m:r>
+                <m:t>&amp;</m:t>
+              </m:r>
+              <m:r>
+                <m:rPr>
+                  <m:sty m:val="p"/>
+                </m:rPr>
+                <m:t>=</m:t>
+              </m:r>
+              <m:nary>
+                <m:naryPr>
+                  <m:chr m:val="∫"/>
+                  <m:limLoc m:val="subSup"/>
+                  <m:subHide m:val="off"/>
+                  <m:supHide m:val="off"/>
+                </m:naryPr>
+                <m:sub>
+                  <m:r>
+                    <m:t>0</m:t>
+                  </m:r>
+                </m:sub>
+                <m:sup>
+                  <m:r>
+                    <m:t>1</m:t>
+                  </m:r>
+                </m:sup>
+                <m:e>
+                  <m:r>
+                    <m:t>x</m:t>
+                  </m:r>
+                </m:e>
+              </m:nary>
+              <m:r>
+                <m:t>​</m:t>
+              </m:r>
+              <m:d>
+                <m:dPr>
+                  <m:begChr m:val="("/>
+                  <m:sepChr m:val=""/>
+                  <m:endChr m:val=")"/>
+                  <m:grow/>
+                </m:dPr>
+                <m:e>
+                  <m:nary>
+                    <m:naryPr>
+                      <m:chr m:val="∫"/>
+                      <m:limLoc m:val="subSup"/>
+                      <m:subHide m:val="off"/>
+                      <m:supHide m:val="off"/>
+                    </m:naryPr>
+                    <m:sub>
+                      <m:r>
+                        <m:t>0</m:t>
+                      </m:r>
+                    </m:sub>
+                    <m:sup>
+                      <m:r>
+                        <m:t>2</m:t>
+                      </m:r>
+                    </m:sup>
+                    <m:e>
+                      <m:r>
+                        <m:t>y</m:t>
+                      </m:r>
+                    </m:e>
+                  </m:nary>
+                  <m:r>
+                    <m:t> </m:t>
+                  </m:r>
+                  <m:r>
+                    <m:t>d</m:t>
+                  </m:r>
+                  <m:r>
+                    <m:t>y</m:t>
+                  </m:r>
+                </m:e>
+              </m:d>
+              <m:r>
+                <m:t>​</m:t>
+              </m:r>
+              <m:r>
+                <m:t> </m:t>
+              </m:r>
+              <m:r>
+                <m:t>d</m:t>
+              </m:r>
+              <m:r>
+                <m:t>x</m:t>
+              </m:r>
+              <m:r>
+                <m:t>&amp;</m:t>
+              </m:r>
+              <m:r>
+                <m:t>&amp;</m:t>
+              </m:r>
+              <m:r>
+                <m:rPr>
+                  <m:nor/>
+                  <m:sty m:val="p"/>
+                </m:rPr>
+                <m:t>(</m:t>
+              </m:r>
+              <m:r>
+                <m:t>x</m:t>
+              </m:r>
+              <m:r>
+                <m:rPr>
+                  <m:nor/>
+                  <m:sty m:val="p"/>
+                </m:rPr>
+                <m:t> is constant in </m:t>
+              </m:r>
+              <m:r>
+                <m:t>y</m:t>
+              </m:r>
+              <m:r>
+                <m:rPr>
+                  <m:nor/>
+                  <m:sty m:val="p"/>
+                </m:rPr>
+                <m:t>)</m:t>
+              </m:r>
+            </m:e>
+            <m:e>
+              <m:r>
+                <m:t>&amp;</m:t>
+              </m:r>
+              <m:r>
+                <m:rPr>
+                  <m:sty m:val="p"/>
+                </m:rPr>
+                <m:t>=</m:t>
+              </m:r>
+              <m:nary>
+                <m:naryPr>
+                  <m:chr m:val="∫"/>
+                  <m:limLoc m:val="subSup"/>
+                  <m:subHide m:val="off"/>
+                  <m:supHide m:val="off"/>
+                </m:naryPr>
+                <m:sub>
+                  <m:r>
+                    <m:t>0</m:t>
+                  </m:r>
+                </m:sub>
+                <m:sup>
+                  <m:r>
+                    <m:t>1</m:t>
+                  </m:r>
+                </m:sup>
+                <m:e>
+                  <m:r>
+                    <m:t>x</m:t>
+                  </m:r>
+                </m:e>
+              </m:nary>
+              <m:r>
+                <m:t>​</m:t>
+              </m:r>
+              <m:d>
+                <m:dPr>
+                  <m:begChr m:val="["/>
+                  <m:sepChr m:val=""/>
+                  <m:endChr m:val="]"/>
+                  <m:grow/>
+                </m:dPr>
+                <m:e>
+                  <m:f>
+                    <m:fPr>
+                      <m:type m:val="bar"/>
+                    </m:fPr>
+                    <m:num>
+                      <m:sSup>
+                        <m:e>
+                          <m:r>
+                            <m:t>y</m:t>
+                          </m:r>
+                        </m:e>
+                        <m:sup>
+                          <m:r>
+                            <m:t>2</m:t>
+                          </m:r>
+                        </m:sup>
+                      </m:sSup>
+                    </m:num>
+                    <m:den>
+                      <m:r>
+                        <m:t>2</m:t>
+                      </m:r>
+                    </m:den>
+                  </m:f>
+                </m:e>
+              </m:d>
+              <m:sSubSup>
+                <m:e>
+                  <m:r>
+                    <m:t>​</m:t>
+                  </m:r>
+                </m:e>
+                <m:sub>
+                  <m:r>
+                    <m:t>y</m:t>
+                  </m:r>
+                  <m:r>
+                    <m:rPr>
+                      <m:sty m:val="p"/>
+                    </m:rPr>
+                    <m:t>=</m:t>
+                  </m:r>
+                  <m:r>
+                    <m:t>0</m:t>
+                  </m:r>
+                </m:sub>
+                <m:sup>
+                  <m:r>
+                    <m:t>y</m:t>
+                  </m:r>
+                  <m:r>
+                    <m:rPr>
+                      <m:sty m:val="p"/>
+                    </m:rPr>
+                    <m:t>=</m:t>
+                  </m:r>
+                  <m:r>
+                    <m:t>2</m:t>
+                  </m:r>
+                </m:sup>
+              </m:sSubSup>
+              <m:r>
+                <m:t> </m:t>
+              </m:r>
+              <m:r>
+                <m:t>d</m:t>
+              </m:r>
+              <m:r>
+                <m:t>x</m:t>
+              </m:r>
+              <m:r>
+                <m:t>&amp;</m:t>
+              </m:r>
+              <m:r>
+                <m:t>&amp;</m:t>
+              </m:r>
+              <m:r>
+                <m:rPr>
+                  <m:nor/>
+                  <m:sty m:val="p"/>
+                </m:rPr>
+                <m:t>(antiderivative of </m:t>
+              </m:r>
+              <m:r>
+                <m:t>y</m:t>
+              </m:r>
+              <m:r>
+                <m:rPr>
+                  <m:nor/>
+                  <m:sty m:val="p"/>
+                </m:rPr>
+                <m:t>)</m:t>
+              </m:r>
+            </m:e>
+            <m:e>
+              <m:r>
+                <m:t>&amp;</m:t>
+              </m:r>
+              <m:r>
+                <m:rPr>
+                  <m:sty m:val="p"/>
+                </m:rPr>
+                <m:t>=</m:t>
+              </m:r>
+              <m:nary>
+                <m:naryPr>
+                  <m:chr m:val="∫"/>
+                  <m:limLoc m:val="subSup"/>
+                  <m:subHide m:val="off"/>
+                  <m:supHide m:val="off"/>
+                </m:naryPr>
+                <m:sub>
+                  <m:r>
+                    <m:t>0</m:t>
+                  </m:r>
+                </m:sub>
+                <m:sup>
+                  <m:r>
+                    <m:t>1</m:t>
+                  </m:r>
+                </m:sup>
+                <m:e>
+                  <m:r>
+                    <m:t>2</m:t>
+                  </m:r>
+                </m:e>
+              </m:nary>
+              <m:r>
+                <m:t>x</m:t>
+              </m:r>
+              <m:r>
+                <m:t> </m:t>
+              </m:r>
+              <m:r>
+                <m:t>d</m:t>
+              </m:r>
+              <m:r>
+                <m:t>x</m:t>
+              </m:r>
+              <m:r>
+                <m:t>&amp;</m:t>
+              </m:r>
+              <m:r>
+                <m:t>&amp;</m:t>
+              </m:r>
+              <m:r>
+                <m:rPr>
+                  <m:nor/>
+                  <m:sty m:val="p"/>
+                </m:rPr>
+                <m:t>(evaluate at the limits)</m:t>
+              </m:r>
+            </m:e>
+            <m:e>
+              <m:r>
+                <m:t>&amp;</m:t>
+              </m:r>
+              <m:r>
+                <m:rPr>
+                  <m:sty m:val="p"/>
+                </m:rPr>
+                <m:t>=</m:t>
+              </m:r>
+              <m:r>
+                <m:t>​</m:t>
+              </m:r>
+              <m:d>
+                <m:dPr>
+                  <m:begChr m:val="["/>
+                  <m:sepChr m:val=""/>
+                  <m:endChr m:val="]"/>
+                  <m:grow/>
+                </m:dPr>
+                <m:e>
+                  <m:sSup>
+                    <m:e>
+                      <m:r>
+                        <m:t>x</m:t>
+                      </m:r>
+                    </m:e>
+                    <m:sup>
+                      <m:r>
+                        <m:t>2</m:t>
+                      </m:r>
+                    </m:sup>
+                  </m:sSup>
+                </m:e>
+              </m:d>
+              <m:sSubSup>
+                <m:e>
+                  <m:r>
+                    <m:t>​</m:t>
+                  </m:r>
+                </m:e>
+                <m:sub>
+                  <m:r>
+                    <m:t>x</m:t>
+                  </m:r>
+                  <m:r>
+                    <m:rPr>
+                      <m:sty m:val="p"/>
+                    </m:rPr>
+                    <m:t>=</m:t>
+                  </m:r>
+                  <m:r>
+                    <m:t>0</m:t>
+                  </m:r>
+                </m:sub>
+                <m:sup>
+                  <m:r>
+                    <m:t>x</m:t>
+                  </m:r>
+                  <m:r>
+                    <m:rPr>
+                      <m:sty m:val="p"/>
+                    </m:rPr>
+                    <m:t>=</m:t>
+                  </m:r>
+                  <m:r>
+                    <m:t>1</m:t>
+                  </m:r>
+                </m:sup>
+              </m:sSubSup>
+              <m:r>
+                <m:t>&amp;</m:t>
+              </m:r>
+              <m:r>
+                <m:t>&amp;</m:t>
+              </m:r>
+              <m:r>
+                <m:rPr>
+                  <m:nor/>
+                  <m:sty m:val="p"/>
+                </m:rPr>
+                <m:t>(antiderivative of </m:t>
+              </m:r>
+              <m:r>
+                <m:t>2</m:t>
+              </m:r>
+              <m:r>
+                <m:t>x</m:t>
+              </m:r>
+              <m:r>
+                <m:rPr>
+                  <m:nor/>
+                  <m:sty m:val="p"/>
+                </m:rPr>
+                <m:t>)</m:t>
+              </m:r>
+            </m:e>
+            <m:e>
+              <m:r>
+                <m:t>&amp;</m:t>
+              </m:r>
+              <m:r>
+                <m:rPr>
+                  <m:sty m:val="p"/>
+                </m:rPr>
+                <m:t>=</m:t>
+              </m:r>
+              <m:r>
+                <m:t>1</m:t>
+              </m:r>
+              <m:r>
+                <m:t>&amp;</m:t>
+              </m:r>
+              <m:r>
+                <m:t>&amp;</m:t>
+              </m:r>
+              <m:r>
+                <m:rPr>
+                  <m:nor/>
+                  <m:sty m:val="p"/>
+                </m:rPr>
+                <m:t>(evaluate at the limits)</m:t>
+              </m:r>
+            </m:e>
+          </m:eqArr>
+        </m:oMath>
+      </m:oMathPara>
+    </w:p>
+    <w:bookmarkEnd w:id="106"/>
+    <w:bookmarkStart w:id="107" w:name="thm-fubini"/>
+    <w:p>
+      <w:pPr>
+        <w:pStyle w:val="FirstParagraph"/>
       </w:pPr>
       <w:r>
         <w:rPr>
@@ -29279,8 +30369,8 @@
         <w:t xml:space="preserve">(Larson and Edwards 2018, Theorem 14.2, p. 982)</w:t>
       </w:r>
     </w:p>
-    <w:bookmarkEnd w:id="105"/>
-    <w:bookmarkStart w:id="112" w:name="exm-fubini-nonrect"/>
+    <w:bookmarkEnd w:id="107"/>
+    <w:bookmarkStart w:id="114" w:name="exm-fubini-nonrect"/>
     <w:p>
       <w:pPr>
         <w:pStyle w:val="BodyText"/>
@@ -29290,7 +30380,7 @@
           <w:b/>
           <w:bCs/>
         </w:rPr>
-        <w:t xml:space="preserve">Example 15 (Changing the order of integration for a non-rectangular region)</w:t>
+        <w:t xml:space="preserve">Example 16 (Changing the order of integration for a non-rectangular region)</w:t>
       </w:r>
       <w:r>
         <w:t xml:space="preserve"> </w:t>
@@ -29622,7 +30712,7 @@
       <w:r>
         <w:t xml:space="preserve"> </w:t>
       </w:r>
-      <w:hyperlink r:id="rId106">
+      <w:hyperlink r:id="rId108">
         <w:r>
           <w:rPr>
             <w:rStyle w:val="Hyperlink"/>
@@ -30425,7 +31515,7 @@
       <w:tr>
         <w:tc>
           <w:tcPr/>
-          <w:bookmarkStart w:id="110" w:name="fig-fubini-nonrect-region"/>
+          <w:bookmarkStart w:id="112" w:name="fig-fubini-nonrect-region"/>
           <w:p>
             <w:pPr>
               <w:pStyle w:val="SourceCode"/>
@@ -31974,18 +33064,18 @@
                 <wp:inline>
                   <wp:extent cx="4620126" cy="3696101"/>
                   <wp:effectExtent b="0" l="0" r="0" t="0"/>
-                  <wp:docPr descr="" title="" id="108" name="Picture"/>
+                  <wp:docPr descr="" title="" id="110" name="Picture"/>
                   <a:graphic>
                     <a:graphicData uri="http://schemas.openxmlformats.org/drawingml/2006/picture">
                       <pic:pic>
                         <pic:nvPicPr>
-                          <pic:cNvPr descr="calculus_files/figure-docx/unnamed-chunk-5-1.png" id="109" name="Picture"/>
+                          <pic:cNvPr descr="calculus_files/figure-docx/unnamed-chunk-5-1.png" id="111" name="Picture"/>
                           <pic:cNvPicPr>
                             <a:picLocks noChangeArrowheads="1" noChangeAspect="1"/>
                           </pic:cNvPicPr>
                         </pic:nvPicPr>
                         <pic:blipFill>
-                          <a:blip r:embed="rId107"/>
+                          <a:blip r:embed="rId109"/>
                           <a:stretch>
                             <a:fillRect/>
                           </a:stretch>
@@ -32225,7 +33315,7 @@
               <w:t xml:space="preserve">.</w:t>
             </w:r>
           </w:p>
-          <w:bookmarkEnd w:id="110"/>
+          <w:bookmarkEnd w:id="112"/>
         </w:tc>
       </w:tr>
     </w:tbl>
@@ -34582,7 +35672,7 @@
       <w:tr>
         <w:tc>
           <w:tcPr/>
-          <w:bookmarkStart w:id="111" w:name="fig-fubini-nonrect"/>
+          <w:bookmarkStart w:id="113" w:name="fig-fubini-nonrect"/>
           <w:p>
             <w:pPr>
               <w:pStyle w:val="Compact"/>
@@ -34929,12 +36019,12 @@
               <w:t xml:space="preserve">.</w:t>
             </w:r>
           </w:p>
-          <w:bookmarkEnd w:id="111"/>
+          <w:bookmarkEnd w:id="113"/>
         </w:tc>
       </w:tr>
     </w:tbl>
-    <w:bookmarkEnd w:id="112"/>
-    <w:bookmarkStart w:id="114" w:name="exm-fubini-fail"/>
+    <w:bookmarkEnd w:id="114"/>
+    <w:bookmarkStart w:id="116" w:name="exm-fubini-fail"/>
     <w:p>
       <w:pPr>
         <w:pStyle w:val="BodyText"/>
@@ -34944,7 +36034,7 @@
           <w:b/>
           <w:bCs/>
         </w:rPr>
-        <w:t xml:space="preserve">Example 16 (When conditions fail: a counterexample)</w:t>
+        <w:t xml:space="preserve">Example 17 (When conditions fail: a counterexample)</w:t>
       </w:r>
       <w:r>
         <w:t xml:space="preserve"> </w:t>
@@ -36994,7 +38084,7 @@
       <w:tr>
         <w:tc>
           <w:tcPr/>
-          <w:bookmarkStart w:id="113" w:name="fig-fubini-fail"/>
+          <w:bookmarkStart w:id="115" w:name="fig-fubini-fail"/>
           <w:p>
             <w:pPr>
               <w:pStyle w:val="Compact"/>
@@ -37546,12 +38636,12 @@
               <w:t xml:space="preserve">does not apply.</w:t>
             </w:r>
           </w:p>
-          <w:bookmarkEnd w:id="113"/>
+          <w:bookmarkEnd w:id="115"/>
         </w:tc>
       </w:tr>
     </w:tbl>
-    <w:bookmarkEnd w:id="114"/>
-    <w:bookmarkStart w:id="115" w:name="cor-fubini-rect"/>
+    <w:bookmarkEnd w:id="116"/>
+    <w:bookmarkStart w:id="117" w:name="cor-fubini-rect"/>
     <w:p>
       <w:pPr>
         <w:pStyle w:val="BodyText"/>
@@ -38124,7 +39214,7 @@
         <w:t xml:space="preserve">(Larson and Edwards 2018, Theorem 14.2, p. 982)</w:t>
       </w:r>
     </w:p>
-    <w:bookmarkEnd w:id="115"/>
+    <w:bookmarkEnd w:id="117"/>
     <w:p>
       <w:pPr>
         <w:pStyle w:val="BodyText"/>
@@ -38379,7 +39469,7 @@
         <w:t xml:space="preserve">two iterated forms shown.</w:t>
       </w:r>
     </w:p>
-    <w:bookmarkStart w:id="121" w:name="exm-fubini-rect"/>
+    <w:bookmarkStart w:id="123" w:name="exm-fubini-rect"/>
     <w:p>
       <w:pPr>
         <w:pStyle w:val="BodyText"/>
@@ -38389,7 +39479,7 @@
           <w:b/>
           <w:bCs/>
         </w:rPr>
-        <w:t xml:space="preserve">Example 17 (Evaluating a double integral on a rectangle)</w:t>
+        <w:t xml:space="preserve">Example 18 (Evaluating a double integral on a rectangle)</w:t>
       </w:r>
       <w:r>
         <w:t xml:space="preserve"> </w:t>
@@ -38967,7 +40057,7 @@
       <w:r>
         <w:t xml:space="preserve"> </w:t>
       </w:r>
-      <w:hyperlink r:id="rId106">
+      <w:hyperlink r:id="rId108">
         <w:r>
           <w:rPr>
             <w:rStyle w:val="Hyperlink"/>
@@ -39258,7 +40348,7 @@
       <w:tr>
         <w:tc>
           <w:tcPr/>
-          <w:bookmarkStart w:id="119" w:name="fig-fubini-rect-region"/>
+          <w:bookmarkStart w:id="121" w:name="fig-fubini-rect-region"/>
           <w:p>
             <w:pPr>
               <w:pStyle w:val="SourceCode"/>
@@ -40150,18 +41240,18 @@
                 <wp:inline>
                   <wp:extent cx="4620126" cy="3696101"/>
                   <wp:effectExtent b="0" l="0" r="0" t="0"/>
-                  <wp:docPr descr="" title="" id="117" name="Picture"/>
+                  <wp:docPr descr="" title="" id="119" name="Picture"/>
                   <a:graphic>
                     <a:graphicData uri="http://schemas.openxmlformats.org/drawingml/2006/picture">
                       <pic:pic>
                         <pic:nvPicPr>
-                          <pic:cNvPr descr="calculus_files/figure-docx/unnamed-chunk-10-1.png" id="118" name="Picture"/>
+                          <pic:cNvPr descr="calculus_files/figure-docx/unnamed-chunk-10-1.png" id="120" name="Picture"/>
                           <pic:cNvPicPr>
                             <a:picLocks noChangeArrowheads="1" noChangeAspect="1"/>
                           </pic:cNvPicPr>
                         </pic:nvPicPr>
                         <pic:blipFill>
-                          <a:blip r:embed="rId116"/>
+                          <a:blip r:embed="rId118"/>
                           <a:stretch>
                             <a:fillRect/>
                           </a:stretch>
@@ -40251,7 +41341,7 @@
               <w:t xml:space="preserve">, the unit square.</w:t>
             </w:r>
           </w:p>
-          <w:bookmarkEnd w:id="119"/>
+          <w:bookmarkEnd w:id="121"/>
         </w:tc>
       </w:tr>
     </w:tbl>
@@ -41883,7 +42973,7 @@
       <w:tr>
         <w:tc>
           <w:tcPr/>
-          <w:bookmarkStart w:id="120" w:name="fig-fubini-rect"/>
+          <w:bookmarkStart w:id="122" w:name="fig-fubini-rect"/>
           <w:p>
             <w:pPr>
               <w:pStyle w:val="Compact"/>
@@ -42107,12 +43197,12 @@
               <w:t xml:space="preserve">.</w:t>
             </w:r>
           </w:p>
-          <w:bookmarkEnd w:id="120"/>
+          <w:bookmarkEnd w:id="122"/>
         </w:tc>
       </w:tr>
     </w:tbl>
-    <w:bookmarkEnd w:id="121"/>
-    <w:bookmarkStart w:id="122" w:name="thm-fubini-tonelli"/>
+    <w:bookmarkEnd w:id="123"/>
+    <w:bookmarkStart w:id="124" w:name="thm-fubini-tonelli"/>
     <w:p>
       <w:pPr>
         <w:pStyle w:val="BodyText"/>
@@ -43275,11 +44365,22 @@
         <w:t xml:space="preserve">(Billingsley 1995, Theorem 18.3; Gut 2013, Theorem 9.1, p. 65; Fubini 1907; Wikipedia contributors 2024)</w:t>
       </w:r>
     </w:p>
-    <w:bookmarkEnd w:id="122"/>
+    <w:bookmarkEnd w:id="124"/>
+    <w:bookmarkStart w:id="125" w:name="rem-fubini-tonelli-probability"/>
     <w:p>
       <w:pPr>
         <w:pStyle w:val="BodyText"/>
       </w:pPr>
+      <w:r>
+        <w:rPr>
+          <w:i/>
+          <w:iCs/>
+        </w:rPr>
+        <w:t xml:space="preserve">Remark 1</w:t>
+      </w:r>
+      <w:r>
+        <w:t xml:space="preserve"> (Fubini–Tonelli for probability measures). </w:t>
+      </w:r>
       <w:r>
         <w:t xml:space="preserve">Applied courses rarely need the measure-theoretic generalization itself,</w:t>
       </w:r>
@@ -43323,18 +44424,47 @@
         <w:t xml:space="preserve">Regression Models for Epidemiology</w:t>
       </w:r>
       <w:r>
-        <w:t xml:space="preserve">: probability measures are finite (hence</w:t>
+        <w:t xml:space="preserve">.</w:t>
+      </w:r>
+      <w:r>
+        <w:t xml:space="preserve"> </w:t>
+      </w:r>
+      <w:r>
+        <w:t xml:space="preserve">A probability measure gives the whole space measure</w:t>
       </w:r>
       <w:r>
         <w:t xml:space="preserve"> </w:t>
       </w:r>
       <m:oMath>
         <m:r>
+          <m:t>1</m:t>
+        </m:r>
+      </m:oMath>
+      <w:r>
+        <w:t xml:space="preserve">,</w:t>
+      </w:r>
+      <w:r>
+        <w:t xml:space="preserve"> </w:t>
+      </w:r>
+      <w:r>
+        <w:t xml:space="preserve">so it is finite, and hence</w:t>
+      </w:r>
+      <w:r>
+        <w:t xml:space="preserve"> </w:t>
+      </w:r>
+      <m:oMath>
+        <m:r>
           <m:t>σ</m:t>
         </m:r>
       </m:oMath>
       <w:r>
-        <w:t xml:space="preserve">-finite), so the</w:t>
+        <w:t xml:space="preserve">-finite;</w:t>
+      </w:r>
+      <w:r>
+        <w:t xml:space="preserve"> </w:t>
+      </w:r>
+      <w:r>
+        <w:t xml:space="preserve">for probability measures, the</w:t>
       </w:r>
       <w:r>
         <w:t xml:space="preserve"> </w:t>
@@ -43347,36 +44477,218 @@
       <w:r>
         <w:t xml:space="preserve">-finiteness condition is automatic.</w:t>
       </w:r>
-      <w:r>
-        <w:t xml:space="preserve"> </w:t>
-      </w:r>
-      <w:r>
-        <w:t xml:space="preserve">The integrability conditions</w:t>
-      </w:r>
-      <w:r>
-        <w:t xml:space="preserve"> </w:t>
-      </w:r>
-      <w:r>
-        <w:t xml:space="preserve">(nonnegativity or absolute integrability) still need to be verified</w:t>
-      </w:r>
-      <w:r>
-        <w:t xml:space="preserve"> </w:t>
-      </w:r>
-      <w:r>
-        <w:t xml:space="preserve">in each application.</w:t>
-      </w:r>
     </w:p>
-    <w:bookmarkStart w:id="123" w:name="exm-fubini-tonelli-apply"/>
     <w:p>
       <w:pPr>
         <w:pStyle w:val="BodyText"/>
       </w:pPr>
       <w:r>
+        <w:t xml:space="preserve">The integrability conditions</w:t>
+      </w:r>
+      <w:r>
+        <w:t xml:space="preserve"> </w:t>
+      </w:r>
+      <w:r>
+        <w:t xml:space="preserve">(nonnegativity or absolute integrability) still need to be verified</w:t>
+      </w:r>
+      <w:r>
+        <w:t xml:space="preserve"> </w:t>
+      </w:r>
+      <w:r>
+        <w:t xml:space="preserve">in each application.</w:t>
+      </w:r>
+      <w:r>
+        <w:t xml:space="preserve"> </w:t>
+      </w:r>
+      <w:r>
+        <w:t xml:space="preserve">For example, Lebesgue measure (ordinary length) on</w:t>
+      </w:r>
+      <w:r>
+        <w:t xml:space="preserve"> </w:t>
+      </w:r>
+      <m:oMath>
+        <m:r>
+          <m:rPr>
+            <m:sty m:val="p"/>
+          </m:rPr>
+          <m:t>[</m:t>
+        </m:r>
+        <m:r>
+          <m:t>0</m:t>
+        </m:r>
+        <m:r>
+          <m:rPr>
+            <m:sty m:val="p"/>
+          </m:rPr>
+          <m:t>,</m:t>
+        </m:r>
+        <m:r>
+          <m:t>1</m:t>
+        </m:r>
+        <m:r>
+          <m:rPr>
+            <m:sty m:val="p"/>
+          </m:rPr>
+          <m:t>]</m:t>
+        </m:r>
+      </m:oMath>
+      <w:r>
+        <w:t xml:space="preserve"> </w:t>
+      </w:r>
+      <w:r>
+        <w:t xml:space="preserve">is a probability measure,</w:t>
+      </w:r>
+      <w:r>
+        <w:t xml:space="preserve"> </w:t>
+      </w:r>
+      <w:r>
+        <w:t xml:space="preserve">so the</w:t>
+      </w:r>
+      <w:r>
+        <w:t xml:space="preserve"> </w:t>
+      </w:r>
+      <m:oMath>
+        <m:r>
+          <m:t>σ</m:t>
+        </m:r>
+      </m:oMath>
+      <w:r>
+        <w:t xml:space="preserve">-finiteness condition holds for both factors</w:t>
+      </w:r>
+      <w:r>
+        <w:t xml:space="preserve"> </w:t>
+      </w:r>
+      <m:oMath>
+        <m:r>
+          <m:rPr>
+            <m:sty m:val="p"/>
+          </m:rPr>
+          <m:t>[</m:t>
+        </m:r>
+        <m:r>
+          <m:t>0</m:t>
+        </m:r>
+        <m:r>
+          <m:rPr>
+            <m:sty m:val="p"/>
+          </m:rPr>
+          <m:t>,</m:t>
+        </m:r>
+        <m:r>
+          <m:t>1</m:t>
+        </m:r>
+        <m:r>
+          <m:rPr>
+            <m:sty m:val="p"/>
+          </m:rPr>
+          <m:t>]</m:t>
+        </m:r>
+      </m:oMath>
+      <w:r>
+        <w:t xml:space="preserve">,</w:t>
+      </w:r>
+      <w:r>
+        <w:t xml:space="preserve"> </w:t>
+      </w:r>
+      <w:r>
+        <w:t xml:space="preserve">yet the two iterated integrals in</w:t>
+      </w:r>
+      <w:r>
+        <w:t xml:space="preserve"> </w:t>
+      </w:r>
+      <w:hyperlink w:anchor="exm-fubini-fail">
+        <w:r>
+          <w:rPr>
+            <w:rStyle w:val="Hyperlink"/>
+          </w:rPr>
+          <w:t xml:space="preserve">Example 17</w:t>
+        </w:r>
+      </w:hyperlink>
+      <w:r>
+        <w:t xml:space="preserve"> </w:t>
+      </w:r>
+      <w:r>
+        <w:t xml:space="preserve">are</w:t>
+      </w:r>
+      <w:r>
+        <w:t xml:space="preserve"> </w:t>
+      </w:r>
+      <m:oMath>
+        <m:r>
+          <m:t>π</m:t>
+        </m:r>
+        <m:r>
+          <m:rPr>
+            <m:sty m:val="p"/>
+          </m:rPr>
+          <m:t>/</m:t>
+        </m:r>
+        <m:r>
+          <m:t>4</m:t>
+        </m:r>
+      </m:oMath>
+      <w:r>
+        <w:t xml:space="preserve"> </w:t>
+      </w:r>
+      <w:r>
+        <w:t xml:space="preserve">and</w:t>
+      </w:r>
+      <w:r>
+        <w:t xml:space="preserve"> </w:t>
+      </w:r>
+      <m:oMath>
+        <m:r>
+          <m:rPr>
+            <m:sty m:val="p"/>
+          </m:rPr>
+          <m:t>−</m:t>
+        </m:r>
+        <m:r>
+          <m:t>π</m:t>
+        </m:r>
+        <m:r>
+          <m:rPr>
+            <m:sty m:val="p"/>
+          </m:rPr>
+          <m:t>/</m:t>
+        </m:r>
+        <m:r>
+          <m:t>4</m:t>
+        </m:r>
+      </m:oMath>
+      <w:r>
+        <w:t xml:space="preserve">.</w:t>
+      </w:r>
+      <w:r>
+        <w:t xml:space="preserve"> </w:t>
+      </w:r>
+      <w:r>
+        <w:t xml:space="preserve">So</w:t>
+      </w:r>
+      <w:r>
+        <w:t xml:space="preserve"> </w:t>
+      </w:r>
+      <m:oMath>
+        <m:r>
+          <m:t>σ</m:t>
+        </m:r>
+      </m:oMath>
+      <w:r>
+        <w:t xml:space="preserve">-finiteness alone does not make the iterated integrals agree.</w:t>
+      </w:r>
+    </w:p>
+    <w:bookmarkEnd w:id="125"/>
+    <w:bookmarkStart w:id="126" w:name="exm-fubini-tonelli-apply"/>
+    <w:p>
+      <w:pPr>
+        <w:pStyle w:val="BodyText"/>
+      </w:pPr>
+      <w:r>
         <w:rPr>
           <w:b/>
           <w:bCs/>
         </w:rPr>
-        <w:t xml:space="preserve">Example 18 (Positive application of</w:t>
+        <w:t xml:space="preserve">Example 19 (Positive application of</w:t>
       </w:r>
       <w:r>
         <w:rPr>
@@ -46474,8 +47786,8 @@
         <w:t xml:space="preserve">guarantees when condition (a) holds.</w:t>
       </w:r>
     </w:p>
-    <w:bookmarkEnd w:id="123"/>
-    <w:bookmarkStart w:id="124" w:name="exm-fubini-fail-tonelli"/>
+    <w:bookmarkEnd w:id="126"/>
+    <w:bookmarkStart w:id="127" w:name="exm-fubini-fail-tonelli"/>
     <w:p>
       <w:pPr>
         <w:pStyle w:val="BodyText"/>
@@ -46485,7 +47797,7 @@
           <w:b/>
           <w:bCs/>
         </w:rPr>
-        <w:t xml:space="preserve">Example 19 (When neither Fubini–Tonelli condition is satisfied)</w:t>
+        <w:t xml:space="preserve">Example 20 (When neither Fubini–Tonelli condition is satisfied)</w:t>
       </w:r>
       <w:r>
         <w:t xml:space="preserve"> </w:t>
@@ -46644,7 +47956,7 @@
           <w:rPr>
             <w:rStyle w:val="Hyperlink"/>
           </w:rPr>
-          <w:t xml:space="preserve">Example 16</w:t>
+          <w:t xml:space="preserve">Example 17</w:t>
         </w:r>
       </w:hyperlink>
       <w:r>
@@ -47572,7 +48884,7 @@
           <w:rPr>
             <w:rStyle w:val="Hyperlink"/>
           </w:rPr>
-          <w:t xml:space="preserve">Example 16</w:t>
+          <w:t xml:space="preserve">Example 17</w:t>
         </w:r>
       </w:hyperlink>
       <w:r>
@@ -47610,9 +48922,9 @@
         <w:t xml:space="preserve">(Wikipedia contributors 2024)</w:t>
       </w:r>
     </w:p>
-    <w:bookmarkEnd w:id="124"/>
-    <w:bookmarkEnd w:id="125"/>
-    <w:bookmarkStart w:id="128" w:name="sec-additional-resources"/>
+    <w:bookmarkEnd w:id="127"/>
+    <w:bookmarkEnd w:id="128"/>
+    <w:bookmarkStart w:id="131" w:name="sec-additional-resources"/>
     <w:p>
       <w:pPr>
         <w:pStyle w:val="Heading2"/>
@@ -47689,7 +49001,7 @@
           <w:numId w:val="1008"/>
         </w:numPr>
       </w:pPr>
-      <w:hyperlink r:id="rId126">
+      <w:hyperlink r:id="rId129">
         <w:r>
           <w:rPr>
             <w:rStyle w:val="Hyperlink"/>
@@ -47706,7 +49018,7 @@
           <w:numId w:val="1008"/>
         </w:numPr>
       </w:pPr>
-      <w:hyperlink r:id="rId127">
+      <w:hyperlink r:id="rId130">
         <w:r>
           <w:rPr>
             <w:rStyle w:val="Hyperlink"/>
@@ -47733,8 +49045,8 @@
         <w:t xml:space="preserve">(the rigorous foundations behind these results)</w:t>
       </w:r>
     </w:p>
-    <w:bookmarkEnd w:id="128"/>
-    <w:bookmarkStart w:id="151" w:name="references"/>
+    <w:bookmarkEnd w:id="131"/>
+    <w:bookmarkStart w:id="154" w:name="references"/>
     <w:p>
       <w:pPr>
         <w:pStyle w:val="Heading2"/>
@@ -47743,8 +49055,8 @@
         <w:t xml:space="preserve">References</w:t>
       </w:r>
     </w:p>
-    <w:bookmarkStart w:id="150" w:name="refs"/>
-    <w:bookmarkStart w:id="130" w:name="ref-calclifesaver"/>
+    <w:bookmarkStart w:id="153" w:name="refs"/>
+    <w:bookmarkStart w:id="133" w:name="ref-calclifesaver"/>
     <w:p>
       <w:pPr>
         <w:pStyle w:val="Bibliography"/>
@@ -47768,7 +49080,7 @@
       <w:r>
         <w:t xml:space="preserve"> </w:t>
       </w:r>
-      <w:hyperlink r:id="rId129">
+      <w:hyperlink r:id="rId132">
         <w:r>
           <w:rPr>
             <w:rStyle w:val="Hyperlink"/>
@@ -47780,8 +49092,8 @@
         <w:t xml:space="preserve">.</w:t>
       </w:r>
     </w:p>
-    <w:bookmarkEnd w:id="130"/>
-    <w:bookmarkStart w:id="131" w:name="ref-billingsley1995probability"/>
+    <w:bookmarkEnd w:id="133"/>
+    <w:bookmarkStart w:id="134" w:name="ref-billingsley1995probability"/>
     <w:p>
       <w:pPr>
         <w:pStyle w:val="Bibliography"/>
@@ -47803,8 +49115,8 @@
         <w:t xml:space="preserve">. 3rd ed. Wiley Series in Probability and Mathematical Statistics. Wiley.</w:t>
       </w:r>
     </w:p>
-    <w:bookmarkEnd w:id="131"/>
-    <w:bookmarkStart w:id="132" w:name="ref-fubini1907"/>
+    <w:bookmarkEnd w:id="134"/>
+    <w:bookmarkStart w:id="135" w:name="ref-fubini1907"/>
     <w:p>
       <w:pPr>
         <w:pStyle w:val="Bibliography"/>
@@ -47835,8 +49147,8 @@
         <w:t xml:space="preserve">16: 608–14.</w:t>
       </w:r>
     </w:p>
-    <w:bookmarkEnd w:id="132"/>
-    <w:bookmarkStart w:id="134" w:name="ref-realanalysislifesaver"/>
+    <w:bookmarkEnd w:id="135"/>
+    <w:bookmarkStart w:id="137" w:name="ref-realanalysislifesaver"/>
     <w:p>
       <w:pPr>
         <w:pStyle w:val="Bibliography"/>
@@ -47860,7 +49172,7 @@
       <w:r>
         <w:t xml:space="preserve"> </w:t>
       </w:r>
-      <w:hyperlink r:id="rId133">
+      <w:hyperlink r:id="rId136">
         <w:r>
           <w:rPr>
             <w:rStyle w:val="Hyperlink"/>
@@ -47872,8 +49184,8 @@
         <w:t xml:space="preserve">.</w:t>
       </w:r>
     </w:p>
-    <w:bookmarkEnd w:id="134"/>
-    <w:bookmarkStart w:id="136" w:name="ref-gut2013"/>
+    <w:bookmarkEnd w:id="137"/>
+    <w:bookmarkStart w:id="139" w:name="ref-gut2013"/>
     <w:p>
       <w:pPr>
         <w:pStyle w:val="Bibliography"/>
@@ -47897,7 +49209,7 @@
       <w:r>
         <w:t xml:space="preserve"> </w:t>
       </w:r>
-      <w:hyperlink r:id="rId135">
+      <w:hyperlink r:id="rId138">
         <w:r>
           <w:rPr>
             <w:rStyle w:val="Hyperlink"/>
@@ -47909,8 +49221,8 @@
         <w:t xml:space="preserve">.</w:t>
       </w:r>
     </w:p>
-    <w:bookmarkEnd w:id="136"/>
-    <w:bookmarkStart w:id="138" w:name="ref-mosaiccalc"/>
+    <w:bookmarkEnd w:id="139"/>
+    <w:bookmarkStart w:id="141" w:name="ref-mosaiccalc"/>
     <w:p>
       <w:pPr>
         <w:pStyle w:val="Bibliography"/>
@@ -47934,7 +49246,7 @@
       <w:r>
         <w:t xml:space="preserve"> </w:t>
       </w:r>
-      <w:hyperlink r:id="rId137">
+      <w:hyperlink r:id="rId140">
         <w:r>
           <w:rPr>
             <w:rStyle w:val="Hyperlink"/>
@@ -47946,8 +49258,8 @@
         <w:t xml:space="preserve">.</w:t>
       </w:r>
     </w:p>
-    <w:bookmarkEnd w:id="138"/>
-    <w:bookmarkStart w:id="140" w:name="ref-khuri2003advanced"/>
+    <w:bookmarkEnd w:id="141"/>
+    <w:bookmarkStart w:id="143" w:name="ref-khuri2003advanced"/>
     <w:p>
       <w:pPr>
         <w:pStyle w:val="Bibliography"/>
@@ -47971,7 +49283,7 @@
       <w:r>
         <w:t xml:space="preserve"> </w:t>
       </w:r>
-      <w:hyperlink r:id="rId139">
+      <w:hyperlink r:id="rId142">
         <w:r>
           <w:rPr>
             <w:rStyle w:val="Hyperlink"/>
@@ -47983,8 +49295,8 @@
         <w:t xml:space="preserve">.</w:t>
       </w:r>
     </w:p>
-    <w:bookmarkEnd w:id="140"/>
-    <w:bookmarkStart w:id="142" w:name="ref-kleinbaum2012survival"/>
+    <w:bookmarkEnd w:id="143"/>
+    <w:bookmarkStart w:id="145" w:name="ref-kleinbaum2012survival"/>
     <w:p>
       <w:pPr>
         <w:pStyle w:val="Bibliography"/>
@@ -48008,7 +49320,7 @@
       <w:r>
         <w:t xml:space="preserve"> </w:t>
       </w:r>
-      <w:hyperlink r:id="rId141">
+      <w:hyperlink r:id="rId144">
         <w:r>
           <w:rPr>
             <w:rStyle w:val="Hyperlink"/>
@@ -48020,8 +49332,8 @@
         <w:t xml:space="preserve">.</w:t>
       </w:r>
     </w:p>
-    <w:bookmarkEnd w:id="142"/>
-    <w:bookmarkStart w:id="144" w:name="ref-larsonCalc11e"/>
+    <w:bookmarkEnd w:id="145"/>
+    <w:bookmarkStart w:id="147" w:name="ref-larsonCalc11e"/>
     <w:p>
       <w:pPr>
         <w:pStyle w:val="Bibliography"/>
@@ -48045,7 +49357,7 @@
       <w:r>
         <w:t xml:space="preserve"> </w:t>
       </w:r>
-      <w:hyperlink r:id="rId143">
+      <w:hyperlink r:id="rId146">
         <w:r>
           <w:rPr>
             <w:rStyle w:val="Hyperlink"/>
@@ -48057,8 +49369,8 @@
         <w:t xml:space="preserve">.</w:t>
       </w:r>
     </w:p>
-    <w:bookmarkEnd w:id="144"/>
-    <w:bookmarkStart w:id="146" w:name="ref-problifesavercalc"/>
+    <w:bookmarkEnd w:id="147"/>
+    <w:bookmarkStart w:id="149" w:name="ref-problifesavercalc"/>
     <w:p>
       <w:pPr>
         <w:pStyle w:val="Bibliography"/>
@@ -48082,7 +49394,7 @@
       <w:r>
         <w:t xml:space="preserve"> </w:t>
       </w:r>
-      <w:hyperlink r:id="rId145">
+      <w:hyperlink r:id="rId148">
         <w:r>
           <w:rPr>
             <w:rStyle w:val="Hyperlink"/>
@@ -48094,8 +49406,8 @@
         <w:t xml:space="preserve">.</w:t>
       </w:r>
     </w:p>
-    <w:bookmarkEnd w:id="146"/>
-    <w:bookmarkStart w:id="147" w:name="ref-rudin1976principles"/>
+    <w:bookmarkEnd w:id="149"/>
+    <w:bookmarkStart w:id="150" w:name="ref-rudin1976principles"/>
     <w:p>
       <w:pPr>
         <w:pStyle w:val="Bibliography"/>
@@ -48117,8 +49429,8 @@
         <w:t xml:space="preserve">. 3rd ed. International Series in Pure and Applied Mathematics. McGraw-Hill.</w:t>
       </w:r>
     </w:p>
-    <w:bookmarkEnd w:id="147"/>
-    <w:bookmarkStart w:id="149" w:name="ref-wp:fubini"/>
+    <w:bookmarkEnd w:id="150"/>
+    <w:bookmarkStart w:id="152" w:name="ref-wp:fubini"/>
     <w:p>
       <w:pPr>
         <w:pStyle w:val="Bibliography"/>
@@ -48177,7 +49489,7 @@
       <w:r>
         <w:t xml:space="preserve"> </w:t>
       </w:r>
-      <w:hyperlink r:id="rId148">
+      <w:hyperlink r:id="rId151">
         <w:r>
           <w:rPr>
             <w:rStyle w:val="Hyperlink"/>
@@ -48189,9 +49501,9 @@
         <w:t xml:space="preserve">.</w:t>
       </w:r>
     </w:p>
-    <w:bookmarkEnd w:id="149"/>
-    <w:bookmarkEnd w:id="150"/>
-    <w:bookmarkEnd w:id="151"/>
+    <w:bookmarkEnd w:id="152"/>
+    <w:bookmarkEnd w:id="153"/>
+    <w:bookmarkEnd w:id="154"/>
     <w:sectPr>
       <w:footnotePr>
         <w:numRestart w:val="eachSect"/>

</xml_diff>

<commit_message>
Deploying to gh-pages from @ Morrison-Lab/mds@9f75a9a69bcd9bf13894ad6509a5aa457a896049 🚀
</commit_message>
<xml_diff>
--- a/calculus.docx
+++ b/calculus.docx
@@ -15,7 +15,7 @@
         <w:pStyle w:val="Date"/>
       </w:pPr>
       <w:r>
-        <w:t xml:space="preserve">Last modified: 2026-10-03 02:36:14 (PDT)</w:t>
+        <w:t xml:space="preserve">Last modified: 2026-10-03 02:55:01 (PDT)</w:t>
       </w:r>
     </w:p>
     <w:bookmarkStart w:id="24" w:name="sec-derivatives"/>
@@ -3452,7 +3452,7 @@
     <w:bookmarkEnd w:id="22"/>
     <w:bookmarkEnd w:id="23"/>
     <w:bookmarkEnd w:id="24"/>
-    <w:bookmarkStart w:id="101" w:name="sec-integration"/>
+    <w:bookmarkStart w:id="102" w:name="sec-integration"/>
     <w:p>
       <w:pPr>
         <w:pStyle w:val="Heading2"/>
@@ -7087,7 +7087,7 @@
     </w:p>
     <w:bookmarkEnd w:id="38"/>
     <w:bookmarkEnd w:id="39"/>
-    <w:bookmarkStart w:id="69" w:name="regularity-conditions"/>
+    <w:bookmarkStart w:id="70" w:name="regularity-conditions"/>
     <w:p>
       <w:pPr>
         <w:pStyle w:val="Heading3"/>
@@ -10270,7 +10270,460 @@
         <w:t xml:space="preserve"> </w:t>
       </w:r>
       <w:r>
-        <w:t xml:space="preserve">if its Riemann integral (</w:t>
+        <w:t xml:space="preserve">if the sums</w:t>
+      </w:r>
+      <w:r>
+        <w:t xml:space="preserve"> </w:t>
+      </w:r>
+      <m:oMath>
+        <m:nary>
+          <m:naryPr>
+            <m:chr m:val="∑"/>
+            <m:limLoc m:val="undOvr"/>
+            <m:subHide m:val="off"/>
+            <m:supHide m:val="off"/>
+          </m:naryPr>
+          <m:sub>
+            <m:r>
+              <m:t>i</m:t>
+            </m:r>
+            <m:r>
+              <m:rPr>
+                <m:sty m:val="p"/>
+              </m:rPr>
+              <m:t>=</m:t>
+            </m:r>
+            <m:r>
+              <m:t>1</m:t>
+            </m:r>
+          </m:sub>
+          <m:sup>
+            <m:r>
+              <m:t>n</m:t>
+            </m:r>
+          </m:sup>
+          <m:e>
+            <m:r>
+              <m:t>f</m:t>
+            </m:r>
+          </m:e>
+        </m:nary>
+        <m:r>
+          <m:rPr>
+            <m:sty m:val="p"/>
+          </m:rPr>
+          <m:t>(</m:t>
+        </m:r>
+        <m:sSubSup>
+          <m:e>
+            <m:r>
+              <m:t>x</m:t>
+            </m:r>
+          </m:e>
+          <m:sub>
+            <m:r>
+              <m:t>i</m:t>
+            </m:r>
+          </m:sub>
+          <m:sup>
+            <m:r>
+              <m:rPr>
+                <m:sty m:val="p"/>
+              </m:rPr>
+              <m:t>*</m:t>
+            </m:r>
+          </m:sup>
+        </m:sSubSup>
+        <m:r>
+          <m:rPr>
+            <m:sty m:val="p"/>
+          </m:rPr>
+          <m:t>)</m:t>
+        </m:r>
+        <m:r>
+          <m:t> </m:t>
+        </m:r>
+        <m:r>
+          <m:rPr>
+            <m:sty m:val="p"/>
+          </m:rPr>
+          <m:t>Δ</m:t>
+        </m:r>
+        <m:sSub>
+          <m:e>
+            <m:r>
+              <m:t>x</m:t>
+            </m:r>
+          </m:e>
+          <m:sub>
+            <m:r>
+              <m:t>i</m:t>
+            </m:r>
+          </m:sub>
+        </m:sSub>
+      </m:oMath>
+      <w:r>
+        <w:t xml:space="preserve">,</w:t>
+      </w:r>
+      <w:r>
+        <w:t xml:space="preserve"> </w:t>
+      </w:r>
+      <w:r>
+        <w:t xml:space="preserve">over partitions</w:t>
+      </w:r>
+      <w:r>
+        <w:t xml:space="preserve"> </w:t>
+      </w:r>
+      <m:oMath>
+        <m:r>
+          <m:rPr>
+            <m:scr m:val="script"/>
+            <m:sty m:val="p"/>
+          </m:rPr>
+          <m:t>P</m:t>
+        </m:r>
+      </m:oMath>
+      <w:r>
+        <w:t xml:space="preserve"> </w:t>
+      </w:r>
+      <w:r>
+        <w:t xml:space="preserve">of</w:t>
+      </w:r>
+      <w:r>
+        <w:t xml:space="preserve"> </w:t>
+      </w:r>
+      <m:oMath>
+        <m:r>
+          <m:rPr>
+            <m:sty m:val="p"/>
+          </m:rPr>
+          <m:t>[</m:t>
+        </m:r>
+        <m:r>
+          <m:t>a</m:t>
+        </m:r>
+        <m:r>
+          <m:rPr>
+            <m:sty m:val="p"/>
+          </m:rPr>
+          <m:t>,</m:t>
+        </m:r>
+        <m:r>
+          <m:t>b</m:t>
+        </m:r>
+        <m:r>
+          <m:rPr>
+            <m:sty m:val="p"/>
+          </m:rPr>
+          <m:t>]</m:t>
+        </m:r>
+      </m:oMath>
+      <w:r>
+        <w:t xml:space="preserve"> </w:t>
+      </w:r>
+      <w:r>
+        <w:t xml:space="preserve">(</w:t>
+      </w:r>
+      <w:hyperlink w:anchor="def-partition">
+        <w:r>
+          <w:rPr>
+            <w:rStyle w:val="Hyperlink"/>
+          </w:rPr>
+          <w:t xml:space="preserve">Definition 8</w:t>
+        </w:r>
+      </w:hyperlink>
+      <w:r>
+        <w:t xml:space="preserve">)</w:t>
+      </w:r>
+      <w:r>
+        <w:t xml:space="preserve"> </w:t>
+      </w:r>
+      <w:r>
+        <w:t xml:space="preserve">with a sample point</w:t>
+      </w:r>
+      <w:r>
+        <w:t xml:space="preserve"> </w:t>
+      </w:r>
+      <m:oMath>
+        <m:sSubSup>
+          <m:e>
+            <m:r>
+              <m:t>x</m:t>
+            </m:r>
+          </m:e>
+          <m:sub>
+            <m:r>
+              <m:t>i</m:t>
+            </m:r>
+          </m:sub>
+          <m:sup>
+            <m:r>
+              <m:rPr>
+                <m:sty m:val="p"/>
+              </m:rPr>
+              <m:t>*</m:t>
+            </m:r>
+          </m:sup>
+        </m:sSubSup>
+      </m:oMath>
+      <w:r>
+        <w:t xml:space="preserve"> </w:t>
+      </w:r>
+      <w:r>
+        <w:t xml:space="preserve">in each subinterval</w:t>
+      </w:r>
+      <w:r>
+        <w:t xml:space="preserve"> </w:t>
+      </w:r>
+      <m:oMath>
+        <m:r>
+          <m:rPr>
+            <m:sty m:val="p"/>
+          </m:rPr>
+          <m:t>[</m:t>
+        </m:r>
+        <m:sSub>
+          <m:e>
+            <m:r>
+              <m:t>x</m:t>
+            </m:r>
+          </m:e>
+          <m:sub>
+            <m:r>
+              <m:t>i</m:t>
+            </m:r>
+            <m:r>
+              <m:rPr>
+                <m:sty m:val="p"/>
+              </m:rPr>
+              <m:t>−</m:t>
+            </m:r>
+            <m:r>
+              <m:t>1</m:t>
+            </m:r>
+          </m:sub>
+        </m:sSub>
+        <m:r>
+          <m:rPr>
+            <m:sty m:val="p"/>
+          </m:rPr>
+          <m:t>,</m:t>
+        </m:r>
+        <m:sSub>
+          <m:e>
+            <m:r>
+              <m:t>x</m:t>
+            </m:r>
+          </m:e>
+          <m:sub>
+            <m:r>
+              <m:t>i</m:t>
+            </m:r>
+          </m:sub>
+        </m:sSub>
+        <m:r>
+          <m:rPr>
+            <m:sty m:val="p"/>
+          </m:rPr>
+          <m:t>]</m:t>
+        </m:r>
+      </m:oMath>
+      <w:r>
+        <w:t xml:space="preserve">,</w:t>
+      </w:r>
+      <w:r>
+        <w:t xml:space="preserve"> </w:t>
+      </w:r>
+      <w:r>
+        <w:t xml:space="preserve">approach a real-number limit as the mesh</w:t>
+      </w:r>
+      <w:r>
+        <w:t xml:space="preserve"> </w:t>
+      </w:r>
+      <m:oMath>
+        <m:r>
+          <m:rPr>
+            <m:sty m:val="p"/>
+          </m:rPr>
+          <m:t>∥</m:t>
+        </m:r>
+        <m:r>
+          <m:rPr>
+            <m:scr m:val="script"/>
+            <m:sty m:val="p"/>
+          </m:rPr>
+          <m:t>P</m:t>
+        </m:r>
+        <m:r>
+          <m:rPr>
+            <m:sty m:val="p"/>
+          </m:rPr>
+          <m:t>∥</m:t>
+        </m:r>
+      </m:oMath>
+      <w:r>
+        <w:t xml:space="preserve"> </w:t>
+      </w:r>
+      <w:r>
+        <w:t xml:space="preserve">(</w:t>
+      </w:r>
+      <w:hyperlink w:anchor="def-mesh">
+        <w:r>
+          <w:rPr>
+            <w:rStyle w:val="Hyperlink"/>
+          </w:rPr>
+          <w:t xml:space="preserve">Definition 9</w:t>
+        </w:r>
+      </w:hyperlink>
+      <w:r>
+        <w:t xml:space="preserve">) shrinks to zero,</w:t>
+      </w:r>
+      <w:r>
+        <w:t xml:space="preserve"> </w:t>
+      </w:r>
+      <w:r>
+        <w:t xml:space="preserve">and that limit is the same</w:t>
+      </w:r>
+      <w:r>
+        <w:t xml:space="preserve"> </w:t>
+      </w:r>
+      <w:r>
+        <w:t xml:space="preserve">for every choice of the partitions and of the sample points.</w:t>
+      </w:r>
+    </w:p>
+    <w:p>
+      <w:pPr>
+        <w:pStyle w:val="BodyText"/>
+      </w:pPr>
+      <w:r>
+        <w:t xml:space="preserve">(Larson and Edwards 2018, sec. 4.3, p. 272)</w:t>
+      </w:r>
+    </w:p>
+    <w:bookmarkEnd w:id="50"/>
+    <w:bookmarkStart w:id="51" w:name="rem-integrable-integral"/>
+    <w:p>
+      <w:pPr>
+        <w:pStyle w:val="BodyText"/>
+      </w:pPr>
+      <w:r>
+        <w:rPr>
+          <w:i/>
+          <w:iCs/>
+        </w:rPr>
+        <w:t xml:space="preserve">Remark 1</w:t>
+      </w:r>
+      <w:r>
+        <w:t xml:space="preserve"> (Riemann integrable functions and Riemann integrals). </w:t>
+      </w:r>
+      <w:r>
+        <w:t xml:space="preserve">A bounded function</w:t>
+      </w:r>
+      <w:r>
+        <w:t xml:space="preserve"> </w:t>
+      </w:r>
+      <m:oMath>
+        <m:r>
+          <m:t>f</m:t>
+        </m:r>
+      </m:oMath>
+      <w:r>
+        <w:t xml:space="preserve"> </w:t>
+      </w:r>
+      <w:r>
+        <w:t xml:space="preserve">is Riemann integrable on</w:t>
+      </w:r>
+      <w:r>
+        <w:t xml:space="preserve"> </w:t>
+      </w:r>
+      <m:oMath>
+        <m:r>
+          <m:rPr>
+            <m:sty m:val="p"/>
+          </m:rPr>
+          <m:t>[</m:t>
+        </m:r>
+        <m:r>
+          <m:t>a</m:t>
+        </m:r>
+        <m:r>
+          <m:rPr>
+            <m:sty m:val="p"/>
+          </m:rPr>
+          <m:t>,</m:t>
+        </m:r>
+        <m:r>
+          <m:t>b</m:t>
+        </m:r>
+        <m:r>
+          <m:rPr>
+            <m:sty m:val="p"/>
+          </m:rPr>
+          <m:t>]</m:t>
+        </m:r>
+      </m:oMath>
+      <w:r>
+        <w:t xml:space="preserve"> </w:t>
+      </w:r>
+      <w:r>
+        <w:t xml:space="preserve">exactly when its Riemann integral</w:t>
+      </w:r>
+      <w:r>
+        <w:t xml:space="preserve"> </w:t>
+      </w:r>
+      <m:oMath>
+        <m:nary>
+          <m:naryPr>
+            <m:chr m:val="∫"/>
+            <m:limLoc m:val="subSup"/>
+            <m:subHide m:val="off"/>
+            <m:supHide m:val="off"/>
+          </m:naryPr>
+          <m:sub>
+            <m:r>
+              <m:t>a</m:t>
+            </m:r>
+          </m:sub>
+          <m:sup>
+            <m:r>
+              <m:t>b</m:t>
+            </m:r>
+          </m:sup>
+          <m:e>
+            <m:r>
+              <m:t>f</m:t>
+            </m:r>
+          </m:e>
+        </m:nary>
+        <m:r>
+          <m:rPr>
+            <m:sty m:val="p"/>
+          </m:rPr>
+          <m:t>(</m:t>
+        </m:r>
+        <m:r>
+          <m:t>x</m:t>
+        </m:r>
+        <m:r>
+          <m:rPr>
+            <m:sty m:val="p"/>
+          </m:rPr>
+          <m:t>)</m:t>
+        </m:r>
+        <m:r>
+          <m:t> </m:t>
+        </m:r>
+        <m:r>
+          <m:t>d</m:t>
+        </m:r>
+        <m:r>
+          <m:t>x</m:t>
+        </m:r>
+      </m:oMath>
+      <w:r>
+        <w:t xml:space="preserve"> </w:t>
+      </w:r>
+      <w:r>
+        <w:t xml:space="preserve">(</w:t>
       </w:r>
       <w:hyperlink w:anchor="def-riemann-integral">
         <w:r>
@@ -10281,20 +10734,148 @@
         </w:r>
       </w:hyperlink>
       <w:r>
-        <w:t xml:space="preserve">) over</w:t>
+        <w:t xml:space="preserve">) exists;</w:t>
+      </w:r>
+      <w:r>
+        <w:t xml:space="preserve"> </w:t>
+      </w:r>
+      <w:r>
+        <w:t xml:space="preserve">the integral is the common limit of the sums.</w:t>
+      </w:r>
+      <w:r>
+        <w:t xml:space="preserve"> </w:t>
+      </w:r>
+      <w:r>
+        <w:t xml:space="preserve">For example, let</w:t>
       </w:r>
       <w:r>
         <w:t xml:space="preserve"> </w:t>
       </w:r>
       <m:oMath>
         <m:r>
+          <m:t>g</m:t>
+        </m:r>
+        <m:r>
+          <m:rPr>
+            <m:sty m:val="p"/>
+          </m:rPr>
+          <m:t>(</m:t>
+        </m:r>
+        <m:r>
+          <m:t>x</m:t>
+        </m:r>
+        <m:r>
+          <m:rPr>
+            <m:sty m:val="p"/>
+          </m:rPr>
+          <m:t>)</m:t>
+        </m:r>
+        <m:r>
+          <m:rPr>
+            <m:sty m:val="p"/>
+          </m:rPr>
+          <m:t>=</m:t>
+        </m:r>
+        <m:r>
+          <m:t>1</m:t>
+        </m:r>
+      </m:oMath>
+      <w:r>
+        <w:t xml:space="preserve"> </w:t>
+      </w:r>
+      <w:r>
+        <w:t xml:space="preserve">when</w:t>
+      </w:r>
+      <w:r>
+        <w:t xml:space="preserve"> </w:t>
+      </w:r>
+      <m:oMath>
+        <m:r>
+          <m:t>x</m:t>
+        </m:r>
+      </m:oMath>
+      <w:r>
+        <w:t xml:space="preserve"> </w:t>
+      </w:r>
+      <w:r>
+        <w:t xml:space="preserve">is rational</w:t>
+      </w:r>
+      <w:r>
+        <w:t xml:space="preserve"> </w:t>
+      </w:r>
+      <w:r>
+        <w:t xml:space="preserve">and</w:t>
+      </w:r>
+      <w:r>
+        <w:t xml:space="preserve"> </w:t>
+      </w:r>
+      <m:oMath>
+        <m:r>
+          <m:t>g</m:t>
+        </m:r>
+        <m:r>
+          <m:rPr>
+            <m:sty m:val="p"/>
+          </m:rPr>
+          <m:t>(</m:t>
+        </m:r>
+        <m:r>
+          <m:t>x</m:t>
+        </m:r>
+        <m:r>
+          <m:rPr>
+            <m:sty m:val="p"/>
+          </m:rPr>
+          <m:t>)</m:t>
+        </m:r>
+        <m:r>
+          <m:rPr>
+            <m:sty m:val="p"/>
+          </m:rPr>
+          <m:t>=</m:t>
+        </m:r>
+        <m:r>
+          <m:t>0</m:t>
+        </m:r>
+      </m:oMath>
+      <w:r>
+        <w:t xml:space="preserve"> </w:t>
+      </w:r>
+      <w:r>
+        <w:t xml:space="preserve">when</w:t>
+      </w:r>
+      <w:r>
+        <w:t xml:space="preserve"> </w:t>
+      </w:r>
+      <m:oMath>
+        <m:r>
+          <m:t>x</m:t>
+        </m:r>
+      </m:oMath>
+      <w:r>
+        <w:t xml:space="preserve"> </w:t>
+      </w:r>
+      <w:r>
+        <w:t xml:space="preserve">is irrational,</w:t>
+      </w:r>
+      <w:r>
+        <w:t xml:space="preserve"> </w:t>
+      </w:r>
+      <w:r>
+        <w:t xml:space="preserve">on</w:t>
+      </w:r>
+      <w:r>
+        <w:t xml:space="preserve"> </w:t>
+      </w:r>
+      <m:oMath>
+        <m:r>
           <m:rPr>
             <m:sty m:val="p"/>
           </m:rPr>
           <m:t>[</m:t>
         </m:r>
         <m:r>
-          <m:t>a</m:t>
+          <m:t>0</m:t>
         </m:r>
         <m:r>
           <m:rPr>
@@ -10303,7 +10884,7 @@
           <m:t>,</m:t>
         </m:r>
         <m:r>
-          <m:t>b</m:t>
+          <m:t>1</m:t>
         </m:r>
         <m:r>
           <m:rPr>
@@ -10313,22 +10894,399 @@
         </m:r>
       </m:oMath>
       <w:r>
-        <w:t xml:space="preserve"> </w:t>
-      </w:r>
-      <w:r>
-        <w:t xml:space="preserve">exists and is finite.</w:t>
+        <w:t xml:space="preserve">.</w:t>
+      </w:r>
+      <w:r>
+        <w:t xml:space="preserve"> </w:t>
+      </w:r>
+      <w:r>
+        <w:t xml:space="preserve">Every subinterval contains both rational and irrational points.</w:t>
+      </w:r>
+      <w:r>
+        <w:t xml:space="preserve"> </w:t>
+      </w:r>
+      <w:r>
+        <w:t xml:space="preserve">Choosing every sample point rational gives</w:t>
+      </w:r>
+      <w:r>
+        <w:t xml:space="preserve"> </w:t>
+      </w:r>
+      <m:oMath>
+        <m:nary>
+          <m:naryPr>
+            <m:chr m:val="∑"/>
+            <m:limLoc m:val="undOvr"/>
+            <m:subHide m:val="off"/>
+            <m:supHide m:val="off"/>
+          </m:naryPr>
+          <m:sub>
+            <m:r>
+              <m:t>i</m:t>
+            </m:r>
+            <m:r>
+              <m:rPr>
+                <m:sty m:val="p"/>
+              </m:rPr>
+              <m:t>=</m:t>
+            </m:r>
+            <m:r>
+              <m:t>1</m:t>
+            </m:r>
+          </m:sub>
+          <m:sup>
+            <m:r>
+              <m:t>n</m:t>
+            </m:r>
+          </m:sup>
+          <m:e>
+            <m:r>
+              <m:t>1</m:t>
+            </m:r>
+          </m:e>
+        </m:nary>
+        <m:r>
+          <m:rPr>
+            <m:sty m:val="p"/>
+          </m:rPr>
+          <m:t>⋅</m:t>
+        </m:r>
+        <m:r>
+          <m:rPr>
+            <m:sty m:val="p"/>
+          </m:rPr>
+          <m:t>Δ</m:t>
+        </m:r>
+        <m:sSub>
+          <m:e>
+            <m:r>
+              <m:t>x</m:t>
+            </m:r>
+          </m:e>
+          <m:sub>
+            <m:r>
+              <m:t>i</m:t>
+            </m:r>
+          </m:sub>
+        </m:sSub>
+        <m:r>
+          <m:rPr>
+            <m:sty m:val="p"/>
+          </m:rPr>
+          <m:t>=</m:t>
+        </m:r>
+        <m:r>
+          <m:t>1</m:t>
+        </m:r>
+      </m:oMath>
+      <w:r>
+        <w:t xml:space="preserve"> </w:t>
+      </w:r>
+      <w:r>
+        <w:t xml:space="preserve">for every partition,</w:t>
+      </w:r>
+      <w:r>
+        <w:t xml:space="preserve"> </w:t>
+      </w:r>
+      <w:r>
+        <w:t xml:space="preserve">because the widths</w:t>
+      </w:r>
+      <w:r>
+        <w:t xml:space="preserve"> </w:t>
+      </w:r>
+      <m:oMath>
+        <m:r>
+          <m:rPr>
+            <m:sty m:val="p"/>
+          </m:rPr>
+          <m:t>Δ</m:t>
+        </m:r>
+        <m:sSub>
+          <m:e>
+            <m:r>
+              <m:t>x</m:t>
+            </m:r>
+          </m:e>
+          <m:sub>
+            <m:r>
+              <m:t>i</m:t>
+            </m:r>
+          </m:sub>
+        </m:sSub>
+      </m:oMath>
+      <w:r>
+        <w:t xml:space="preserve"> </w:t>
+      </w:r>
+      <w:r>
+        <w:t xml:space="preserve">add up to the length</w:t>
+      </w:r>
+      <w:r>
+        <w:t xml:space="preserve"> </w:t>
+      </w:r>
+      <m:oMath>
+        <m:r>
+          <m:t>1</m:t>
+        </m:r>
+        <m:r>
+          <m:rPr>
+            <m:sty m:val="p"/>
+          </m:rPr>
+          <m:t>−</m:t>
+        </m:r>
+        <m:r>
+          <m:t>0</m:t>
+        </m:r>
+        <m:r>
+          <m:rPr>
+            <m:sty m:val="p"/>
+          </m:rPr>
+          <m:t>=</m:t>
+        </m:r>
+        <m:r>
+          <m:t>1</m:t>
+        </m:r>
+      </m:oMath>
+      <w:r>
+        <w:t xml:space="preserve"> </w:t>
+      </w:r>
+      <w:r>
+        <w:t xml:space="preserve">of</w:t>
+      </w:r>
+      <w:r>
+        <w:t xml:space="preserve"> </w:t>
+      </w:r>
+      <m:oMath>
+        <m:r>
+          <m:rPr>
+            <m:sty m:val="p"/>
+          </m:rPr>
+          <m:t>[</m:t>
+        </m:r>
+        <m:r>
+          <m:t>0</m:t>
+        </m:r>
+        <m:r>
+          <m:rPr>
+            <m:sty m:val="p"/>
+          </m:rPr>
+          <m:t>,</m:t>
+        </m:r>
+        <m:r>
+          <m:t>1</m:t>
+        </m:r>
+        <m:r>
+          <m:rPr>
+            <m:sty m:val="p"/>
+          </m:rPr>
+          <m:t>]</m:t>
+        </m:r>
+      </m:oMath>
+      <w:r>
+        <w:t xml:space="preserve">,</w:t>
+      </w:r>
+      <w:r>
+        <w:t xml:space="preserve"> </w:t>
+      </w:r>
+      <w:r>
+        <w:t xml:space="preserve">and choosing every sample point irrational gives</w:t>
+      </w:r>
+      <w:r>
+        <w:t xml:space="preserve"> </w:t>
+      </w:r>
+      <m:oMath>
+        <m:nary>
+          <m:naryPr>
+            <m:chr m:val="∑"/>
+            <m:limLoc m:val="undOvr"/>
+            <m:subHide m:val="off"/>
+            <m:supHide m:val="off"/>
+          </m:naryPr>
+          <m:sub>
+            <m:r>
+              <m:t>i</m:t>
+            </m:r>
+            <m:r>
+              <m:rPr>
+                <m:sty m:val="p"/>
+              </m:rPr>
+              <m:t>=</m:t>
+            </m:r>
+            <m:r>
+              <m:t>1</m:t>
+            </m:r>
+          </m:sub>
+          <m:sup>
+            <m:r>
+              <m:t>n</m:t>
+            </m:r>
+          </m:sup>
+          <m:e>
+            <m:r>
+              <m:t>0</m:t>
+            </m:r>
+          </m:e>
+        </m:nary>
+        <m:r>
+          <m:rPr>
+            <m:sty m:val="p"/>
+          </m:rPr>
+          <m:t>⋅</m:t>
+        </m:r>
+        <m:r>
+          <m:rPr>
+            <m:sty m:val="p"/>
+          </m:rPr>
+          <m:t>Δ</m:t>
+        </m:r>
+        <m:sSub>
+          <m:e>
+            <m:r>
+              <m:t>x</m:t>
+            </m:r>
+          </m:e>
+          <m:sub>
+            <m:r>
+              <m:t>i</m:t>
+            </m:r>
+          </m:sub>
+        </m:sSub>
+        <m:r>
+          <m:rPr>
+            <m:sty m:val="p"/>
+          </m:rPr>
+          <m:t>=</m:t>
+        </m:r>
+        <m:r>
+          <m:t>0</m:t>
+        </m:r>
+      </m:oMath>
+      <w:r>
+        <w:t xml:space="preserve">.</w:t>
+      </w:r>
+      <w:r>
+        <w:t xml:space="preserve"> </w:t>
+      </w:r>
+      <w:r>
+        <w:t xml:space="preserve">The two limits differ,</w:t>
+      </w:r>
+      <w:r>
+        <w:t xml:space="preserve"> </w:t>
+      </w:r>
+      <w:r>
+        <w:t xml:space="preserve">so</w:t>
+      </w:r>
+      <w:r>
+        <w:t xml:space="preserve"> </w:t>
+      </w:r>
+      <m:oMath>
+        <m:r>
+          <m:t>g</m:t>
+        </m:r>
+      </m:oMath>
+      <w:r>
+        <w:t xml:space="preserve"> </w:t>
+      </w:r>
+      <w:r>
+        <w:t xml:space="preserve">is not Riemann integrable on</w:t>
+      </w:r>
+      <w:r>
+        <w:t xml:space="preserve"> </w:t>
+      </w:r>
+      <m:oMath>
+        <m:r>
+          <m:rPr>
+            <m:sty m:val="p"/>
+          </m:rPr>
+          <m:t>[</m:t>
+        </m:r>
+        <m:r>
+          <m:t>0</m:t>
+        </m:r>
+        <m:r>
+          <m:rPr>
+            <m:sty m:val="p"/>
+          </m:rPr>
+          <m:t>,</m:t>
+        </m:r>
+        <m:r>
+          <m:t>1</m:t>
+        </m:r>
+        <m:r>
+          <m:rPr>
+            <m:sty m:val="p"/>
+          </m:rPr>
+          <m:t>]</m:t>
+        </m:r>
+      </m:oMath>
+      <w:r>
+        <w:t xml:space="preserve">,</w:t>
+      </w:r>
+      <w:r>
+        <w:t xml:space="preserve"> </w:t>
+      </w:r>
+      <w:r>
+        <w:t xml:space="preserve">and</w:t>
+      </w:r>
+      <w:r>
+        <w:t xml:space="preserve"> </w:t>
+      </w:r>
+      <m:oMath>
+        <m:nary>
+          <m:naryPr>
+            <m:chr m:val="∫"/>
+            <m:limLoc m:val="subSup"/>
+            <m:subHide m:val="off"/>
+            <m:supHide m:val="off"/>
+          </m:naryPr>
+          <m:sub>
+            <m:r>
+              <m:t>0</m:t>
+            </m:r>
+          </m:sub>
+          <m:sup>
+            <m:r>
+              <m:t>1</m:t>
+            </m:r>
+          </m:sup>
+          <m:e>
+            <m:r>
+              <m:t>g</m:t>
+            </m:r>
+          </m:e>
+        </m:nary>
+        <m:r>
+          <m:rPr>
+            <m:sty m:val="p"/>
+          </m:rPr>
+          <m:t>(</m:t>
+        </m:r>
+        <m:r>
+          <m:t>x</m:t>
+        </m:r>
+        <m:r>
+          <m:rPr>
+            <m:sty m:val="p"/>
+          </m:rPr>
+          <m:t>)</m:t>
+        </m:r>
+        <m:r>
+          <m:t> </m:t>
+        </m:r>
+        <m:r>
+          <m:t>d</m:t>
+        </m:r>
+        <m:r>
+          <m:t>x</m:t>
+        </m:r>
+      </m:oMath>
+      <w:r>
+        <w:t xml:space="preserve"> </w:t>
+      </w:r>
+      <w:r>
+        <w:t xml:space="preserve">does not exist.</w:t>
       </w:r>
     </w:p>
-    <w:p>
-      <w:pPr>
-        <w:pStyle w:val="BodyText"/>
-      </w:pPr>
-      <w:r>
-        <w:t xml:space="preserve">(Larson and Edwards 2018, sec. 4.3, p. 272)</w:t>
-      </w:r>
-    </w:p>
-    <w:bookmarkEnd w:id="50"/>
-    <w:bookmarkStart w:id="51" w:name="def-riemann-sum-equal-width"/>
+    <w:bookmarkEnd w:id="51"/>
+    <w:bookmarkStart w:id="52" w:name="def-riemann-sum-equal-width"/>
     <w:p>
       <w:pPr>
         <w:pStyle w:val="BodyText"/>
@@ -10726,8 +11684,8 @@
         </m:oMath>
       </m:oMathPara>
     </w:p>
-    <w:bookmarkEnd w:id="51"/>
-    <w:bookmarkStart w:id="52" w:name="exm-equal-width-sum"/>
+    <w:bookmarkEnd w:id="52"/>
+    <w:bookmarkStart w:id="53" w:name="exm-equal-width-sum"/>
     <w:p>
       <w:pPr>
         <w:pStyle w:val="FirstParagraph"/>
@@ -11328,7 +12286,7 @@
         </m:oMath>
       </m:oMathPara>
     </w:p>
-    <w:bookmarkEnd w:id="52"/>
+    <w:bookmarkEnd w:id="53"/>
     <w:p>
       <w:pPr>
         <w:pStyle w:val="FirstParagraph"/>
@@ -11449,7 +12407,7 @@
         <w:t xml:space="preserve">which says what continuity buys us.</w:t>
       </w:r>
     </w:p>
-    <w:bookmarkStart w:id="53" w:name="thm-diff-implies-cont"/>
+    <w:bookmarkStart w:id="54" w:name="thm-diff-implies-cont"/>
     <w:p>
       <w:pPr>
         <w:pStyle w:val="BodyText"/>
@@ -11544,7 +12502,7 @@
         <w:t xml:space="preserve">(Larson and Edwards 2018, Theorem 2.1, p. 106)</w:t>
       </w:r>
     </w:p>
-    <w:bookmarkEnd w:id="53"/>
+    <w:bookmarkEnd w:id="54"/>
     <w:p>
       <w:pPr>
         <w:pStyle w:val="BodyText"/>
@@ -12422,7 +13380,7 @@
         <w:t xml:space="preserve">hold.</w:t>
       </w:r>
     </w:p>
-    <w:bookmarkStart w:id="54" w:name="exm-diff-implies-cont"/>
+    <w:bookmarkStart w:id="55" w:name="exm-diff-implies-cont"/>
     <w:p>
       <w:pPr>
         <w:pStyle w:val="BodyText"/>
@@ -12625,8 +13583,8 @@
         <w:t xml:space="preserve">it is continuous everywhere.</w:t>
       </w:r>
     </w:p>
-    <w:bookmarkEnd w:id="54"/>
-    <w:bookmarkStart w:id="59" w:name="exm-cont-not-diff"/>
+    <w:bookmarkEnd w:id="55"/>
+    <w:bookmarkStart w:id="60" w:name="exm-cont-not-diff"/>
     <w:p>
       <w:pPr>
         <w:pStyle w:val="BodyText"/>
@@ -12972,7 +13930,7 @@
       <w:tr>
         <w:tc>
           <w:tcPr/>
-          <w:bookmarkStart w:id="58" w:name="fig-abs-value"/>
+          <w:bookmarkStart w:id="59" w:name="fig-abs-value"/>
           <w:p>
             <w:pPr>
               <w:pStyle w:val="SourceCode"/>
@@ -13408,18 +14366,18 @@
                 <wp:inline>
                   <wp:extent cx="4620126" cy="3696101"/>
                   <wp:effectExtent b="0" l="0" r="0" t="0"/>
-                  <wp:docPr descr="" title="" id="56" name="Picture"/>
+                  <wp:docPr descr="" title="" id="57" name="Picture"/>
                   <a:graphic>
                     <a:graphicData uri="http://schemas.openxmlformats.org/drawingml/2006/picture">
                       <pic:pic>
                         <pic:nvPicPr>
-                          <pic:cNvPr descr="calculus_files/figure-docx/abs-value-code-1.png" id="57" name="Picture"/>
+                          <pic:cNvPr descr="calculus_files/figure-docx/abs-value-code-1.png" id="58" name="Picture"/>
                           <pic:cNvPicPr>
                             <a:picLocks noChangeArrowheads="1" noChangeAspect="1"/>
                           </pic:cNvPicPr>
                         </pic:nvPicPr>
                         <pic:blipFill>
-                          <a:blip r:embed="rId55"/>
+                          <a:blip r:embed="rId56"/>
                           <a:stretch>
                             <a:fillRect/>
                           </a:stretch>
@@ -13542,12 +14500,12 @@
               <w:t xml:space="preserve">but is continuous everywhere: no gaps or jumps.</w:t>
             </w:r>
           </w:p>
-          <w:bookmarkEnd w:id="58"/>
+          <w:bookmarkEnd w:id="59"/>
         </w:tc>
       </w:tr>
     </w:tbl>
-    <w:bookmarkEnd w:id="59"/>
-    <w:bookmarkStart w:id="60" w:name="thm-cont-implies-int"/>
+    <w:bookmarkEnd w:id="60"/>
+    <w:bookmarkStart w:id="61" w:name="thm-cont-implies-int"/>
     <w:p>
       <w:pPr>
         <w:pStyle w:val="BodyText"/>
@@ -13733,8 +14691,8 @@
         <w:t xml:space="preserve">(Larson and Edwards 2018, Theorem 4.4, p. 272)</w:t>
       </w:r>
     </w:p>
-    <w:bookmarkEnd w:id="60"/>
-    <w:bookmarkStart w:id="61" w:name="exm-cont-implies-int"/>
+    <w:bookmarkEnd w:id="61"/>
+    <w:bookmarkStart w:id="62" w:name="exm-cont-implies-int"/>
     <w:p>
       <w:pPr>
         <w:pStyle w:val="BodyText"/>
@@ -13829,8 +14787,8 @@
         <w:t xml:space="preserve">.</w:t>
       </w:r>
     </w:p>
-    <w:bookmarkEnd w:id="61"/>
-    <w:bookmarkStart w:id="66" w:name="exm-int-not-cont"/>
+    <w:bookmarkEnd w:id="62"/>
+    <w:bookmarkStart w:id="67" w:name="exm-int-not-cont"/>
     <w:p>
       <w:pPr>
         <w:pStyle w:val="BodyText"/>
@@ -14356,7 +15314,7 @@
       <w:tr>
         <w:tc>
           <w:tcPr/>
-          <w:bookmarkStart w:id="65" w:name="fig-step"/>
+          <w:bookmarkStart w:id="66" w:name="fig-step"/>
           <w:p>
             <w:pPr>
               <w:pStyle w:val="SourceCode"/>
@@ -15728,18 +16686,18 @@
                 <wp:inline>
                   <wp:extent cx="4620126" cy="3696101"/>
                   <wp:effectExtent b="0" l="0" r="0" t="0"/>
-                  <wp:docPr descr="" title="" id="63" name="Picture"/>
+                  <wp:docPr descr="" title="" id="64" name="Picture"/>
                   <a:graphic>
                     <a:graphicData uri="http://schemas.openxmlformats.org/drawingml/2006/picture">
                       <pic:pic>
                         <pic:nvPicPr>
-                          <pic:cNvPr descr="calculus_files/figure-docx/step-code-1.png" id="64" name="Picture"/>
+                          <pic:cNvPr descr="calculus_files/figure-docx/step-code-1.png" id="65" name="Picture"/>
                           <pic:cNvPicPr>
                             <a:picLocks noChangeArrowheads="1" noChangeAspect="1"/>
                           </pic:cNvPicPr>
                         </pic:nvPicPr>
                         <pic:blipFill>
-                          <a:blip r:embed="rId62"/>
+                          <a:blip r:embed="rId63"/>
                           <a:stretch>
                             <a:fillRect/>
                           </a:stretch>
@@ -16004,11 +16962,11 @@
               <w:t xml:space="preserve">.</w:t>
             </w:r>
           </w:p>
-          <w:bookmarkEnd w:id="65"/>
+          <w:bookmarkEnd w:id="66"/>
         </w:tc>
       </w:tr>
     </w:tbl>
-    <w:bookmarkEnd w:id="66"/>
+    <w:bookmarkEnd w:id="67"/>
     <w:p>
       <w:pPr>
         <w:pStyle w:val="BodyText"/>
@@ -16216,7 +17174,7 @@
         <w:t xml:space="preserve">show that neither implication reverses in general.</w:t>
       </w:r>
     </w:p>
-    <w:bookmarkStart w:id="67" w:name="thm-riemann-general"/>
+    <w:bookmarkStart w:id="68" w:name="thm-riemann-general"/>
     <w:p>
       <w:pPr>
         <w:pStyle w:val="BodyText"/>
@@ -16456,7 +17414,7 @@
         </m:oMath>
       </m:oMathPara>
     </w:p>
-    <w:bookmarkEnd w:id="67"/>
+    <w:bookmarkEnd w:id="68"/>
     <w:p>
       <w:pPr>
         <w:pStyle w:val="FirstParagraph"/>
@@ -16694,7 +17652,7 @@
         <w:t xml:space="preserve">has that value along this sequence too.</w:t>
       </w:r>
     </w:p>
-    <w:bookmarkStart w:id="68" w:name="exm-riemann-equal-width"/>
+    <w:bookmarkStart w:id="69" w:name="exm-riemann-equal-width"/>
     <w:p>
       <w:pPr>
         <w:pStyle w:val="BodyText"/>
@@ -17622,9 +18580,9 @@
         <w:t xml:space="preserve">.</w:t>
       </w:r>
     </w:p>
-    <w:bookmarkEnd w:id="68"/>
     <w:bookmarkEnd w:id="69"/>
-    <w:bookmarkStart w:id="100" w:name="fundamental-theorem-of-calculus"/>
+    <w:bookmarkEnd w:id="70"/>
+    <w:bookmarkStart w:id="101" w:name="fundamental-theorem-of-calculus"/>
     <w:p>
       <w:pPr>
         <w:pStyle w:val="Heading3"/>
@@ -17633,7 +18591,7 @@
         <w:t xml:space="preserve">2.3 Fundamental Theorem of Calculus</w:t>
       </w:r>
     </w:p>
-    <w:bookmarkStart w:id="76" w:name="thm-ftc"/>
+    <w:bookmarkStart w:id="77" w:name="thm-ftc"/>
     <w:p>
       <w:pPr>
         <w:pStyle w:val="FirstParagraph"/>
@@ -17863,7 +18821,7 @@
       <w:pPr>
         <w:pStyle w:val="BodyText"/>
       </w:pPr>
-      <w:bookmarkStart w:id="70" w:name="eq-ftc-deriv-of-integral"/>
+      <w:bookmarkStart w:id="71" w:name="eq-ftc-deriv-of-integral"/>
       <m:oMathPara>
         <m:oMathParaPr>
           <m:jc m:val="center"/>
@@ -17984,7 +18942,7 @@
           </m:r>
         </m:oMath>
       </m:oMathPara>
-      <w:bookmarkEnd w:id="70"/>
+      <w:bookmarkEnd w:id="71"/>
     </w:p>
     <w:tbl>
       <w:tblPr>
@@ -18027,18 +18985,18 @@
                 <wp:inline>
                   <wp:extent cx="152400" cy="152400"/>
                   <wp:effectExtent b="0" l="0" r="0" t="0"/>
-                  <wp:docPr descr="" title="" id="72" name="Picture"/>
+                  <wp:docPr descr="" title="" id="73" name="Picture"/>
                   <a:graphic>
                     <a:graphicData uri="http://schemas.openxmlformats.org/drawingml/2006/picture">
                       <pic:pic>
                         <pic:nvPicPr>
-                          <pic:cNvPr descr="/opt/quarto/share/formats/docx/note.png" id="73" name="Picture"/>
+                          <pic:cNvPr descr="/opt/quarto/share/formats/docx/note.png" id="74" name="Picture"/>
                           <pic:cNvPicPr>
                             <a:picLocks noChangeArrowheads="1" noChangeAspect="1"/>
                           </pic:cNvPicPr>
                         </pic:nvPicPr>
                         <pic:blipFill>
-                          <a:blip r:embed="rId71"/>
+                          <a:blip r:embed="rId72"/>
                           <a:stretch>
                             <a:fillRect/>
                           </a:stretch>
@@ -18544,7 +19502,7 @@
       <w:pPr>
         <w:pStyle w:val="BodyText"/>
       </w:pPr>
-      <w:bookmarkStart w:id="74" w:name="eq-ftc-part2"/>
+      <w:bookmarkStart w:id="75" w:name="eq-ftc-part2"/>
       <m:oMathPara>
         <m:oMathParaPr>
           <m:jc m:val="center"/>
@@ -18665,7 +19623,7 @@
           </m:r>
         </m:oMath>
       </m:oMathPara>
-      <w:bookmarkEnd w:id="74"/>
+      <w:bookmarkEnd w:id="75"/>
     </w:p>
     <w:p>
       <w:pPr>
@@ -18735,7 +19693,7 @@
       <w:pPr>
         <w:pStyle w:val="BodyText"/>
       </w:pPr>
-      <w:bookmarkStart w:id="75" w:name="eq-ftc-integral-of-deriv"/>
+      <w:bookmarkStart w:id="76" w:name="eq-ftc-integral-of-deriv"/>
       <m:oMathPara>
         <m:oMathParaPr>
           <m:jc m:val="center"/>
@@ -18868,7 +19826,7 @@
           </m:r>
         </m:oMath>
       </m:oMathPara>
-      <w:bookmarkEnd w:id="75"/>
+      <w:bookmarkEnd w:id="76"/>
     </w:p>
     <w:p>
       <w:pPr>
@@ -18996,7 +19954,7 @@
         <w:t xml:space="preserve">(Banner 2007, chap. 18; Larson and Edwards 2018, Theorem 4.9, p. 282)</w:t>
       </w:r>
     </w:p>
-    <w:bookmarkEnd w:id="76"/>
+    <w:bookmarkEnd w:id="77"/>
     <w:p>
       <w:pPr>
         <w:pStyle w:val="BodyText"/>
@@ -19363,7 +20321,7 @@
         <w:t xml:space="preserve">a common situation in applied statistics.</w:t>
       </w:r>
     </w:p>
-    <w:bookmarkStart w:id="86" w:name="exm-ftc-part1-accumulation"/>
+    <w:bookmarkStart w:id="87" w:name="exm-ftc-part1-accumulation"/>
     <w:p>
       <w:pPr>
         <w:pStyle w:val="BodyText"/>
@@ -20072,7 +21030,7 @@
         <w:t xml:space="preserve">).</w:t>
       </w:r>
     </w:p>
-    <w:bookmarkStart w:id="85" w:name="fig-ftc-part1"/>
+    <w:bookmarkStart w:id="86" w:name="fig-ftc-part1"/>
     <w:tbl>
       <w:tblPr>
         <w:tblStyle w:val="Table"/>
@@ -20100,7 +21058,7 @@
             <w:tr>
               <w:tc>
                 <w:tcPr/>
-                <w:bookmarkStart w:id="80" w:name="fig-ftc-part1-left"/>
+                <w:bookmarkStart w:id="81" w:name="fig-ftc-part1-left"/>
                 <w:p>
                   <w:pPr>
                     <w:pStyle w:val="SourceCode"/>
@@ -20940,18 +21898,18 @@
                       <wp:inline>
                         <wp:extent cx="2971800" cy="2377440"/>
                         <wp:effectExtent b="0" l="0" r="0" t="0"/>
-                        <wp:docPr descr="" title="" id="78" name="Picture"/>
+                        <wp:docPr descr="" title="" id="79" name="Picture"/>
                         <a:graphic>
                           <a:graphicData uri="http://schemas.openxmlformats.org/drawingml/2006/picture">
                             <pic:pic>
                               <pic:nvPicPr>
-                                <pic:cNvPr descr="calculus_files/figure-docx/ftc-part1-left-code-1.png" id="79" name="Picture"/>
+                                <pic:cNvPr descr="calculus_files/figure-docx/ftc-part1-left-code-1.png" id="80" name="Picture"/>
                                 <pic:cNvPicPr>
                                   <a:picLocks noChangeArrowheads="1" noChangeAspect="1"/>
                                 </pic:cNvPicPr>
                               </pic:nvPicPr>
                               <pic:blipFill>
-                                <a:blip r:embed="rId77"/>
+                                <a:blip r:embed="rId78"/>
                                 <a:stretch>
                                   <a:fillRect/>
                                 </a:stretch>
@@ -21115,7 +22073,7 @@
                     <w:t xml:space="preserve">.</w:t>
                   </w:r>
                 </w:p>
-                <w:bookmarkEnd w:id="80"/>
+                <w:bookmarkEnd w:id="81"/>
               </w:tc>
             </w:tr>
           </w:tbl>
@@ -21165,7 +22123,7 @@
             <w:tr>
               <w:tc>
                 <w:tcPr/>
-                <w:bookmarkStart w:id="84" w:name="fig-ftc-part1-right"/>
+                <w:bookmarkStart w:id="85" w:name="fig-ftc-part1-right"/>
                 <w:p>
                   <w:pPr>
                     <w:pStyle w:val="SourceCode"/>
@@ -22239,18 +23197,18 @@
                       <wp:inline>
                         <wp:extent cx="2971800" cy="2377440"/>
                         <wp:effectExtent b="0" l="0" r="0" t="0"/>
-                        <wp:docPr descr="" title="" id="82" name="Picture"/>
+                        <wp:docPr descr="" title="" id="83" name="Picture"/>
                         <a:graphic>
                           <a:graphicData uri="http://schemas.openxmlformats.org/drawingml/2006/picture">
                             <pic:pic>
                               <pic:nvPicPr>
-                                <pic:cNvPr descr="calculus_files/figure-docx/ftc-part1-right-code-1.png" id="83" name="Picture"/>
+                                <pic:cNvPr descr="calculus_files/figure-docx/ftc-part1-right-code-1.png" id="84" name="Picture"/>
                                 <pic:cNvPicPr>
                                   <a:picLocks noChangeArrowheads="1" noChangeAspect="1"/>
                                 </pic:cNvPicPr>
                               </pic:nvPicPr>
                               <pic:blipFill>
-                                <a:blip r:embed="rId81"/>
+                                <a:blip r:embed="rId82"/>
                                 <a:stretch>
                                   <a:fillRect/>
                                 </a:stretch>
@@ -22387,7 +23345,7 @@
                     <w:t xml:space="preserve">.</w:t>
                   </w:r>
                 </w:p>
-                <w:bookmarkEnd w:id="84"/>
+                <w:bookmarkEnd w:id="85"/>
               </w:tc>
             </w:tr>
           </w:tbl>
@@ -22670,9 +23628,9 @@
         <w:t xml:space="preserve">.</w:t>
       </w:r>
     </w:p>
-    <w:bookmarkEnd w:id="85"/>
     <w:bookmarkEnd w:id="86"/>
-    <w:bookmarkStart w:id="99" w:name="exm-ftc-cdf-pdf"/>
+    <w:bookmarkEnd w:id="87"/>
+    <w:bookmarkStart w:id="100" w:name="exm-ftc-cdf-pdf"/>
     <w:p>
       <w:pPr>
         <w:pStyle w:val="BodyText"/>
@@ -22794,7 +23752,7 @@
       <w:r>
         <w:t xml:space="preserve"> </w:t>
       </w:r>
-      <w:hyperlink r:id="rId87">
+      <w:hyperlink r:id="rId88">
         <w:r>
           <w:rPr>
             <w:rStyle w:val="Hyperlink"/>
@@ -22837,7 +23795,7 @@
       <w:r>
         <w:t xml:space="preserve"> </w:t>
       </w:r>
-      <w:hyperlink r:id="rId88">
+      <w:hyperlink r:id="rId89">
         <w:r>
           <w:rPr>
             <w:rStyle w:val="Hyperlink"/>
@@ -22981,7 +23939,7 @@
       <w:r>
         <w:t xml:space="preserve"> </w:t>
       </w:r>
-      <w:hyperlink r:id="rId89">
+      <w:hyperlink r:id="rId90">
         <w:r>
           <w:rPr>
             <w:rStyle w:val="Hyperlink"/>
@@ -24878,7 +25836,7 @@
         <w:t xml:space="preserve">.</w:t>
       </w:r>
     </w:p>
-    <w:bookmarkStart w:id="98" w:name="fig-exp-pdf-cdf"/>
+    <w:bookmarkStart w:id="99" w:name="fig-exp-pdf-cdf"/>
     <w:tbl>
       <w:tblPr>
         <w:tblStyle w:val="Table"/>
@@ -24906,7 +25864,7 @@
             <w:tr>
               <w:tc>
                 <w:tcPr/>
-                <w:bookmarkStart w:id="93" w:name="fig-exp-pdf-cdf-pdf"/>
+                <w:bookmarkStart w:id="94" w:name="fig-exp-pdf-cdf-pdf"/>
                 <w:p>
                   <w:pPr>
                     <w:pStyle w:val="SourceCode"/>
@@ -25521,18 +26479,18 @@
                       <wp:inline>
                         <wp:extent cx="2971800" cy="2377440"/>
                         <wp:effectExtent b="0" l="0" r="0" t="0"/>
-                        <wp:docPr descr="" title="" id="91" name="Picture"/>
+                        <wp:docPr descr="" title="" id="92" name="Picture"/>
                         <a:graphic>
                           <a:graphicData uri="http://schemas.openxmlformats.org/drawingml/2006/picture">
                             <pic:pic>
                               <pic:nvPicPr>
-                                <pic:cNvPr descr="calculus_files/figure-docx/exp-pdf-cdf-pdf-code-1.png" id="92" name="Picture"/>
+                                <pic:cNvPr descr="calculus_files/figure-docx/exp-pdf-cdf-pdf-code-1.png" id="93" name="Picture"/>
                                 <pic:cNvPicPr>
                                   <a:picLocks noChangeArrowheads="1" noChangeAspect="1"/>
                                 </pic:cNvPicPr>
                               </pic:nvPicPr>
                               <pic:blipFill>
-                                <a:blip r:embed="rId90"/>
+                                <a:blip r:embed="rId91"/>
                                 <a:stretch>
                                   <a:fillRect/>
                                 </a:stretch>
@@ -25628,7 +26586,7 @@
                     <w:t xml:space="preserve">.</w:t>
                   </w:r>
                 </w:p>
-                <w:bookmarkEnd w:id="93"/>
+                <w:bookmarkEnd w:id="94"/>
               </w:tc>
             </w:tr>
           </w:tbl>
@@ -25678,7 +26636,7 @@
             <w:tr>
               <w:tc>
                 <w:tcPr/>
-                <w:bookmarkStart w:id="97" w:name="fig-exp-pdf-cdf-cdf"/>
+                <w:bookmarkStart w:id="98" w:name="fig-exp-pdf-cdf-cdf"/>
                 <w:p>
                   <w:pPr>
                     <w:pStyle w:val="SourceCode"/>
@@ -26524,18 +27482,18 @@
                       <wp:inline>
                         <wp:extent cx="2971800" cy="2377440"/>
                         <wp:effectExtent b="0" l="0" r="0" t="0"/>
-                        <wp:docPr descr="" title="" id="95" name="Picture"/>
+                        <wp:docPr descr="" title="" id="96" name="Picture"/>
                         <a:graphic>
                           <a:graphicData uri="http://schemas.openxmlformats.org/drawingml/2006/picture">
                             <pic:pic>
                               <pic:nvPicPr>
-                                <pic:cNvPr descr="calculus_files/figure-docx/exp-pdf-cdf-cdf-code-1.png" id="96" name="Picture"/>
+                                <pic:cNvPr descr="calculus_files/figure-docx/exp-pdf-cdf-cdf-code-1.png" id="97" name="Picture"/>
                                 <pic:cNvPicPr>
                                   <a:picLocks noChangeArrowheads="1" noChangeAspect="1"/>
                                 </pic:cNvPicPr>
                               </pic:nvPicPr>
                               <pic:blipFill>
-                                <a:blip r:embed="rId94"/>
+                                <a:blip r:embed="rId95"/>
                                 <a:stretch>
                                   <a:fillRect/>
                                 </a:stretch>
@@ -26631,7 +27589,7 @@
                     <w:t xml:space="preserve">.</w:t>
                   </w:r>
                 </w:p>
-                <w:bookmarkEnd w:id="97"/>
+                <w:bookmarkEnd w:id="98"/>
               </w:tc>
             </w:tr>
           </w:tbl>
@@ -26901,11 +27859,11 @@
         <w:t xml:space="preserve">computed via FTC Part 2.</w:t>
       </w:r>
     </w:p>
-    <w:bookmarkEnd w:id="98"/>
     <w:bookmarkEnd w:id="99"/>
     <w:bookmarkEnd w:id="100"/>
     <w:bookmarkEnd w:id="101"/>
-    <w:bookmarkStart w:id="128" w:name="sec-double-integrals"/>
+    <w:bookmarkEnd w:id="102"/>
+    <w:bookmarkStart w:id="129" w:name="sec-double-integrals"/>
     <w:p>
       <w:pPr>
         <w:pStyle w:val="Heading2"/>
@@ -27009,7 +27967,7 @@
       <w:r>
         <w:t xml:space="preserve"> </w:t>
       </w:r>
-      <w:hyperlink r:id="rId102">
+      <w:hyperlink r:id="rId103">
         <w:r>
           <w:rPr>
             <w:rStyle w:val="Hyperlink"/>
@@ -27040,7 +27998,7 @@
         <w:t xml:space="preserve">follow from a stated theorem rather than from an aside.</w:t>
       </w:r>
     </w:p>
-    <w:bookmarkStart w:id="103" w:name="def-double-integral"/>
+    <w:bookmarkStart w:id="104" w:name="def-double-integral"/>
     <w:p>
       <w:pPr>
         <w:pStyle w:val="BodyText"/>
@@ -27716,8 +28674,8 @@
         <w:t xml:space="preserve">(Larson and Edwards 2018, sec. 14.2)</w:t>
       </w:r>
     </w:p>
-    <w:bookmarkEnd w:id="103"/>
-    <w:bookmarkStart w:id="104" w:name="exm-double-integral-area"/>
+    <w:bookmarkEnd w:id="104"/>
+    <w:bookmarkStart w:id="105" w:name="exm-double-integral-area"/>
     <w:p>
       <w:pPr>
         <w:pStyle w:val="BodyText"/>
@@ -28007,8 +28965,8 @@
         <w:t xml:space="preserve">.</w:t>
       </w:r>
     </w:p>
-    <w:bookmarkEnd w:id="104"/>
-    <w:bookmarkStart w:id="105" w:name="def-iterated-integral"/>
+    <w:bookmarkEnd w:id="105"/>
+    <w:bookmarkStart w:id="106" w:name="def-iterated-integral"/>
     <w:p>
       <w:pPr>
         <w:pStyle w:val="BodyText"/>
@@ -28682,8 +29640,8 @@
         <w:t xml:space="preserve">swapped.</w:t>
       </w:r>
     </w:p>
-    <w:bookmarkEnd w:id="105"/>
-    <w:bookmarkStart w:id="106" w:name="exm-iterated-integral"/>
+    <w:bookmarkEnd w:id="106"/>
+    <w:bookmarkStart w:id="107" w:name="exm-iterated-integral"/>
     <w:p>
       <w:pPr>
         <w:pStyle w:val="BodyText"/>
@@ -29354,8 +30312,8 @@
         </m:oMath>
       </m:oMathPara>
     </w:p>
-    <w:bookmarkEnd w:id="106"/>
-    <w:bookmarkStart w:id="107" w:name="thm-fubini"/>
+    <w:bookmarkEnd w:id="107"/>
+    <w:bookmarkStart w:id="108" w:name="thm-fubini"/>
     <w:p>
       <w:pPr>
         <w:pStyle w:val="FirstParagraph"/>
@@ -30369,8 +31327,8 @@
         <w:t xml:space="preserve">(Larson and Edwards 2018, Theorem 14.2, p. 982)</w:t>
       </w:r>
     </w:p>
-    <w:bookmarkEnd w:id="107"/>
-    <w:bookmarkStart w:id="114" w:name="exm-fubini-nonrect"/>
+    <w:bookmarkEnd w:id="108"/>
+    <w:bookmarkStart w:id="115" w:name="exm-fubini-nonrect"/>
     <w:p>
       <w:pPr>
         <w:pStyle w:val="BodyText"/>
@@ -30471,7 +31429,7 @@
       <w:r>
         <w:t xml:space="preserve"> </w:t>
       </w:r>
-      <w:hyperlink r:id="rId87">
+      <w:hyperlink r:id="rId88">
         <w:r>
           <w:rPr>
             <w:rStyle w:val="Hyperlink"/>
@@ -30491,7 +31449,7 @@
       <w:r>
         <w:t xml:space="preserve"> </w:t>
       </w:r>
-      <w:hyperlink r:id="rId88">
+      <w:hyperlink r:id="rId89">
         <w:r>
           <w:rPr>
             <w:rStyle w:val="Hyperlink"/>
@@ -30712,7 +31670,7 @@
       <w:r>
         <w:t xml:space="preserve"> </w:t>
       </w:r>
-      <w:hyperlink r:id="rId108">
+      <w:hyperlink r:id="rId109">
         <w:r>
           <w:rPr>
             <w:rStyle w:val="Hyperlink"/>
@@ -31515,7 +32473,7 @@
       <w:tr>
         <w:tc>
           <w:tcPr/>
-          <w:bookmarkStart w:id="112" w:name="fig-fubini-nonrect-region"/>
+          <w:bookmarkStart w:id="113" w:name="fig-fubini-nonrect-region"/>
           <w:p>
             <w:pPr>
               <w:pStyle w:val="SourceCode"/>
@@ -33064,18 +34022,18 @@
                 <wp:inline>
                   <wp:extent cx="4620126" cy="3696101"/>
                   <wp:effectExtent b="0" l="0" r="0" t="0"/>
-                  <wp:docPr descr="" title="" id="110" name="Picture"/>
+                  <wp:docPr descr="" title="" id="111" name="Picture"/>
                   <a:graphic>
                     <a:graphicData uri="http://schemas.openxmlformats.org/drawingml/2006/picture">
                       <pic:pic>
                         <pic:nvPicPr>
-                          <pic:cNvPr descr="calculus_files/figure-docx/unnamed-chunk-5-1.png" id="111" name="Picture"/>
+                          <pic:cNvPr descr="calculus_files/figure-docx/unnamed-chunk-5-1.png" id="112" name="Picture"/>
                           <pic:cNvPicPr>
                             <a:picLocks noChangeArrowheads="1" noChangeAspect="1"/>
                           </pic:cNvPicPr>
                         </pic:nvPicPr>
                         <pic:blipFill>
-                          <a:blip r:embed="rId109"/>
+                          <a:blip r:embed="rId110"/>
                           <a:stretch>
                             <a:fillRect/>
                           </a:stretch>
@@ -33315,7 +34273,7 @@
               <w:t xml:space="preserve">.</w:t>
             </w:r>
           </w:p>
-          <w:bookmarkEnd w:id="112"/>
+          <w:bookmarkEnd w:id="113"/>
         </w:tc>
       </w:tr>
     </w:tbl>
@@ -35672,7 +36630,7 @@
       <w:tr>
         <w:tc>
           <w:tcPr/>
-          <w:bookmarkStart w:id="113" w:name="fig-fubini-nonrect"/>
+          <w:bookmarkStart w:id="114" w:name="fig-fubini-nonrect"/>
           <w:p>
             <w:pPr>
               <w:pStyle w:val="Compact"/>
@@ -36019,12 +36977,12 @@
               <w:t xml:space="preserve">.</w:t>
             </w:r>
           </w:p>
-          <w:bookmarkEnd w:id="113"/>
+          <w:bookmarkEnd w:id="114"/>
         </w:tc>
       </w:tr>
     </w:tbl>
-    <w:bookmarkEnd w:id="114"/>
-    <w:bookmarkStart w:id="116" w:name="exm-fubini-fail"/>
+    <w:bookmarkEnd w:id="115"/>
+    <w:bookmarkStart w:id="117" w:name="exm-fubini-fail"/>
     <w:p>
       <w:pPr>
         <w:pStyle w:val="BodyText"/>
@@ -38084,7 +39042,7 @@
       <w:tr>
         <w:tc>
           <w:tcPr/>
-          <w:bookmarkStart w:id="115" w:name="fig-fubini-fail"/>
+          <w:bookmarkStart w:id="116" w:name="fig-fubini-fail"/>
           <w:p>
             <w:pPr>
               <w:pStyle w:val="Compact"/>
@@ -38636,12 +39594,12 @@
               <w:t xml:space="preserve">does not apply.</w:t>
             </w:r>
           </w:p>
-          <w:bookmarkEnd w:id="115"/>
+          <w:bookmarkEnd w:id="116"/>
         </w:tc>
       </w:tr>
     </w:tbl>
-    <w:bookmarkEnd w:id="116"/>
-    <w:bookmarkStart w:id="117" w:name="cor-fubini-rect"/>
+    <w:bookmarkEnd w:id="117"/>
+    <w:bookmarkStart w:id="118" w:name="cor-fubini-rect"/>
     <w:p>
       <w:pPr>
         <w:pStyle w:val="BodyText"/>
@@ -39214,7 +40172,7 @@
         <w:t xml:space="preserve">(Larson and Edwards 2018, Theorem 14.2, p. 982)</w:t>
       </w:r>
     </w:p>
-    <w:bookmarkEnd w:id="117"/>
+    <w:bookmarkEnd w:id="118"/>
     <w:p>
       <w:pPr>
         <w:pStyle w:val="BodyText"/>
@@ -39469,7 +40427,7 @@
         <w:t xml:space="preserve">two iterated forms shown.</w:t>
       </w:r>
     </w:p>
-    <w:bookmarkStart w:id="123" w:name="exm-fubini-rect"/>
+    <w:bookmarkStart w:id="124" w:name="exm-fubini-rect"/>
     <w:p>
       <w:pPr>
         <w:pStyle w:val="BodyText"/>
@@ -39748,7 +40706,7 @@
       <w:r>
         <w:t xml:space="preserve"> </w:t>
       </w:r>
-      <w:hyperlink r:id="rId87">
+      <w:hyperlink r:id="rId88">
         <w:r>
           <w:rPr>
             <w:rStyle w:val="Hyperlink"/>
@@ -39768,7 +40726,7 @@
       <w:r>
         <w:t xml:space="preserve"> </w:t>
       </w:r>
-      <w:hyperlink r:id="rId88">
+      <w:hyperlink r:id="rId89">
         <w:r>
           <w:rPr>
             <w:rStyle w:val="Hyperlink"/>
@@ -40057,7 +41015,7 @@
       <w:r>
         <w:t xml:space="preserve"> </w:t>
       </w:r>
-      <w:hyperlink r:id="rId108">
+      <w:hyperlink r:id="rId109">
         <w:r>
           <w:rPr>
             <w:rStyle w:val="Hyperlink"/>
@@ -40348,7 +41306,7 @@
       <w:tr>
         <w:tc>
           <w:tcPr/>
-          <w:bookmarkStart w:id="121" w:name="fig-fubini-rect-region"/>
+          <w:bookmarkStart w:id="122" w:name="fig-fubini-rect-region"/>
           <w:p>
             <w:pPr>
               <w:pStyle w:val="SourceCode"/>
@@ -41240,18 +42198,18 @@
                 <wp:inline>
                   <wp:extent cx="4620126" cy="3696101"/>
                   <wp:effectExtent b="0" l="0" r="0" t="0"/>
-                  <wp:docPr descr="" title="" id="119" name="Picture"/>
+                  <wp:docPr descr="" title="" id="120" name="Picture"/>
                   <a:graphic>
                     <a:graphicData uri="http://schemas.openxmlformats.org/drawingml/2006/picture">
                       <pic:pic>
                         <pic:nvPicPr>
-                          <pic:cNvPr descr="calculus_files/figure-docx/unnamed-chunk-10-1.png" id="120" name="Picture"/>
+                          <pic:cNvPr descr="calculus_files/figure-docx/unnamed-chunk-10-1.png" id="121" name="Picture"/>
                           <pic:cNvPicPr>
                             <a:picLocks noChangeArrowheads="1" noChangeAspect="1"/>
                           </pic:cNvPicPr>
                         </pic:nvPicPr>
                         <pic:blipFill>
-                          <a:blip r:embed="rId118"/>
+                          <a:blip r:embed="rId119"/>
                           <a:stretch>
                             <a:fillRect/>
                           </a:stretch>
@@ -41341,7 +42299,7 @@
               <w:t xml:space="preserve">, the unit square.</w:t>
             </w:r>
           </w:p>
-          <w:bookmarkEnd w:id="121"/>
+          <w:bookmarkEnd w:id="122"/>
         </w:tc>
       </w:tr>
     </w:tbl>
@@ -42973,7 +43931,7 @@
       <w:tr>
         <w:tc>
           <w:tcPr/>
-          <w:bookmarkStart w:id="122" w:name="fig-fubini-rect"/>
+          <w:bookmarkStart w:id="123" w:name="fig-fubini-rect"/>
           <w:p>
             <w:pPr>
               <w:pStyle w:val="Compact"/>
@@ -43197,12 +44155,12 @@
               <w:t xml:space="preserve">.</w:t>
             </w:r>
           </w:p>
-          <w:bookmarkEnd w:id="122"/>
+          <w:bookmarkEnd w:id="123"/>
         </w:tc>
       </w:tr>
     </w:tbl>
-    <w:bookmarkEnd w:id="123"/>
-    <w:bookmarkStart w:id="124" w:name="thm-fubini-tonelli"/>
+    <w:bookmarkEnd w:id="124"/>
+    <w:bookmarkStart w:id="125" w:name="thm-fubini-tonelli"/>
     <w:p>
       <w:pPr>
         <w:pStyle w:val="BodyText"/>
@@ -44365,8 +45323,8 @@
         <w:t xml:space="preserve">(Billingsley 1995, Theorem 18.3; Gut 2013, Theorem 9.1, p. 65; Fubini 1907; Wikipedia contributors 2024)</w:t>
       </w:r>
     </w:p>
-    <w:bookmarkEnd w:id="124"/>
-    <w:bookmarkStart w:id="125" w:name="rem-fubini-tonelli-probability"/>
+    <w:bookmarkEnd w:id="125"/>
+    <w:bookmarkStart w:id="126" w:name="rem-fubini-tonelli-probability"/>
     <w:p>
       <w:pPr>
         <w:pStyle w:val="BodyText"/>
@@ -44376,7 +45334,7 @@
           <w:i/>
           <w:iCs/>
         </w:rPr>
-        <w:t xml:space="preserve">Remark 1</w:t>
+        <w:t xml:space="preserve">Remark 2</w:t>
       </w:r>
       <w:r>
         <w:t xml:space="preserve"> (Fubini–Tonelli for probability measures). </w:t>
@@ -44393,7 +45351,7 @@
       <w:r>
         <w:t xml:space="preserve"> </w:t>
       </w:r>
-      <w:hyperlink r:id="rId102">
+      <w:hyperlink r:id="rId103">
         <w:r>
           <w:rPr>
             <w:rStyle w:val="Hyperlink"/>
@@ -44677,8 +45635,8 @@
         <w:t xml:space="preserve">-finiteness alone does not make the iterated integrals agree.</w:t>
       </w:r>
     </w:p>
-    <w:bookmarkEnd w:id="125"/>
-    <w:bookmarkStart w:id="126" w:name="exm-fubini-tonelli-apply"/>
+    <w:bookmarkEnd w:id="126"/>
+    <w:bookmarkStart w:id="127" w:name="exm-fubini-tonelli-apply"/>
     <w:p>
       <w:pPr>
         <w:pStyle w:val="BodyText"/>
@@ -44777,7 +45735,7 @@
       <w:r>
         <w:t xml:space="preserve"> </w:t>
       </w:r>
-      <w:hyperlink r:id="rId87">
+      <w:hyperlink r:id="rId88">
         <w:r>
           <w:rPr>
             <w:rStyle w:val="Hyperlink"/>
@@ -44797,7 +45755,7 @@
       <w:r>
         <w:t xml:space="preserve"> </w:t>
       </w:r>
-      <w:hyperlink r:id="rId88">
+      <w:hyperlink r:id="rId89">
         <w:r>
           <w:rPr>
             <w:rStyle w:val="Hyperlink"/>
@@ -47786,8 +48744,8 @@
         <w:t xml:space="preserve">guarantees when condition (a) holds.</w:t>
       </w:r>
     </w:p>
-    <w:bookmarkEnd w:id="126"/>
-    <w:bookmarkStart w:id="127" w:name="exm-fubini-fail-tonelli"/>
+    <w:bookmarkEnd w:id="127"/>
+    <w:bookmarkStart w:id="128" w:name="exm-fubini-fail-tonelli"/>
     <w:p>
       <w:pPr>
         <w:pStyle w:val="BodyText"/>
@@ -48922,9 +49880,9 @@
         <w:t xml:space="preserve">(Wikipedia contributors 2024)</w:t>
       </w:r>
     </w:p>
-    <w:bookmarkEnd w:id="127"/>
     <w:bookmarkEnd w:id="128"/>
-    <w:bookmarkStart w:id="131" w:name="sec-additional-resources"/>
+    <w:bookmarkEnd w:id="129"/>
+    <w:bookmarkStart w:id="132" w:name="sec-additional-resources"/>
     <w:p>
       <w:pPr>
         <w:pStyle w:val="Heading2"/>
@@ -49001,7 +49959,7 @@
           <w:numId w:val="1008"/>
         </w:numPr>
       </w:pPr>
-      <w:hyperlink r:id="rId129">
+      <w:hyperlink r:id="rId130">
         <w:r>
           <w:rPr>
             <w:rStyle w:val="Hyperlink"/>
@@ -49018,7 +49976,7 @@
           <w:numId w:val="1008"/>
         </w:numPr>
       </w:pPr>
-      <w:hyperlink r:id="rId130">
+      <w:hyperlink r:id="rId131">
         <w:r>
           <w:rPr>
             <w:rStyle w:val="Hyperlink"/>
@@ -49045,8 +50003,8 @@
         <w:t xml:space="preserve">(the rigorous foundations behind these results)</w:t>
       </w:r>
     </w:p>
-    <w:bookmarkEnd w:id="131"/>
-    <w:bookmarkStart w:id="154" w:name="references"/>
+    <w:bookmarkEnd w:id="132"/>
+    <w:bookmarkStart w:id="155" w:name="references"/>
     <w:p>
       <w:pPr>
         <w:pStyle w:val="Heading2"/>
@@ -49055,8 +50013,8 @@
         <w:t xml:space="preserve">References</w:t>
       </w:r>
     </w:p>
-    <w:bookmarkStart w:id="153" w:name="refs"/>
-    <w:bookmarkStart w:id="133" w:name="ref-calclifesaver"/>
+    <w:bookmarkStart w:id="154" w:name="refs"/>
+    <w:bookmarkStart w:id="134" w:name="ref-calclifesaver"/>
     <w:p>
       <w:pPr>
         <w:pStyle w:val="Bibliography"/>
@@ -49080,7 +50038,7 @@
       <w:r>
         <w:t xml:space="preserve"> </w:t>
       </w:r>
-      <w:hyperlink r:id="rId132">
+      <w:hyperlink r:id="rId133">
         <w:r>
           <w:rPr>
             <w:rStyle w:val="Hyperlink"/>
@@ -49092,8 +50050,8 @@
         <w:t xml:space="preserve">.</w:t>
       </w:r>
     </w:p>
-    <w:bookmarkEnd w:id="133"/>
-    <w:bookmarkStart w:id="134" w:name="ref-billingsley1995probability"/>
+    <w:bookmarkEnd w:id="134"/>
+    <w:bookmarkStart w:id="135" w:name="ref-billingsley1995probability"/>
     <w:p>
       <w:pPr>
         <w:pStyle w:val="Bibliography"/>
@@ -49115,8 +50073,8 @@
         <w:t xml:space="preserve">. 3rd ed. Wiley Series in Probability and Mathematical Statistics. Wiley.</w:t>
       </w:r>
     </w:p>
-    <w:bookmarkEnd w:id="134"/>
-    <w:bookmarkStart w:id="135" w:name="ref-fubini1907"/>
+    <w:bookmarkEnd w:id="135"/>
+    <w:bookmarkStart w:id="136" w:name="ref-fubini1907"/>
     <w:p>
       <w:pPr>
         <w:pStyle w:val="Bibliography"/>
@@ -49147,8 +50105,8 @@
         <w:t xml:space="preserve">16: 608–14.</w:t>
       </w:r>
     </w:p>
-    <w:bookmarkEnd w:id="135"/>
-    <w:bookmarkStart w:id="137" w:name="ref-realanalysislifesaver"/>
+    <w:bookmarkEnd w:id="136"/>
+    <w:bookmarkStart w:id="138" w:name="ref-realanalysislifesaver"/>
     <w:p>
       <w:pPr>
         <w:pStyle w:val="Bibliography"/>
@@ -49172,7 +50130,7 @@
       <w:r>
         <w:t xml:space="preserve"> </w:t>
       </w:r>
-      <w:hyperlink r:id="rId136">
+      <w:hyperlink r:id="rId137">
         <w:r>
           <w:rPr>
             <w:rStyle w:val="Hyperlink"/>
@@ -49184,8 +50142,8 @@
         <w:t xml:space="preserve">.</w:t>
       </w:r>
     </w:p>
-    <w:bookmarkEnd w:id="137"/>
-    <w:bookmarkStart w:id="139" w:name="ref-gut2013"/>
+    <w:bookmarkEnd w:id="138"/>
+    <w:bookmarkStart w:id="140" w:name="ref-gut2013"/>
     <w:p>
       <w:pPr>
         <w:pStyle w:val="Bibliography"/>
@@ -49209,7 +50167,7 @@
       <w:r>
         <w:t xml:space="preserve"> </w:t>
       </w:r>
-      <w:hyperlink r:id="rId138">
+      <w:hyperlink r:id="rId139">
         <w:r>
           <w:rPr>
             <w:rStyle w:val="Hyperlink"/>
@@ -49221,8 +50179,8 @@
         <w:t xml:space="preserve">.</w:t>
       </w:r>
     </w:p>
-    <w:bookmarkEnd w:id="139"/>
-    <w:bookmarkStart w:id="141" w:name="ref-mosaiccalc"/>
+    <w:bookmarkEnd w:id="140"/>
+    <w:bookmarkStart w:id="142" w:name="ref-mosaiccalc"/>
     <w:p>
       <w:pPr>
         <w:pStyle w:val="Bibliography"/>
@@ -49246,7 +50204,7 @@
       <w:r>
         <w:t xml:space="preserve"> </w:t>
       </w:r>
-      <w:hyperlink r:id="rId140">
+      <w:hyperlink r:id="rId141">
         <w:r>
           <w:rPr>
             <w:rStyle w:val="Hyperlink"/>
@@ -49258,8 +50216,8 @@
         <w:t xml:space="preserve">.</w:t>
       </w:r>
     </w:p>
-    <w:bookmarkEnd w:id="141"/>
-    <w:bookmarkStart w:id="143" w:name="ref-khuri2003advanced"/>
+    <w:bookmarkEnd w:id="142"/>
+    <w:bookmarkStart w:id="144" w:name="ref-khuri2003advanced"/>
     <w:p>
       <w:pPr>
         <w:pStyle w:val="Bibliography"/>
@@ -49283,7 +50241,7 @@
       <w:r>
         <w:t xml:space="preserve"> </w:t>
       </w:r>
-      <w:hyperlink r:id="rId142">
+      <w:hyperlink r:id="rId143">
         <w:r>
           <w:rPr>
             <w:rStyle w:val="Hyperlink"/>
@@ -49295,8 +50253,8 @@
         <w:t xml:space="preserve">.</w:t>
       </w:r>
     </w:p>
-    <w:bookmarkEnd w:id="143"/>
-    <w:bookmarkStart w:id="145" w:name="ref-kleinbaum2012survival"/>
+    <w:bookmarkEnd w:id="144"/>
+    <w:bookmarkStart w:id="146" w:name="ref-kleinbaum2012survival"/>
     <w:p>
       <w:pPr>
         <w:pStyle w:val="Bibliography"/>
@@ -49320,7 +50278,7 @@
       <w:r>
         <w:t xml:space="preserve"> </w:t>
       </w:r>
-      <w:hyperlink r:id="rId144">
+      <w:hyperlink r:id="rId145">
         <w:r>
           <w:rPr>
             <w:rStyle w:val="Hyperlink"/>
@@ -49332,8 +50290,8 @@
         <w:t xml:space="preserve">.</w:t>
       </w:r>
     </w:p>
-    <w:bookmarkEnd w:id="145"/>
-    <w:bookmarkStart w:id="147" w:name="ref-larsonCalc11e"/>
+    <w:bookmarkEnd w:id="146"/>
+    <w:bookmarkStart w:id="148" w:name="ref-larsonCalc11e"/>
     <w:p>
       <w:pPr>
         <w:pStyle w:val="Bibliography"/>
@@ -49357,7 +50315,7 @@
       <w:r>
         <w:t xml:space="preserve"> </w:t>
       </w:r>
-      <w:hyperlink r:id="rId146">
+      <w:hyperlink r:id="rId147">
         <w:r>
           <w:rPr>
             <w:rStyle w:val="Hyperlink"/>
@@ -49369,8 +50327,8 @@
         <w:t xml:space="preserve">.</w:t>
       </w:r>
     </w:p>
-    <w:bookmarkEnd w:id="147"/>
-    <w:bookmarkStart w:id="149" w:name="ref-problifesavercalc"/>
+    <w:bookmarkEnd w:id="148"/>
+    <w:bookmarkStart w:id="150" w:name="ref-problifesavercalc"/>
     <w:p>
       <w:pPr>
         <w:pStyle w:val="Bibliography"/>
@@ -49394,7 +50352,7 @@
       <w:r>
         <w:t xml:space="preserve"> </w:t>
       </w:r>
-      <w:hyperlink r:id="rId148">
+      <w:hyperlink r:id="rId149">
         <w:r>
           <w:rPr>
             <w:rStyle w:val="Hyperlink"/>
@@ -49406,8 +50364,8 @@
         <w:t xml:space="preserve">.</w:t>
       </w:r>
     </w:p>
-    <w:bookmarkEnd w:id="149"/>
-    <w:bookmarkStart w:id="150" w:name="ref-rudin1976principles"/>
+    <w:bookmarkEnd w:id="150"/>
+    <w:bookmarkStart w:id="151" w:name="ref-rudin1976principles"/>
     <w:p>
       <w:pPr>
         <w:pStyle w:val="Bibliography"/>
@@ -49429,8 +50387,8 @@
         <w:t xml:space="preserve">. 3rd ed. International Series in Pure and Applied Mathematics. McGraw-Hill.</w:t>
       </w:r>
     </w:p>
-    <w:bookmarkEnd w:id="150"/>
-    <w:bookmarkStart w:id="152" w:name="ref-wp:fubini"/>
+    <w:bookmarkEnd w:id="151"/>
+    <w:bookmarkStart w:id="153" w:name="ref-wp:fubini"/>
     <w:p>
       <w:pPr>
         <w:pStyle w:val="Bibliography"/>
@@ -49489,7 +50447,7 @@
       <w:r>
         <w:t xml:space="preserve"> </w:t>
       </w:r>
-      <w:hyperlink r:id="rId151">
+      <w:hyperlink r:id="rId152">
         <w:r>
           <w:rPr>
             <w:rStyle w:val="Hyperlink"/>
@@ -49501,9 +50459,9 @@
         <w:t xml:space="preserve">.</w:t>
       </w:r>
     </w:p>
-    <w:bookmarkEnd w:id="152"/>
     <w:bookmarkEnd w:id="153"/>
     <w:bookmarkEnd w:id="154"/>
+    <w:bookmarkEnd w:id="155"/>
     <w:sectPr>
       <w:footnotePr>
         <w:numRestart w:val="eachSect"/>

</xml_diff>

<commit_message>
Deploying to gh-pages from @ Morrison-Lab/mds@ad013eea303915fbc35c2a4263ed5b9504d995c3 🚀
</commit_message>
<xml_diff>
--- a/calculus.docx
+++ b/calculus.docx
@@ -15,10 +15,10 @@
         <w:pStyle w:val="Date"/>
       </w:pPr>
       <w:r>
-        <w:t xml:space="preserve">Last modified: 2026-10-03 02:55:01 (PDT)</w:t>
+        <w:t xml:space="preserve">Last modified: 2026-10-03 12:42:49 (PDT)</w:t>
       </w:r>
     </w:p>
-    <w:bookmarkStart w:id="24" w:name="sec-derivatives"/>
+    <w:bookmarkStart w:id="42" w:name="sec-derivatives"/>
     <w:p>
       <w:pPr>
         <w:pStyle w:val="Heading2"/>
@@ -2243,7 +2243,7 @@
         </m:oMath>
       </m:oMathPara>
     </w:p>
-    <w:bookmarkStart w:id="23" w:name="linear-approximation"/>
+    <w:bookmarkStart w:id="41" w:name="linear-approximation"/>
     <w:p>
       <w:pPr>
         <w:pStyle w:val="Heading3"/>
@@ -3450,9 +3450,392 @@
       </w:r>
     </w:p>
     <w:bookmarkEnd w:id="22"/>
-    <w:bookmarkEnd w:id="23"/>
-    <w:bookmarkEnd w:id="24"/>
-    <w:bookmarkStart w:id="102" w:name="sec-integration"/>
+    <w:tbl>
+      <w:tblPr>
+        <w:tblStyle w:val="Table"/>
+        <w:tblLook w:firstRow="0" w:lastRow="0" w:firstColumn="0" w:lastColumn="0" w:noHBand="0" w:noVBand="0" w:val="0000"/>
+        <w:tblBorders>
+          <w:top w:val="single" w:sz="4" w:space="0" w:color="00A047"/>
+          <w:left w:val="single" w:sz="24" w:space="0" w:color="00A047"/>
+          <w:bottom w:val="single" w:sz="4" w:space="0" w:color="00A047"/>
+          <w:right w:val="single" w:sz="4" w:space="0" w:color="00A047"/>
+        </w:tblBorders>
+        <w:tblCellMar>
+          <w:left w:w="144" w:type="dxa"/>
+          <w:right w:w="144" w:type="dxa"/>
+        </w:tblCellMar>
+        <w:tblLook w:firstRow="0" w:lastRow="0" w:firstColumn="0" w:lastColumn="0" w:noHBand="0" w:noVBand="0" w:val="0000"/>
+      </w:tblPr>
+      <w:tr>
+        <w:trPr>
+          <w:cantSplit/>
+        </w:trPr>
+        <w:tc>
+          <w:tcPr>
+            <w:shd w:color="auto" w:fill="ccf1e3" w:val="clear"/>
+            <w:tcMar>
+              <w:top w:w="92" w:type="dxa"/>
+              <w:bottom w:w="92" w:type="dxa"/>
+            </w:tcMar>
+          </w:tcPr>
+          <w:p>
+            <w:pPr>
+              <w:pStyle w:val="BodyText"/>
+            </w:pPr>
+            <w:pPr>
+              <w:spacing w:before="0" w:after="0"/>
+              <w:textAlignment w:val="center"/>
+            </w:pPr>
+            <w:r>
+              <w:drawing>
+                <wp:inline>
+                  <wp:extent cx="152400" cy="152400"/>
+                  <wp:effectExtent b="0" l="0" r="0" t="0"/>
+                  <wp:docPr descr="" title="" id="24" name="Picture"/>
+                  <a:graphic>
+                    <a:graphicData uri="http://schemas.openxmlformats.org/drawingml/2006/picture">
+                      <pic:pic>
+                        <pic:nvPicPr>
+                          <pic:cNvPr descr="/opt/quarto/share/formats/docx/tip.png" id="25" name="Picture"/>
+                          <pic:cNvPicPr>
+                            <a:picLocks noChangeArrowheads="1" noChangeAspect="1"/>
+                          </pic:cNvPicPr>
+                        </pic:nvPicPr>
+                        <pic:blipFill>
+                          <a:blip r:embed="rId23"/>
+                          <a:stretch>
+                            <a:fillRect/>
+                          </a:stretch>
+                        </pic:blipFill>
+                        <pic:spPr bwMode="auto">
+                          <a:xfrm>
+                            <a:off x="0" y="0"/>
+                            <a:ext cx="152400" cy="152400"/>
+                          </a:xfrm>
+                          <a:prstGeom prst="rect">
+                            <a:avLst/>
+                          </a:prstGeom>
+                          <a:noFill/>
+                          <a:ln w="9525">
+                            <a:noFill/>
+                            <a:headEnd/>
+                            <a:tailEnd/>
+                          </a:ln>
+                        </pic:spPr>
+                      </pic:pic>
+                    </a:graphicData>
+                  </a:graphic>
+                </wp:inline>
+              </w:drawing>
+            </w:r>
+            <w:r>
+              <w:t xml:space="preserve"> </w:t>
+            </w:r>
+            <w:r>
+              <w:t xml:space="preserve"> </w:t>
+            </w:r>
+            <w:r>
+              <w:t xml:space="preserve">Videos</w:t>
+            </w:r>
+          </w:p>
+        </w:tc>
+      </w:tr>
+      <w:tr>
+        <w:trPr>
+          <w:cantSplit/>
+        </w:trPr>
+        <w:tc>
+          <w:tcPr>
+            <w:tcMar>
+              <w:top w:w="108" w:type="dxa"/>
+              <w:bottom w:w="108" w:type="dxa"/>
+            </w:tcMar>
+          </w:tcPr>
+          <w:p>
+            <w:pPr>
+              <w:pStyle w:val="BodyText"/>
+            </w:pPr>
+            <w:pPr>
+              <w:spacing w:before="16"/>
+            </w:pPr>
+            <w:r>
+              <w:t xml:space="preserve">Jon Krohn’s</w:t>
+            </w:r>
+            <w:r>
+              <w:t xml:space="preserve"> </w:t>
+            </w:r>
+            <w:r>
+              <w:t xml:space="preserve">“Calculus for Machine Learning”</w:t>
+            </w:r>
+            <w:r>
+              <w:t xml:space="preserve"> </w:t>
+            </w:r>
+            <w:r>
+              <w:t xml:space="preserve">YouTube playlist has videos on limits, the idea behind derivatives, and the rules of differentiation:</w:t>
+            </w:r>
+          </w:p>
+          <w:p>
+            <w:pPr>
+              <w:pStyle w:val="Compact"/>
+              <w:numPr>
+                <w:ilvl w:val="0"/>
+                <w:numId w:val="1002"/>
+              </w:numPr>
+            </w:pPr>
+            <w:hyperlink r:id="rId26">
+              <w:r>
+                <w:rPr>
+                  <w:rStyle w:val="Hyperlink"/>
+                </w:rPr>
+                <w:t xml:space="preserve">Calculating Limits</w:t>
+              </w:r>
+            </w:hyperlink>
+          </w:p>
+          <w:p>
+            <w:pPr>
+              <w:pStyle w:val="Compact"/>
+              <w:numPr>
+                <w:ilvl w:val="0"/>
+                <w:numId w:val="1002"/>
+              </w:numPr>
+            </w:pPr>
+            <w:hyperlink r:id="rId27">
+              <w:r>
+                <w:rPr>
+                  <w:rStyle w:val="Hyperlink"/>
+                </w:rPr>
+                <w:t xml:space="preserve">Exercises on Limits</w:t>
+              </w:r>
+            </w:hyperlink>
+          </w:p>
+          <w:p>
+            <w:pPr>
+              <w:pStyle w:val="Compact"/>
+              <w:numPr>
+                <w:ilvl w:val="0"/>
+                <w:numId w:val="1002"/>
+              </w:numPr>
+            </w:pPr>
+            <w:hyperlink r:id="rId28">
+              <w:r>
+                <w:rPr>
+                  <w:rStyle w:val="Hyperlink"/>
+                </w:rPr>
+                <w:t xml:space="preserve">Intro to Differential Calculus</w:t>
+              </w:r>
+            </w:hyperlink>
+          </w:p>
+          <w:p>
+            <w:pPr>
+              <w:pStyle w:val="Compact"/>
+              <w:numPr>
+                <w:ilvl w:val="0"/>
+                <w:numId w:val="1002"/>
+              </w:numPr>
+            </w:pPr>
+            <w:hyperlink r:id="rId29">
+              <w:r>
+                <w:rPr>
+                  <w:rStyle w:val="Hyperlink"/>
+                </w:rPr>
+                <w:t xml:space="preserve">How Derivatives Arise from Limits</w:t>
+              </w:r>
+            </w:hyperlink>
+          </w:p>
+          <w:p>
+            <w:pPr>
+              <w:pStyle w:val="Compact"/>
+              <w:numPr>
+                <w:ilvl w:val="0"/>
+                <w:numId w:val="1002"/>
+              </w:numPr>
+            </w:pPr>
+            <w:hyperlink r:id="rId30">
+              <w:r>
+                <w:rPr>
+                  <w:rStyle w:val="Hyperlink"/>
+                </w:rPr>
+                <w:t xml:space="preserve">Derivative Notation</w:t>
+              </w:r>
+            </w:hyperlink>
+          </w:p>
+          <w:p>
+            <w:pPr>
+              <w:pStyle w:val="Compact"/>
+              <w:numPr>
+                <w:ilvl w:val="0"/>
+                <w:numId w:val="1002"/>
+              </w:numPr>
+            </w:pPr>
+            <w:hyperlink r:id="rId31">
+              <w:r>
+                <w:rPr>
+                  <w:rStyle w:val="Hyperlink"/>
+                </w:rPr>
+                <w:t xml:space="preserve">The Derivative of a Constant</w:t>
+              </w:r>
+            </w:hyperlink>
+          </w:p>
+          <w:p>
+            <w:pPr>
+              <w:pStyle w:val="Compact"/>
+              <w:numPr>
+                <w:ilvl w:val="0"/>
+                <w:numId w:val="1002"/>
+              </w:numPr>
+            </w:pPr>
+            <w:hyperlink r:id="rId32">
+              <w:r>
+                <w:rPr>
+                  <w:rStyle w:val="Hyperlink"/>
+                </w:rPr>
+                <w:t xml:space="preserve">The Power Rule for Derivatives</w:t>
+              </w:r>
+            </w:hyperlink>
+          </w:p>
+          <w:p>
+            <w:pPr>
+              <w:pStyle w:val="Compact"/>
+              <w:numPr>
+                <w:ilvl w:val="0"/>
+                <w:numId w:val="1002"/>
+              </w:numPr>
+            </w:pPr>
+            <w:hyperlink r:id="rId33">
+              <w:r>
+                <w:rPr>
+                  <w:rStyle w:val="Hyperlink"/>
+                </w:rPr>
+                <w:t xml:space="preserve">The Constant Multiple Rule for Derivatives</w:t>
+              </w:r>
+            </w:hyperlink>
+          </w:p>
+          <w:p>
+            <w:pPr>
+              <w:pStyle w:val="Compact"/>
+              <w:numPr>
+                <w:ilvl w:val="0"/>
+                <w:numId w:val="1002"/>
+              </w:numPr>
+            </w:pPr>
+            <w:hyperlink r:id="rId34">
+              <w:r>
+                <w:rPr>
+                  <w:rStyle w:val="Hyperlink"/>
+                </w:rPr>
+                <w:t xml:space="preserve">The Sum Rule for Derivatives</w:t>
+              </w:r>
+            </w:hyperlink>
+          </w:p>
+          <w:p>
+            <w:pPr>
+              <w:pStyle w:val="Compact"/>
+              <w:numPr>
+                <w:ilvl w:val="0"/>
+                <w:numId w:val="1002"/>
+              </w:numPr>
+            </w:pPr>
+            <w:hyperlink r:id="rId35">
+              <w:r>
+                <w:rPr>
+                  <w:rStyle w:val="Hyperlink"/>
+                </w:rPr>
+                <w:t xml:space="preserve">Exercises on Derivative Rules</w:t>
+              </w:r>
+            </w:hyperlink>
+          </w:p>
+          <w:p>
+            <w:pPr>
+              <w:pStyle w:val="Compact"/>
+              <w:numPr>
+                <w:ilvl w:val="0"/>
+                <w:numId w:val="1002"/>
+              </w:numPr>
+            </w:pPr>
+            <w:hyperlink r:id="rId36">
+              <w:r>
+                <w:rPr>
+                  <w:rStyle w:val="Hyperlink"/>
+                </w:rPr>
+                <w:t xml:space="preserve">The Product Rule for Derivatives</w:t>
+              </w:r>
+            </w:hyperlink>
+          </w:p>
+          <w:p>
+            <w:pPr>
+              <w:pStyle w:val="Compact"/>
+              <w:numPr>
+                <w:ilvl w:val="0"/>
+                <w:numId w:val="1002"/>
+              </w:numPr>
+            </w:pPr>
+            <w:hyperlink r:id="rId37">
+              <w:r>
+                <w:rPr>
+                  <w:rStyle w:val="Hyperlink"/>
+                </w:rPr>
+                <w:t xml:space="preserve">The Quotient Rule for Derivatives</w:t>
+              </w:r>
+            </w:hyperlink>
+          </w:p>
+          <w:p>
+            <w:pPr>
+              <w:pStyle w:val="Compact"/>
+              <w:numPr>
+                <w:ilvl w:val="0"/>
+                <w:numId w:val="1002"/>
+              </w:numPr>
+            </w:pPr>
+            <w:hyperlink r:id="rId38">
+              <w:r>
+                <w:rPr>
+                  <w:rStyle w:val="Hyperlink"/>
+                </w:rPr>
+                <w:t xml:space="preserve">The Chain Rule for Derivatives</w:t>
+              </w:r>
+            </w:hyperlink>
+          </w:p>
+          <w:p>
+            <w:pPr>
+              <w:pStyle w:val="Compact"/>
+              <w:numPr>
+                <w:ilvl w:val="0"/>
+                <w:numId w:val="1002"/>
+              </w:numPr>
+            </w:pPr>
+            <w:hyperlink r:id="rId39">
+              <w:r>
+                <w:rPr>
+                  <w:rStyle w:val="Hyperlink"/>
+                </w:rPr>
+                <w:t xml:space="preserve">The Power Rule on a Function Chain</w:t>
+              </w:r>
+            </w:hyperlink>
+          </w:p>
+          <w:p>
+            <w:pPr>
+              <w:pStyle w:val="Compact"/>
+              <w:numPr>
+                <w:ilvl w:val="0"/>
+                <w:numId w:val="1002"/>
+              </w:numPr>
+            </w:pPr>
+            <w:hyperlink r:id="rId40">
+              <w:r>
+                <w:rPr>
+                  <w:rStyle w:val="Hyperlink"/>
+                </w:rPr>
+                <w:t xml:space="preserve">Advanced Exercises on Derivative Rules</w:t>
+              </w:r>
+            </w:hyperlink>
+          </w:p>
+          <w:p/>
+        </w:tc>
+      </w:tr>
+    </w:tbl>
+    <w:bookmarkEnd w:id="41"/>
+    <w:bookmarkEnd w:id="42"/>
+    <w:bookmarkStart w:id="130" w:name="sec-integration"/>
     <w:p>
       <w:pPr>
         <w:pStyle w:val="Heading2"/>
@@ -3493,7 +3876,7 @@
         <w:t xml:space="preserve">Calculus and a worked example from probability.</w:t>
       </w:r>
     </w:p>
-    <w:bookmarkStart w:id="39" w:name="antiderivatives"/>
+    <w:bookmarkStart w:id="57" w:name="antiderivatives"/>
     <w:p>
       <w:pPr>
         <w:pStyle w:val="Heading3"/>
@@ -3502,7 +3885,7 @@
         <w:t xml:space="preserve">2.1 Antiderivatives</w:t>
       </w:r>
     </w:p>
-    <w:bookmarkStart w:id="25" w:name="def-antiderivative"/>
+    <w:bookmarkStart w:id="43" w:name="def-antiderivative"/>
     <w:p>
       <w:pPr>
         <w:pStyle w:val="FirstParagraph"/>
@@ -3692,8 +4075,8 @@
         <w:t xml:space="preserve">(Larson and Edwards 2018, sec. 4.1, pp. 248–249)</w:t>
       </w:r>
     </w:p>
-    <w:bookmarkEnd w:id="25"/>
-    <w:bookmarkStart w:id="26" w:name="def-indefinite-integral"/>
+    <w:bookmarkEnd w:id="43"/>
+    <w:bookmarkStart w:id="44" w:name="def-indefinite-integral"/>
     <w:p>
       <w:pPr>
         <w:pStyle w:val="BodyText"/>
@@ -3906,8 +4289,8 @@
         <w:t xml:space="preserve">(Larson and Edwards 2018, sec. 4.1, pp. 248–249)</w:t>
       </w:r>
     </w:p>
-    <w:bookmarkEnd w:id="26"/>
-    <w:bookmarkStart w:id="36" w:name="exm-antiderivative-power"/>
+    <w:bookmarkEnd w:id="44"/>
+    <w:bookmarkStart w:id="54" w:name="exm-antiderivative-power"/>
     <w:p>
       <w:pPr>
         <w:pStyle w:val="BodyText"/>
@@ -4322,7 +4705,7 @@
         <w:t xml:space="preserve">.</w:t>
       </w:r>
     </w:p>
-    <w:bookmarkStart w:id="35" w:name="fig-antiderivatives"/>
+    <w:bookmarkStart w:id="53" w:name="fig-antiderivatives"/>
     <w:tbl>
       <w:tblPr>
         <w:tblStyle w:val="Table"/>
@@ -4350,7 +4733,7 @@
             <w:tr>
               <w:tc>
                 <w:tcPr/>
-                <w:bookmarkStart w:id="30" w:name="fig-antiderivatives-f"/>
+                <w:bookmarkStart w:id="48" w:name="fig-antiderivatives-f"/>
                 <w:p>
                   <w:pPr>
                     <w:pStyle w:val="SourceCode"/>
@@ -4617,18 +5000,18 @@
                       <wp:inline>
                         <wp:extent cx="2971800" cy="2377440"/>
                         <wp:effectExtent b="0" l="0" r="0" t="0"/>
-                        <wp:docPr descr="" title="" id="28" name="Picture"/>
+                        <wp:docPr descr="" title="" id="46" name="Picture"/>
                         <a:graphic>
                           <a:graphicData uri="http://schemas.openxmlformats.org/drawingml/2006/picture">
                             <pic:pic>
                               <pic:nvPicPr>
-                                <pic:cNvPr descr="calculus_files/figure-docx/antiderivatives-f-code-1.png" id="29" name="Picture"/>
+                                <pic:cNvPr descr="calculus_files/figure-docx/antiderivatives-f-code-1.png" id="47" name="Picture"/>
                                 <pic:cNvPicPr>
                                   <a:picLocks noChangeArrowheads="1" noChangeAspect="1"/>
                                 </pic:cNvPicPr>
                               </pic:nvPicPr>
                               <pic:blipFill>
-                                <a:blip r:embed="rId27"/>
+                                <a:blip r:embed="rId45"/>
                                 <a:stretch>
                                   <a:fillRect/>
                                 </a:stretch>
@@ -4713,7 +5096,7 @@
                     <w:t xml:space="preserve">.</w:t>
                   </w:r>
                 </w:p>
-                <w:bookmarkEnd w:id="30"/>
+                <w:bookmarkEnd w:id="48"/>
               </w:tc>
             </w:tr>
           </w:tbl>
@@ -4763,7 +5146,7 @@
             <w:tr>
               <w:tc>
                 <w:tcPr/>
-                <w:bookmarkStart w:id="34" w:name="fig-antiderivatives-F"/>
+                <w:bookmarkStart w:id="52" w:name="fig-antiderivatives-F"/>
                 <w:p>
                   <w:pPr>
                     <w:pStyle w:val="SourceCode"/>
@@ -5363,18 +5746,18 @@
                       <wp:inline>
                         <wp:extent cx="2971800" cy="2377440"/>
                         <wp:effectExtent b="0" l="0" r="0" t="0"/>
-                        <wp:docPr descr="" title="" id="32" name="Picture"/>
+                        <wp:docPr descr="" title="" id="50" name="Picture"/>
                         <a:graphic>
                           <a:graphicData uri="http://schemas.openxmlformats.org/drawingml/2006/picture">
                             <pic:pic>
                               <pic:nvPicPr>
-                                <pic:cNvPr descr="calculus_files/figure-docx/antiderivatives-F-code-1.png" id="33" name="Picture"/>
+                                <pic:cNvPr descr="calculus_files/figure-docx/antiderivatives-F-code-1.png" id="51" name="Picture"/>
                                 <pic:cNvPicPr>
                                   <a:picLocks noChangeArrowheads="1" noChangeAspect="1"/>
                                 </pic:cNvPicPr>
                               </pic:nvPicPr>
                               <pic:blipFill>
-                                <a:blip r:embed="rId31"/>
+                                <a:blip r:embed="rId49"/>
                                 <a:stretch>
                                   <a:fillRect/>
                                 </a:stretch>
@@ -5477,7 +5860,7 @@
                     <w:t xml:space="preserve">.</w:t>
                   </w:r>
                 </w:p>
-                <w:bookmarkEnd w:id="34"/>
+                <w:bookmarkEnd w:id="52"/>
               </w:tc>
             </w:tr>
           </w:tbl>
@@ -5706,9 +6089,9 @@
         <w:t xml:space="preserve">; they differ only by a vertical shift.</w:t>
       </w:r>
     </w:p>
-    <w:bookmarkEnd w:id="35"/>
-    <w:bookmarkEnd w:id="36"/>
-    <w:bookmarkStart w:id="37" w:name="thm-integral-rules"/>
+    <w:bookmarkEnd w:id="53"/>
+    <w:bookmarkEnd w:id="54"/>
+    <w:bookmarkStart w:id="55" w:name="thm-integral-rules"/>
     <w:p>
       <w:pPr>
         <w:pStyle w:val="BodyText"/>
@@ -6688,8 +7071,8 @@
         <w:t xml:space="preserve">.</w:t>
       </w:r>
     </w:p>
-    <w:bookmarkEnd w:id="37"/>
-    <w:bookmarkStart w:id="38" w:name="exm-integral-rules-quadratic"/>
+    <w:bookmarkEnd w:id="55"/>
+    <w:bookmarkStart w:id="56" w:name="exm-integral-rules-quadratic"/>
     <w:p>
       <w:pPr>
         <w:pStyle w:val="BodyText"/>
@@ -7085,9 +7468,9 @@
         <w:t xml:space="preserve">, as required.</w:t>
       </w:r>
     </w:p>
-    <w:bookmarkEnd w:id="38"/>
-    <w:bookmarkEnd w:id="39"/>
-    <w:bookmarkStart w:id="70" w:name="regularity-conditions"/>
+    <w:bookmarkEnd w:id="56"/>
+    <w:bookmarkEnd w:id="57"/>
+    <w:bookmarkStart w:id="88" w:name="regularity-conditions"/>
     <w:p>
       <w:pPr>
         <w:pStyle w:val="Heading3"/>
@@ -7096,7 +7479,7 @@
         <w:t xml:space="preserve">2.2 Regularity Conditions</w:t>
       </w:r>
     </w:p>
-    <w:bookmarkStart w:id="40" w:name="def-differentiable"/>
+    <w:bookmarkStart w:id="58" w:name="def-differentiable"/>
     <w:p>
       <w:pPr>
         <w:pStyle w:val="FirstParagraph"/>
@@ -7326,8 +7709,8 @@
         <w:t xml:space="preserve">(Larson and Edwards 2018, sec. 2.1, p. 100)</w:t>
       </w:r>
     </w:p>
-    <w:bookmarkEnd w:id="40"/>
-    <w:bookmarkStart w:id="41" w:name="def-differentiable-on"/>
+    <w:bookmarkEnd w:id="58"/>
+    <w:bookmarkStart w:id="59" w:name="def-differentiable-on"/>
     <w:p>
       <w:pPr>
         <w:pStyle w:val="BodyText"/>
@@ -7407,8 +7790,8 @@
         <w:t xml:space="preserve">(Larson and Edwards 2018, sec. 2.1, p. 100)</w:t>
       </w:r>
     </w:p>
-    <w:bookmarkEnd w:id="41"/>
-    <w:bookmarkStart w:id="42" w:name="def-continuous"/>
+    <w:bookmarkEnd w:id="59"/>
+    <w:bookmarkStart w:id="60" w:name="def-continuous"/>
     <w:p>
       <w:pPr>
         <w:pStyle w:val="BodyText"/>
@@ -7479,7 +7862,7 @@
         <w:pStyle w:val="Compact"/>
         <w:numPr>
           <w:ilvl w:val="0"/>
-          <w:numId w:val="1002"/>
+          <w:numId w:val="1003"/>
         </w:numPr>
       </w:pPr>
       <m:oMath>
@@ -7514,7 +7897,7 @@
         <w:pStyle w:val="Compact"/>
         <w:numPr>
           <w:ilvl w:val="0"/>
-          <w:numId w:val="1002"/>
+          <w:numId w:val="1003"/>
         </w:numPr>
       </w:pPr>
       <m:oMath>
@@ -7573,7 +7956,7 @@
         <w:pStyle w:val="Compact"/>
         <w:numPr>
           <w:ilvl w:val="0"/>
-          <w:numId w:val="1002"/>
+          <w:numId w:val="1003"/>
         </w:numPr>
       </w:pPr>
       <m:oMath>
@@ -7656,8 +8039,8 @@
         <w:t xml:space="preserve">(Larson and Edwards 2018, sec. 1.4, p. 73)</w:t>
       </w:r>
     </w:p>
-    <w:bookmarkEnd w:id="42"/>
-    <w:bookmarkStart w:id="43" w:name="def-continuous-on"/>
+    <w:bookmarkEnd w:id="60"/>
+    <w:bookmarkStart w:id="61" w:name="def-continuous-on"/>
     <w:p>
       <w:pPr>
         <w:pStyle w:val="BodyText"/>
@@ -7746,7 +8129,7 @@
         <w:pStyle w:val="Compact"/>
         <w:numPr>
           <w:ilvl w:val="0"/>
-          <w:numId w:val="1003"/>
+          <w:numId w:val="1004"/>
         </w:numPr>
       </w:pPr>
       <m:oMath>
@@ -7809,7 +8192,7 @@
         <w:pStyle w:val="Compact"/>
         <w:numPr>
           <w:ilvl w:val="0"/>
-          <w:numId w:val="1003"/>
+          <w:numId w:val="1004"/>
         </w:numPr>
       </w:pPr>
       <m:oMath>
@@ -7901,7 +8284,7 @@
         <w:pStyle w:val="Compact"/>
         <w:numPr>
           <w:ilvl w:val="0"/>
-          <w:numId w:val="1003"/>
+          <w:numId w:val="1004"/>
         </w:numPr>
       </w:pPr>
       <m:oMath>
@@ -7996,8 +8379,8 @@
         <w:t xml:space="preserve">(Larson and Edwards 2018, sec. 1.4, p. 73)</w:t>
       </w:r>
     </w:p>
-    <w:bookmarkEnd w:id="43"/>
-    <w:bookmarkStart w:id="44" w:name="exm-continuous-on-sqrt"/>
+    <w:bookmarkEnd w:id="61"/>
+    <w:bookmarkStart w:id="62" w:name="exm-continuous-on-sqrt"/>
     <w:p>
       <w:pPr>
         <w:pStyle w:val="BodyText"/>
@@ -8534,8 +8917,8 @@
         <w:t xml:space="preserve">).</w:t>
       </w:r>
     </w:p>
-    <w:bookmarkEnd w:id="44"/>
-    <w:bookmarkStart w:id="45" w:name="def-partition"/>
+    <w:bookmarkEnd w:id="62"/>
+    <w:bookmarkStart w:id="63" w:name="def-partition"/>
     <w:p>
       <w:pPr>
         <w:pStyle w:val="BodyText"/>
@@ -8927,8 +9310,8 @@
         <w:t xml:space="preserve">(Larson and Edwards 2018, sec. 4.3)</w:t>
       </w:r>
     </w:p>
-    <w:bookmarkEnd w:id="45"/>
-    <w:bookmarkStart w:id="46" w:name="exm-partition"/>
+    <w:bookmarkEnd w:id="63"/>
+    <w:bookmarkStart w:id="64" w:name="exm-partition"/>
     <w:p>
       <w:pPr>
         <w:pStyle w:val="BodyText"/>
@@ -9197,8 +9580,8 @@
         <w:t xml:space="preserve">.</w:t>
       </w:r>
     </w:p>
-    <w:bookmarkEnd w:id="46"/>
-    <w:bookmarkStart w:id="47" w:name="def-mesh"/>
+    <w:bookmarkEnd w:id="64"/>
+    <w:bookmarkStart w:id="65" w:name="def-mesh"/>
     <w:p>
       <w:pPr>
         <w:pStyle w:val="BodyText"/>
@@ -9359,8 +9742,8 @@
         <w:t xml:space="preserve">(Larson and Edwards 2018, sec. 4.3)</w:t>
       </w:r>
     </w:p>
-    <w:bookmarkEnd w:id="47"/>
-    <w:bookmarkStart w:id="48" w:name="exm-mesh"/>
+    <w:bookmarkEnd w:id="65"/>
+    <w:bookmarkStart w:id="66" w:name="exm-mesh"/>
     <w:p>
       <w:pPr>
         <w:pStyle w:val="BodyText"/>
@@ -9621,8 +10004,8 @@
         <w:t xml:space="preserve">.</w:t>
       </w:r>
     </w:p>
-    <w:bookmarkEnd w:id="48"/>
-    <w:bookmarkStart w:id="49" w:name="def-riemann-integral"/>
+    <w:bookmarkEnd w:id="66"/>
+    <w:bookmarkStart w:id="67" w:name="def-riemann-integral"/>
     <w:p>
       <w:pPr>
         <w:pStyle w:val="BodyText"/>
@@ -10194,8 +10577,8 @@
         <w:t xml:space="preserve">(Larson and Edwards 2018, sec. 4.3, p. 272)</w:t>
       </w:r>
     </w:p>
-    <w:bookmarkEnd w:id="49"/>
-    <w:bookmarkStart w:id="50" w:name="def-integrable"/>
+    <w:bookmarkEnd w:id="67"/>
+    <w:bookmarkStart w:id="68" w:name="def-integrable"/>
     <w:p>
       <w:pPr>
         <w:pStyle w:val="BodyText"/>
@@ -10599,8 +10982,8 @@
         <w:t xml:space="preserve">(Larson and Edwards 2018, sec. 4.3, p. 272)</w:t>
       </w:r>
     </w:p>
-    <w:bookmarkEnd w:id="50"/>
-    <w:bookmarkStart w:id="51" w:name="rem-integrable-integral"/>
+    <w:bookmarkEnd w:id="68"/>
+    <w:bookmarkStart w:id="69" w:name="rem-integrable-integral"/>
     <w:p>
       <w:pPr>
         <w:pStyle w:val="BodyText"/>
@@ -11285,8 +11668,8 @@
         <w:t xml:space="preserve">does not exist.</w:t>
       </w:r>
     </w:p>
-    <w:bookmarkEnd w:id="51"/>
-    <w:bookmarkStart w:id="52" w:name="def-riemann-sum-equal-width"/>
+    <w:bookmarkEnd w:id="69"/>
+    <w:bookmarkStart w:id="70" w:name="def-riemann-sum-equal-width"/>
     <w:p>
       <w:pPr>
         <w:pStyle w:val="BodyText"/>
@@ -11684,8 +12067,8 @@
         </m:oMath>
       </m:oMathPara>
     </w:p>
-    <w:bookmarkEnd w:id="52"/>
-    <w:bookmarkStart w:id="53" w:name="exm-equal-width-sum"/>
+    <w:bookmarkEnd w:id="70"/>
+    <w:bookmarkStart w:id="71" w:name="exm-equal-width-sum"/>
     <w:p>
       <w:pPr>
         <w:pStyle w:val="FirstParagraph"/>
@@ -12286,7 +12669,7 @@
         </m:oMath>
       </m:oMathPara>
     </w:p>
-    <w:bookmarkEnd w:id="53"/>
+    <w:bookmarkEnd w:id="71"/>
     <w:p>
       <w:pPr>
         <w:pStyle w:val="FirstParagraph"/>
@@ -12407,7 +12790,7 @@
         <w:t xml:space="preserve">which says what continuity buys us.</w:t>
       </w:r>
     </w:p>
-    <w:bookmarkStart w:id="54" w:name="thm-diff-implies-cont"/>
+    <w:bookmarkStart w:id="72" w:name="thm-diff-implies-cont"/>
     <w:p>
       <w:pPr>
         <w:pStyle w:val="BodyText"/>
@@ -12502,7 +12885,7 @@
         <w:t xml:space="preserve">(Larson and Edwards 2018, Theorem 2.1, p. 106)</w:t>
       </w:r>
     </w:p>
-    <w:bookmarkEnd w:id="54"/>
+    <w:bookmarkEnd w:id="72"/>
     <w:p>
       <w:pPr>
         <w:pStyle w:val="BodyText"/>
@@ -13380,7 +13763,7 @@
         <w:t xml:space="preserve">hold.</w:t>
       </w:r>
     </w:p>
-    <w:bookmarkStart w:id="55" w:name="exm-diff-implies-cont"/>
+    <w:bookmarkStart w:id="73" w:name="exm-diff-implies-cont"/>
     <w:p>
       <w:pPr>
         <w:pStyle w:val="BodyText"/>
@@ -13583,8 +13966,8 @@
         <w:t xml:space="preserve">it is continuous everywhere.</w:t>
       </w:r>
     </w:p>
-    <w:bookmarkEnd w:id="55"/>
-    <w:bookmarkStart w:id="60" w:name="exm-cont-not-diff"/>
+    <w:bookmarkEnd w:id="73"/>
+    <w:bookmarkStart w:id="78" w:name="exm-cont-not-diff"/>
     <w:p>
       <w:pPr>
         <w:pStyle w:val="BodyText"/>
@@ -13930,7 +14313,7 @@
       <w:tr>
         <w:tc>
           <w:tcPr/>
-          <w:bookmarkStart w:id="59" w:name="fig-abs-value"/>
+          <w:bookmarkStart w:id="77" w:name="fig-abs-value"/>
           <w:p>
             <w:pPr>
               <w:pStyle w:val="SourceCode"/>
@@ -14366,18 +14749,18 @@
                 <wp:inline>
                   <wp:extent cx="4620126" cy="3696101"/>
                   <wp:effectExtent b="0" l="0" r="0" t="0"/>
-                  <wp:docPr descr="" title="" id="57" name="Picture"/>
+                  <wp:docPr descr="" title="" id="75" name="Picture"/>
                   <a:graphic>
                     <a:graphicData uri="http://schemas.openxmlformats.org/drawingml/2006/picture">
                       <pic:pic>
                         <pic:nvPicPr>
-                          <pic:cNvPr descr="calculus_files/figure-docx/abs-value-code-1.png" id="58" name="Picture"/>
+                          <pic:cNvPr descr="calculus_files/figure-docx/abs-value-code-1.png" id="76" name="Picture"/>
                           <pic:cNvPicPr>
                             <a:picLocks noChangeArrowheads="1" noChangeAspect="1"/>
                           </pic:cNvPicPr>
                         </pic:nvPicPr>
                         <pic:blipFill>
-                          <a:blip r:embed="rId56"/>
+                          <a:blip r:embed="rId74"/>
                           <a:stretch>
                             <a:fillRect/>
                           </a:stretch>
@@ -14500,12 +14883,12 @@
               <w:t xml:space="preserve">but is continuous everywhere: no gaps or jumps.</w:t>
             </w:r>
           </w:p>
-          <w:bookmarkEnd w:id="59"/>
+          <w:bookmarkEnd w:id="77"/>
         </w:tc>
       </w:tr>
     </w:tbl>
-    <w:bookmarkEnd w:id="60"/>
-    <w:bookmarkStart w:id="61" w:name="thm-cont-implies-int"/>
+    <w:bookmarkEnd w:id="78"/>
+    <w:bookmarkStart w:id="79" w:name="thm-cont-implies-int"/>
     <w:p>
       <w:pPr>
         <w:pStyle w:val="BodyText"/>
@@ -14691,8 +15074,8 @@
         <w:t xml:space="preserve">(Larson and Edwards 2018, Theorem 4.4, p. 272)</w:t>
       </w:r>
     </w:p>
-    <w:bookmarkEnd w:id="61"/>
-    <w:bookmarkStart w:id="62" w:name="exm-cont-implies-int"/>
+    <w:bookmarkEnd w:id="79"/>
+    <w:bookmarkStart w:id="80" w:name="exm-cont-implies-int"/>
     <w:p>
       <w:pPr>
         <w:pStyle w:val="BodyText"/>
@@ -14787,8 +15170,8 @@
         <w:t xml:space="preserve">.</w:t>
       </w:r>
     </w:p>
-    <w:bookmarkEnd w:id="62"/>
-    <w:bookmarkStart w:id="67" w:name="exm-int-not-cont"/>
+    <w:bookmarkEnd w:id="80"/>
+    <w:bookmarkStart w:id="85" w:name="exm-int-not-cont"/>
     <w:p>
       <w:pPr>
         <w:pStyle w:val="BodyText"/>
@@ -15314,7 +15697,7 @@
       <w:tr>
         <w:tc>
           <w:tcPr/>
-          <w:bookmarkStart w:id="66" w:name="fig-step"/>
+          <w:bookmarkStart w:id="84" w:name="fig-step"/>
           <w:p>
             <w:pPr>
               <w:pStyle w:val="SourceCode"/>
@@ -16686,18 +17069,18 @@
                 <wp:inline>
                   <wp:extent cx="4620126" cy="3696101"/>
                   <wp:effectExtent b="0" l="0" r="0" t="0"/>
-                  <wp:docPr descr="" title="" id="64" name="Picture"/>
+                  <wp:docPr descr="" title="" id="82" name="Picture"/>
                   <a:graphic>
                     <a:graphicData uri="http://schemas.openxmlformats.org/drawingml/2006/picture">
                       <pic:pic>
                         <pic:nvPicPr>
-                          <pic:cNvPr descr="calculus_files/figure-docx/step-code-1.png" id="65" name="Picture"/>
+                          <pic:cNvPr descr="calculus_files/figure-docx/step-code-1.png" id="83" name="Picture"/>
                           <pic:cNvPicPr>
                             <a:picLocks noChangeArrowheads="1" noChangeAspect="1"/>
                           </pic:cNvPicPr>
                         </pic:nvPicPr>
                         <pic:blipFill>
-                          <a:blip r:embed="rId63"/>
+                          <a:blip r:embed="rId81"/>
                           <a:stretch>
                             <a:fillRect/>
                           </a:stretch>
@@ -16962,11 +17345,11 @@
               <w:t xml:space="preserve">.</w:t>
             </w:r>
           </w:p>
-          <w:bookmarkEnd w:id="66"/>
+          <w:bookmarkEnd w:id="84"/>
         </w:tc>
       </w:tr>
     </w:tbl>
-    <w:bookmarkEnd w:id="67"/>
+    <w:bookmarkEnd w:id="85"/>
     <w:p>
       <w:pPr>
         <w:pStyle w:val="BodyText"/>
@@ -17174,7 +17557,7 @@
         <w:t xml:space="preserve">show that neither implication reverses in general.</w:t>
       </w:r>
     </w:p>
-    <w:bookmarkStart w:id="68" w:name="thm-riemann-general"/>
+    <w:bookmarkStart w:id="86" w:name="thm-riemann-general"/>
     <w:p>
       <w:pPr>
         <w:pStyle w:val="BodyText"/>
@@ -17414,7 +17797,7 @@
         </m:oMath>
       </m:oMathPara>
     </w:p>
-    <w:bookmarkEnd w:id="68"/>
+    <w:bookmarkEnd w:id="86"/>
     <w:p>
       <w:pPr>
         <w:pStyle w:val="FirstParagraph"/>
@@ -17652,7 +18035,7 @@
         <w:t xml:space="preserve">has that value along this sequence too.</w:t>
       </w:r>
     </w:p>
-    <w:bookmarkStart w:id="69" w:name="exm-riemann-equal-width"/>
+    <w:bookmarkStart w:id="87" w:name="exm-riemann-equal-width"/>
     <w:p>
       <w:pPr>
         <w:pStyle w:val="BodyText"/>
@@ -18580,9 +18963,9 @@
         <w:t xml:space="preserve">.</w:t>
       </w:r>
     </w:p>
-    <w:bookmarkEnd w:id="69"/>
-    <w:bookmarkEnd w:id="70"/>
-    <w:bookmarkStart w:id="101" w:name="fundamental-theorem-of-calculus"/>
+    <w:bookmarkEnd w:id="87"/>
+    <w:bookmarkEnd w:id="88"/>
+    <w:bookmarkStart w:id="129" w:name="fundamental-theorem-of-calculus"/>
     <w:p>
       <w:pPr>
         <w:pStyle w:val="Heading3"/>
@@ -18591,7 +18974,7 @@
         <w:t xml:space="preserve">2.3 Fundamental Theorem of Calculus</w:t>
       </w:r>
     </w:p>
-    <w:bookmarkStart w:id="77" w:name="thm-ftc"/>
+    <w:bookmarkStart w:id="95" w:name="thm-ftc"/>
     <w:p>
       <w:pPr>
         <w:pStyle w:val="FirstParagraph"/>
@@ -18821,7 +19204,7 @@
       <w:pPr>
         <w:pStyle w:val="BodyText"/>
       </w:pPr>
-      <w:bookmarkStart w:id="71" w:name="eq-ftc-deriv-of-integral"/>
+      <w:bookmarkStart w:id="89" w:name="eq-ftc-deriv-of-integral"/>
       <m:oMathPara>
         <m:oMathParaPr>
           <m:jc m:val="center"/>
@@ -18942,7 +19325,7 @@
           </m:r>
         </m:oMath>
       </m:oMathPara>
-      <w:bookmarkEnd w:id="71"/>
+      <w:bookmarkEnd w:id="89"/>
     </w:p>
     <w:tbl>
       <w:tblPr>
@@ -18985,18 +19368,18 @@
                 <wp:inline>
                   <wp:extent cx="152400" cy="152400"/>
                   <wp:effectExtent b="0" l="0" r="0" t="0"/>
-                  <wp:docPr descr="" title="" id="73" name="Picture"/>
+                  <wp:docPr descr="" title="" id="91" name="Picture"/>
                   <a:graphic>
                     <a:graphicData uri="http://schemas.openxmlformats.org/drawingml/2006/picture">
                       <pic:pic>
                         <pic:nvPicPr>
-                          <pic:cNvPr descr="/opt/quarto/share/formats/docx/note.png" id="74" name="Picture"/>
+                          <pic:cNvPr descr="/opt/quarto/share/formats/docx/note.png" id="92" name="Picture"/>
                           <pic:cNvPicPr>
                             <a:picLocks noChangeArrowheads="1" noChangeAspect="1"/>
                           </pic:cNvPicPr>
                         </pic:nvPicPr>
                         <pic:blipFill>
-                          <a:blip r:embed="rId72"/>
+                          <a:blip r:embed="rId90"/>
                           <a:stretch>
                             <a:fillRect/>
                           </a:stretch>
@@ -19502,7 +19885,7 @@
       <w:pPr>
         <w:pStyle w:val="BodyText"/>
       </w:pPr>
-      <w:bookmarkStart w:id="75" w:name="eq-ftc-part2"/>
+      <w:bookmarkStart w:id="93" w:name="eq-ftc-part2"/>
       <m:oMathPara>
         <m:oMathParaPr>
           <m:jc m:val="center"/>
@@ -19623,7 +20006,7 @@
           </m:r>
         </m:oMath>
       </m:oMathPara>
-      <w:bookmarkEnd w:id="75"/>
+      <w:bookmarkEnd w:id="93"/>
     </w:p>
     <w:p>
       <w:pPr>
@@ -19693,7 +20076,7 @@
       <w:pPr>
         <w:pStyle w:val="BodyText"/>
       </w:pPr>
-      <w:bookmarkStart w:id="76" w:name="eq-ftc-integral-of-deriv"/>
+      <w:bookmarkStart w:id="94" w:name="eq-ftc-integral-of-deriv"/>
       <m:oMathPara>
         <m:oMathParaPr>
           <m:jc m:val="center"/>
@@ -19826,7 +20209,7 @@
           </m:r>
         </m:oMath>
       </m:oMathPara>
-      <w:bookmarkEnd w:id="76"/>
+      <w:bookmarkEnd w:id="94"/>
     </w:p>
     <w:p>
       <w:pPr>
@@ -19954,7 +20337,7 @@
         <w:t xml:space="preserve">(Banner 2007, chap. 18; Larson and Edwards 2018, Theorem 4.9, p. 282)</w:t>
       </w:r>
     </w:p>
-    <w:bookmarkEnd w:id="77"/>
+    <w:bookmarkEnd w:id="95"/>
     <w:p>
       <w:pPr>
         <w:pStyle w:val="BodyText"/>
@@ -19995,7 +20378,7 @@
         <w:pStyle w:val="Compact"/>
         <w:numPr>
           <w:ilvl w:val="0"/>
-          <w:numId w:val="1004"/>
+          <w:numId w:val="1005"/>
         </w:numPr>
       </w:pPr>
       <w:r>
@@ -20046,7 +20429,7 @@
         <w:pStyle w:val="Compact"/>
         <w:numPr>
           <w:ilvl w:val="0"/>
-          <w:numId w:val="1004"/>
+          <w:numId w:val="1005"/>
         </w:numPr>
       </w:pPr>
       <w:r>
@@ -20321,7 +20704,7 @@
         <w:t xml:space="preserve">a common situation in applied statistics.</w:t>
       </w:r>
     </w:p>
-    <w:bookmarkStart w:id="87" w:name="exm-ftc-part1-accumulation"/>
+    <w:bookmarkStart w:id="105" w:name="exm-ftc-part1-accumulation"/>
     <w:p>
       <w:pPr>
         <w:pStyle w:val="BodyText"/>
@@ -21030,7 +21413,7 @@
         <w:t xml:space="preserve">).</w:t>
       </w:r>
     </w:p>
-    <w:bookmarkStart w:id="86" w:name="fig-ftc-part1"/>
+    <w:bookmarkStart w:id="104" w:name="fig-ftc-part1"/>
     <w:tbl>
       <w:tblPr>
         <w:tblStyle w:val="Table"/>
@@ -21058,7 +21441,7 @@
             <w:tr>
               <w:tc>
                 <w:tcPr/>
-                <w:bookmarkStart w:id="81" w:name="fig-ftc-part1-left"/>
+                <w:bookmarkStart w:id="99" w:name="fig-ftc-part1-left"/>
                 <w:p>
                   <w:pPr>
                     <w:pStyle w:val="SourceCode"/>
@@ -21898,18 +22281,18 @@
                       <wp:inline>
                         <wp:extent cx="2971800" cy="2377440"/>
                         <wp:effectExtent b="0" l="0" r="0" t="0"/>
-                        <wp:docPr descr="" title="" id="79" name="Picture"/>
+                        <wp:docPr descr="" title="" id="97" name="Picture"/>
                         <a:graphic>
                           <a:graphicData uri="http://schemas.openxmlformats.org/drawingml/2006/picture">
                             <pic:pic>
                               <pic:nvPicPr>
-                                <pic:cNvPr descr="calculus_files/figure-docx/ftc-part1-left-code-1.png" id="80" name="Picture"/>
+                                <pic:cNvPr descr="calculus_files/figure-docx/ftc-part1-left-code-1.png" id="98" name="Picture"/>
                                 <pic:cNvPicPr>
                                   <a:picLocks noChangeArrowheads="1" noChangeAspect="1"/>
                                 </pic:cNvPicPr>
                               </pic:nvPicPr>
                               <pic:blipFill>
-                                <a:blip r:embed="rId78"/>
+                                <a:blip r:embed="rId96"/>
                                 <a:stretch>
                                   <a:fillRect/>
                                 </a:stretch>
@@ -22073,7 +22456,7 @@
                     <w:t xml:space="preserve">.</w:t>
                   </w:r>
                 </w:p>
-                <w:bookmarkEnd w:id="81"/>
+                <w:bookmarkEnd w:id="99"/>
               </w:tc>
             </w:tr>
           </w:tbl>
@@ -22123,7 +22506,7 @@
             <w:tr>
               <w:tc>
                 <w:tcPr/>
-                <w:bookmarkStart w:id="85" w:name="fig-ftc-part1-right"/>
+                <w:bookmarkStart w:id="103" w:name="fig-ftc-part1-right"/>
                 <w:p>
                   <w:pPr>
                     <w:pStyle w:val="SourceCode"/>
@@ -23197,18 +23580,18 @@
                       <wp:inline>
                         <wp:extent cx="2971800" cy="2377440"/>
                         <wp:effectExtent b="0" l="0" r="0" t="0"/>
-                        <wp:docPr descr="" title="" id="83" name="Picture"/>
+                        <wp:docPr descr="" title="" id="101" name="Picture"/>
                         <a:graphic>
                           <a:graphicData uri="http://schemas.openxmlformats.org/drawingml/2006/picture">
                             <pic:pic>
                               <pic:nvPicPr>
-                                <pic:cNvPr descr="calculus_files/figure-docx/ftc-part1-right-code-1.png" id="84" name="Picture"/>
+                                <pic:cNvPr descr="calculus_files/figure-docx/ftc-part1-right-code-1.png" id="102" name="Picture"/>
                                 <pic:cNvPicPr>
                                   <a:picLocks noChangeArrowheads="1" noChangeAspect="1"/>
                                 </pic:cNvPicPr>
                               </pic:nvPicPr>
                               <pic:blipFill>
-                                <a:blip r:embed="rId82"/>
+                                <a:blip r:embed="rId100"/>
                                 <a:stretch>
                                   <a:fillRect/>
                                 </a:stretch>
@@ -23345,7 +23728,7 @@
                     <w:t xml:space="preserve">.</w:t>
                   </w:r>
                 </w:p>
-                <w:bookmarkEnd w:id="85"/>
+                <w:bookmarkEnd w:id="103"/>
               </w:tc>
             </w:tr>
           </w:tbl>
@@ -23628,9 +24011,9 @@
         <w:t xml:space="preserve">.</w:t>
       </w:r>
     </w:p>
-    <w:bookmarkEnd w:id="86"/>
-    <w:bookmarkEnd w:id="87"/>
-    <w:bookmarkStart w:id="100" w:name="exm-ftc-cdf-pdf"/>
+    <w:bookmarkEnd w:id="104"/>
+    <w:bookmarkEnd w:id="105"/>
+    <w:bookmarkStart w:id="118" w:name="exm-ftc-cdf-pdf"/>
     <w:p>
       <w:pPr>
         <w:pStyle w:val="BodyText"/>
@@ -23752,7 +24135,7 @@
       <w:r>
         <w:t xml:space="preserve"> </w:t>
       </w:r>
-      <w:hyperlink r:id="rId88">
+      <w:hyperlink r:id="rId106">
         <w:r>
           <w:rPr>
             <w:rStyle w:val="Hyperlink"/>
@@ -23795,7 +24178,7 @@
       <w:r>
         <w:t xml:space="preserve"> </w:t>
       </w:r>
-      <w:hyperlink r:id="rId89">
+      <w:hyperlink r:id="rId107">
         <w:r>
           <w:rPr>
             <w:rStyle w:val="Hyperlink"/>
@@ -23939,7 +24322,7 @@
       <w:r>
         <w:t xml:space="preserve"> </w:t>
       </w:r>
-      <w:hyperlink r:id="rId90">
+      <w:hyperlink r:id="rId108">
         <w:r>
           <w:rPr>
             <w:rStyle w:val="Hyperlink"/>
@@ -25836,7 +26219,7 @@
         <w:t xml:space="preserve">.</w:t>
       </w:r>
     </w:p>
-    <w:bookmarkStart w:id="99" w:name="fig-exp-pdf-cdf"/>
+    <w:bookmarkStart w:id="117" w:name="fig-exp-pdf-cdf"/>
     <w:tbl>
       <w:tblPr>
         <w:tblStyle w:val="Table"/>
@@ -25864,7 +26247,7 @@
             <w:tr>
               <w:tc>
                 <w:tcPr/>
-                <w:bookmarkStart w:id="94" w:name="fig-exp-pdf-cdf-pdf"/>
+                <w:bookmarkStart w:id="112" w:name="fig-exp-pdf-cdf-pdf"/>
                 <w:p>
                   <w:pPr>
                     <w:pStyle w:val="SourceCode"/>
@@ -26479,18 +26862,18 @@
                       <wp:inline>
                         <wp:extent cx="2971800" cy="2377440"/>
                         <wp:effectExtent b="0" l="0" r="0" t="0"/>
-                        <wp:docPr descr="" title="" id="92" name="Picture"/>
+                        <wp:docPr descr="" title="" id="110" name="Picture"/>
                         <a:graphic>
                           <a:graphicData uri="http://schemas.openxmlformats.org/drawingml/2006/picture">
                             <pic:pic>
                               <pic:nvPicPr>
-                                <pic:cNvPr descr="calculus_files/figure-docx/exp-pdf-cdf-pdf-code-1.png" id="93" name="Picture"/>
+                                <pic:cNvPr descr="calculus_files/figure-docx/exp-pdf-cdf-pdf-code-1.png" id="111" name="Picture"/>
                                 <pic:cNvPicPr>
                                   <a:picLocks noChangeArrowheads="1" noChangeAspect="1"/>
                                 </pic:cNvPicPr>
                               </pic:nvPicPr>
                               <pic:blipFill>
-                                <a:blip r:embed="rId91"/>
+                                <a:blip r:embed="rId109"/>
                                 <a:stretch>
                                   <a:fillRect/>
                                 </a:stretch>
@@ -26586,7 +26969,7 @@
                     <w:t xml:space="preserve">.</w:t>
                   </w:r>
                 </w:p>
-                <w:bookmarkEnd w:id="94"/>
+                <w:bookmarkEnd w:id="112"/>
               </w:tc>
             </w:tr>
           </w:tbl>
@@ -26636,7 +27019,7 @@
             <w:tr>
               <w:tc>
                 <w:tcPr/>
-                <w:bookmarkStart w:id="98" w:name="fig-exp-pdf-cdf-cdf"/>
+                <w:bookmarkStart w:id="116" w:name="fig-exp-pdf-cdf-cdf"/>
                 <w:p>
                   <w:pPr>
                     <w:pStyle w:val="SourceCode"/>
@@ -27482,18 +27865,18 @@
                       <wp:inline>
                         <wp:extent cx="2971800" cy="2377440"/>
                         <wp:effectExtent b="0" l="0" r="0" t="0"/>
-                        <wp:docPr descr="" title="" id="96" name="Picture"/>
+                        <wp:docPr descr="" title="" id="114" name="Picture"/>
                         <a:graphic>
                           <a:graphicData uri="http://schemas.openxmlformats.org/drawingml/2006/picture">
                             <pic:pic>
                               <pic:nvPicPr>
-                                <pic:cNvPr descr="calculus_files/figure-docx/exp-pdf-cdf-cdf-code-1.png" id="97" name="Picture"/>
+                                <pic:cNvPr descr="calculus_files/figure-docx/exp-pdf-cdf-cdf-code-1.png" id="115" name="Picture"/>
                                 <pic:cNvPicPr>
                                   <a:picLocks noChangeArrowheads="1" noChangeAspect="1"/>
                                 </pic:cNvPicPr>
                               </pic:nvPicPr>
                               <pic:blipFill>
-                                <a:blip r:embed="rId95"/>
+                                <a:blip r:embed="rId113"/>
                                 <a:stretch>
                                   <a:fillRect/>
                                 </a:stretch>
@@ -27589,7 +27972,7 @@
                     <w:t xml:space="preserve">.</w:t>
                   </w:r>
                 </w:p>
-                <w:bookmarkEnd w:id="98"/>
+                <w:bookmarkEnd w:id="116"/>
               </w:tc>
             </w:tr>
           </w:tbl>
@@ -27859,11 +28242,275 @@
         <w:t xml:space="preserve">computed via FTC Part 2.</w:t>
       </w:r>
     </w:p>
-    <w:bookmarkEnd w:id="99"/>
-    <w:bookmarkEnd w:id="100"/>
-    <w:bookmarkEnd w:id="101"/>
-    <w:bookmarkEnd w:id="102"/>
-    <w:bookmarkStart w:id="129" w:name="sec-double-integrals"/>
+    <w:bookmarkEnd w:id="117"/>
+    <w:bookmarkEnd w:id="118"/>
+    <w:tbl>
+      <w:tblPr>
+        <w:tblStyle w:val="Table"/>
+        <w:tblLook w:firstRow="0" w:lastRow="0" w:firstColumn="0" w:lastColumn="0" w:noHBand="0" w:noVBand="0" w:val="0000"/>
+        <w:tblBorders>
+          <w:top w:val="single" w:sz="4" w:space="0" w:color="00A047"/>
+          <w:left w:val="single" w:sz="24" w:space="0" w:color="00A047"/>
+          <w:bottom w:val="single" w:sz="4" w:space="0" w:color="00A047"/>
+          <w:right w:val="single" w:sz="4" w:space="0" w:color="00A047"/>
+        </w:tblBorders>
+        <w:tblCellMar>
+          <w:left w:w="144" w:type="dxa"/>
+          <w:right w:w="144" w:type="dxa"/>
+        </w:tblCellMar>
+        <w:tblLook w:firstRow="0" w:lastRow="0" w:firstColumn="0" w:lastColumn="0" w:noHBand="0" w:noVBand="0" w:val="0000"/>
+      </w:tblPr>
+      <w:tr>
+        <w:trPr>
+          <w:cantSplit/>
+        </w:trPr>
+        <w:tc>
+          <w:tcPr>
+            <w:shd w:color="auto" w:fill="ccf1e3" w:val="clear"/>
+            <w:tcMar>
+              <w:top w:w="92" w:type="dxa"/>
+              <w:bottom w:w="92" w:type="dxa"/>
+            </w:tcMar>
+          </w:tcPr>
+          <w:p>
+            <w:pPr>
+              <w:pStyle w:val="BodyText"/>
+            </w:pPr>
+            <w:pPr>
+              <w:spacing w:before="0" w:after="0"/>
+              <w:textAlignment w:val="center"/>
+            </w:pPr>
+            <w:r>
+              <w:drawing>
+                <wp:inline>
+                  <wp:extent cx="152400" cy="152400"/>
+                  <wp:effectExtent b="0" l="0" r="0" t="0"/>
+                  <wp:docPr descr="" title="" id="119" name="Picture"/>
+                  <a:graphic>
+                    <a:graphicData uri="http://schemas.openxmlformats.org/drawingml/2006/picture">
+                      <pic:pic>
+                        <pic:nvPicPr>
+                          <pic:cNvPr descr="/opt/quarto/share/formats/docx/tip.png" id="120" name="Picture"/>
+                          <pic:cNvPicPr>
+                            <a:picLocks noChangeArrowheads="1" noChangeAspect="1"/>
+                          </pic:cNvPicPr>
+                        </pic:nvPicPr>
+                        <pic:blipFill>
+                          <a:blip r:embed="rId23"/>
+                          <a:stretch>
+                            <a:fillRect/>
+                          </a:stretch>
+                        </pic:blipFill>
+                        <pic:spPr bwMode="auto">
+                          <a:xfrm>
+                            <a:off x="0" y="0"/>
+                            <a:ext cx="152400" cy="152400"/>
+                          </a:xfrm>
+                          <a:prstGeom prst="rect">
+                            <a:avLst/>
+                          </a:prstGeom>
+                          <a:noFill/>
+                          <a:ln w="9525">
+                            <a:noFill/>
+                            <a:headEnd/>
+                            <a:tailEnd/>
+                          </a:ln>
+                        </pic:spPr>
+                      </pic:pic>
+                    </a:graphicData>
+                  </a:graphic>
+                </wp:inline>
+              </w:drawing>
+            </w:r>
+            <w:r>
+              <w:t xml:space="preserve"> </w:t>
+            </w:r>
+            <w:r>
+              <w:t xml:space="preserve"> </w:t>
+            </w:r>
+            <w:r>
+              <w:t xml:space="preserve">Videos</w:t>
+            </w:r>
+          </w:p>
+        </w:tc>
+      </w:tr>
+      <w:tr>
+        <w:trPr>
+          <w:cantSplit/>
+        </w:trPr>
+        <w:tc>
+          <w:tcPr>
+            <w:tcMar>
+              <w:top w:w="108" w:type="dxa"/>
+              <w:bottom w:w="108" w:type="dxa"/>
+            </w:tcMar>
+          </w:tcPr>
+          <w:p>
+            <w:pPr>
+              <w:pStyle w:val="BodyText"/>
+            </w:pPr>
+            <w:pPr>
+              <w:spacing w:before="16"/>
+            </w:pPr>
+            <w:r>
+              <w:t xml:space="preserve">Jon Krohn’s</w:t>
+            </w:r>
+            <w:r>
+              <w:t xml:space="preserve"> </w:t>
+            </w:r>
+            <w:r>
+              <w:t xml:space="preserve">“Calculus for Machine Learning”</w:t>
+            </w:r>
+            <w:r>
+              <w:t xml:space="preserve"> </w:t>
+            </w:r>
+            <w:r>
+              <w:t xml:space="preserve">YouTube playlist has videos on integration:</w:t>
+            </w:r>
+          </w:p>
+          <w:p>
+            <w:pPr>
+              <w:pStyle w:val="Compact"/>
+              <w:numPr>
+                <w:ilvl w:val="0"/>
+                <w:numId w:val="1006"/>
+              </w:numPr>
+            </w:pPr>
+            <w:hyperlink r:id="rId121">
+              <w:r>
+                <w:rPr>
+                  <w:rStyle w:val="Hyperlink"/>
+                </w:rPr>
+                <w:t xml:space="preserve">Intro to Integral Calculus</w:t>
+              </w:r>
+            </w:hyperlink>
+          </w:p>
+          <w:p>
+            <w:pPr>
+              <w:pStyle w:val="Compact"/>
+              <w:numPr>
+                <w:ilvl w:val="0"/>
+                <w:numId w:val="1006"/>
+              </w:numPr>
+            </w:pPr>
+            <w:hyperlink r:id="rId122">
+              <w:r>
+                <w:rPr>
+                  <w:rStyle w:val="Hyperlink"/>
+                </w:rPr>
+                <w:t xml:space="preserve">The Method of Exhaustion</w:t>
+              </w:r>
+            </w:hyperlink>
+          </w:p>
+          <w:p>
+            <w:pPr>
+              <w:pStyle w:val="Compact"/>
+              <w:numPr>
+                <w:ilvl w:val="0"/>
+                <w:numId w:val="1006"/>
+              </w:numPr>
+            </w:pPr>
+            <w:hyperlink r:id="rId123">
+              <w:r>
+                <w:rPr>
+                  <w:rStyle w:val="Hyperlink"/>
+                </w:rPr>
+                <w:t xml:space="preserve">What Integral Calculus Is</w:t>
+              </w:r>
+            </w:hyperlink>
+          </w:p>
+          <w:p>
+            <w:pPr>
+              <w:pStyle w:val="Compact"/>
+              <w:numPr>
+                <w:ilvl w:val="0"/>
+                <w:numId w:val="1006"/>
+              </w:numPr>
+            </w:pPr>
+            <w:hyperlink r:id="rId124">
+              <w:r>
+                <w:rPr>
+                  <w:rStyle w:val="Hyperlink"/>
+                </w:rPr>
+                <w:t xml:space="preserve">The Integral Calculus Rules</w:t>
+              </w:r>
+            </w:hyperlink>
+          </w:p>
+          <w:p>
+            <w:pPr>
+              <w:pStyle w:val="Compact"/>
+              <w:numPr>
+                <w:ilvl w:val="0"/>
+                <w:numId w:val="1006"/>
+              </w:numPr>
+            </w:pPr>
+            <w:hyperlink r:id="rId125">
+              <w:r>
+                <w:rPr>
+                  <w:rStyle w:val="Hyperlink"/>
+                </w:rPr>
+                <w:t xml:space="preserve">Indefinite Integral Exercises</w:t>
+              </w:r>
+            </w:hyperlink>
+          </w:p>
+          <w:p>
+            <w:pPr>
+              <w:pStyle w:val="Compact"/>
+              <w:numPr>
+                <w:ilvl w:val="0"/>
+                <w:numId w:val="1006"/>
+              </w:numPr>
+            </w:pPr>
+            <w:hyperlink r:id="rId126">
+              <w:r>
+                <w:rPr>
+                  <w:rStyle w:val="Hyperlink"/>
+                </w:rPr>
+                <w:t xml:space="preserve">Definite Integrals</w:t>
+              </w:r>
+            </w:hyperlink>
+          </w:p>
+          <w:p>
+            <w:pPr>
+              <w:pStyle w:val="Compact"/>
+              <w:numPr>
+                <w:ilvl w:val="0"/>
+                <w:numId w:val="1006"/>
+              </w:numPr>
+            </w:pPr>
+            <w:hyperlink r:id="rId127">
+              <w:r>
+                <w:rPr>
+                  <w:rStyle w:val="Hyperlink"/>
+                </w:rPr>
+                <w:t xml:space="preserve">Definite Integral Exercise</w:t>
+              </w:r>
+            </w:hyperlink>
+          </w:p>
+          <w:p>
+            <w:pPr>
+              <w:pStyle w:val="Compact"/>
+              <w:numPr>
+                <w:ilvl w:val="0"/>
+                <w:numId w:val="1006"/>
+              </w:numPr>
+            </w:pPr>
+            <w:hyperlink r:id="rId128">
+              <w:r>
+                <w:rPr>
+                  <w:rStyle w:val="Hyperlink"/>
+                </w:rPr>
+                <w:t xml:space="preserve">Numeric Integration with Python</w:t>
+              </w:r>
+            </w:hyperlink>
+          </w:p>
+          <w:p/>
+        </w:tc>
+      </w:tr>
+    </w:tbl>
+    <w:bookmarkEnd w:id="129"/>
+    <w:bookmarkEnd w:id="130"/>
+    <w:bookmarkStart w:id="157" w:name="sec-double-integrals"/>
     <w:p>
       <w:pPr>
         <w:pStyle w:val="Heading2"/>
@@ -27967,7 +28614,7 @@
       <w:r>
         <w:t xml:space="preserve"> </w:t>
       </w:r>
-      <w:hyperlink r:id="rId103">
+      <w:hyperlink r:id="rId131">
         <w:r>
           <w:rPr>
             <w:rStyle w:val="Hyperlink"/>
@@ -27998,7 +28645,7 @@
         <w:t xml:space="preserve">follow from a stated theorem rather than from an aside.</w:t>
       </w:r>
     </w:p>
-    <w:bookmarkStart w:id="104" w:name="def-double-integral"/>
+    <w:bookmarkStart w:id="132" w:name="def-double-integral"/>
     <w:p>
       <w:pPr>
         <w:pStyle w:val="BodyText"/>
@@ -28674,8 +29321,8 @@
         <w:t xml:space="preserve">(Larson and Edwards 2018, sec. 14.2)</w:t>
       </w:r>
     </w:p>
-    <w:bookmarkEnd w:id="104"/>
-    <w:bookmarkStart w:id="105" w:name="exm-double-integral-area"/>
+    <w:bookmarkEnd w:id="132"/>
+    <w:bookmarkStart w:id="133" w:name="exm-double-integral-area"/>
     <w:p>
       <w:pPr>
         <w:pStyle w:val="BodyText"/>
@@ -28965,8 +29612,8 @@
         <w:t xml:space="preserve">.</w:t>
       </w:r>
     </w:p>
-    <w:bookmarkEnd w:id="105"/>
-    <w:bookmarkStart w:id="106" w:name="def-iterated-integral"/>
+    <w:bookmarkEnd w:id="133"/>
+    <w:bookmarkStart w:id="134" w:name="def-iterated-integral"/>
     <w:p>
       <w:pPr>
         <w:pStyle w:val="BodyText"/>
@@ -29640,8 +30287,8 @@
         <w:t xml:space="preserve">swapped.</w:t>
       </w:r>
     </w:p>
-    <w:bookmarkEnd w:id="106"/>
-    <w:bookmarkStart w:id="107" w:name="exm-iterated-integral"/>
+    <w:bookmarkEnd w:id="134"/>
+    <w:bookmarkStart w:id="135" w:name="exm-iterated-integral"/>
     <w:p>
       <w:pPr>
         <w:pStyle w:val="BodyText"/>
@@ -30312,8 +30959,8 @@
         </m:oMath>
       </m:oMathPara>
     </w:p>
-    <w:bookmarkEnd w:id="107"/>
-    <w:bookmarkStart w:id="108" w:name="thm-fubini"/>
+    <w:bookmarkEnd w:id="135"/>
+    <w:bookmarkStart w:id="136" w:name="thm-fubini"/>
     <w:p>
       <w:pPr>
         <w:pStyle w:val="FirstParagraph"/>
@@ -30399,7 +31046,7 @@
       <w:pPr>
         <w:numPr>
           <w:ilvl w:val="0"/>
-          <w:numId w:val="1005"/>
+          <w:numId w:val="1007"/>
         </w:numPr>
       </w:pPr>
       <w:r>
@@ -30847,7 +31494,7 @@
       <w:pPr>
         <w:numPr>
           <w:ilvl w:val="0"/>
-          <w:numId w:val="1005"/>
+          <w:numId w:val="1007"/>
         </w:numPr>
       </w:pPr>
       <w:r>
@@ -31327,8 +31974,8 @@
         <w:t xml:space="preserve">(Larson and Edwards 2018, Theorem 14.2, p. 982)</w:t>
       </w:r>
     </w:p>
-    <w:bookmarkEnd w:id="108"/>
-    <w:bookmarkStart w:id="115" w:name="exm-fubini-nonrect"/>
+    <w:bookmarkEnd w:id="136"/>
+    <w:bookmarkStart w:id="143" w:name="exm-fubini-nonrect"/>
     <w:p>
       <w:pPr>
         <w:pStyle w:val="BodyText"/>
@@ -31429,7 +32076,7 @@
       <w:r>
         <w:t xml:space="preserve"> </w:t>
       </w:r>
-      <w:hyperlink r:id="rId88">
+      <w:hyperlink r:id="rId106">
         <w:r>
           <w:rPr>
             <w:rStyle w:val="Hyperlink"/>
@@ -31449,7 +32096,7 @@
       <w:r>
         <w:t xml:space="preserve"> </w:t>
       </w:r>
-      <w:hyperlink r:id="rId89">
+      <w:hyperlink r:id="rId107">
         <w:r>
           <w:rPr>
             <w:rStyle w:val="Hyperlink"/>
@@ -31670,7 +32317,7 @@
       <w:r>
         <w:t xml:space="preserve"> </w:t>
       </w:r>
-      <w:hyperlink r:id="rId109">
+      <w:hyperlink r:id="rId137">
         <w:r>
           <w:rPr>
             <w:rStyle w:val="Hyperlink"/>
@@ -32473,7 +33120,7 @@
       <w:tr>
         <w:tc>
           <w:tcPr/>
-          <w:bookmarkStart w:id="113" w:name="fig-fubini-nonrect-region"/>
+          <w:bookmarkStart w:id="141" w:name="fig-fubini-nonrect-region"/>
           <w:p>
             <w:pPr>
               <w:pStyle w:val="SourceCode"/>
@@ -34022,18 +34669,18 @@
                 <wp:inline>
                   <wp:extent cx="4620126" cy="3696101"/>
                   <wp:effectExtent b="0" l="0" r="0" t="0"/>
-                  <wp:docPr descr="" title="" id="111" name="Picture"/>
+                  <wp:docPr descr="" title="" id="139" name="Picture"/>
                   <a:graphic>
                     <a:graphicData uri="http://schemas.openxmlformats.org/drawingml/2006/picture">
                       <pic:pic>
                         <pic:nvPicPr>
-                          <pic:cNvPr descr="calculus_files/figure-docx/unnamed-chunk-5-1.png" id="112" name="Picture"/>
+                          <pic:cNvPr descr="calculus_files/figure-docx/unnamed-chunk-5-1.png" id="140" name="Picture"/>
                           <pic:cNvPicPr>
                             <a:picLocks noChangeArrowheads="1" noChangeAspect="1"/>
                           </pic:cNvPicPr>
                         </pic:nvPicPr>
                         <pic:blipFill>
-                          <a:blip r:embed="rId110"/>
+                          <a:blip r:embed="rId138"/>
                           <a:stretch>
                             <a:fillRect/>
                           </a:stretch>
@@ -34273,7 +34920,7 @@
               <w:t xml:space="preserve">.</w:t>
             </w:r>
           </w:p>
-          <w:bookmarkEnd w:id="113"/>
+          <w:bookmarkEnd w:id="141"/>
         </w:tc>
       </w:tr>
     </w:tbl>
@@ -36630,7 +37277,7 @@
       <w:tr>
         <w:tc>
           <w:tcPr/>
-          <w:bookmarkStart w:id="114" w:name="fig-fubini-nonrect"/>
+          <w:bookmarkStart w:id="142" w:name="fig-fubini-nonrect"/>
           <w:p>
             <w:pPr>
               <w:pStyle w:val="Compact"/>
@@ -36977,12 +37624,12 @@
               <w:t xml:space="preserve">.</w:t>
             </w:r>
           </w:p>
-          <w:bookmarkEnd w:id="114"/>
+          <w:bookmarkEnd w:id="142"/>
         </w:tc>
       </w:tr>
     </w:tbl>
-    <w:bookmarkEnd w:id="115"/>
-    <w:bookmarkStart w:id="117" w:name="exm-fubini-fail"/>
+    <w:bookmarkEnd w:id="143"/>
+    <w:bookmarkStart w:id="145" w:name="exm-fubini-fail"/>
     <w:p>
       <w:pPr>
         <w:pStyle w:val="BodyText"/>
@@ -39042,7 +39689,7 @@
       <w:tr>
         <w:tc>
           <w:tcPr/>
-          <w:bookmarkStart w:id="116" w:name="fig-fubini-fail"/>
+          <w:bookmarkStart w:id="144" w:name="fig-fubini-fail"/>
           <w:p>
             <w:pPr>
               <w:pStyle w:val="Compact"/>
@@ -39594,12 +40241,12 @@
               <w:t xml:space="preserve">does not apply.</w:t>
             </w:r>
           </w:p>
-          <w:bookmarkEnd w:id="116"/>
+          <w:bookmarkEnd w:id="144"/>
         </w:tc>
       </w:tr>
     </w:tbl>
-    <w:bookmarkEnd w:id="117"/>
-    <w:bookmarkStart w:id="118" w:name="cor-fubini-rect"/>
+    <w:bookmarkEnd w:id="145"/>
+    <w:bookmarkStart w:id="146" w:name="cor-fubini-rect"/>
     <w:p>
       <w:pPr>
         <w:pStyle w:val="BodyText"/>
@@ -40172,7 +40819,7 @@
         <w:t xml:space="preserve">(Larson and Edwards 2018, Theorem 14.2, p. 982)</w:t>
       </w:r>
     </w:p>
-    <w:bookmarkEnd w:id="118"/>
+    <w:bookmarkEnd w:id="146"/>
     <w:p>
       <w:pPr>
         <w:pStyle w:val="BodyText"/>
@@ -40427,7 +41074,7 @@
         <w:t xml:space="preserve">two iterated forms shown.</w:t>
       </w:r>
     </w:p>
-    <w:bookmarkStart w:id="124" w:name="exm-fubini-rect"/>
+    <w:bookmarkStart w:id="152" w:name="exm-fubini-rect"/>
     <w:p>
       <w:pPr>
         <w:pStyle w:val="BodyText"/>
@@ -40706,7 +41353,7 @@
       <w:r>
         <w:t xml:space="preserve"> </w:t>
       </w:r>
-      <w:hyperlink r:id="rId88">
+      <w:hyperlink r:id="rId106">
         <w:r>
           <w:rPr>
             <w:rStyle w:val="Hyperlink"/>
@@ -40726,7 +41373,7 @@
       <w:r>
         <w:t xml:space="preserve"> </w:t>
       </w:r>
-      <w:hyperlink r:id="rId89">
+      <w:hyperlink r:id="rId107">
         <w:r>
           <w:rPr>
             <w:rStyle w:val="Hyperlink"/>
@@ -41015,7 +41662,7 @@
       <w:r>
         <w:t xml:space="preserve"> </w:t>
       </w:r>
-      <w:hyperlink r:id="rId109">
+      <w:hyperlink r:id="rId137">
         <w:r>
           <w:rPr>
             <w:rStyle w:val="Hyperlink"/>
@@ -41306,7 +41953,7 @@
       <w:tr>
         <w:tc>
           <w:tcPr/>
-          <w:bookmarkStart w:id="122" w:name="fig-fubini-rect-region"/>
+          <w:bookmarkStart w:id="150" w:name="fig-fubini-rect-region"/>
           <w:p>
             <w:pPr>
               <w:pStyle w:val="SourceCode"/>
@@ -42198,18 +42845,18 @@
                 <wp:inline>
                   <wp:extent cx="4620126" cy="3696101"/>
                   <wp:effectExtent b="0" l="0" r="0" t="0"/>
-                  <wp:docPr descr="" title="" id="120" name="Picture"/>
+                  <wp:docPr descr="" title="" id="148" name="Picture"/>
                   <a:graphic>
                     <a:graphicData uri="http://schemas.openxmlformats.org/drawingml/2006/picture">
                       <pic:pic>
                         <pic:nvPicPr>
-                          <pic:cNvPr descr="calculus_files/figure-docx/unnamed-chunk-10-1.png" id="121" name="Picture"/>
+                          <pic:cNvPr descr="calculus_files/figure-docx/unnamed-chunk-10-1.png" id="149" name="Picture"/>
                           <pic:cNvPicPr>
                             <a:picLocks noChangeArrowheads="1" noChangeAspect="1"/>
                           </pic:cNvPicPr>
                         </pic:nvPicPr>
                         <pic:blipFill>
-                          <a:blip r:embed="rId119"/>
+                          <a:blip r:embed="rId147"/>
                           <a:stretch>
                             <a:fillRect/>
                           </a:stretch>
@@ -42299,7 +42946,7 @@
               <w:t xml:space="preserve">, the unit square.</w:t>
             </w:r>
           </w:p>
-          <w:bookmarkEnd w:id="122"/>
+          <w:bookmarkEnd w:id="150"/>
         </w:tc>
       </w:tr>
     </w:tbl>
@@ -43931,7 +44578,7 @@
       <w:tr>
         <w:tc>
           <w:tcPr/>
-          <w:bookmarkStart w:id="123" w:name="fig-fubini-rect"/>
+          <w:bookmarkStart w:id="151" w:name="fig-fubini-rect"/>
           <w:p>
             <w:pPr>
               <w:pStyle w:val="Compact"/>
@@ -44155,12 +44802,12 @@
               <w:t xml:space="preserve">.</w:t>
             </w:r>
           </w:p>
-          <w:bookmarkEnd w:id="123"/>
+          <w:bookmarkEnd w:id="151"/>
         </w:tc>
       </w:tr>
     </w:tbl>
-    <w:bookmarkEnd w:id="124"/>
-    <w:bookmarkStart w:id="125" w:name="thm-fubini-tonelli"/>
+    <w:bookmarkEnd w:id="152"/>
+    <w:bookmarkStart w:id="153" w:name="thm-fubini-tonelli"/>
     <w:p>
       <w:pPr>
         <w:pStyle w:val="BodyText"/>
@@ -44504,7 +45151,7 @@
       <w:pPr>
         <w:numPr>
           <w:ilvl w:val="0"/>
-          <w:numId w:val="1006"/>
+          <w:numId w:val="1008"/>
         </w:numPr>
       </w:pPr>
       <m:oMath>
@@ -44583,7 +45230,7 @@
       <w:pPr>
         <w:numPr>
           <w:ilvl w:val="0"/>
-          <w:numId w:val="1006"/>
+          <w:numId w:val="1008"/>
         </w:numPr>
       </w:pPr>
       <m:oMath>
@@ -45323,8 +45970,8 @@
         <w:t xml:space="preserve">(Billingsley 1995, Theorem 18.3; Gut 2013, Theorem 9.1, p. 65; Fubini 1907; Wikipedia contributors 2024)</w:t>
       </w:r>
     </w:p>
-    <w:bookmarkEnd w:id="125"/>
-    <w:bookmarkStart w:id="126" w:name="rem-fubini-tonelli-probability"/>
+    <w:bookmarkEnd w:id="153"/>
+    <w:bookmarkStart w:id="154" w:name="rem-fubini-tonelli-probability"/>
     <w:p>
       <w:pPr>
         <w:pStyle w:val="BodyText"/>
@@ -45351,7 +45998,7 @@
       <w:r>
         <w:t xml:space="preserve"> </w:t>
       </w:r>
-      <w:hyperlink r:id="rId103">
+      <w:hyperlink r:id="rId131">
         <w:r>
           <w:rPr>
             <w:rStyle w:val="Hyperlink"/>
@@ -45635,8 +46282,8 @@
         <w:t xml:space="preserve">-finiteness alone does not make the iterated integrals agree.</w:t>
       </w:r>
     </w:p>
-    <w:bookmarkEnd w:id="126"/>
-    <w:bookmarkStart w:id="127" w:name="exm-fubini-tonelli-apply"/>
+    <w:bookmarkEnd w:id="154"/>
+    <w:bookmarkStart w:id="155" w:name="exm-fubini-tonelli-apply"/>
     <w:p>
       <w:pPr>
         <w:pStyle w:val="BodyText"/>
@@ -45735,7 +46382,7 @@
       <w:r>
         <w:t xml:space="preserve"> </w:t>
       </w:r>
-      <w:hyperlink r:id="rId88">
+      <w:hyperlink r:id="rId106">
         <w:r>
           <w:rPr>
             <w:rStyle w:val="Hyperlink"/>
@@ -45755,7 +46402,7 @@
       <w:r>
         <w:t xml:space="preserve"> </w:t>
       </w:r>
-      <w:hyperlink r:id="rId89">
+      <w:hyperlink r:id="rId107">
         <w:r>
           <w:rPr>
             <w:rStyle w:val="Hyperlink"/>
@@ -48744,8 +49391,8 @@
         <w:t xml:space="preserve">guarantees when condition (a) holds.</w:t>
       </w:r>
     </w:p>
-    <w:bookmarkEnd w:id="127"/>
-    <w:bookmarkStart w:id="128" w:name="exm-fubini-fail-tonelli"/>
+    <w:bookmarkEnd w:id="155"/>
+    <w:bookmarkStart w:id="156" w:name="exm-fubini-fail-tonelli"/>
     <w:p>
       <w:pPr>
         <w:pStyle w:val="BodyText"/>
@@ -49880,9 +50527,9 @@
         <w:t xml:space="preserve">(Wikipedia contributors 2024)</w:t>
       </w:r>
     </w:p>
-    <w:bookmarkEnd w:id="128"/>
-    <w:bookmarkEnd w:id="129"/>
-    <w:bookmarkStart w:id="132" w:name="sec-additional-resources"/>
+    <w:bookmarkEnd w:id="156"/>
+    <w:bookmarkEnd w:id="157"/>
+    <w:bookmarkStart w:id="160" w:name="sec-additional-resources"/>
     <w:p>
       <w:pPr>
         <w:pStyle w:val="Heading2"/>
@@ -49896,7 +50543,7 @@
         <w:pStyle w:val="Compact"/>
         <w:numPr>
           <w:ilvl w:val="0"/>
-          <w:numId w:val="1007"/>
+          <w:numId w:val="1009"/>
         </w:numPr>
       </w:pPr>
       <w:r>
@@ -49908,7 +50555,7 @@
         <w:pStyle w:val="Compact"/>
         <w:numPr>
           <w:ilvl w:val="0"/>
-          <w:numId w:val="1007"/>
+          <w:numId w:val="1009"/>
         </w:numPr>
       </w:pPr>
       <w:r>
@@ -49920,7 +50567,7 @@
         <w:pStyle w:val="Compact"/>
         <w:numPr>
           <w:ilvl w:val="0"/>
-          <w:numId w:val="1007"/>
+          <w:numId w:val="1009"/>
         </w:numPr>
       </w:pPr>
       <w:r>
@@ -49932,7 +50579,7 @@
         <w:pStyle w:val="Compact"/>
         <w:numPr>
           <w:ilvl w:val="0"/>
-          <w:numId w:val="1007"/>
+          <w:numId w:val="1009"/>
         </w:numPr>
       </w:pPr>
       <w:r>
@@ -49944,7 +50591,7 @@
         <w:pStyle w:val="Compact"/>
         <w:numPr>
           <w:ilvl w:val="0"/>
-          <w:numId w:val="1007"/>
+          <w:numId w:val="1009"/>
         </w:numPr>
       </w:pPr>
       <w:r>
@@ -49956,10 +50603,10 @@
         <w:pStyle w:val="Compact"/>
         <w:numPr>
           <w:ilvl w:val="1"/>
-          <w:numId w:val="1008"/>
+          <w:numId w:val="1010"/>
         </w:numPr>
       </w:pPr>
-      <w:hyperlink r:id="rId130">
+      <w:hyperlink r:id="rId158">
         <w:r>
           <w:rPr>
             <w:rStyle w:val="Hyperlink"/>
@@ -49973,10 +50620,10 @@
         <w:pStyle w:val="Compact"/>
         <w:numPr>
           <w:ilvl w:val="1"/>
-          <w:numId w:val="1008"/>
+          <w:numId w:val="1010"/>
         </w:numPr>
       </w:pPr>
-      <w:hyperlink r:id="rId131">
+      <w:hyperlink r:id="rId159">
         <w:r>
           <w:rPr>
             <w:rStyle w:val="Hyperlink"/>
@@ -49990,7 +50637,7 @@
         <w:pStyle w:val="Compact"/>
         <w:numPr>
           <w:ilvl w:val="0"/>
-          <w:numId w:val="1007"/>
+          <w:numId w:val="1009"/>
         </w:numPr>
       </w:pPr>
       <w:r>
@@ -50003,8 +50650,8 @@
         <w:t xml:space="preserve">(the rigorous foundations behind these results)</w:t>
       </w:r>
     </w:p>
-    <w:bookmarkEnd w:id="132"/>
-    <w:bookmarkStart w:id="155" w:name="references"/>
+    <w:bookmarkEnd w:id="160"/>
+    <w:bookmarkStart w:id="183" w:name="references"/>
     <w:p>
       <w:pPr>
         <w:pStyle w:val="Heading2"/>
@@ -50013,8 +50660,8 @@
         <w:t xml:space="preserve">References</w:t>
       </w:r>
     </w:p>
-    <w:bookmarkStart w:id="154" w:name="refs"/>
-    <w:bookmarkStart w:id="134" w:name="ref-calclifesaver"/>
+    <w:bookmarkStart w:id="182" w:name="refs"/>
+    <w:bookmarkStart w:id="162" w:name="ref-calclifesaver"/>
     <w:p>
       <w:pPr>
         <w:pStyle w:val="Bibliography"/>
@@ -50038,7 +50685,7 @@
       <w:r>
         <w:t xml:space="preserve"> </w:t>
       </w:r>
-      <w:hyperlink r:id="rId133">
+      <w:hyperlink r:id="rId161">
         <w:r>
           <w:rPr>
             <w:rStyle w:val="Hyperlink"/>
@@ -50050,8 +50697,8 @@
         <w:t xml:space="preserve">.</w:t>
       </w:r>
     </w:p>
-    <w:bookmarkEnd w:id="134"/>
-    <w:bookmarkStart w:id="135" w:name="ref-billingsley1995probability"/>
+    <w:bookmarkEnd w:id="162"/>
+    <w:bookmarkStart w:id="163" w:name="ref-billingsley1995probability"/>
     <w:p>
       <w:pPr>
         <w:pStyle w:val="Bibliography"/>
@@ -50073,8 +50720,8 @@
         <w:t xml:space="preserve">. 3rd ed. Wiley Series in Probability and Mathematical Statistics. Wiley.</w:t>
       </w:r>
     </w:p>
-    <w:bookmarkEnd w:id="135"/>
-    <w:bookmarkStart w:id="136" w:name="ref-fubini1907"/>
+    <w:bookmarkEnd w:id="163"/>
+    <w:bookmarkStart w:id="164" w:name="ref-fubini1907"/>
     <w:p>
       <w:pPr>
         <w:pStyle w:val="Bibliography"/>
@@ -50105,8 +50752,8 @@
         <w:t xml:space="preserve">16: 608–14.</w:t>
       </w:r>
     </w:p>
-    <w:bookmarkEnd w:id="136"/>
-    <w:bookmarkStart w:id="138" w:name="ref-realanalysislifesaver"/>
+    <w:bookmarkEnd w:id="164"/>
+    <w:bookmarkStart w:id="166" w:name="ref-realanalysislifesaver"/>
     <w:p>
       <w:pPr>
         <w:pStyle w:val="Bibliography"/>
@@ -50130,7 +50777,7 @@
       <w:r>
         <w:t xml:space="preserve"> </w:t>
       </w:r>
-      <w:hyperlink r:id="rId137">
+      <w:hyperlink r:id="rId165">
         <w:r>
           <w:rPr>
             <w:rStyle w:val="Hyperlink"/>
@@ -50142,8 +50789,8 @@
         <w:t xml:space="preserve">.</w:t>
       </w:r>
     </w:p>
-    <w:bookmarkEnd w:id="138"/>
-    <w:bookmarkStart w:id="140" w:name="ref-gut2013"/>
+    <w:bookmarkEnd w:id="166"/>
+    <w:bookmarkStart w:id="168" w:name="ref-gut2013"/>
     <w:p>
       <w:pPr>
         <w:pStyle w:val="Bibliography"/>
@@ -50167,7 +50814,7 @@
       <w:r>
         <w:t xml:space="preserve"> </w:t>
       </w:r>
-      <w:hyperlink r:id="rId139">
+      <w:hyperlink r:id="rId167">
         <w:r>
           <w:rPr>
             <w:rStyle w:val="Hyperlink"/>
@@ -50179,8 +50826,8 @@
         <w:t xml:space="preserve">.</w:t>
       </w:r>
     </w:p>
-    <w:bookmarkEnd w:id="140"/>
-    <w:bookmarkStart w:id="142" w:name="ref-mosaiccalc"/>
+    <w:bookmarkEnd w:id="168"/>
+    <w:bookmarkStart w:id="170" w:name="ref-mosaiccalc"/>
     <w:p>
       <w:pPr>
         <w:pStyle w:val="Bibliography"/>
@@ -50204,7 +50851,7 @@
       <w:r>
         <w:t xml:space="preserve"> </w:t>
       </w:r>
-      <w:hyperlink r:id="rId141">
+      <w:hyperlink r:id="rId169">
         <w:r>
           <w:rPr>
             <w:rStyle w:val="Hyperlink"/>
@@ -50216,8 +50863,8 @@
         <w:t xml:space="preserve">.</w:t>
       </w:r>
     </w:p>
-    <w:bookmarkEnd w:id="142"/>
-    <w:bookmarkStart w:id="144" w:name="ref-khuri2003advanced"/>
+    <w:bookmarkEnd w:id="170"/>
+    <w:bookmarkStart w:id="172" w:name="ref-khuri2003advanced"/>
     <w:p>
       <w:pPr>
         <w:pStyle w:val="Bibliography"/>
@@ -50241,7 +50888,7 @@
       <w:r>
         <w:t xml:space="preserve"> </w:t>
       </w:r>
-      <w:hyperlink r:id="rId143">
+      <w:hyperlink r:id="rId171">
         <w:r>
           <w:rPr>
             <w:rStyle w:val="Hyperlink"/>
@@ -50253,8 +50900,8 @@
         <w:t xml:space="preserve">.</w:t>
       </w:r>
     </w:p>
-    <w:bookmarkEnd w:id="144"/>
-    <w:bookmarkStart w:id="146" w:name="ref-kleinbaum2012survival"/>
+    <w:bookmarkEnd w:id="172"/>
+    <w:bookmarkStart w:id="174" w:name="ref-kleinbaum2012survival"/>
     <w:p>
       <w:pPr>
         <w:pStyle w:val="Bibliography"/>
@@ -50278,7 +50925,7 @@
       <w:r>
         <w:t xml:space="preserve"> </w:t>
       </w:r>
-      <w:hyperlink r:id="rId145">
+      <w:hyperlink r:id="rId173">
         <w:r>
           <w:rPr>
             <w:rStyle w:val="Hyperlink"/>
@@ -50290,8 +50937,8 @@
         <w:t xml:space="preserve">.</w:t>
       </w:r>
     </w:p>
-    <w:bookmarkEnd w:id="146"/>
-    <w:bookmarkStart w:id="148" w:name="ref-larsonCalc11e"/>
+    <w:bookmarkEnd w:id="174"/>
+    <w:bookmarkStart w:id="176" w:name="ref-larsonCalc11e"/>
     <w:p>
       <w:pPr>
         <w:pStyle w:val="Bibliography"/>
@@ -50315,7 +50962,7 @@
       <w:r>
         <w:t xml:space="preserve"> </w:t>
       </w:r>
-      <w:hyperlink r:id="rId147">
+      <w:hyperlink r:id="rId175">
         <w:r>
           <w:rPr>
             <w:rStyle w:val="Hyperlink"/>
@@ -50327,8 +50974,8 @@
         <w:t xml:space="preserve">.</w:t>
       </w:r>
     </w:p>
-    <w:bookmarkEnd w:id="148"/>
-    <w:bookmarkStart w:id="150" w:name="ref-problifesavercalc"/>
+    <w:bookmarkEnd w:id="176"/>
+    <w:bookmarkStart w:id="178" w:name="ref-problifesavercalc"/>
     <w:p>
       <w:pPr>
         <w:pStyle w:val="Bibliography"/>
@@ -50352,7 +50999,7 @@
       <w:r>
         <w:t xml:space="preserve"> </w:t>
       </w:r>
-      <w:hyperlink r:id="rId149">
+      <w:hyperlink r:id="rId177">
         <w:r>
           <w:rPr>
             <w:rStyle w:val="Hyperlink"/>
@@ -50364,8 +51011,8 @@
         <w:t xml:space="preserve">.</w:t>
       </w:r>
     </w:p>
-    <w:bookmarkEnd w:id="150"/>
-    <w:bookmarkStart w:id="151" w:name="ref-rudin1976principles"/>
+    <w:bookmarkEnd w:id="178"/>
+    <w:bookmarkStart w:id="179" w:name="ref-rudin1976principles"/>
     <w:p>
       <w:pPr>
         <w:pStyle w:val="Bibliography"/>
@@ -50387,8 +51034,8 @@
         <w:t xml:space="preserve">. 3rd ed. International Series in Pure and Applied Mathematics. McGraw-Hill.</w:t>
       </w:r>
     </w:p>
-    <w:bookmarkEnd w:id="151"/>
-    <w:bookmarkStart w:id="153" w:name="ref-wp:fubini"/>
+    <w:bookmarkEnd w:id="179"/>
+    <w:bookmarkStart w:id="181" w:name="ref-wp:fubini"/>
     <w:p>
       <w:pPr>
         <w:pStyle w:val="Bibliography"/>
@@ -50447,7 +51094,7 @@
       <w:r>
         <w:t xml:space="preserve"> </w:t>
       </w:r>
-      <w:hyperlink r:id="rId152">
+      <w:hyperlink r:id="rId180">
         <w:r>
           <w:rPr>
             <w:rStyle w:val="Hyperlink"/>
@@ -50459,9 +51106,9 @@
         <w:t xml:space="preserve">.</w:t>
       </w:r>
     </w:p>
-    <w:bookmarkEnd w:id="153"/>
-    <w:bookmarkEnd w:id="154"/>
-    <w:bookmarkEnd w:id="155"/>
+    <w:bookmarkEnd w:id="181"/>
+    <w:bookmarkEnd w:id="182"/>
+    <w:bookmarkEnd w:id="183"/>
     <w:sectPr>
       <w:footnotePr>
         <w:numRestart w:val="eachSect"/>
@@ -50879,34 +51526,7 @@
     </w:lvlOverride>
   </w:num>
   <w:num w:numId="1002">
-    <w:abstractNumId w:val="99411"/>
-    <w:lvlOverride w:ilvl="0">
-      <w:startOverride w:val="1"/>
-    </w:lvlOverride>
-    <w:lvlOverride w:ilvl="1">
-      <w:startOverride w:val="1"/>
-    </w:lvlOverride>
-    <w:lvlOverride w:ilvl="2">
-      <w:startOverride w:val="1"/>
-    </w:lvlOverride>
-    <w:lvlOverride w:ilvl="3">
-      <w:startOverride w:val="1"/>
-    </w:lvlOverride>
-    <w:lvlOverride w:ilvl="4">
-      <w:startOverride w:val="1"/>
-    </w:lvlOverride>
-    <w:lvlOverride w:ilvl="5">
-      <w:startOverride w:val="1"/>
-    </w:lvlOverride>
-    <w:lvlOverride w:ilvl="6">
-      <w:startOverride w:val="1"/>
-    </w:lvlOverride>
-    <w:lvlOverride w:ilvl="7">
-      <w:startOverride w:val="1"/>
-    </w:lvlOverride>
-    <w:lvlOverride w:ilvl="8">
-      <w:startOverride w:val="1"/>
-    </w:lvlOverride>
+    <w:abstractNumId w:val="991"/>
   </w:num>
   <w:num w:numId="1003">
     <w:abstractNumId w:val="99411"/>
@@ -50939,9 +51559,6 @@
     </w:lvlOverride>
   </w:num>
   <w:num w:numId="1004">
-    <w:abstractNumId w:val="991"/>
-  </w:num>
-  <w:num w:numId="1005">
     <w:abstractNumId w:val="99411"/>
     <w:lvlOverride w:ilvl="0">
       <w:startOverride w:val="1"/>
@@ -50971,7 +51588,43 @@
       <w:startOverride w:val="1"/>
     </w:lvlOverride>
   </w:num>
+  <w:num w:numId="1005">
+    <w:abstractNumId w:val="991"/>
+  </w:num>
   <w:num w:numId="1006">
+    <w:abstractNumId w:val="991"/>
+  </w:num>
+  <w:num w:numId="1007">
+    <w:abstractNumId w:val="99411"/>
+    <w:lvlOverride w:ilvl="0">
+      <w:startOverride w:val="1"/>
+    </w:lvlOverride>
+    <w:lvlOverride w:ilvl="1">
+      <w:startOverride w:val="1"/>
+    </w:lvlOverride>
+    <w:lvlOverride w:ilvl="2">
+      <w:startOverride w:val="1"/>
+    </w:lvlOverride>
+    <w:lvlOverride w:ilvl="3">
+      <w:startOverride w:val="1"/>
+    </w:lvlOverride>
+    <w:lvlOverride w:ilvl="4">
+      <w:startOverride w:val="1"/>
+    </w:lvlOverride>
+    <w:lvlOverride w:ilvl="5">
+      <w:startOverride w:val="1"/>
+    </w:lvlOverride>
+    <w:lvlOverride w:ilvl="6">
+      <w:startOverride w:val="1"/>
+    </w:lvlOverride>
+    <w:lvlOverride w:ilvl="7">
+      <w:startOverride w:val="1"/>
+    </w:lvlOverride>
+    <w:lvlOverride w:ilvl="8">
+      <w:startOverride w:val="1"/>
+    </w:lvlOverride>
+  </w:num>
+  <w:num w:numId="1008">
     <w:abstractNumId w:val="99731"/>
     <w:lvlOverride w:ilvl="0">
       <w:startOverride w:val="1"/>
@@ -51001,10 +51654,10 @@
       <w:startOverride w:val="1"/>
     </w:lvlOverride>
   </w:num>
-  <w:num w:numId="1007">
+  <w:num w:numId="1009">
     <w:abstractNumId w:val="991"/>
   </w:num>
-  <w:num w:numId="1008">
+  <w:num w:numId="1010">
     <w:abstractNumId w:val="991"/>
   </w:num>
 </w:numbering>

</xml_diff>

<commit_message>
Deploying to gh-pages from @ Morrison-Lab/mds@66e5c17d340a87f44300cdd859a15ce73f7d06c8 🚀
</commit_message>
<xml_diff>
--- a/calculus.docx
+++ b/calculus.docx
@@ -15,7 +15,7 @@
         <w:pStyle w:val="Date"/>
       </w:pPr>
       <w:r>
-        <w:t xml:space="preserve">Last modified: 2026-10-03 14:54:29 (PDT)</w:t>
+        <w:t xml:space="preserve">Last modified: 2026-10-03 18:50:04 (PDT)</w:t>
       </w:r>
     </w:p>
     <w:bookmarkStart w:id="42" w:name="sec-derivatives"/>
@@ -28709,7 +28709,7 @@
         <w:t xml:space="preserve"> </w:t>
       </w:r>
       <w:r>
-        <w:t xml:space="preserve">corollary in the probability chapter of</w:t>
+        <w:t xml:space="preserve">corollary in</w:t>
       </w:r>
       <w:r>
         <w:t xml:space="preserve"> </w:t>
@@ -28719,7 +28719,7 @@
           <w:i/>
           <w:iCs/>
         </w:rPr>
-        <w:t xml:space="preserve">Regression Models for Epidemiology</w:t>
+        <w:t xml:space="preserve">Probability for Data Science</w:t>
       </w:r>
       <w:r>
         <w:t xml:space="preserve"> </w:t>
@@ -46093,13 +46093,7 @@
         <w:t xml:space="preserve"> </w:t>
       </w:r>
       <w:r>
-        <w:t xml:space="preserve">corollary in the probability</w:t>
-      </w:r>
-      <w:r>
-        <w:t xml:space="preserve"> </w:t>
-      </w:r>
-      <w:r>
-        <w:t xml:space="preserve">chapter of</w:t>
+        <w:t xml:space="preserve">corollary in</w:t>
       </w:r>
       <w:r>
         <w:t xml:space="preserve"> </w:t>
@@ -46109,7 +46103,7 @@
           <w:i/>
           <w:iCs/>
         </w:rPr>
-        <w:t xml:space="preserve">Regression Models for Epidemiology</w:t>
+        <w:t xml:space="preserve">Probability for Data Science</w:t>
       </w:r>
       <w:r>
         <w:t xml:space="preserve">.</w:t>

</xml_diff>

<commit_message>
Deploying to gh-pages from @ Morrison-Lab/mds@922feba3892f1e3047c8a76b60e2ae5aa31926f9 🚀
</commit_message>
<xml_diff>
--- a/calculus.docx
+++ b/calculus.docx
@@ -15,10 +15,10 @@
         <w:pStyle w:val="Date"/>
       </w:pPr>
       <w:r>
-        <w:t xml:space="preserve">Last modified: 2026-10-05 13:41:05 (PDT)</w:t>
+        <w:t xml:space="preserve">Last modified: 2026-10-05 14:38:19 (PDT)</w:t>
       </w:r>
     </w:p>
-    <w:bookmarkStart w:id="43" w:name="sec-derivatives"/>
+    <w:bookmarkStart w:id="48" w:name="sec-derivatives"/>
     <w:p>
       <w:pPr>
         <w:pStyle w:val="Heading2"/>
@@ -120,7 +120,152 @@
       </m:oMathPara>
     </w:p>
     <w:bookmarkEnd w:id="9"/>
-    <w:bookmarkStart w:id="10" w:name="thm-deriv-const-factor"/>
+    <w:tbl>
+      <w:tblPr>
+        <w:tblStyle w:val="Table"/>
+        <w:tblLook w:firstRow="0" w:lastRow="0" w:firstColumn="0" w:lastColumn="0" w:noHBand="0" w:noVBand="0" w:val="0000"/>
+        <w:tblBorders>
+          <w:top w:val="single" w:sz="4" w:space="0" w:color="00A047"/>
+          <w:left w:val="single" w:sz="24" w:space="0" w:color="00A047"/>
+          <w:bottom w:val="single" w:sz="4" w:space="0" w:color="00A047"/>
+          <w:right w:val="single" w:sz="4" w:space="0" w:color="00A047"/>
+        </w:tblBorders>
+        <w:tblCellMar>
+          <w:left w:w="144" w:type="dxa"/>
+          <w:right w:w="144" w:type="dxa"/>
+        </w:tblCellMar>
+        <w:tblLook w:firstRow="0" w:lastRow="0" w:firstColumn="0" w:lastColumn="0" w:noHBand="0" w:noVBand="0" w:val="0000"/>
+      </w:tblPr>
+      <w:tr>
+        <w:trPr>
+          <w:cantSplit/>
+        </w:trPr>
+        <w:tc>
+          <w:tcPr>
+            <w:shd w:color="auto" w:fill="ccf1e3" w:val="clear"/>
+            <w:tcMar>
+              <w:top w:w="92" w:type="dxa"/>
+              <w:bottom w:w="92" w:type="dxa"/>
+            </w:tcMar>
+          </w:tcPr>
+          <w:p>
+            <w:pPr>
+              <w:pStyle w:val="FirstParagraph"/>
+            </w:pPr>
+            <w:pPr>
+              <w:spacing w:before="0" w:after="0"/>
+              <w:textAlignment w:val="center"/>
+            </w:pPr>
+            <w:r>
+              <w:drawing>
+                <wp:inline>
+                  <wp:extent cx="152400" cy="152400"/>
+                  <wp:effectExtent b="0" l="0" r="0" t="0"/>
+                  <wp:docPr descr="" title="" id="11" name="Picture"/>
+                  <a:graphic>
+                    <a:graphicData uri="http://schemas.openxmlformats.org/drawingml/2006/picture">
+                      <pic:pic>
+                        <pic:nvPicPr>
+                          <pic:cNvPr descr="/opt/quarto/share/formats/docx/tip.png" id="12" name="Picture"/>
+                          <pic:cNvPicPr>
+                            <a:picLocks noChangeArrowheads="1" noChangeAspect="1"/>
+                          </pic:cNvPicPr>
+                        </pic:nvPicPr>
+                        <pic:blipFill>
+                          <a:blip r:embed="rId10"/>
+                          <a:stretch>
+                            <a:fillRect/>
+                          </a:stretch>
+                        </pic:blipFill>
+                        <pic:spPr bwMode="auto">
+                          <a:xfrm>
+                            <a:off x="0" y="0"/>
+                            <a:ext cx="152400" cy="152400"/>
+                          </a:xfrm>
+                          <a:prstGeom prst="rect">
+                            <a:avLst/>
+                          </a:prstGeom>
+                          <a:noFill/>
+                          <a:ln w="9525">
+                            <a:noFill/>
+                            <a:headEnd/>
+                            <a:tailEnd/>
+                          </a:ln>
+                        </pic:spPr>
+                      </pic:pic>
+                    </a:graphicData>
+                  </a:graphic>
+                </wp:inline>
+              </w:drawing>
+            </w:r>
+            <w:r>
+              <w:t xml:space="preserve"> </w:t>
+            </w:r>
+            <w:r>
+              <w:t xml:space="preserve"> </w:t>
+            </w:r>
+            <w:r>
+              <w:t xml:space="preserve">Video</w:t>
+            </w:r>
+          </w:p>
+        </w:tc>
+      </w:tr>
+      <w:tr>
+        <w:trPr>
+          <w:cantSplit/>
+        </w:trPr>
+        <w:tc>
+          <w:tcPr>
+            <w:tcMar>
+              <w:top w:w="108" w:type="dxa"/>
+              <w:bottom w:w="108" w:type="dxa"/>
+            </w:tcMar>
+          </w:tcPr>
+          <w:p>
+            <w:pPr>
+              <w:pStyle w:val="BodyText"/>
+            </w:pPr>
+            <w:pPr>
+              <w:spacing w:before="16"/>
+            </w:pPr>
+            <w:r>
+              <w:t xml:space="preserve">Jon Krohn’s</w:t>
+            </w:r>
+            <w:r>
+              <w:t xml:space="preserve"> </w:t>
+            </w:r>
+            <w:r>
+              <w:t xml:space="preserve">“Calculus for Machine Learning”</w:t>
+            </w:r>
+            <w:r>
+              <w:t xml:space="preserve"> </w:t>
+            </w:r>
+            <w:r>
+              <w:t xml:space="preserve">YouTube playlist has a video on this rule:</w:t>
+            </w:r>
+          </w:p>
+          <w:p>
+            <w:pPr>
+              <w:pStyle w:val="Compact"/>
+              <w:numPr>
+                <w:ilvl w:val="0"/>
+                <w:numId w:val="1001"/>
+              </w:numPr>
+            </w:pPr>
+            <w:hyperlink r:id="rId13">
+              <w:r>
+                <w:rPr>
+                  <w:rStyle w:val="Hyperlink"/>
+                </w:rPr>
+                <w:t xml:space="preserve">The Derivative of a Constant</w:t>
+              </w:r>
+            </w:hyperlink>
+          </w:p>
+          <w:p/>
+        </w:tc>
+      </w:tr>
+    </w:tbl>
+    <w:bookmarkStart w:id="14" w:name="thm-deriv-const-factor"/>
     <w:p>
       <w:pPr>
         <w:pStyle w:val="FirstParagraph"/>
@@ -270,8 +415,153 @@
         </m:oMath>
       </m:oMathPara>
     </w:p>
-    <w:bookmarkEnd w:id="10"/>
-    <w:bookmarkStart w:id="11" w:name="thm-deriv-polynomial"/>
+    <w:bookmarkEnd w:id="14"/>
+    <w:tbl>
+      <w:tblPr>
+        <w:tblStyle w:val="Table"/>
+        <w:tblLook w:firstRow="0" w:lastRow="0" w:firstColumn="0" w:lastColumn="0" w:noHBand="0" w:noVBand="0" w:val="0000"/>
+        <w:tblBorders>
+          <w:top w:val="single" w:sz="4" w:space="0" w:color="00A047"/>
+          <w:left w:val="single" w:sz="24" w:space="0" w:color="00A047"/>
+          <w:bottom w:val="single" w:sz="4" w:space="0" w:color="00A047"/>
+          <w:right w:val="single" w:sz="4" w:space="0" w:color="00A047"/>
+        </w:tblBorders>
+        <w:tblCellMar>
+          <w:left w:w="144" w:type="dxa"/>
+          <w:right w:w="144" w:type="dxa"/>
+        </w:tblCellMar>
+        <w:tblLook w:firstRow="0" w:lastRow="0" w:firstColumn="0" w:lastColumn="0" w:noHBand="0" w:noVBand="0" w:val="0000"/>
+      </w:tblPr>
+      <w:tr>
+        <w:trPr>
+          <w:cantSplit/>
+        </w:trPr>
+        <w:tc>
+          <w:tcPr>
+            <w:shd w:color="auto" w:fill="ccf1e3" w:val="clear"/>
+            <w:tcMar>
+              <w:top w:w="92" w:type="dxa"/>
+              <w:bottom w:w="92" w:type="dxa"/>
+            </w:tcMar>
+          </w:tcPr>
+          <w:p>
+            <w:pPr>
+              <w:pStyle w:val="FirstParagraph"/>
+            </w:pPr>
+            <w:pPr>
+              <w:spacing w:before="0" w:after="0"/>
+              <w:textAlignment w:val="center"/>
+            </w:pPr>
+            <w:r>
+              <w:drawing>
+                <wp:inline>
+                  <wp:extent cx="152400" cy="152400"/>
+                  <wp:effectExtent b="0" l="0" r="0" t="0"/>
+                  <wp:docPr descr="" title="" id="15" name="Picture"/>
+                  <a:graphic>
+                    <a:graphicData uri="http://schemas.openxmlformats.org/drawingml/2006/picture">
+                      <pic:pic>
+                        <pic:nvPicPr>
+                          <pic:cNvPr descr="/opt/quarto/share/formats/docx/tip.png" id="16" name="Picture"/>
+                          <pic:cNvPicPr>
+                            <a:picLocks noChangeArrowheads="1" noChangeAspect="1"/>
+                          </pic:cNvPicPr>
+                        </pic:nvPicPr>
+                        <pic:blipFill>
+                          <a:blip r:embed="rId10"/>
+                          <a:stretch>
+                            <a:fillRect/>
+                          </a:stretch>
+                        </pic:blipFill>
+                        <pic:spPr bwMode="auto">
+                          <a:xfrm>
+                            <a:off x="0" y="0"/>
+                            <a:ext cx="152400" cy="152400"/>
+                          </a:xfrm>
+                          <a:prstGeom prst="rect">
+                            <a:avLst/>
+                          </a:prstGeom>
+                          <a:noFill/>
+                          <a:ln w="9525">
+                            <a:noFill/>
+                            <a:headEnd/>
+                            <a:tailEnd/>
+                          </a:ln>
+                        </pic:spPr>
+                      </pic:pic>
+                    </a:graphicData>
+                  </a:graphic>
+                </wp:inline>
+              </w:drawing>
+            </w:r>
+            <w:r>
+              <w:t xml:space="preserve"> </w:t>
+            </w:r>
+            <w:r>
+              <w:t xml:space="preserve"> </w:t>
+            </w:r>
+            <w:r>
+              <w:t xml:space="preserve">Video</w:t>
+            </w:r>
+          </w:p>
+        </w:tc>
+      </w:tr>
+      <w:tr>
+        <w:trPr>
+          <w:cantSplit/>
+        </w:trPr>
+        <w:tc>
+          <w:tcPr>
+            <w:tcMar>
+              <w:top w:w="108" w:type="dxa"/>
+              <w:bottom w:w="108" w:type="dxa"/>
+            </w:tcMar>
+          </w:tcPr>
+          <w:p>
+            <w:pPr>
+              <w:pStyle w:val="BodyText"/>
+            </w:pPr>
+            <w:pPr>
+              <w:spacing w:before="16"/>
+            </w:pPr>
+            <w:r>
+              <w:t xml:space="preserve">Jon Krohn’s</w:t>
+            </w:r>
+            <w:r>
+              <w:t xml:space="preserve"> </w:t>
+            </w:r>
+            <w:r>
+              <w:t xml:space="preserve">“Calculus for Machine Learning”</w:t>
+            </w:r>
+            <w:r>
+              <w:t xml:space="preserve"> </w:t>
+            </w:r>
+            <w:r>
+              <w:t xml:space="preserve">YouTube playlist has a video on this rule:</w:t>
+            </w:r>
+          </w:p>
+          <w:p>
+            <w:pPr>
+              <w:pStyle w:val="Compact"/>
+              <w:numPr>
+                <w:ilvl w:val="0"/>
+                <w:numId w:val="1002"/>
+              </w:numPr>
+            </w:pPr>
+            <w:hyperlink r:id="rId17">
+              <w:r>
+                <w:rPr>
+                  <w:rStyle w:val="Hyperlink"/>
+                </w:rPr>
+                <w:t xml:space="preserve">The Constant Multiple Rule for Derivatives</w:t>
+              </w:r>
+            </w:hyperlink>
+          </w:p>
+          <w:p/>
+        </w:tc>
+      </w:tr>
+    </w:tbl>
+    <w:bookmarkStart w:id="18" w:name="thm-deriv-polynomial"/>
     <w:p>
       <w:pPr>
         <w:pStyle w:val="FirstParagraph"/>
@@ -441,11 +731,190 @@
         <w:t xml:space="preserve">.</w:t>
       </w:r>
     </w:p>
-    <w:bookmarkEnd w:id="11"/>
-    <w:bookmarkStart w:id="12" w:name="thm-deriv-log"/>
+    <w:bookmarkEnd w:id="18"/>
+    <w:tbl>
+      <w:tblPr>
+        <w:tblStyle w:val="Table"/>
+        <w:tblLook w:firstRow="0" w:lastRow="0" w:firstColumn="0" w:lastColumn="0" w:noHBand="0" w:noVBand="0" w:val="0000"/>
+        <w:tblBorders>
+          <w:top w:val="single" w:sz="4" w:space="0" w:color="00A047"/>
+          <w:left w:val="single" w:sz="24" w:space="0" w:color="00A047"/>
+          <w:bottom w:val="single" w:sz="4" w:space="0" w:color="00A047"/>
+          <w:right w:val="single" w:sz="4" w:space="0" w:color="00A047"/>
+        </w:tblBorders>
+        <w:tblCellMar>
+          <w:left w:w="144" w:type="dxa"/>
+          <w:right w:w="144" w:type="dxa"/>
+        </w:tblCellMar>
+        <w:tblLook w:firstRow="0" w:lastRow="0" w:firstColumn="0" w:lastColumn="0" w:noHBand="0" w:noVBand="0" w:val="0000"/>
+      </w:tblPr>
+      <w:tr>
+        <w:trPr>
+          <w:cantSplit/>
+        </w:trPr>
+        <w:tc>
+          <w:tcPr>
+            <w:shd w:color="auto" w:fill="ccf1e3" w:val="clear"/>
+            <w:tcMar>
+              <w:top w:w="92" w:type="dxa"/>
+              <w:bottom w:w="92" w:type="dxa"/>
+            </w:tcMar>
+          </w:tcPr>
+          <w:p>
+            <w:pPr>
+              <w:pStyle w:val="BodyText"/>
+            </w:pPr>
+            <w:pPr>
+              <w:spacing w:before="0" w:after="0"/>
+              <w:textAlignment w:val="center"/>
+            </w:pPr>
+            <w:r>
+              <w:drawing>
+                <wp:inline>
+                  <wp:extent cx="152400" cy="152400"/>
+                  <wp:effectExtent b="0" l="0" r="0" t="0"/>
+                  <wp:docPr descr="" title="" id="19" name="Picture"/>
+                  <a:graphic>
+                    <a:graphicData uri="http://schemas.openxmlformats.org/drawingml/2006/picture">
+                      <pic:pic>
+                        <pic:nvPicPr>
+                          <pic:cNvPr descr="/opt/quarto/share/formats/docx/tip.png" id="20" name="Picture"/>
+                          <pic:cNvPicPr>
+                            <a:picLocks noChangeArrowheads="1" noChangeAspect="1"/>
+                          </pic:cNvPicPr>
+                        </pic:nvPicPr>
+                        <pic:blipFill>
+                          <a:blip r:embed="rId10"/>
+                          <a:stretch>
+                            <a:fillRect/>
+                          </a:stretch>
+                        </pic:blipFill>
+                        <pic:spPr bwMode="auto">
+                          <a:xfrm>
+                            <a:off x="0" y="0"/>
+                            <a:ext cx="152400" cy="152400"/>
+                          </a:xfrm>
+                          <a:prstGeom prst="rect">
+                            <a:avLst/>
+                          </a:prstGeom>
+                          <a:noFill/>
+                          <a:ln w="9525">
+                            <a:noFill/>
+                            <a:headEnd/>
+                            <a:tailEnd/>
+                          </a:ln>
+                        </pic:spPr>
+                      </pic:pic>
+                    </a:graphicData>
+                  </a:graphic>
+                </wp:inline>
+              </w:drawing>
+            </w:r>
+            <w:r>
+              <w:t xml:space="preserve"> </w:t>
+            </w:r>
+            <w:r>
+              <w:t xml:space="preserve"> </w:t>
+            </w:r>
+            <w:r>
+              <w:t xml:space="preserve">Videos</w:t>
+            </w:r>
+          </w:p>
+        </w:tc>
+      </w:tr>
+      <w:tr>
+        <w:trPr>
+          <w:cantSplit/>
+        </w:trPr>
+        <w:tc>
+          <w:tcPr>
+            <w:tcMar>
+              <w:top w:w="108" w:type="dxa"/>
+              <w:bottom w:w="108" w:type="dxa"/>
+            </w:tcMar>
+          </w:tcPr>
+          <w:p>
+            <w:pPr>
+              <w:pStyle w:val="BodyText"/>
+            </w:pPr>
+            <w:pPr>
+              <w:spacing w:before="16"/>
+            </w:pPr>
+            <w:r>
+              <w:t xml:space="preserve">Jon Krohn’s</w:t>
+            </w:r>
+            <w:r>
+              <w:t xml:space="preserve"> </w:t>
+            </w:r>
+            <w:r>
+              <w:t xml:space="preserve">“Calculus for Machine Learning”</w:t>
+            </w:r>
+            <w:r>
+              <w:t xml:space="preserve"> </w:t>
+            </w:r>
+            <w:r>
+              <w:t xml:space="preserve">YouTube playlist has videos on this rule, on the sum rule (the derivative of a sum is the sum of the derivatives), and on exercises that combine the rules so far:</w:t>
+            </w:r>
+          </w:p>
+          <w:p>
+            <w:pPr>
+              <w:pStyle w:val="Compact"/>
+              <w:numPr>
+                <w:ilvl w:val="0"/>
+                <w:numId w:val="1003"/>
+              </w:numPr>
+            </w:pPr>
+            <w:hyperlink r:id="rId21">
+              <w:r>
+                <w:rPr>
+                  <w:rStyle w:val="Hyperlink"/>
+                </w:rPr>
+                <w:t xml:space="preserve">The Power Rule for Derivatives</w:t>
+              </w:r>
+            </w:hyperlink>
+          </w:p>
+          <w:p>
+            <w:pPr>
+              <w:pStyle w:val="Compact"/>
+              <w:numPr>
+                <w:ilvl w:val="0"/>
+                <w:numId w:val="1003"/>
+              </w:numPr>
+            </w:pPr>
+            <w:hyperlink r:id="rId22">
+              <w:r>
+                <w:rPr>
+                  <w:rStyle w:val="Hyperlink"/>
+                </w:rPr>
+                <w:t xml:space="preserve">The Sum Rule for Derivatives</w:t>
+              </w:r>
+            </w:hyperlink>
+          </w:p>
+          <w:p>
+            <w:pPr>
+              <w:pStyle w:val="Compact"/>
+              <w:numPr>
+                <w:ilvl w:val="0"/>
+                <w:numId w:val="1003"/>
+              </w:numPr>
+            </w:pPr>
+            <w:hyperlink r:id="rId23">
+              <w:r>
+                <w:rPr>
+                  <w:rStyle w:val="Hyperlink"/>
+                </w:rPr>
+                <w:t xml:space="preserve">Exercises on Derivative Rules</w:t>
+              </w:r>
+            </w:hyperlink>
+          </w:p>
+          <w:p/>
+        </w:tc>
+      </w:tr>
+    </w:tbl>
+    <w:bookmarkStart w:id="24" w:name="thm-deriv-log"/>
     <w:p>
       <w:pPr>
-        <w:pStyle w:val="BodyText"/>
+        <w:pStyle w:val="FirstParagraph"/>
       </w:pPr>
       <w:r>
         <w:rPr>
@@ -575,8 +1044,8 @@
         </m:oMath>
       </m:oMathPara>
     </w:p>
-    <w:bookmarkEnd w:id="12"/>
-    <w:bookmarkStart w:id="13" w:name="thm-deriv-exp"/>
+    <w:bookmarkEnd w:id="24"/>
+    <w:bookmarkStart w:id="25" w:name="thm-deriv-exp"/>
     <w:p>
       <w:pPr>
         <w:pStyle w:val="FirstParagraph"/>
@@ -686,8 +1155,8 @@
         </m:oMath>
       </m:oMathPara>
     </w:p>
-    <w:bookmarkEnd w:id="13"/>
-    <w:bookmarkStart w:id="14" w:name="thm-product-rule"/>
+    <w:bookmarkEnd w:id="25"/>
+    <w:bookmarkStart w:id="26" w:name="thm-product-rule"/>
     <w:p>
       <w:pPr>
         <w:pStyle w:val="FirstParagraph"/>
@@ -835,8 +1304,153 @@
         </m:oMath>
       </m:oMathPara>
     </w:p>
-    <w:bookmarkEnd w:id="14"/>
-    <w:bookmarkStart w:id="15" w:name="thm-quotient-rule"/>
+    <w:bookmarkEnd w:id="26"/>
+    <w:tbl>
+      <w:tblPr>
+        <w:tblStyle w:val="Table"/>
+        <w:tblLook w:firstRow="0" w:lastRow="0" w:firstColumn="0" w:lastColumn="0" w:noHBand="0" w:noVBand="0" w:val="0000"/>
+        <w:tblBorders>
+          <w:top w:val="single" w:sz="4" w:space="0" w:color="00A047"/>
+          <w:left w:val="single" w:sz="24" w:space="0" w:color="00A047"/>
+          <w:bottom w:val="single" w:sz="4" w:space="0" w:color="00A047"/>
+          <w:right w:val="single" w:sz="4" w:space="0" w:color="00A047"/>
+        </w:tblBorders>
+        <w:tblCellMar>
+          <w:left w:w="144" w:type="dxa"/>
+          <w:right w:w="144" w:type="dxa"/>
+        </w:tblCellMar>
+        <w:tblLook w:firstRow="0" w:lastRow="0" w:firstColumn="0" w:lastColumn="0" w:noHBand="0" w:noVBand="0" w:val="0000"/>
+      </w:tblPr>
+      <w:tr>
+        <w:trPr>
+          <w:cantSplit/>
+        </w:trPr>
+        <w:tc>
+          <w:tcPr>
+            <w:shd w:color="auto" w:fill="ccf1e3" w:val="clear"/>
+            <w:tcMar>
+              <w:top w:w="92" w:type="dxa"/>
+              <w:bottom w:w="92" w:type="dxa"/>
+            </w:tcMar>
+          </w:tcPr>
+          <w:p>
+            <w:pPr>
+              <w:pStyle w:val="FirstParagraph"/>
+            </w:pPr>
+            <w:pPr>
+              <w:spacing w:before="0" w:after="0"/>
+              <w:textAlignment w:val="center"/>
+            </w:pPr>
+            <w:r>
+              <w:drawing>
+                <wp:inline>
+                  <wp:extent cx="152400" cy="152400"/>
+                  <wp:effectExtent b="0" l="0" r="0" t="0"/>
+                  <wp:docPr descr="" title="" id="27" name="Picture"/>
+                  <a:graphic>
+                    <a:graphicData uri="http://schemas.openxmlformats.org/drawingml/2006/picture">
+                      <pic:pic>
+                        <pic:nvPicPr>
+                          <pic:cNvPr descr="/opt/quarto/share/formats/docx/tip.png" id="28" name="Picture"/>
+                          <pic:cNvPicPr>
+                            <a:picLocks noChangeArrowheads="1" noChangeAspect="1"/>
+                          </pic:cNvPicPr>
+                        </pic:nvPicPr>
+                        <pic:blipFill>
+                          <a:blip r:embed="rId10"/>
+                          <a:stretch>
+                            <a:fillRect/>
+                          </a:stretch>
+                        </pic:blipFill>
+                        <pic:spPr bwMode="auto">
+                          <a:xfrm>
+                            <a:off x="0" y="0"/>
+                            <a:ext cx="152400" cy="152400"/>
+                          </a:xfrm>
+                          <a:prstGeom prst="rect">
+                            <a:avLst/>
+                          </a:prstGeom>
+                          <a:noFill/>
+                          <a:ln w="9525">
+                            <a:noFill/>
+                            <a:headEnd/>
+                            <a:tailEnd/>
+                          </a:ln>
+                        </pic:spPr>
+                      </pic:pic>
+                    </a:graphicData>
+                  </a:graphic>
+                </wp:inline>
+              </w:drawing>
+            </w:r>
+            <w:r>
+              <w:t xml:space="preserve"> </w:t>
+            </w:r>
+            <w:r>
+              <w:t xml:space="preserve"> </w:t>
+            </w:r>
+            <w:r>
+              <w:t xml:space="preserve">Video</w:t>
+            </w:r>
+          </w:p>
+        </w:tc>
+      </w:tr>
+      <w:tr>
+        <w:trPr>
+          <w:cantSplit/>
+        </w:trPr>
+        <w:tc>
+          <w:tcPr>
+            <w:tcMar>
+              <w:top w:w="108" w:type="dxa"/>
+              <w:bottom w:w="108" w:type="dxa"/>
+            </w:tcMar>
+          </w:tcPr>
+          <w:p>
+            <w:pPr>
+              <w:pStyle w:val="BodyText"/>
+            </w:pPr>
+            <w:pPr>
+              <w:spacing w:before="16"/>
+            </w:pPr>
+            <w:r>
+              <w:t xml:space="preserve">Jon Krohn’s</w:t>
+            </w:r>
+            <w:r>
+              <w:t xml:space="preserve"> </w:t>
+            </w:r>
+            <w:r>
+              <w:t xml:space="preserve">“Calculus for Machine Learning”</w:t>
+            </w:r>
+            <w:r>
+              <w:t xml:space="preserve"> </w:t>
+            </w:r>
+            <w:r>
+              <w:t xml:space="preserve">YouTube playlist has a video on this rule:</w:t>
+            </w:r>
+          </w:p>
+          <w:p>
+            <w:pPr>
+              <w:pStyle w:val="Compact"/>
+              <w:numPr>
+                <w:ilvl w:val="0"/>
+                <w:numId w:val="1004"/>
+              </w:numPr>
+            </w:pPr>
+            <w:hyperlink r:id="rId29">
+              <w:r>
+                <w:rPr>
+                  <w:rStyle w:val="Hyperlink"/>
+                </w:rPr>
+                <w:t xml:space="preserve">The Product Rule for Derivatives</w:t>
+              </w:r>
+            </w:hyperlink>
+          </w:p>
+          <w:p/>
+        </w:tc>
+      </w:tr>
+    </w:tbl>
+    <w:bookmarkStart w:id="30" w:name="thm-quotient-rule"/>
     <w:p>
       <w:pPr>
         <w:pStyle w:val="FirstParagraph"/>
@@ -1049,8 +1663,153 @@
         </m:oMath>
       </m:oMathPara>
     </w:p>
-    <w:bookmarkEnd w:id="15"/>
-    <w:bookmarkStart w:id="17" w:name="thm-chain-rule"/>
+    <w:bookmarkEnd w:id="30"/>
+    <w:tbl>
+      <w:tblPr>
+        <w:tblStyle w:val="Table"/>
+        <w:tblLook w:firstRow="0" w:lastRow="0" w:firstColumn="0" w:lastColumn="0" w:noHBand="0" w:noVBand="0" w:val="0000"/>
+        <w:tblBorders>
+          <w:top w:val="single" w:sz="4" w:space="0" w:color="00A047"/>
+          <w:left w:val="single" w:sz="24" w:space="0" w:color="00A047"/>
+          <w:bottom w:val="single" w:sz="4" w:space="0" w:color="00A047"/>
+          <w:right w:val="single" w:sz="4" w:space="0" w:color="00A047"/>
+        </w:tblBorders>
+        <w:tblCellMar>
+          <w:left w:w="144" w:type="dxa"/>
+          <w:right w:w="144" w:type="dxa"/>
+        </w:tblCellMar>
+        <w:tblLook w:firstRow="0" w:lastRow="0" w:firstColumn="0" w:lastColumn="0" w:noHBand="0" w:noVBand="0" w:val="0000"/>
+      </w:tblPr>
+      <w:tr>
+        <w:trPr>
+          <w:cantSplit/>
+        </w:trPr>
+        <w:tc>
+          <w:tcPr>
+            <w:shd w:color="auto" w:fill="ccf1e3" w:val="clear"/>
+            <w:tcMar>
+              <w:top w:w="92" w:type="dxa"/>
+              <w:bottom w:w="92" w:type="dxa"/>
+            </w:tcMar>
+          </w:tcPr>
+          <w:p>
+            <w:pPr>
+              <w:pStyle w:val="FirstParagraph"/>
+            </w:pPr>
+            <w:pPr>
+              <w:spacing w:before="0" w:after="0"/>
+              <w:textAlignment w:val="center"/>
+            </w:pPr>
+            <w:r>
+              <w:drawing>
+                <wp:inline>
+                  <wp:extent cx="152400" cy="152400"/>
+                  <wp:effectExtent b="0" l="0" r="0" t="0"/>
+                  <wp:docPr descr="" title="" id="31" name="Picture"/>
+                  <a:graphic>
+                    <a:graphicData uri="http://schemas.openxmlformats.org/drawingml/2006/picture">
+                      <pic:pic>
+                        <pic:nvPicPr>
+                          <pic:cNvPr descr="/opt/quarto/share/formats/docx/tip.png" id="32" name="Picture"/>
+                          <pic:cNvPicPr>
+                            <a:picLocks noChangeArrowheads="1" noChangeAspect="1"/>
+                          </pic:cNvPicPr>
+                        </pic:nvPicPr>
+                        <pic:blipFill>
+                          <a:blip r:embed="rId10"/>
+                          <a:stretch>
+                            <a:fillRect/>
+                          </a:stretch>
+                        </pic:blipFill>
+                        <pic:spPr bwMode="auto">
+                          <a:xfrm>
+                            <a:off x="0" y="0"/>
+                            <a:ext cx="152400" cy="152400"/>
+                          </a:xfrm>
+                          <a:prstGeom prst="rect">
+                            <a:avLst/>
+                          </a:prstGeom>
+                          <a:noFill/>
+                          <a:ln w="9525">
+                            <a:noFill/>
+                            <a:headEnd/>
+                            <a:tailEnd/>
+                          </a:ln>
+                        </pic:spPr>
+                      </pic:pic>
+                    </a:graphicData>
+                  </a:graphic>
+                </wp:inline>
+              </w:drawing>
+            </w:r>
+            <w:r>
+              <w:t xml:space="preserve"> </w:t>
+            </w:r>
+            <w:r>
+              <w:t xml:space="preserve"> </w:t>
+            </w:r>
+            <w:r>
+              <w:t xml:space="preserve">Video</w:t>
+            </w:r>
+          </w:p>
+        </w:tc>
+      </w:tr>
+      <w:tr>
+        <w:trPr>
+          <w:cantSplit/>
+        </w:trPr>
+        <w:tc>
+          <w:tcPr>
+            <w:tcMar>
+              <w:top w:w="108" w:type="dxa"/>
+              <w:bottom w:w="108" w:type="dxa"/>
+            </w:tcMar>
+          </w:tcPr>
+          <w:p>
+            <w:pPr>
+              <w:pStyle w:val="BodyText"/>
+            </w:pPr>
+            <w:pPr>
+              <w:spacing w:before="16"/>
+            </w:pPr>
+            <w:r>
+              <w:t xml:space="preserve">Jon Krohn’s</w:t>
+            </w:r>
+            <w:r>
+              <w:t xml:space="preserve"> </w:t>
+            </w:r>
+            <w:r>
+              <w:t xml:space="preserve">“Calculus for Machine Learning”</w:t>
+            </w:r>
+            <w:r>
+              <w:t xml:space="preserve"> </w:t>
+            </w:r>
+            <w:r>
+              <w:t xml:space="preserve">YouTube playlist has a video on this rule:</w:t>
+            </w:r>
+          </w:p>
+          <w:p>
+            <w:pPr>
+              <w:pStyle w:val="Compact"/>
+              <w:numPr>
+                <w:ilvl w:val="0"/>
+                <w:numId w:val="1005"/>
+              </w:numPr>
+            </w:pPr>
+            <w:hyperlink r:id="rId33">
+              <w:r>
+                <w:rPr>
+                  <w:rStyle w:val="Hyperlink"/>
+                </w:rPr>
+                <w:t xml:space="preserve">The Quotient Rule for Derivatives</w:t>
+              </w:r>
+            </w:hyperlink>
+          </w:p>
+          <w:p/>
+        </w:tc>
+      </w:tr>
+    </w:tbl>
+    <w:bookmarkStart w:id="35" w:name="thm-chain-rule"/>
     <w:p>
       <w:pPr>
         <w:pStyle w:val="FirstParagraph"/>
@@ -1307,7 +2066,7 @@
       <w:r>
         <w:t xml:space="preserve"> </w:t>
       </w:r>
-      <w:hyperlink r:id="rId16">
+      <w:hyperlink r:id="rId34">
         <w:r>
           <w:rPr>
             <w:rStyle w:val="Hyperlink"/>
@@ -1543,8 +2302,8 @@
         </m:oMath>
       </m:oMathPara>
     </w:p>
-    <w:bookmarkEnd w:id="17"/>
-    <w:bookmarkStart w:id="18" w:name="cor-deriv-log-chain"/>
+    <w:bookmarkEnd w:id="35"/>
+    <w:bookmarkStart w:id="36" w:name="cor-deriv-log-chain"/>
     <w:p>
       <w:pPr>
         <w:pStyle w:val="FirstParagraph"/>
@@ -1759,7 +2518,7 @@
         </m:oMath>
       </m:oMathPara>
     </w:p>
-    <w:bookmarkEnd w:id="18"/>
+    <w:bookmarkEnd w:id="36"/>
     <w:p>
       <w:pPr>
         <w:pStyle w:val="FirstParagraph"/>
@@ -2243,7 +3002,186 @@
         </m:oMath>
       </m:oMathPara>
     </w:p>
-    <w:bookmarkStart w:id="42" w:name="linear-approximation"/>
+    <w:tbl>
+      <w:tblPr>
+        <w:tblStyle w:val="Table"/>
+        <w:tblLook w:firstRow="0" w:lastRow="0" w:firstColumn="0" w:lastColumn="0" w:noHBand="0" w:noVBand="0" w:val="0000"/>
+        <w:tblBorders>
+          <w:top w:val="single" w:sz="4" w:space="0" w:color="00A047"/>
+          <w:left w:val="single" w:sz="24" w:space="0" w:color="00A047"/>
+          <w:bottom w:val="single" w:sz="4" w:space="0" w:color="00A047"/>
+          <w:right w:val="single" w:sz="4" w:space="0" w:color="00A047"/>
+        </w:tblBorders>
+        <w:tblCellMar>
+          <w:left w:w="144" w:type="dxa"/>
+          <w:right w:w="144" w:type="dxa"/>
+        </w:tblCellMar>
+        <w:tblLook w:firstRow="0" w:lastRow="0" w:firstColumn="0" w:lastColumn="0" w:noHBand="0" w:noVBand="0" w:val="0000"/>
+      </w:tblPr>
+      <w:tr>
+        <w:trPr>
+          <w:cantSplit/>
+        </w:trPr>
+        <w:tc>
+          <w:tcPr>
+            <w:shd w:color="auto" w:fill="ccf1e3" w:val="clear"/>
+            <w:tcMar>
+              <w:top w:w="92" w:type="dxa"/>
+              <w:bottom w:w="92" w:type="dxa"/>
+            </w:tcMar>
+          </w:tcPr>
+          <w:p>
+            <w:pPr>
+              <w:pStyle w:val="FirstParagraph"/>
+            </w:pPr>
+            <w:pPr>
+              <w:spacing w:before="0" w:after="0"/>
+              <w:textAlignment w:val="center"/>
+            </w:pPr>
+            <w:r>
+              <w:drawing>
+                <wp:inline>
+                  <wp:extent cx="152400" cy="152400"/>
+                  <wp:effectExtent b="0" l="0" r="0" t="0"/>
+                  <wp:docPr descr="" title="" id="37" name="Picture"/>
+                  <a:graphic>
+                    <a:graphicData uri="http://schemas.openxmlformats.org/drawingml/2006/picture">
+                      <pic:pic>
+                        <pic:nvPicPr>
+                          <pic:cNvPr descr="/opt/quarto/share/formats/docx/tip.png" id="38" name="Picture"/>
+                          <pic:cNvPicPr>
+                            <a:picLocks noChangeArrowheads="1" noChangeAspect="1"/>
+                          </pic:cNvPicPr>
+                        </pic:nvPicPr>
+                        <pic:blipFill>
+                          <a:blip r:embed="rId10"/>
+                          <a:stretch>
+                            <a:fillRect/>
+                          </a:stretch>
+                        </pic:blipFill>
+                        <pic:spPr bwMode="auto">
+                          <a:xfrm>
+                            <a:off x="0" y="0"/>
+                            <a:ext cx="152400" cy="152400"/>
+                          </a:xfrm>
+                          <a:prstGeom prst="rect">
+                            <a:avLst/>
+                          </a:prstGeom>
+                          <a:noFill/>
+                          <a:ln w="9525">
+                            <a:noFill/>
+                            <a:headEnd/>
+                            <a:tailEnd/>
+                          </a:ln>
+                        </pic:spPr>
+                      </pic:pic>
+                    </a:graphicData>
+                  </a:graphic>
+                </wp:inline>
+              </w:drawing>
+            </w:r>
+            <w:r>
+              <w:t xml:space="preserve"> </w:t>
+            </w:r>
+            <w:r>
+              <w:t xml:space="preserve"> </w:t>
+            </w:r>
+            <w:r>
+              <w:t xml:space="preserve">Videos</w:t>
+            </w:r>
+          </w:p>
+        </w:tc>
+      </w:tr>
+      <w:tr>
+        <w:trPr>
+          <w:cantSplit/>
+        </w:trPr>
+        <w:tc>
+          <w:tcPr>
+            <w:tcMar>
+              <w:top w:w="108" w:type="dxa"/>
+              <w:bottom w:w="108" w:type="dxa"/>
+            </w:tcMar>
+          </w:tcPr>
+          <w:p>
+            <w:pPr>
+              <w:pStyle w:val="BodyText"/>
+            </w:pPr>
+            <w:pPr>
+              <w:spacing w:before="16"/>
+            </w:pPr>
+            <w:r>
+              <w:t xml:space="preserve">Jon Krohn’s</w:t>
+            </w:r>
+            <w:r>
+              <w:t xml:space="preserve"> </w:t>
+            </w:r>
+            <w:r>
+              <w:t xml:space="preserve">“Calculus for Machine Learning”</w:t>
+            </w:r>
+            <w:r>
+              <w:t xml:space="preserve"> </w:t>
+            </w:r>
+            <w:r>
+              <w:t xml:space="preserve">YouTube playlist has videos on this rule and on exercises that combine it with the other rules:</w:t>
+            </w:r>
+          </w:p>
+          <w:p>
+            <w:pPr>
+              <w:pStyle w:val="Compact"/>
+              <w:numPr>
+                <w:ilvl w:val="0"/>
+                <w:numId w:val="1006"/>
+              </w:numPr>
+            </w:pPr>
+            <w:hyperlink r:id="rId39">
+              <w:r>
+                <w:rPr>
+                  <w:rStyle w:val="Hyperlink"/>
+                </w:rPr>
+                <w:t xml:space="preserve">The Chain Rule for Derivatives</w:t>
+              </w:r>
+            </w:hyperlink>
+          </w:p>
+          <w:p>
+            <w:pPr>
+              <w:pStyle w:val="Compact"/>
+              <w:numPr>
+                <w:ilvl w:val="0"/>
+                <w:numId w:val="1006"/>
+              </w:numPr>
+            </w:pPr>
+            <w:hyperlink r:id="rId40">
+              <w:r>
+                <w:rPr>
+                  <w:rStyle w:val="Hyperlink"/>
+                </w:rPr>
+                <w:t xml:space="preserve">The Power Rule on a Function Chain</w:t>
+              </w:r>
+            </w:hyperlink>
+          </w:p>
+          <w:p>
+            <w:pPr>
+              <w:pStyle w:val="Compact"/>
+              <w:numPr>
+                <w:ilvl w:val="0"/>
+                <w:numId w:val="1006"/>
+              </w:numPr>
+            </w:pPr>
+            <w:hyperlink r:id="rId41">
+              <w:r>
+                <w:rPr>
+                  <w:rStyle w:val="Hyperlink"/>
+                </w:rPr>
+                <w:t xml:space="preserve">Advanced Exercises on Derivative Rules</w:t>
+              </w:r>
+            </w:hyperlink>
+          </w:p>
+          <w:p/>
+        </w:tc>
+      </w:tr>
+    </w:tbl>
+    <w:bookmarkStart w:id="47" w:name="linear-approximation"/>
     <w:p>
       <w:pPr>
         <w:pStyle w:val="Heading3"/>
@@ -2289,7 +3227,7 @@
       <w:pPr>
         <w:pStyle w:val="BodyText"/>
       </w:pPr>
-      <w:bookmarkStart w:id="19" w:name="eq-linear-approx"/>
+      <w:bookmarkStart w:id="42" w:name="eq-linear-approx"/>
       <m:oMathPara>
         <m:oMathParaPr>
           <m:jc m:val="center"/>
@@ -2414,9 +3352,9 @@
           </m:r>
         </m:oMath>
       </m:oMathPara>
-      <w:bookmarkEnd w:id="19"/>
+      <w:bookmarkEnd w:id="42"/>
     </w:p>
-    <w:bookmarkStart w:id="20" w:name="def-flat-point"/>
+    <w:bookmarkStart w:id="43" w:name="def-flat-point"/>
     <w:p>
       <w:pPr>
         <w:pStyle w:val="FirstParagraph"/>
@@ -2483,8 +3421,8 @@
         <w:t xml:space="preserve">.</w:t>
       </w:r>
     </w:p>
-    <w:bookmarkEnd w:id="20"/>
-    <w:bookmarkStart w:id="21" w:name="exm-flat-point"/>
+    <w:bookmarkEnd w:id="43"/>
+    <w:bookmarkStart w:id="44" w:name="exm-flat-point"/>
     <w:p>
       <w:pPr>
         <w:pStyle w:val="BodyText"/>
@@ -2508,7 +3446,7 @@
         <w:pStyle w:val="Compact"/>
         <w:numPr>
           <w:ilvl w:val="0"/>
-          <w:numId w:val="1001"/>
+          <w:numId w:val="1007"/>
         </w:numPr>
       </w:pPr>
       <m:oMath>
@@ -2793,7 +3731,7 @@
         <w:pStyle w:val="Compact"/>
         <w:numPr>
           <w:ilvl w:val="0"/>
-          <w:numId w:val="1001"/>
+          <w:numId w:val="1007"/>
         </w:numPr>
       </w:pPr>
       <m:oMath>
@@ -3027,7 +3965,7 @@
         <w:pStyle w:val="Compact"/>
         <w:numPr>
           <w:ilvl w:val="0"/>
-          <w:numId w:val="1001"/>
+          <w:numId w:val="1007"/>
         </w:numPr>
       </w:pPr>
       <m:oMath>
@@ -3145,8 +4083,8 @@
         <w:t xml:space="preserve">is not a flat point.</w:t>
       </w:r>
     </w:p>
-    <w:bookmarkEnd w:id="21"/>
-    <w:bookmarkStart w:id="22" w:name="exr-flat-point"/>
+    <w:bookmarkEnd w:id="44"/>
+    <w:bookmarkStart w:id="45" w:name="exr-flat-point"/>
     <w:p>
       <w:pPr>
         <w:pStyle w:val="FirstParagraph"/>
@@ -3235,7 +4173,7 @@
         <w:pStyle w:val="Compact"/>
         <w:numPr>
           <w:ilvl w:val="0"/>
-          <w:numId w:val="1002"/>
+          <w:numId w:val="1008"/>
         </w:numPr>
       </w:pPr>
       <w:r>
@@ -3258,7 +4196,7 @@
         <w:pStyle w:val="Compact"/>
         <w:numPr>
           <w:ilvl w:val="0"/>
-          <w:numId w:val="1002"/>
+          <w:numId w:val="1008"/>
         </w:numPr>
       </w:pPr>
       <w:r>
@@ -3304,7 +4242,7 @@
         <w:pStyle w:val="Compact"/>
         <w:numPr>
           <w:ilvl w:val="0"/>
-          <w:numId w:val="1002"/>
+          <w:numId w:val="1008"/>
         </w:numPr>
       </w:pPr>
       <w:r>
@@ -3374,8 +4312,8 @@
         <w:t xml:space="preserve">, and compare that prediction with the exact value.</w:t>
       </w:r>
     </w:p>
-    <w:bookmarkEnd w:id="22"/>
-    <w:bookmarkStart w:id="23" w:name="sol-flat-point"/>
+    <w:bookmarkEnd w:id="45"/>
+    <w:bookmarkStart w:id="46" w:name="sol-flat-point"/>
     <w:p>
       <w:pPr>
         <w:pStyle w:val="FirstParagraph"/>
@@ -4111,7 +5049,50 @@
         <w:t xml:space="preserve">and the recommendation is trustworthy only as far as the step is small.</w:t>
       </w:r>
     </w:p>
-    <w:bookmarkEnd w:id="23"/>
+    <w:bookmarkEnd w:id="46"/>
+    <w:bookmarkEnd w:id="47"/>
+    <w:bookmarkEnd w:id="48"/>
+    <w:bookmarkStart w:id="155" w:name="sec-integration"/>
+    <w:p>
+      <w:pPr>
+        <w:pStyle w:val="Heading2"/>
+      </w:pPr>
+      <w:r>
+        <w:t xml:space="preserve">2 Integration</w:t>
+      </w:r>
+    </w:p>
+    <w:p>
+      <w:pPr>
+        <w:pStyle w:val="FirstParagraph"/>
+      </w:pPr>
+      <w:r>
+        <w:t xml:space="preserve">Integration is the inverse operation of differentiation: it recovers a</w:t>
+      </w:r>
+      <w:r>
+        <w:t xml:space="preserve"> </w:t>
+      </w:r>
+      <w:r>
+        <w:t xml:space="preserve">function from its derivative and accumulates quantities such as areas,</w:t>
+      </w:r>
+      <w:r>
+        <w:t xml:space="preserve"> </w:t>
+      </w:r>
+      <w:r>
+        <w:t xml:space="preserve">totals, and probabilities. We begin with antiderivatives, then state</w:t>
+      </w:r>
+      <w:r>
+        <w:t xml:space="preserve"> </w:t>
+      </w:r>
+      <w:r>
+        <w:t xml:space="preserve">basic integration rules, and conclude with the Fundamental Theorem of</w:t>
+      </w:r>
+      <w:r>
+        <w:t xml:space="preserve"> </w:t>
+      </w:r>
+      <w:r>
+        <w:t xml:space="preserve">Calculus and a worked example from probability.</w:t>
+      </w:r>
+    </w:p>
     <w:tbl>
       <w:tblPr>
         <w:tblStyle w:val="Table"/>
@@ -4153,18 +5134,18 @@
                 <wp:inline>
                   <wp:extent cx="152400" cy="152400"/>
                   <wp:effectExtent b="0" l="0" r="0" t="0"/>
-                  <wp:docPr descr="" title="" id="25" name="Picture"/>
+                  <wp:docPr descr="" title="" id="49" name="Picture"/>
                   <a:graphic>
                     <a:graphicData uri="http://schemas.openxmlformats.org/drawingml/2006/picture">
                       <pic:pic>
                         <pic:nvPicPr>
-                          <pic:cNvPr descr="/opt/quarto/share/formats/docx/tip.png" id="26" name="Picture"/>
+                          <pic:cNvPr descr="/opt/quarto/share/formats/docx/tip.png" id="50" name="Picture"/>
                           <pic:cNvPicPr>
                             <a:picLocks noChangeArrowheads="1" noChangeAspect="1"/>
                           </pic:cNvPicPr>
                         </pic:nvPicPr>
                         <pic:blipFill>
-                          <a:blip r:embed="rId24"/>
+                          <a:blip r:embed="rId10"/>
                           <a:stretch>
                             <a:fillRect/>
                           </a:stretch>
@@ -4233,7 +5214,7 @@
               <w:t xml:space="preserve"> </w:t>
             </w:r>
             <w:r>
-              <w:t xml:space="preserve">YouTube playlist has videos on limits, the idea behind derivatives, and the rules of differentiation:</w:t>
+              <w:t xml:space="preserve">YouTube playlist introduces integral calculus:</w:t>
             </w:r>
           </w:p>
           <w:p>
@@ -4241,15 +5222,15 @@
               <w:pStyle w:val="Compact"/>
               <w:numPr>
                 <w:ilvl w:val="0"/>
-                <w:numId w:val="1003"/>
+                <w:numId w:val="1009"/>
               </w:numPr>
             </w:pPr>
-            <w:hyperlink r:id="rId27">
+            <w:hyperlink r:id="rId51">
               <w:r>
                 <w:rPr>
                   <w:rStyle w:val="Hyperlink"/>
                 </w:rPr>
-                <w:t xml:space="preserve">Calculating Limits</w:t>
+                <w:t xml:space="preserve">Intro to Integral Calculus</w:t>
               </w:r>
             </w:hyperlink>
           </w:p>
@@ -4258,236 +5239,15 @@
               <w:pStyle w:val="Compact"/>
               <w:numPr>
                 <w:ilvl w:val="0"/>
-                <w:numId w:val="1003"/>
+                <w:numId w:val="1009"/>
               </w:numPr>
             </w:pPr>
-            <w:hyperlink r:id="rId28">
+            <w:hyperlink r:id="rId52">
               <w:r>
                 <w:rPr>
                   <w:rStyle w:val="Hyperlink"/>
                 </w:rPr>
-                <w:t xml:space="preserve">Exercises on Limits</w:t>
-              </w:r>
-            </w:hyperlink>
-          </w:p>
-          <w:p>
-            <w:pPr>
-              <w:pStyle w:val="Compact"/>
-              <w:numPr>
-                <w:ilvl w:val="0"/>
-                <w:numId w:val="1003"/>
-              </w:numPr>
-            </w:pPr>
-            <w:hyperlink r:id="rId29">
-              <w:r>
-                <w:rPr>
-                  <w:rStyle w:val="Hyperlink"/>
-                </w:rPr>
-                <w:t xml:space="preserve">Intro to Differential Calculus</w:t>
-              </w:r>
-            </w:hyperlink>
-          </w:p>
-          <w:p>
-            <w:pPr>
-              <w:pStyle w:val="Compact"/>
-              <w:numPr>
-                <w:ilvl w:val="0"/>
-                <w:numId w:val="1003"/>
-              </w:numPr>
-            </w:pPr>
-            <w:hyperlink r:id="rId30">
-              <w:r>
-                <w:rPr>
-                  <w:rStyle w:val="Hyperlink"/>
-                </w:rPr>
-                <w:t xml:space="preserve">How Derivatives Arise from Limits</w:t>
-              </w:r>
-            </w:hyperlink>
-          </w:p>
-          <w:p>
-            <w:pPr>
-              <w:pStyle w:val="Compact"/>
-              <w:numPr>
-                <w:ilvl w:val="0"/>
-                <w:numId w:val="1003"/>
-              </w:numPr>
-            </w:pPr>
-            <w:hyperlink r:id="rId31">
-              <w:r>
-                <w:rPr>
-                  <w:rStyle w:val="Hyperlink"/>
-                </w:rPr>
-                <w:t xml:space="preserve">Derivative Notation</w:t>
-              </w:r>
-            </w:hyperlink>
-          </w:p>
-          <w:p>
-            <w:pPr>
-              <w:pStyle w:val="Compact"/>
-              <w:numPr>
-                <w:ilvl w:val="0"/>
-                <w:numId w:val="1003"/>
-              </w:numPr>
-            </w:pPr>
-            <w:hyperlink r:id="rId32">
-              <w:r>
-                <w:rPr>
-                  <w:rStyle w:val="Hyperlink"/>
-                </w:rPr>
-                <w:t xml:space="preserve">The Derivative of a Constant</w:t>
-              </w:r>
-            </w:hyperlink>
-          </w:p>
-          <w:p>
-            <w:pPr>
-              <w:pStyle w:val="Compact"/>
-              <w:numPr>
-                <w:ilvl w:val="0"/>
-                <w:numId w:val="1003"/>
-              </w:numPr>
-            </w:pPr>
-            <w:hyperlink r:id="rId33">
-              <w:r>
-                <w:rPr>
-                  <w:rStyle w:val="Hyperlink"/>
-                </w:rPr>
-                <w:t xml:space="preserve">The Power Rule for Derivatives</w:t>
-              </w:r>
-            </w:hyperlink>
-          </w:p>
-          <w:p>
-            <w:pPr>
-              <w:pStyle w:val="Compact"/>
-              <w:numPr>
-                <w:ilvl w:val="0"/>
-                <w:numId w:val="1003"/>
-              </w:numPr>
-            </w:pPr>
-            <w:hyperlink r:id="rId34">
-              <w:r>
-                <w:rPr>
-                  <w:rStyle w:val="Hyperlink"/>
-                </w:rPr>
-                <w:t xml:space="preserve">The Constant Multiple Rule for Derivatives</w:t>
-              </w:r>
-            </w:hyperlink>
-          </w:p>
-          <w:p>
-            <w:pPr>
-              <w:pStyle w:val="Compact"/>
-              <w:numPr>
-                <w:ilvl w:val="0"/>
-                <w:numId w:val="1003"/>
-              </w:numPr>
-            </w:pPr>
-            <w:hyperlink r:id="rId35">
-              <w:r>
-                <w:rPr>
-                  <w:rStyle w:val="Hyperlink"/>
-                </w:rPr>
-                <w:t xml:space="preserve">The Sum Rule for Derivatives</w:t>
-              </w:r>
-            </w:hyperlink>
-          </w:p>
-          <w:p>
-            <w:pPr>
-              <w:pStyle w:val="Compact"/>
-              <w:numPr>
-                <w:ilvl w:val="0"/>
-                <w:numId w:val="1003"/>
-              </w:numPr>
-            </w:pPr>
-            <w:hyperlink r:id="rId36">
-              <w:r>
-                <w:rPr>
-                  <w:rStyle w:val="Hyperlink"/>
-                </w:rPr>
-                <w:t xml:space="preserve">Exercises on Derivative Rules</w:t>
-              </w:r>
-            </w:hyperlink>
-          </w:p>
-          <w:p>
-            <w:pPr>
-              <w:pStyle w:val="Compact"/>
-              <w:numPr>
-                <w:ilvl w:val="0"/>
-                <w:numId w:val="1003"/>
-              </w:numPr>
-            </w:pPr>
-            <w:hyperlink r:id="rId37">
-              <w:r>
-                <w:rPr>
-                  <w:rStyle w:val="Hyperlink"/>
-                </w:rPr>
-                <w:t xml:space="preserve">The Product Rule for Derivatives</w:t>
-              </w:r>
-            </w:hyperlink>
-          </w:p>
-          <w:p>
-            <w:pPr>
-              <w:pStyle w:val="Compact"/>
-              <w:numPr>
-                <w:ilvl w:val="0"/>
-                <w:numId w:val="1003"/>
-              </w:numPr>
-            </w:pPr>
-            <w:hyperlink r:id="rId38">
-              <w:r>
-                <w:rPr>
-                  <w:rStyle w:val="Hyperlink"/>
-                </w:rPr>
-                <w:t xml:space="preserve">The Quotient Rule for Derivatives</w:t>
-              </w:r>
-            </w:hyperlink>
-          </w:p>
-          <w:p>
-            <w:pPr>
-              <w:pStyle w:val="Compact"/>
-              <w:numPr>
-                <w:ilvl w:val="0"/>
-                <w:numId w:val="1003"/>
-              </w:numPr>
-            </w:pPr>
-            <w:hyperlink r:id="rId39">
-              <w:r>
-                <w:rPr>
-                  <w:rStyle w:val="Hyperlink"/>
-                </w:rPr>
-                <w:t xml:space="preserve">The Chain Rule for Derivatives</w:t>
-              </w:r>
-            </w:hyperlink>
-          </w:p>
-          <w:p>
-            <w:pPr>
-              <w:pStyle w:val="Compact"/>
-              <w:numPr>
-                <w:ilvl w:val="0"/>
-                <w:numId w:val="1003"/>
-              </w:numPr>
-            </w:pPr>
-            <w:hyperlink r:id="rId40">
-              <w:r>
-                <w:rPr>
-                  <w:rStyle w:val="Hyperlink"/>
-                </w:rPr>
-                <w:t xml:space="preserve">The Power Rule on a Function Chain</w:t>
-              </w:r>
-            </w:hyperlink>
-          </w:p>
-          <w:p>
-            <w:pPr>
-              <w:pStyle w:val="Compact"/>
-              <w:numPr>
-                <w:ilvl w:val="0"/>
-                <w:numId w:val="1003"/>
-              </w:numPr>
-            </w:pPr>
-            <w:hyperlink r:id="rId41">
-              <w:r>
-                <w:rPr>
-                  <w:rStyle w:val="Hyperlink"/>
-                </w:rPr>
-                <w:t xml:space="preserve">Advanced Exercises on Derivative Rules</w:t>
+                <w:t xml:space="preserve">What Integral Calculus Is</w:t>
               </w:r>
             </w:hyperlink>
           </w:p>
@@ -4495,50 +5255,7 @@
         </w:tc>
       </w:tr>
     </w:tbl>
-    <w:bookmarkEnd w:id="42"/>
-    <w:bookmarkEnd w:id="43"/>
-    <w:bookmarkStart w:id="137" w:name="sec-integration"/>
-    <w:p>
-      <w:pPr>
-        <w:pStyle w:val="Heading2"/>
-      </w:pPr>
-      <w:r>
-        <w:t xml:space="preserve">2 Integration</w:t>
-      </w:r>
-    </w:p>
-    <w:p>
-      <w:pPr>
-        <w:pStyle w:val="FirstParagraph"/>
-      </w:pPr>
-      <w:r>
-        <w:t xml:space="preserve">Integration is the inverse operation of differentiation: it recovers a</w:t>
-      </w:r>
-      <w:r>
-        <w:t xml:space="preserve"> </w:t>
-      </w:r>
-      <w:r>
-        <w:t xml:space="preserve">function from its derivative and accumulates quantities such as areas,</w:t>
-      </w:r>
-      <w:r>
-        <w:t xml:space="preserve"> </w:t>
-      </w:r>
-      <w:r>
-        <w:t xml:space="preserve">totals, and probabilities. We begin with antiderivatives, then state</w:t>
-      </w:r>
-      <w:r>
-        <w:t xml:space="preserve"> </w:t>
-      </w:r>
-      <w:r>
-        <w:t xml:space="preserve">basic integration rules, and conclude with the Fundamental Theorem of</w:t>
-      </w:r>
-      <w:r>
-        <w:t xml:space="preserve"> </w:t>
-      </w:r>
-      <w:r>
-        <w:t xml:space="preserve">Calculus and a worked example from probability.</w:t>
-      </w:r>
-    </w:p>
-    <w:bookmarkStart w:id="58" w:name="antiderivatives"/>
+    <w:bookmarkStart w:id="71" w:name="antiderivatives"/>
     <w:p>
       <w:pPr>
         <w:pStyle w:val="Heading3"/>
@@ -4547,7 +5264,7 @@
         <w:t xml:space="preserve">2.1 Antiderivatives</w:t>
       </w:r>
     </w:p>
-    <w:bookmarkStart w:id="44" w:name="def-antiderivative"/>
+    <w:bookmarkStart w:id="53" w:name="def-antiderivative"/>
     <w:p>
       <w:pPr>
         <w:pStyle w:val="FirstParagraph"/>
@@ -4737,8 +5454,8 @@
         <w:t xml:space="preserve">(Larson and Edwards 2018, sec. 4.1, pp. 248–249)</w:t>
       </w:r>
     </w:p>
-    <w:bookmarkEnd w:id="44"/>
-    <w:bookmarkStart w:id="45" w:name="def-indefinite-integral"/>
+    <w:bookmarkEnd w:id="53"/>
+    <w:bookmarkStart w:id="54" w:name="def-indefinite-integral"/>
     <w:p>
       <w:pPr>
         <w:pStyle w:val="BodyText"/>
@@ -4951,8 +5668,8 @@
         <w:t xml:space="preserve">(Larson and Edwards 2018, sec. 4.1, pp. 248–249)</w:t>
       </w:r>
     </w:p>
-    <w:bookmarkEnd w:id="45"/>
-    <w:bookmarkStart w:id="55" w:name="exm-antiderivative-power"/>
+    <w:bookmarkEnd w:id="54"/>
+    <w:bookmarkStart w:id="64" w:name="exm-antiderivative-power"/>
     <w:p>
       <w:pPr>
         <w:pStyle w:val="BodyText"/>
@@ -5536,7 +6253,7 @@
         <w:t xml:space="preserve">.</w:t>
       </w:r>
     </w:p>
-    <w:bookmarkStart w:id="54" w:name="fig-antiderivatives"/>
+    <w:bookmarkStart w:id="63" w:name="fig-antiderivatives"/>
     <w:tbl>
       <w:tblPr>
         <w:tblStyle w:val="Table"/>
@@ -5564,7 +6281,7 @@
             <w:tr>
               <w:tc>
                 <w:tcPr/>
-                <w:bookmarkStart w:id="49" w:name="fig-antiderivatives-f"/>
+                <w:bookmarkStart w:id="58" w:name="fig-antiderivatives-f"/>
                 <w:p>
                   <w:pPr>
                     <w:pStyle w:val="SourceCode"/>
@@ -5831,18 +6548,18 @@
                       <wp:inline>
                         <wp:extent cx="2971800" cy="2377440"/>
                         <wp:effectExtent b="0" l="0" r="0" t="0"/>
-                        <wp:docPr descr="" title="" id="47" name="Picture"/>
+                        <wp:docPr descr="" title="" id="56" name="Picture"/>
                         <a:graphic>
                           <a:graphicData uri="http://schemas.openxmlformats.org/drawingml/2006/picture">
                             <pic:pic>
                               <pic:nvPicPr>
-                                <pic:cNvPr descr="calculus_files/figure-docx/antiderivatives-f-code-1.png" id="48" name="Picture"/>
+                                <pic:cNvPr descr="calculus_files/figure-docx/antiderivatives-f-code-1.png" id="57" name="Picture"/>
                                 <pic:cNvPicPr>
                                   <a:picLocks noChangeArrowheads="1" noChangeAspect="1"/>
                                 </pic:cNvPicPr>
                               </pic:nvPicPr>
                               <pic:blipFill>
-                                <a:blip r:embed="rId46"/>
+                                <a:blip r:embed="rId55"/>
                                 <a:stretch>
                                   <a:fillRect/>
                                 </a:stretch>
@@ -5927,7 +6644,7 @@
                     <w:t xml:space="preserve">.</w:t>
                   </w:r>
                 </w:p>
-                <w:bookmarkEnd w:id="49"/>
+                <w:bookmarkEnd w:id="58"/>
               </w:tc>
             </w:tr>
           </w:tbl>
@@ -5977,7 +6694,7 @@
             <w:tr>
               <w:tc>
                 <w:tcPr/>
-                <w:bookmarkStart w:id="53" w:name="fig-antiderivatives-F"/>
+                <w:bookmarkStart w:id="62" w:name="fig-antiderivatives-F"/>
                 <w:p>
                   <w:pPr>
                     <w:pStyle w:val="SourceCode"/>
@@ -6577,18 +7294,18 @@
                       <wp:inline>
                         <wp:extent cx="2971800" cy="2377440"/>
                         <wp:effectExtent b="0" l="0" r="0" t="0"/>
-                        <wp:docPr descr="" title="" id="51" name="Picture"/>
+                        <wp:docPr descr="" title="" id="60" name="Picture"/>
                         <a:graphic>
                           <a:graphicData uri="http://schemas.openxmlformats.org/drawingml/2006/picture">
                             <pic:pic>
                               <pic:nvPicPr>
-                                <pic:cNvPr descr="calculus_files/figure-docx/antiderivatives-F-code-1.png" id="52" name="Picture"/>
+                                <pic:cNvPr descr="calculus_files/figure-docx/antiderivatives-F-code-1.png" id="61" name="Picture"/>
                                 <pic:cNvPicPr>
                                   <a:picLocks noChangeArrowheads="1" noChangeAspect="1"/>
                                 </pic:cNvPicPr>
                               </pic:nvPicPr>
                               <pic:blipFill>
-                                <a:blip r:embed="rId50"/>
+                                <a:blip r:embed="rId59"/>
                                 <a:stretch>
                                   <a:fillRect/>
                                 </a:stretch>
@@ -6691,7 +7408,7 @@
                     <w:t xml:space="preserve">.</w:t>
                   </w:r>
                 </w:p>
-                <w:bookmarkEnd w:id="53"/>
+                <w:bookmarkEnd w:id="62"/>
               </w:tc>
             </w:tr>
           </w:tbl>
@@ -6920,9 +7637,9 @@
         <w:t xml:space="preserve">; they differ only by a vertical shift.</w:t>
       </w:r>
     </w:p>
-    <w:bookmarkEnd w:id="54"/>
-    <w:bookmarkEnd w:id="55"/>
-    <w:bookmarkStart w:id="56" w:name="thm-integral-rules"/>
+    <w:bookmarkEnd w:id="63"/>
+    <w:bookmarkEnd w:id="64"/>
+    <w:bookmarkStart w:id="65" w:name="thm-integral-rules"/>
     <w:p>
       <w:pPr>
         <w:pStyle w:val="BodyText"/>
@@ -7902,8 +8619,8 @@
         <w:t xml:space="preserve">.</w:t>
       </w:r>
     </w:p>
-    <w:bookmarkEnd w:id="56"/>
-    <w:bookmarkStart w:id="57" w:name="exm-integral-rules-quadratic"/>
+    <w:bookmarkEnd w:id="65"/>
+    <w:bookmarkStart w:id="66" w:name="exm-integral-rules-quadratic"/>
     <w:p>
       <w:pPr>
         <w:pStyle w:val="BodyText"/>
@@ -8299,9 +9016,171 @@
         <w:t xml:space="preserve">, as required.</w:t>
       </w:r>
     </w:p>
-    <w:bookmarkEnd w:id="57"/>
-    <w:bookmarkEnd w:id="58"/>
-    <w:bookmarkStart w:id="95" w:name="regularity-conditions"/>
+    <w:bookmarkEnd w:id="66"/>
+    <w:tbl>
+      <w:tblPr>
+        <w:tblStyle w:val="Table"/>
+        <w:tblLook w:firstRow="0" w:lastRow="0" w:firstColumn="0" w:lastColumn="0" w:noHBand="0" w:noVBand="0" w:val="0000"/>
+        <w:tblBorders>
+          <w:top w:val="single" w:sz="4" w:space="0" w:color="00A047"/>
+          <w:left w:val="single" w:sz="24" w:space="0" w:color="00A047"/>
+          <w:bottom w:val="single" w:sz="4" w:space="0" w:color="00A047"/>
+          <w:right w:val="single" w:sz="4" w:space="0" w:color="00A047"/>
+        </w:tblBorders>
+        <w:tblCellMar>
+          <w:left w:w="144" w:type="dxa"/>
+          <w:right w:w="144" w:type="dxa"/>
+        </w:tblCellMar>
+        <w:tblLook w:firstRow="0" w:lastRow="0" w:firstColumn="0" w:lastColumn="0" w:noHBand="0" w:noVBand="0" w:val="0000"/>
+      </w:tblPr>
+      <w:tr>
+        <w:trPr>
+          <w:cantSplit/>
+        </w:trPr>
+        <w:tc>
+          <w:tcPr>
+            <w:shd w:color="auto" w:fill="ccf1e3" w:val="clear"/>
+            <w:tcMar>
+              <w:top w:w="92" w:type="dxa"/>
+              <w:bottom w:w="92" w:type="dxa"/>
+            </w:tcMar>
+          </w:tcPr>
+          <w:p>
+            <w:pPr>
+              <w:pStyle w:val="BodyText"/>
+            </w:pPr>
+            <w:pPr>
+              <w:spacing w:before="0" w:after="0"/>
+              <w:textAlignment w:val="center"/>
+            </w:pPr>
+            <w:r>
+              <w:drawing>
+                <wp:inline>
+                  <wp:extent cx="152400" cy="152400"/>
+                  <wp:effectExtent b="0" l="0" r="0" t="0"/>
+                  <wp:docPr descr="" title="" id="67" name="Picture"/>
+                  <a:graphic>
+                    <a:graphicData uri="http://schemas.openxmlformats.org/drawingml/2006/picture">
+                      <pic:pic>
+                        <pic:nvPicPr>
+                          <pic:cNvPr descr="/opt/quarto/share/formats/docx/tip.png" id="68" name="Picture"/>
+                          <pic:cNvPicPr>
+                            <a:picLocks noChangeArrowheads="1" noChangeAspect="1"/>
+                          </pic:cNvPicPr>
+                        </pic:nvPicPr>
+                        <pic:blipFill>
+                          <a:blip r:embed="rId10"/>
+                          <a:stretch>
+                            <a:fillRect/>
+                          </a:stretch>
+                        </pic:blipFill>
+                        <pic:spPr bwMode="auto">
+                          <a:xfrm>
+                            <a:off x="0" y="0"/>
+                            <a:ext cx="152400" cy="152400"/>
+                          </a:xfrm>
+                          <a:prstGeom prst="rect">
+                            <a:avLst/>
+                          </a:prstGeom>
+                          <a:noFill/>
+                          <a:ln w="9525">
+                            <a:noFill/>
+                            <a:headEnd/>
+                            <a:tailEnd/>
+                          </a:ln>
+                        </pic:spPr>
+                      </pic:pic>
+                    </a:graphicData>
+                  </a:graphic>
+                </wp:inline>
+              </w:drawing>
+            </w:r>
+            <w:r>
+              <w:t xml:space="preserve"> </w:t>
+            </w:r>
+            <w:r>
+              <w:t xml:space="preserve"> </w:t>
+            </w:r>
+            <w:r>
+              <w:t xml:space="preserve">Videos</w:t>
+            </w:r>
+          </w:p>
+        </w:tc>
+      </w:tr>
+      <w:tr>
+        <w:trPr>
+          <w:cantSplit/>
+        </w:trPr>
+        <w:tc>
+          <w:tcPr>
+            <w:tcMar>
+              <w:top w:w="108" w:type="dxa"/>
+              <w:bottom w:w="108" w:type="dxa"/>
+            </w:tcMar>
+          </w:tcPr>
+          <w:p>
+            <w:pPr>
+              <w:pStyle w:val="BodyText"/>
+            </w:pPr>
+            <w:pPr>
+              <w:spacing w:before="16"/>
+            </w:pPr>
+            <w:r>
+              <w:t xml:space="preserve">Jon Krohn’s</w:t>
+            </w:r>
+            <w:r>
+              <w:t xml:space="preserve"> </w:t>
+            </w:r>
+            <w:r>
+              <w:t xml:space="preserve">“Calculus for Machine Learning”</w:t>
+            </w:r>
+            <w:r>
+              <w:t xml:space="preserve"> </w:t>
+            </w:r>
+            <w:r>
+              <w:t xml:space="preserve">YouTube playlist has videos on these rules:</w:t>
+            </w:r>
+          </w:p>
+          <w:p>
+            <w:pPr>
+              <w:pStyle w:val="Compact"/>
+              <w:numPr>
+                <w:ilvl w:val="0"/>
+                <w:numId w:val="1010"/>
+              </w:numPr>
+            </w:pPr>
+            <w:hyperlink r:id="rId69">
+              <w:r>
+                <w:rPr>
+                  <w:rStyle w:val="Hyperlink"/>
+                </w:rPr>
+                <w:t xml:space="preserve">The Integral Calculus Rules</w:t>
+              </w:r>
+            </w:hyperlink>
+          </w:p>
+          <w:p>
+            <w:pPr>
+              <w:pStyle w:val="Compact"/>
+              <w:numPr>
+                <w:ilvl w:val="0"/>
+                <w:numId w:val="1010"/>
+              </w:numPr>
+            </w:pPr>
+            <w:hyperlink r:id="rId70">
+              <w:r>
+                <w:rPr>
+                  <w:rStyle w:val="Hyperlink"/>
+                </w:rPr>
+                <w:t xml:space="preserve">Indefinite Integral Exercises</w:t>
+              </w:r>
+            </w:hyperlink>
+          </w:p>
+          <w:p/>
+        </w:tc>
+      </w:tr>
+    </w:tbl>
+    <w:bookmarkEnd w:id="71"/>
+    <w:bookmarkStart w:id="119" w:name="regularity-conditions"/>
     <w:p>
       <w:pPr>
         <w:pStyle w:val="Heading3"/>
@@ -8310,7 +9189,7 @@
         <w:t xml:space="preserve">2.2 Regularity Conditions</w:t>
       </w:r>
     </w:p>
-    <w:bookmarkStart w:id="59" w:name="def-differentiable"/>
+    <w:bookmarkStart w:id="72" w:name="def-differentiable"/>
     <w:p>
       <w:pPr>
         <w:pStyle w:val="FirstParagraph"/>
@@ -8540,8 +9419,8 @@
         <w:t xml:space="preserve">(Larson and Edwards 2018, sec. 2.1, p. 100)</w:t>
       </w:r>
     </w:p>
-    <w:bookmarkEnd w:id="59"/>
-    <w:bookmarkStart w:id="60" w:name="exm-differentiable"/>
+    <w:bookmarkEnd w:id="72"/>
+    <w:bookmarkStart w:id="73" w:name="exm-differentiable"/>
     <w:p>
       <w:pPr>
         <w:pStyle w:val="BodyText"/>
@@ -8564,7 +9443,7 @@
       <w:pPr>
         <w:numPr>
           <w:ilvl w:val="0"/>
-          <w:numId w:val="1004"/>
+          <w:numId w:val="1011"/>
         </w:numPr>
       </w:pPr>
       <m:oMath>
@@ -9176,7 +10055,7 @@
       <w:pPr>
         <w:numPr>
           <w:ilvl w:val="0"/>
-          <w:numId w:val="1004"/>
+          <w:numId w:val="1011"/>
         </w:numPr>
       </w:pPr>
       <m:oMath>
@@ -9422,8 +10301,221 @@
         <w:t xml:space="preserve">so the limit is not finite.</w:t>
       </w:r>
     </w:p>
-    <w:bookmarkEnd w:id="60"/>
-    <w:bookmarkStart w:id="61" w:name="def-differentiable-on"/>
+    <w:bookmarkEnd w:id="73"/>
+    <w:tbl>
+      <w:tblPr>
+        <w:tblStyle w:val="Table"/>
+        <w:tblLook w:firstRow="0" w:lastRow="0" w:firstColumn="0" w:lastColumn="0" w:noHBand="0" w:noVBand="0" w:val="0000"/>
+        <w:tblBorders>
+          <w:top w:val="single" w:sz="4" w:space="0" w:color="00A047"/>
+          <w:left w:val="single" w:sz="24" w:space="0" w:color="00A047"/>
+          <w:bottom w:val="single" w:sz="4" w:space="0" w:color="00A047"/>
+          <w:right w:val="single" w:sz="4" w:space="0" w:color="00A047"/>
+        </w:tblBorders>
+        <w:tblCellMar>
+          <w:left w:w="144" w:type="dxa"/>
+          <w:right w:w="144" w:type="dxa"/>
+        </w:tblCellMar>
+        <w:tblLook w:firstRow="0" w:lastRow="0" w:firstColumn="0" w:lastColumn="0" w:noHBand="0" w:noVBand="0" w:val="0000"/>
+      </w:tblPr>
+      <w:tr>
+        <w:trPr>
+          <w:cantSplit/>
+        </w:trPr>
+        <w:tc>
+          <w:tcPr>
+            <w:shd w:color="auto" w:fill="ccf1e3" w:val="clear"/>
+            <w:tcMar>
+              <w:top w:w="92" w:type="dxa"/>
+              <w:bottom w:w="92" w:type="dxa"/>
+            </w:tcMar>
+          </w:tcPr>
+          <w:p>
+            <w:pPr>
+              <w:pStyle w:val="FirstParagraph"/>
+            </w:pPr>
+            <w:pPr>
+              <w:spacing w:before="0" w:after="0"/>
+              <w:textAlignment w:val="center"/>
+            </w:pPr>
+            <w:r>
+              <w:drawing>
+                <wp:inline>
+                  <wp:extent cx="152400" cy="152400"/>
+                  <wp:effectExtent b="0" l="0" r="0" t="0"/>
+                  <wp:docPr descr="" title="" id="74" name="Picture"/>
+                  <a:graphic>
+                    <a:graphicData uri="http://schemas.openxmlformats.org/drawingml/2006/picture">
+                      <pic:pic>
+                        <pic:nvPicPr>
+                          <pic:cNvPr descr="/opt/quarto/share/formats/docx/tip.png" id="75" name="Picture"/>
+                          <pic:cNvPicPr>
+                            <a:picLocks noChangeArrowheads="1" noChangeAspect="1"/>
+                          </pic:cNvPicPr>
+                        </pic:nvPicPr>
+                        <pic:blipFill>
+                          <a:blip r:embed="rId10"/>
+                          <a:stretch>
+                            <a:fillRect/>
+                          </a:stretch>
+                        </pic:blipFill>
+                        <pic:spPr bwMode="auto">
+                          <a:xfrm>
+                            <a:off x="0" y="0"/>
+                            <a:ext cx="152400" cy="152400"/>
+                          </a:xfrm>
+                          <a:prstGeom prst="rect">
+                            <a:avLst/>
+                          </a:prstGeom>
+                          <a:noFill/>
+                          <a:ln w="9525">
+                            <a:noFill/>
+                            <a:headEnd/>
+                            <a:tailEnd/>
+                          </a:ln>
+                        </pic:spPr>
+                      </pic:pic>
+                    </a:graphicData>
+                  </a:graphic>
+                </wp:inline>
+              </w:drawing>
+            </w:r>
+            <w:r>
+              <w:t xml:space="preserve"> </w:t>
+            </w:r>
+            <w:r>
+              <w:t xml:space="preserve"> </w:t>
+            </w:r>
+            <w:r>
+              <w:t xml:space="preserve">Videos</w:t>
+            </w:r>
+          </w:p>
+        </w:tc>
+      </w:tr>
+      <w:tr>
+        <w:trPr>
+          <w:cantSplit/>
+        </w:trPr>
+        <w:tc>
+          <w:tcPr>
+            <w:tcMar>
+              <w:top w:w="108" w:type="dxa"/>
+              <w:bottom w:w="108" w:type="dxa"/>
+            </w:tcMar>
+          </w:tcPr>
+          <w:p>
+            <w:pPr>
+              <w:pStyle w:val="BodyText"/>
+            </w:pPr>
+            <w:pPr>
+              <w:spacing w:before="16"/>
+            </w:pPr>
+            <w:r>
+              <w:t xml:space="preserve">Jon Krohn’s</w:t>
+            </w:r>
+            <w:r>
+              <w:t xml:space="preserve"> </w:t>
+            </w:r>
+            <w:r>
+              <w:t xml:space="preserve">“Calculus for Machine Learning”</w:t>
+            </w:r>
+            <w:r>
+              <w:t xml:space="preserve"> </w:t>
+            </w:r>
+            <w:r>
+              <w:t xml:space="preserve">YouTube playlist introduces limits and derivatives:</w:t>
+            </w:r>
+          </w:p>
+          <w:p>
+            <w:pPr>
+              <w:pStyle w:val="Compact"/>
+              <w:numPr>
+                <w:ilvl w:val="0"/>
+                <w:numId w:val="1012"/>
+              </w:numPr>
+            </w:pPr>
+            <w:hyperlink r:id="rId76">
+              <w:r>
+                <w:rPr>
+                  <w:rStyle w:val="Hyperlink"/>
+                </w:rPr>
+                <w:t xml:space="preserve">Calculating Limits</w:t>
+              </w:r>
+            </w:hyperlink>
+          </w:p>
+          <w:p>
+            <w:pPr>
+              <w:pStyle w:val="Compact"/>
+              <w:numPr>
+                <w:ilvl w:val="0"/>
+                <w:numId w:val="1012"/>
+              </w:numPr>
+            </w:pPr>
+            <w:hyperlink r:id="rId77">
+              <w:r>
+                <w:rPr>
+                  <w:rStyle w:val="Hyperlink"/>
+                </w:rPr>
+                <w:t xml:space="preserve">Exercises on Limits</w:t>
+              </w:r>
+            </w:hyperlink>
+          </w:p>
+          <w:p>
+            <w:pPr>
+              <w:pStyle w:val="Compact"/>
+              <w:numPr>
+                <w:ilvl w:val="0"/>
+                <w:numId w:val="1012"/>
+              </w:numPr>
+            </w:pPr>
+            <w:hyperlink r:id="rId78">
+              <w:r>
+                <w:rPr>
+                  <w:rStyle w:val="Hyperlink"/>
+                </w:rPr>
+                <w:t xml:space="preserve">Intro to Differential Calculus</w:t>
+              </w:r>
+            </w:hyperlink>
+          </w:p>
+          <w:p>
+            <w:pPr>
+              <w:pStyle w:val="Compact"/>
+              <w:numPr>
+                <w:ilvl w:val="0"/>
+                <w:numId w:val="1012"/>
+              </w:numPr>
+            </w:pPr>
+            <w:hyperlink r:id="rId79">
+              <w:r>
+                <w:rPr>
+                  <w:rStyle w:val="Hyperlink"/>
+                </w:rPr>
+                <w:t xml:space="preserve">How Derivatives Arise from Limits</w:t>
+              </w:r>
+            </w:hyperlink>
+          </w:p>
+          <w:p>
+            <w:pPr>
+              <w:pStyle w:val="Compact"/>
+              <w:numPr>
+                <w:ilvl w:val="0"/>
+                <w:numId w:val="1012"/>
+              </w:numPr>
+            </w:pPr>
+            <w:hyperlink r:id="rId80">
+              <w:r>
+                <w:rPr>
+                  <w:rStyle w:val="Hyperlink"/>
+                </w:rPr>
+                <w:t xml:space="preserve">Derivative Notation</w:t>
+              </w:r>
+            </w:hyperlink>
+          </w:p>
+          <w:p/>
+        </w:tc>
+      </w:tr>
+    </w:tbl>
+    <w:bookmarkStart w:id="81" w:name="def-differentiable-on"/>
     <w:p>
       <w:pPr>
         <w:pStyle w:val="FirstParagraph"/>
@@ -9503,8 +10595,8 @@
         <w:t xml:space="preserve">(Larson and Edwards 2018, sec. 2.1, p. 100)</w:t>
       </w:r>
     </w:p>
-    <w:bookmarkEnd w:id="61"/>
-    <w:bookmarkStart w:id="62" w:name="exm-differentiable-on"/>
+    <w:bookmarkEnd w:id="81"/>
+    <w:bookmarkStart w:id="82" w:name="exm-differentiable-on"/>
     <w:p>
       <w:pPr>
         <w:pStyle w:val="BodyText"/>
@@ -9528,7 +10620,7 @@
         <w:pStyle w:val="Compact"/>
         <w:numPr>
           <w:ilvl w:val="0"/>
-          <w:numId w:val="1005"/>
+          <w:numId w:val="1013"/>
         </w:numPr>
       </w:pPr>
       <m:oMath>
@@ -9801,7 +10893,7 @@
         <w:pStyle w:val="Compact"/>
         <w:numPr>
           <w:ilvl w:val="0"/>
-          <w:numId w:val="1005"/>
+          <w:numId w:val="1013"/>
         </w:numPr>
       </w:pPr>
       <m:oMath>
@@ -10014,8 +11106,8 @@
         <w:t xml:space="preserve">is not differentiable there.</w:t>
       </w:r>
     </w:p>
-    <w:bookmarkEnd w:id="62"/>
-    <w:bookmarkStart w:id="63" w:name="def-continuous"/>
+    <w:bookmarkEnd w:id="82"/>
+    <w:bookmarkStart w:id="83" w:name="def-continuous"/>
     <w:p>
       <w:pPr>
         <w:pStyle w:val="FirstParagraph"/>
@@ -10086,7 +11178,7 @@
         <w:pStyle w:val="Compact"/>
         <w:numPr>
           <w:ilvl w:val="0"/>
-          <w:numId w:val="1006"/>
+          <w:numId w:val="1014"/>
         </w:numPr>
       </w:pPr>
       <m:oMath>
@@ -10121,7 +11213,7 @@
         <w:pStyle w:val="Compact"/>
         <w:numPr>
           <w:ilvl w:val="0"/>
-          <w:numId w:val="1006"/>
+          <w:numId w:val="1014"/>
         </w:numPr>
       </w:pPr>
       <m:oMath>
@@ -10180,7 +11272,7 @@
         <w:pStyle w:val="Compact"/>
         <w:numPr>
           <w:ilvl w:val="0"/>
-          <w:numId w:val="1006"/>
+          <w:numId w:val="1014"/>
         </w:numPr>
       </w:pPr>
       <m:oMath>
@@ -10263,8 +11355,8 @@
         <w:t xml:space="preserve">(Larson and Edwards 2018, sec. 1.4, p. 73)</w:t>
       </w:r>
     </w:p>
-    <w:bookmarkEnd w:id="63"/>
-    <w:bookmarkStart w:id="64" w:name="exm-continuous"/>
+    <w:bookmarkEnd w:id="83"/>
+    <w:bookmarkStart w:id="84" w:name="exm-continuous"/>
     <w:p>
       <w:pPr>
         <w:pStyle w:val="BodyText"/>
@@ -10288,7 +11380,7 @@
         <w:pStyle w:val="Compact"/>
         <w:numPr>
           <w:ilvl w:val="0"/>
-          <w:numId w:val="1007"/>
+          <w:numId w:val="1015"/>
         </w:numPr>
       </w:pPr>
       <m:oMath>
@@ -10476,7 +11568,7 @@
         <w:pStyle w:val="Compact"/>
         <w:numPr>
           <w:ilvl w:val="0"/>
-          <w:numId w:val="1007"/>
+          <w:numId w:val="1015"/>
         </w:numPr>
       </w:pPr>
       <m:oMath>
@@ -10859,7 +11951,7 @@
         <w:pStyle w:val="Compact"/>
         <w:numPr>
           <w:ilvl w:val="0"/>
-          <w:numId w:val="1007"/>
+          <w:numId w:val="1015"/>
         </w:numPr>
       </w:pPr>
       <w:r>
@@ -11103,7 +12195,7 @@
         <w:pStyle w:val="Compact"/>
         <w:numPr>
           <w:ilvl w:val="0"/>
-          <w:numId w:val="1007"/>
+          <w:numId w:val="1015"/>
         </w:numPr>
       </w:pPr>
       <m:oMath>
@@ -11329,8 +12421,8 @@
         <w:t xml:space="preserve">.</w:t>
       </w:r>
     </w:p>
-    <w:bookmarkEnd w:id="64"/>
-    <w:bookmarkStart w:id="65" w:name="def-continuous-on"/>
+    <w:bookmarkEnd w:id="84"/>
+    <w:bookmarkStart w:id="85" w:name="def-continuous-on"/>
     <w:p>
       <w:pPr>
         <w:pStyle w:val="FirstParagraph"/>
@@ -11419,7 +12511,7 @@
         <w:pStyle w:val="Compact"/>
         <w:numPr>
           <w:ilvl w:val="0"/>
-          <w:numId w:val="1008"/>
+          <w:numId w:val="1016"/>
         </w:numPr>
       </w:pPr>
       <m:oMath>
@@ -11482,7 +12574,7 @@
         <w:pStyle w:val="Compact"/>
         <w:numPr>
           <w:ilvl w:val="0"/>
-          <w:numId w:val="1008"/>
+          <w:numId w:val="1016"/>
         </w:numPr>
       </w:pPr>
       <m:oMath>
@@ -11574,7 +12666,7 @@
         <w:pStyle w:val="Compact"/>
         <w:numPr>
           <w:ilvl w:val="0"/>
-          <w:numId w:val="1008"/>
+          <w:numId w:val="1016"/>
         </w:numPr>
       </w:pPr>
       <m:oMath>
@@ -11669,8 +12761,8 @@
         <w:t xml:space="preserve">(Larson and Edwards 2018, sec. 1.4, p. 73)</w:t>
       </w:r>
     </w:p>
-    <w:bookmarkEnd w:id="65"/>
-    <w:bookmarkStart w:id="66" w:name="exm-continuous-on-sqrt"/>
+    <w:bookmarkEnd w:id="85"/>
+    <w:bookmarkStart w:id="86" w:name="exm-continuous-on-sqrt"/>
     <w:p>
       <w:pPr>
         <w:pStyle w:val="BodyText"/>
@@ -12207,8 +13299,8 @@
         <w:t xml:space="preserve">).</w:t>
       </w:r>
     </w:p>
-    <w:bookmarkEnd w:id="66"/>
-    <w:bookmarkStart w:id="67" w:name="exm-not-continuous-on"/>
+    <w:bookmarkEnd w:id="86"/>
+    <w:bookmarkStart w:id="87" w:name="exm-not-continuous-on"/>
     <w:p>
       <w:pPr>
         <w:pStyle w:val="BodyText"/>
@@ -12557,8 +13649,8 @@
         <w:t xml:space="preserve">.</w:t>
       </w:r>
     </w:p>
-    <w:bookmarkEnd w:id="67"/>
-    <w:bookmarkStart w:id="68" w:name="def-partition"/>
+    <w:bookmarkEnd w:id="87"/>
+    <w:bookmarkStart w:id="88" w:name="def-partition"/>
     <w:p>
       <w:pPr>
         <w:pStyle w:val="BodyText"/>
@@ -12950,8 +14042,8 @@
         <w:t xml:space="preserve">(Larson and Edwards 2018, sec. 4.3)</w:t>
       </w:r>
     </w:p>
-    <w:bookmarkEnd w:id="68"/>
-    <w:bookmarkStart w:id="69" w:name="exm-partition"/>
+    <w:bookmarkEnd w:id="88"/>
+    <w:bookmarkStart w:id="89" w:name="exm-partition"/>
     <w:p>
       <w:pPr>
         <w:pStyle w:val="BodyText"/>
@@ -13220,8 +14312,8 @@
         <w:t xml:space="preserve">.</w:t>
       </w:r>
     </w:p>
-    <w:bookmarkEnd w:id="69"/>
-    <w:bookmarkStart w:id="70" w:name="exm-not-partition"/>
+    <w:bookmarkEnd w:id="89"/>
+    <w:bookmarkStart w:id="90" w:name="exm-not-partition"/>
     <w:p>
       <w:pPr>
         <w:pStyle w:val="BodyText"/>
@@ -13285,7 +14377,7 @@
         <w:pStyle w:val="Compact"/>
         <w:numPr>
           <w:ilvl w:val="0"/>
-          <w:numId w:val="1009"/>
+          <w:numId w:val="1017"/>
         </w:numPr>
       </w:pPr>
       <m:oMath>
@@ -13352,7 +14444,7 @@
         <w:pStyle w:val="Compact"/>
         <w:numPr>
           <w:ilvl w:val="0"/>
-          <w:numId w:val="1009"/>
+          <w:numId w:val="1017"/>
         </w:numPr>
       </w:pPr>
       <m:oMath>
@@ -13439,8 +14531,8 @@
         <w:t xml:space="preserve">.</w:t>
       </w:r>
     </w:p>
-    <w:bookmarkEnd w:id="70"/>
-    <w:bookmarkStart w:id="71" w:name="def-mesh"/>
+    <w:bookmarkEnd w:id="90"/>
+    <w:bookmarkStart w:id="91" w:name="def-mesh"/>
     <w:p>
       <w:pPr>
         <w:pStyle w:val="FirstParagraph"/>
@@ -13684,8 +14776,8 @@
         <w:t xml:space="preserve">(Larson and Edwards 2018, sec. 4.3)</w:t>
       </w:r>
     </w:p>
-    <w:bookmarkEnd w:id="71"/>
-    <w:bookmarkStart w:id="72" w:name="exm-mesh"/>
+    <w:bookmarkEnd w:id="91"/>
+    <w:bookmarkStart w:id="92" w:name="exm-mesh"/>
     <w:p>
       <w:pPr>
         <w:pStyle w:val="BodyText"/>
@@ -13946,8 +15038,8 @@
         <w:t xml:space="preserve">.</w:t>
       </w:r>
     </w:p>
-    <w:bookmarkEnd w:id="72"/>
-    <w:bookmarkStart w:id="73" w:name="def-riemann-integral"/>
+    <w:bookmarkEnd w:id="92"/>
+    <w:bookmarkStart w:id="93" w:name="def-riemann-integral"/>
     <w:p>
       <w:pPr>
         <w:pStyle w:val="BodyText"/>
@@ -14519,8 +15611,8 @@
         <w:t xml:space="preserve">(Larson and Edwards 2018, sec. 4.3, p. 272)</w:t>
       </w:r>
     </w:p>
-    <w:bookmarkEnd w:id="73"/>
-    <w:bookmarkStart w:id="74" w:name="def-integrable"/>
+    <w:bookmarkEnd w:id="93"/>
+    <w:bookmarkStart w:id="94" w:name="def-integrable"/>
     <w:p>
       <w:pPr>
         <w:pStyle w:val="BodyText"/>
@@ -14924,8 +16016,8 @@
         <w:t xml:space="preserve">(Larson and Edwards 2018, sec. 4.3, p. 272)</w:t>
       </w:r>
     </w:p>
-    <w:bookmarkEnd w:id="74"/>
-    <w:bookmarkStart w:id="75" w:name="exm-integrable-constant"/>
+    <w:bookmarkEnd w:id="94"/>
+    <w:bookmarkStart w:id="95" w:name="exm-integrable-constant"/>
     <w:p>
       <w:pPr>
         <w:pStyle w:val="BodyText"/>
@@ -15559,8 +16651,8 @@
         <w:t xml:space="preserve">).</w:t>
       </w:r>
     </w:p>
-    <w:bookmarkEnd w:id="75"/>
-    <w:bookmarkStart w:id="76" w:name="rem-integrable-integral"/>
+    <w:bookmarkEnd w:id="95"/>
+    <w:bookmarkStart w:id="96" w:name="rem-integrable-integral"/>
     <w:p>
       <w:pPr>
         <w:pStyle w:val="BodyText"/>
@@ -16245,8 +17337,8 @@
         <w:t xml:space="preserve">does not exist.</w:t>
       </w:r>
     </w:p>
-    <w:bookmarkEnd w:id="76"/>
-    <w:bookmarkStart w:id="77" w:name="def-riemann-sum-equal-width"/>
+    <w:bookmarkEnd w:id="96"/>
+    <w:bookmarkStart w:id="97" w:name="def-riemann-sum-equal-width"/>
     <w:p>
       <w:pPr>
         <w:pStyle w:val="BodyText"/>
@@ -16644,8 +17736,8 @@
         </m:oMath>
       </m:oMathPara>
     </w:p>
-    <w:bookmarkEnd w:id="77"/>
-    <w:bookmarkStart w:id="78" w:name="exm-equal-width-sum"/>
+    <w:bookmarkEnd w:id="97"/>
+    <w:bookmarkStart w:id="98" w:name="exm-equal-width-sum"/>
     <w:p>
       <w:pPr>
         <w:pStyle w:val="FirstParagraph"/>
@@ -17246,7 +18338,169 @@
         </m:oMath>
       </m:oMathPara>
     </w:p>
-    <w:bookmarkEnd w:id="78"/>
+    <w:bookmarkEnd w:id="98"/>
+    <w:tbl>
+      <w:tblPr>
+        <w:tblStyle w:val="Table"/>
+        <w:tblLook w:firstRow="0" w:lastRow="0" w:firstColumn="0" w:lastColumn="0" w:noHBand="0" w:noVBand="0" w:val="0000"/>
+        <w:tblBorders>
+          <w:top w:val="single" w:sz="4" w:space="0" w:color="00A047"/>
+          <w:left w:val="single" w:sz="24" w:space="0" w:color="00A047"/>
+          <w:bottom w:val="single" w:sz="4" w:space="0" w:color="00A047"/>
+          <w:right w:val="single" w:sz="4" w:space="0" w:color="00A047"/>
+        </w:tblBorders>
+        <w:tblCellMar>
+          <w:left w:w="144" w:type="dxa"/>
+          <w:right w:w="144" w:type="dxa"/>
+        </w:tblCellMar>
+        <w:tblLook w:firstRow="0" w:lastRow="0" w:firstColumn="0" w:lastColumn="0" w:noHBand="0" w:noVBand="0" w:val="0000"/>
+      </w:tblPr>
+      <w:tr>
+        <w:trPr>
+          <w:cantSplit/>
+        </w:trPr>
+        <w:tc>
+          <w:tcPr>
+            <w:shd w:color="auto" w:fill="ccf1e3" w:val="clear"/>
+            <w:tcMar>
+              <w:top w:w="92" w:type="dxa"/>
+              <w:bottom w:w="92" w:type="dxa"/>
+            </w:tcMar>
+          </w:tcPr>
+          <w:p>
+            <w:pPr>
+              <w:pStyle w:val="FirstParagraph"/>
+            </w:pPr>
+            <w:pPr>
+              <w:spacing w:before="0" w:after="0"/>
+              <w:textAlignment w:val="center"/>
+            </w:pPr>
+            <w:r>
+              <w:drawing>
+                <wp:inline>
+                  <wp:extent cx="152400" cy="152400"/>
+                  <wp:effectExtent b="0" l="0" r="0" t="0"/>
+                  <wp:docPr descr="" title="" id="99" name="Picture"/>
+                  <a:graphic>
+                    <a:graphicData uri="http://schemas.openxmlformats.org/drawingml/2006/picture">
+                      <pic:pic>
+                        <pic:nvPicPr>
+                          <pic:cNvPr descr="/opt/quarto/share/formats/docx/tip.png" id="100" name="Picture"/>
+                          <pic:cNvPicPr>
+                            <a:picLocks noChangeArrowheads="1" noChangeAspect="1"/>
+                          </pic:cNvPicPr>
+                        </pic:nvPicPr>
+                        <pic:blipFill>
+                          <a:blip r:embed="rId10"/>
+                          <a:stretch>
+                            <a:fillRect/>
+                          </a:stretch>
+                        </pic:blipFill>
+                        <pic:spPr bwMode="auto">
+                          <a:xfrm>
+                            <a:off x="0" y="0"/>
+                            <a:ext cx="152400" cy="152400"/>
+                          </a:xfrm>
+                          <a:prstGeom prst="rect">
+                            <a:avLst/>
+                          </a:prstGeom>
+                          <a:noFill/>
+                          <a:ln w="9525">
+                            <a:noFill/>
+                            <a:headEnd/>
+                            <a:tailEnd/>
+                          </a:ln>
+                        </pic:spPr>
+                      </pic:pic>
+                    </a:graphicData>
+                  </a:graphic>
+                </wp:inline>
+              </w:drawing>
+            </w:r>
+            <w:r>
+              <w:t xml:space="preserve"> </w:t>
+            </w:r>
+            <w:r>
+              <w:t xml:space="preserve"> </w:t>
+            </w:r>
+            <w:r>
+              <w:t xml:space="preserve">Videos</w:t>
+            </w:r>
+          </w:p>
+        </w:tc>
+      </w:tr>
+      <w:tr>
+        <w:trPr>
+          <w:cantSplit/>
+        </w:trPr>
+        <w:tc>
+          <w:tcPr>
+            <w:tcMar>
+              <w:top w:w="108" w:type="dxa"/>
+              <w:bottom w:w="108" w:type="dxa"/>
+            </w:tcMar>
+          </w:tcPr>
+          <w:p>
+            <w:pPr>
+              <w:pStyle w:val="BodyText"/>
+            </w:pPr>
+            <w:pPr>
+              <w:spacing w:before="16"/>
+            </w:pPr>
+            <w:r>
+              <w:t xml:space="preserve">Jon Krohn’s</w:t>
+            </w:r>
+            <w:r>
+              <w:t xml:space="preserve"> </w:t>
+            </w:r>
+            <w:r>
+              <w:t xml:space="preserve">“Calculus for Machine Learning”</w:t>
+            </w:r>
+            <w:r>
+              <w:t xml:space="preserve"> </w:t>
+            </w:r>
+            <w:r>
+              <w:t xml:space="preserve">YouTube playlist has videos on approximating an area by a sum of simple pieces, as a Riemann sum does, and on computing such sums in Python:</w:t>
+            </w:r>
+          </w:p>
+          <w:p>
+            <w:pPr>
+              <w:pStyle w:val="Compact"/>
+              <w:numPr>
+                <w:ilvl w:val="0"/>
+                <w:numId w:val="1018"/>
+              </w:numPr>
+            </w:pPr>
+            <w:hyperlink r:id="rId101">
+              <w:r>
+                <w:rPr>
+                  <w:rStyle w:val="Hyperlink"/>
+                </w:rPr>
+                <w:t xml:space="preserve">The Method of Exhaustion</w:t>
+              </w:r>
+            </w:hyperlink>
+          </w:p>
+          <w:p>
+            <w:pPr>
+              <w:pStyle w:val="Compact"/>
+              <w:numPr>
+                <w:ilvl w:val="0"/>
+                <w:numId w:val="1018"/>
+              </w:numPr>
+            </w:pPr>
+            <w:hyperlink r:id="rId102">
+              <w:r>
+                <w:rPr>
+                  <w:rStyle w:val="Hyperlink"/>
+                </w:rPr>
+                <w:t xml:space="preserve">Numeric Integration with Python</w:t>
+              </w:r>
+            </w:hyperlink>
+          </w:p>
+          <w:p/>
+        </w:tc>
+      </w:tr>
+    </w:tbl>
     <w:p>
       <w:pPr>
         <w:pStyle w:val="FirstParagraph"/>
@@ -17367,7 +18621,7 @@
         <w:t xml:space="preserve">which says what continuity buys us.</w:t>
       </w:r>
     </w:p>
-    <w:bookmarkStart w:id="79" w:name="thm-diff-implies-cont"/>
+    <w:bookmarkStart w:id="103" w:name="thm-diff-implies-cont"/>
     <w:p>
       <w:pPr>
         <w:pStyle w:val="BodyText"/>
@@ -17462,7 +18716,7 @@
         <w:t xml:space="preserve">(Larson and Edwards 2018, Theorem 2.1, p. 106)</w:t>
       </w:r>
     </w:p>
-    <w:bookmarkEnd w:id="79"/>
+    <w:bookmarkEnd w:id="103"/>
     <w:p>
       <w:pPr>
         <w:pStyle w:val="BodyText"/>
@@ -18340,7 +19594,7 @@
         <w:t xml:space="preserve">hold.</w:t>
       </w:r>
     </w:p>
-    <w:bookmarkStart w:id="80" w:name="exm-diff-implies-cont"/>
+    <w:bookmarkStart w:id="104" w:name="exm-diff-implies-cont"/>
     <w:p>
       <w:pPr>
         <w:pStyle w:val="BodyText"/>
@@ -18543,8 +19797,8 @@
         <w:t xml:space="preserve">it is continuous everywhere.</w:t>
       </w:r>
     </w:p>
-    <w:bookmarkEnd w:id="80"/>
-    <w:bookmarkStart w:id="85" w:name="exm-cont-not-diff"/>
+    <w:bookmarkEnd w:id="104"/>
+    <w:bookmarkStart w:id="109" w:name="exm-cont-not-diff"/>
     <w:p>
       <w:pPr>
         <w:pStyle w:val="BodyText"/>
@@ -18890,7 +20144,7 @@
       <w:tr>
         <w:tc>
           <w:tcPr/>
-          <w:bookmarkStart w:id="84" w:name="fig-abs-value"/>
+          <w:bookmarkStart w:id="108" w:name="fig-abs-value"/>
           <w:p>
             <w:pPr>
               <w:pStyle w:val="SourceCode"/>
@@ -19326,18 +20580,18 @@
                 <wp:inline>
                   <wp:extent cx="4620126" cy="3696101"/>
                   <wp:effectExtent b="0" l="0" r="0" t="0"/>
-                  <wp:docPr descr="" title="" id="82" name="Picture"/>
+                  <wp:docPr descr="" title="" id="106" name="Picture"/>
                   <a:graphic>
                     <a:graphicData uri="http://schemas.openxmlformats.org/drawingml/2006/picture">
                       <pic:pic>
                         <pic:nvPicPr>
-                          <pic:cNvPr descr="calculus_files/figure-docx/abs-value-code-1.png" id="83" name="Picture"/>
+                          <pic:cNvPr descr="calculus_files/figure-docx/abs-value-code-1.png" id="107" name="Picture"/>
                           <pic:cNvPicPr>
                             <a:picLocks noChangeArrowheads="1" noChangeAspect="1"/>
                           </pic:cNvPicPr>
                         </pic:nvPicPr>
                         <pic:blipFill>
-                          <a:blip r:embed="rId81"/>
+                          <a:blip r:embed="rId105"/>
                           <a:stretch>
                             <a:fillRect/>
                           </a:stretch>
@@ -19460,12 +20714,12 @@
               <w:t xml:space="preserve">but is continuous everywhere: no gaps or jumps.</w:t>
             </w:r>
           </w:p>
-          <w:bookmarkEnd w:id="84"/>
+          <w:bookmarkEnd w:id="108"/>
         </w:tc>
       </w:tr>
     </w:tbl>
-    <w:bookmarkEnd w:id="85"/>
-    <w:bookmarkStart w:id="86" w:name="thm-cont-implies-int"/>
+    <w:bookmarkEnd w:id="109"/>
+    <w:bookmarkStart w:id="110" w:name="thm-cont-implies-int"/>
     <w:p>
       <w:pPr>
         <w:pStyle w:val="BodyText"/>
@@ -19651,8 +20905,8 @@
         <w:t xml:space="preserve">(Larson and Edwards 2018, Theorem 4.4, p. 272)</w:t>
       </w:r>
     </w:p>
-    <w:bookmarkEnd w:id="86"/>
-    <w:bookmarkStart w:id="87" w:name="exm-cont-implies-int"/>
+    <w:bookmarkEnd w:id="110"/>
+    <w:bookmarkStart w:id="111" w:name="exm-cont-implies-int"/>
     <w:p>
       <w:pPr>
         <w:pStyle w:val="BodyText"/>
@@ -19747,8 +21001,8 @@
         <w:t xml:space="preserve">.</w:t>
       </w:r>
     </w:p>
-    <w:bookmarkEnd w:id="87"/>
-    <w:bookmarkStart w:id="92" w:name="exm-int-not-cont"/>
+    <w:bookmarkEnd w:id="111"/>
+    <w:bookmarkStart w:id="116" w:name="exm-int-not-cont"/>
     <w:p>
       <w:pPr>
         <w:pStyle w:val="BodyText"/>
@@ -20274,7 +21528,7 @@
       <w:tr>
         <w:tc>
           <w:tcPr/>
-          <w:bookmarkStart w:id="91" w:name="fig-step"/>
+          <w:bookmarkStart w:id="115" w:name="fig-step"/>
           <w:p>
             <w:pPr>
               <w:pStyle w:val="SourceCode"/>
@@ -21646,18 +22900,18 @@
                 <wp:inline>
                   <wp:extent cx="4620126" cy="3696101"/>
                   <wp:effectExtent b="0" l="0" r="0" t="0"/>
-                  <wp:docPr descr="" title="" id="89" name="Picture"/>
+                  <wp:docPr descr="" title="" id="113" name="Picture"/>
                   <a:graphic>
                     <a:graphicData uri="http://schemas.openxmlformats.org/drawingml/2006/picture">
                       <pic:pic>
                         <pic:nvPicPr>
-                          <pic:cNvPr descr="calculus_files/figure-docx/step-code-1.png" id="90" name="Picture"/>
+                          <pic:cNvPr descr="calculus_files/figure-docx/step-code-1.png" id="114" name="Picture"/>
                           <pic:cNvPicPr>
                             <a:picLocks noChangeArrowheads="1" noChangeAspect="1"/>
                           </pic:cNvPicPr>
                         </pic:nvPicPr>
                         <pic:blipFill>
-                          <a:blip r:embed="rId88"/>
+                          <a:blip r:embed="rId112"/>
                           <a:stretch>
                             <a:fillRect/>
                           </a:stretch>
@@ -21922,11 +23176,11 @@
               <w:t xml:space="preserve">.</w:t>
             </w:r>
           </w:p>
-          <w:bookmarkEnd w:id="91"/>
+          <w:bookmarkEnd w:id="115"/>
         </w:tc>
       </w:tr>
     </w:tbl>
-    <w:bookmarkEnd w:id="92"/>
+    <w:bookmarkEnd w:id="116"/>
     <w:p>
       <w:pPr>
         <w:pStyle w:val="BodyText"/>
@@ -22134,7 +23388,7 @@
         <w:t xml:space="preserve">show that neither implication reverses in general.</w:t>
       </w:r>
     </w:p>
-    <w:bookmarkStart w:id="93" w:name="thm-riemann-general"/>
+    <w:bookmarkStart w:id="117" w:name="thm-riemann-general"/>
     <w:p>
       <w:pPr>
         <w:pStyle w:val="BodyText"/>
@@ -22374,7 +23628,7 @@
         </m:oMath>
       </m:oMathPara>
     </w:p>
-    <w:bookmarkEnd w:id="93"/>
+    <w:bookmarkEnd w:id="117"/>
     <w:p>
       <w:pPr>
         <w:pStyle w:val="FirstParagraph"/>
@@ -22612,7 +23866,7 @@
         <w:t xml:space="preserve">has that value along this sequence too.</w:t>
       </w:r>
     </w:p>
-    <w:bookmarkStart w:id="94" w:name="exm-riemann-equal-width"/>
+    <w:bookmarkStart w:id="118" w:name="exm-riemann-equal-width"/>
     <w:p>
       <w:pPr>
         <w:pStyle w:val="BodyText"/>
@@ -23540,9 +24794,9 @@
         <w:t xml:space="preserve">.</w:t>
       </w:r>
     </w:p>
-    <w:bookmarkEnd w:id="94"/>
-    <w:bookmarkEnd w:id="95"/>
-    <w:bookmarkStart w:id="136" w:name="fundamental-theorem-of-calculus"/>
+    <w:bookmarkEnd w:id="118"/>
+    <w:bookmarkEnd w:id="119"/>
+    <w:bookmarkStart w:id="154" w:name="fundamental-theorem-of-calculus"/>
     <w:p>
       <w:pPr>
         <w:pStyle w:val="Heading3"/>
@@ -23551,7 +24805,7 @@
         <w:t xml:space="preserve">2.3 Fundamental Theorem of Calculus</w:t>
       </w:r>
     </w:p>
-    <w:bookmarkStart w:id="102" w:name="thm-ftc"/>
+    <w:bookmarkStart w:id="126" w:name="thm-ftc"/>
     <w:p>
       <w:pPr>
         <w:pStyle w:val="FirstParagraph"/>
@@ -23781,7 +25035,7 @@
       <w:pPr>
         <w:pStyle w:val="BodyText"/>
       </w:pPr>
-      <w:bookmarkStart w:id="96" w:name="eq-ftc-deriv-of-integral"/>
+      <w:bookmarkStart w:id="120" w:name="eq-ftc-deriv-of-integral"/>
       <m:oMathPara>
         <m:oMathParaPr>
           <m:jc m:val="center"/>
@@ -23902,7 +25156,7 @@
           </m:r>
         </m:oMath>
       </m:oMathPara>
-      <w:bookmarkEnd w:id="96"/>
+      <w:bookmarkEnd w:id="120"/>
     </w:p>
     <w:tbl>
       <w:tblPr>
@@ -23945,18 +25199,18 @@
                 <wp:inline>
                   <wp:extent cx="152400" cy="152400"/>
                   <wp:effectExtent b="0" l="0" r="0" t="0"/>
-                  <wp:docPr descr="" title="" id="98" name="Picture"/>
+                  <wp:docPr descr="" title="" id="122" name="Picture"/>
                   <a:graphic>
                     <a:graphicData uri="http://schemas.openxmlformats.org/drawingml/2006/picture">
                       <pic:pic>
                         <pic:nvPicPr>
-                          <pic:cNvPr descr="/opt/quarto/share/formats/docx/note.png" id="99" name="Picture"/>
+                          <pic:cNvPr descr="/opt/quarto/share/formats/docx/note.png" id="123" name="Picture"/>
                           <pic:cNvPicPr>
                             <a:picLocks noChangeArrowheads="1" noChangeAspect="1"/>
                           </pic:cNvPicPr>
                         </pic:nvPicPr>
                         <pic:blipFill>
-                          <a:blip r:embed="rId97"/>
+                          <a:blip r:embed="rId121"/>
                           <a:stretch>
                             <a:fillRect/>
                           </a:stretch>
@@ -24462,7 +25716,7 @@
       <w:pPr>
         <w:pStyle w:val="BodyText"/>
       </w:pPr>
-      <w:bookmarkStart w:id="100" w:name="eq-ftc-part2"/>
+      <w:bookmarkStart w:id="124" w:name="eq-ftc-part2"/>
       <m:oMathPara>
         <m:oMathParaPr>
           <m:jc m:val="center"/>
@@ -24583,7 +25837,7 @@
           </m:r>
         </m:oMath>
       </m:oMathPara>
-      <w:bookmarkEnd w:id="100"/>
+      <w:bookmarkEnd w:id="124"/>
     </w:p>
     <w:p>
       <w:pPr>
@@ -24653,7 +25907,7 @@
       <w:pPr>
         <w:pStyle w:val="BodyText"/>
       </w:pPr>
-      <w:bookmarkStart w:id="101" w:name="eq-ftc-integral-of-deriv"/>
+      <w:bookmarkStart w:id="125" w:name="eq-ftc-integral-of-deriv"/>
       <m:oMathPara>
         <m:oMathParaPr>
           <m:jc m:val="center"/>
@@ -24786,7 +26040,7 @@
           </m:r>
         </m:oMath>
       </m:oMathPara>
-      <w:bookmarkEnd w:id="101"/>
+      <w:bookmarkEnd w:id="125"/>
     </w:p>
     <w:p>
       <w:pPr>
@@ -24914,7 +26168,7 @@
         <w:t xml:space="preserve">(Banner 2007, chap. 18; Larson and Edwards 2018, Theorem 4.9, p. 282)</w:t>
       </w:r>
     </w:p>
-    <w:bookmarkEnd w:id="102"/>
+    <w:bookmarkEnd w:id="126"/>
     <w:p>
       <w:pPr>
         <w:pStyle w:val="BodyText"/>
@@ -24955,7 +26209,7 @@
         <w:pStyle w:val="Compact"/>
         <w:numPr>
           <w:ilvl w:val="0"/>
-          <w:numId w:val="1010"/>
+          <w:numId w:val="1019"/>
         </w:numPr>
       </w:pPr>
       <w:r>
@@ -25006,7 +26260,7 @@
         <w:pStyle w:val="Compact"/>
         <w:numPr>
           <w:ilvl w:val="0"/>
-          <w:numId w:val="1010"/>
+          <w:numId w:val="1019"/>
         </w:numPr>
       </w:pPr>
       <w:r>
@@ -25281,7 +26535,7 @@
         <w:t xml:space="preserve">a common situation in applied statistics.</w:t>
       </w:r>
     </w:p>
-    <w:bookmarkStart w:id="112" w:name="exm-ftc-part1-accumulation"/>
+    <w:bookmarkStart w:id="136" w:name="exm-ftc-part1-accumulation"/>
     <w:p>
       <w:pPr>
         <w:pStyle w:val="BodyText"/>
@@ -25990,7 +27244,7 @@
         <w:t xml:space="preserve">).</w:t>
       </w:r>
     </w:p>
-    <w:bookmarkStart w:id="111" w:name="fig-ftc-part1"/>
+    <w:bookmarkStart w:id="135" w:name="fig-ftc-part1"/>
     <w:tbl>
       <w:tblPr>
         <w:tblStyle w:val="Table"/>
@@ -26018,7 +27272,7 @@
             <w:tr>
               <w:tc>
                 <w:tcPr/>
-                <w:bookmarkStart w:id="106" w:name="fig-ftc-part1-left"/>
+                <w:bookmarkStart w:id="130" w:name="fig-ftc-part1-left"/>
                 <w:p>
                   <w:pPr>
                     <w:pStyle w:val="SourceCode"/>
@@ -26858,18 +28112,18 @@
                       <wp:inline>
                         <wp:extent cx="2971800" cy="2377440"/>
                         <wp:effectExtent b="0" l="0" r="0" t="0"/>
-                        <wp:docPr descr="" title="" id="104" name="Picture"/>
+                        <wp:docPr descr="" title="" id="128" name="Picture"/>
                         <a:graphic>
                           <a:graphicData uri="http://schemas.openxmlformats.org/drawingml/2006/picture">
                             <pic:pic>
                               <pic:nvPicPr>
-                                <pic:cNvPr descr="calculus_files/figure-docx/ftc-part1-left-code-1.png" id="105" name="Picture"/>
+                                <pic:cNvPr descr="calculus_files/figure-docx/ftc-part1-left-code-1.png" id="129" name="Picture"/>
                                 <pic:cNvPicPr>
                                   <a:picLocks noChangeArrowheads="1" noChangeAspect="1"/>
                                 </pic:cNvPicPr>
                               </pic:nvPicPr>
                               <pic:blipFill>
-                                <a:blip r:embed="rId103"/>
+                                <a:blip r:embed="rId127"/>
                                 <a:stretch>
                                   <a:fillRect/>
                                 </a:stretch>
@@ -27033,7 +28287,7 @@
                     <w:t xml:space="preserve">.</w:t>
                   </w:r>
                 </w:p>
-                <w:bookmarkEnd w:id="106"/>
+                <w:bookmarkEnd w:id="130"/>
               </w:tc>
             </w:tr>
           </w:tbl>
@@ -27083,7 +28337,7 @@
             <w:tr>
               <w:tc>
                 <w:tcPr/>
-                <w:bookmarkStart w:id="110" w:name="fig-ftc-part1-right"/>
+                <w:bookmarkStart w:id="134" w:name="fig-ftc-part1-right"/>
                 <w:p>
                   <w:pPr>
                     <w:pStyle w:val="SourceCode"/>
@@ -28157,18 +29411,18 @@
                       <wp:inline>
                         <wp:extent cx="2971800" cy="2377440"/>
                         <wp:effectExtent b="0" l="0" r="0" t="0"/>
-                        <wp:docPr descr="" title="" id="108" name="Picture"/>
+                        <wp:docPr descr="" title="" id="132" name="Picture"/>
                         <a:graphic>
                           <a:graphicData uri="http://schemas.openxmlformats.org/drawingml/2006/picture">
                             <pic:pic>
                               <pic:nvPicPr>
-                                <pic:cNvPr descr="calculus_files/figure-docx/ftc-part1-right-code-1.png" id="109" name="Picture"/>
+                                <pic:cNvPr descr="calculus_files/figure-docx/ftc-part1-right-code-1.png" id="133" name="Picture"/>
                                 <pic:cNvPicPr>
                                   <a:picLocks noChangeArrowheads="1" noChangeAspect="1"/>
                                 </pic:cNvPicPr>
                               </pic:nvPicPr>
                               <pic:blipFill>
-                                <a:blip r:embed="rId107"/>
+                                <a:blip r:embed="rId131"/>
                                 <a:stretch>
                                   <a:fillRect/>
                                 </a:stretch>
@@ -28305,7 +29559,7 @@
                     <w:t xml:space="preserve">.</w:t>
                   </w:r>
                 </w:p>
-                <w:bookmarkEnd w:id="110"/>
+                <w:bookmarkEnd w:id="134"/>
               </w:tc>
             </w:tr>
           </w:tbl>
@@ -28588,9 +29842,9 @@
         <w:t xml:space="preserve">.</w:t>
       </w:r>
     </w:p>
-    <w:bookmarkEnd w:id="111"/>
-    <w:bookmarkEnd w:id="112"/>
-    <w:bookmarkStart w:id="125" w:name="exm-ftc-cdf-pdf"/>
+    <w:bookmarkEnd w:id="135"/>
+    <w:bookmarkEnd w:id="136"/>
+    <w:bookmarkStart w:id="149" w:name="exm-ftc-cdf-pdf"/>
     <w:p>
       <w:pPr>
         <w:pStyle w:val="BodyText"/>
@@ -28712,7 +29966,7 @@
       <w:r>
         <w:t xml:space="preserve"> </w:t>
       </w:r>
-      <w:hyperlink r:id="rId113">
+      <w:hyperlink r:id="rId137">
         <w:r>
           <w:rPr>
             <w:rStyle w:val="Hyperlink"/>
@@ -28755,7 +30009,7 @@
       <w:r>
         <w:t xml:space="preserve"> </w:t>
       </w:r>
-      <w:hyperlink r:id="rId114">
+      <w:hyperlink r:id="rId138">
         <w:r>
           <w:rPr>
             <w:rStyle w:val="Hyperlink"/>
@@ -28899,7 +30153,7 @@
       <w:r>
         <w:t xml:space="preserve"> </w:t>
       </w:r>
-      <w:hyperlink r:id="rId115">
+      <w:hyperlink r:id="rId139">
         <w:r>
           <w:rPr>
             <w:rStyle w:val="Hyperlink"/>
@@ -30796,7 +32050,7 @@
         <w:t xml:space="preserve">.</w:t>
       </w:r>
     </w:p>
-    <w:bookmarkStart w:id="124" w:name="fig-exp-pdf-cdf"/>
+    <w:bookmarkStart w:id="148" w:name="fig-exp-pdf-cdf"/>
     <w:tbl>
       <w:tblPr>
         <w:tblStyle w:val="Table"/>
@@ -30824,7 +32078,7 @@
             <w:tr>
               <w:tc>
                 <w:tcPr/>
-                <w:bookmarkStart w:id="119" w:name="fig-exp-pdf-cdf-pdf"/>
+                <w:bookmarkStart w:id="143" w:name="fig-exp-pdf-cdf-pdf"/>
                 <w:p>
                   <w:pPr>
                     <w:pStyle w:val="SourceCode"/>
@@ -31439,18 +32693,18 @@
                       <wp:inline>
                         <wp:extent cx="2971800" cy="2377440"/>
                         <wp:effectExtent b="0" l="0" r="0" t="0"/>
-                        <wp:docPr descr="" title="" id="117" name="Picture"/>
+                        <wp:docPr descr="" title="" id="141" name="Picture"/>
                         <a:graphic>
                           <a:graphicData uri="http://schemas.openxmlformats.org/drawingml/2006/picture">
                             <pic:pic>
                               <pic:nvPicPr>
-                                <pic:cNvPr descr="calculus_files/figure-docx/exp-pdf-cdf-pdf-code-1.png" id="118" name="Picture"/>
+                                <pic:cNvPr descr="calculus_files/figure-docx/exp-pdf-cdf-pdf-code-1.png" id="142" name="Picture"/>
                                 <pic:cNvPicPr>
                                   <a:picLocks noChangeArrowheads="1" noChangeAspect="1"/>
                                 </pic:cNvPicPr>
                               </pic:nvPicPr>
                               <pic:blipFill>
-                                <a:blip r:embed="rId116"/>
+                                <a:blip r:embed="rId140"/>
                                 <a:stretch>
                                   <a:fillRect/>
                                 </a:stretch>
@@ -31546,7 +32800,7 @@
                     <w:t xml:space="preserve">.</w:t>
                   </w:r>
                 </w:p>
-                <w:bookmarkEnd w:id="119"/>
+                <w:bookmarkEnd w:id="143"/>
               </w:tc>
             </w:tr>
           </w:tbl>
@@ -31596,7 +32850,7 @@
             <w:tr>
               <w:tc>
                 <w:tcPr/>
-                <w:bookmarkStart w:id="123" w:name="fig-exp-pdf-cdf-cdf"/>
+                <w:bookmarkStart w:id="147" w:name="fig-exp-pdf-cdf-cdf"/>
                 <w:p>
                   <w:pPr>
                     <w:pStyle w:val="SourceCode"/>
@@ -32442,18 +33696,18 @@
                       <wp:inline>
                         <wp:extent cx="2971800" cy="2377440"/>
                         <wp:effectExtent b="0" l="0" r="0" t="0"/>
-                        <wp:docPr descr="" title="" id="121" name="Picture"/>
+                        <wp:docPr descr="" title="" id="145" name="Picture"/>
                         <a:graphic>
                           <a:graphicData uri="http://schemas.openxmlformats.org/drawingml/2006/picture">
                             <pic:pic>
                               <pic:nvPicPr>
-                                <pic:cNvPr descr="calculus_files/figure-docx/exp-pdf-cdf-cdf-code-1.png" id="122" name="Picture"/>
+                                <pic:cNvPr descr="calculus_files/figure-docx/exp-pdf-cdf-cdf-code-1.png" id="146" name="Picture"/>
                                 <pic:cNvPicPr>
                                   <a:picLocks noChangeArrowheads="1" noChangeAspect="1"/>
                                 </pic:cNvPicPr>
                               </pic:nvPicPr>
                               <pic:blipFill>
-                                <a:blip r:embed="rId120"/>
+                                <a:blip r:embed="rId144"/>
                                 <a:stretch>
                                   <a:fillRect/>
                                 </a:stretch>
@@ -32549,7 +33803,7 @@
                     <w:t xml:space="preserve">.</w:t>
                   </w:r>
                 </w:p>
-                <w:bookmarkEnd w:id="123"/>
+                <w:bookmarkEnd w:id="147"/>
               </w:tc>
             </w:tr>
           </w:tbl>
@@ -32819,8 +34073,8 @@
         <w:t xml:space="preserve">computed via FTC Part 2.</w:t>
       </w:r>
     </w:p>
-    <w:bookmarkEnd w:id="124"/>
-    <w:bookmarkEnd w:id="125"/>
+    <w:bookmarkEnd w:id="148"/>
+    <w:bookmarkEnd w:id="149"/>
     <w:tbl>
       <w:tblPr>
         <w:tblStyle w:val="Table"/>
@@ -32862,18 +34116,18 @@
                 <wp:inline>
                   <wp:extent cx="152400" cy="152400"/>
                   <wp:effectExtent b="0" l="0" r="0" t="0"/>
-                  <wp:docPr descr="" title="" id="126" name="Picture"/>
+                  <wp:docPr descr="" title="" id="150" name="Picture"/>
                   <a:graphic>
                     <a:graphicData uri="http://schemas.openxmlformats.org/drawingml/2006/picture">
                       <pic:pic>
                         <pic:nvPicPr>
-                          <pic:cNvPr descr="/opt/quarto/share/formats/docx/tip.png" id="127" name="Picture"/>
+                          <pic:cNvPr descr="/opt/quarto/share/formats/docx/tip.png" id="151" name="Picture"/>
                           <pic:cNvPicPr>
                             <a:picLocks noChangeArrowheads="1" noChangeAspect="1"/>
                           </pic:cNvPicPr>
                         </pic:nvPicPr>
                         <pic:blipFill>
-                          <a:blip r:embed="rId24"/>
+                          <a:blip r:embed="rId10"/>
                           <a:stretch>
                             <a:fillRect/>
                           </a:stretch>
@@ -32942,7 +34196,7 @@
               <w:t xml:space="preserve"> </w:t>
             </w:r>
             <w:r>
-              <w:t xml:space="preserve">YouTube playlist has videos on integration:</w:t>
+              <w:t xml:space="preserve">YouTube playlist has videos on evaluating definite integrals:</w:t>
             </w:r>
           </w:p>
           <w:p>
@@ -32950,95 +34204,10 @@
               <w:pStyle w:val="Compact"/>
               <w:numPr>
                 <w:ilvl w:val="0"/>
-                <w:numId w:val="1011"/>
+                <w:numId w:val="1020"/>
               </w:numPr>
             </w:pPr>
-            <w:hyperlink r:id="rId128">
-              <w:r>
-                <w:rPr>
-                  <w:rStyle w:val="Hyperlink"/>
-                </w:rPr>
-                <w:t xml:space="preserve">Intro to Integral Calculus</w:t>
-              </w:r>
-            </w:hyperlink>
-          </w:p>
-          <w:p>
-            <w:pPr>
-              <w:pStyle w:val="Compact"/>
-              <w:numPr>
-                <w:ilvl w:val="0"/>
-                <w:numId w:val="1011"/>
-              </w:numPr>
-            </w:pPr>
-            <w:hyperlink r:id="rId129">
-              <w:r>
-                <w:rPr>
-                  <w:rStyle w:val="Hyperlink"/>
-                </w:rPr>
-                <w:t xml:space="preserve">The Method of Exhaustion</w:t>
-              </w:r>
-            </w:hyperlink>
-          </w:p>
-          <w:p>
-            <w:pPr>
-              <w:pStyle w:val="Compact"/>
-              <w:numPr>
-                <w:ilvl w:val="0"/>
-                <w:numId w:val="1011"/>
-              </w:numPr>
-            </w:pPr>
-            <w:hyperlink r:id="rId130">
-              <w:r>
-                <w:rPr>
-                  <w:rStyle w:val="Hyperlink"/>
-                </w:rPr>
-                <w:t xml:space="preserve">What Integral Calculus Is</w:t>
-              </w:r>
-            </w:hyperlink>
-          </w:p>
-          <w:p>
-            <w:pPr>
-              <w:pStyle w:val="Compact"/>
-              <w:numPr>
-                <w:ilvl w:val="0"/>
-                <w:numId w:val="1011"/>
-              </w:numPr>
-            </w:pPr>
-            <w:hyperlink r:id="rId131">
-              <w:r>
-                <w:rPr>
-                  <w:rStyle w:val="Hyperlink"/>
-                </w:rPr>
-                <w:t xml:space="preserve">The Integral Calculus Rules</w:t>
-              </w:r>
-            </w:hyperlink>
-          </w:p>
-          <w:p>
-            <w:pPr>
-              <w:pStyle w:val="Compact"/>
-              <w:numPr>
-                <w:ilvl w:val="0"/>
-                <w:numId w:val="1011"/>
-              </w:numPr>
-            </w:pPr>
-            <w:hyperlink r:id="rId132">
-              <w:r>
-                <w:rPr>
-                  <w:rStyle w:val="Hyperlink"/>
-                </w:rPr>
-                <w:t xml:space="preserve">Indefinite Integral Exercises</w:t>
-              </w:r>
-            </w:hyperlink>
-          </w:p>
-          <w:p>
-            <w:pPr>
-              <w:pStyle w:val="Compact"/>
-              <w:numPr>
-                <w:ilvl w:val="0"/>
-                <w:numId w:val="1011"/>
-              </w:numPr>
-            </w:pPr>
-            <w:hyperlink r:id="rId133">
+            <w:hyperlink r:id="rId152">
               <w:r>
                 <w:rPr>
                   <w:rStyle w:val="Hyperlink"/>
@@ -33052,10 +34221,10 @@
               <w:pStyle w:val="Compact"/>
               <w:numPr>
                 <w:ilvl w:val="0"/>
-                <w:numId w:val="1011"/>
+                <w:numId w:val="1020"/>
               </w:numPr>
             </w:pPr>
-            <w:hyperlink r:id="rId134">
+            <w:hyperlink r:id="rId153">
               <w:r>
                 <w:rPr>
                   <w:rStyle w:val="Hyperlink"/>
@@ -33064,30 +34233,13 @@
               </w:r>
             </w:hyperlink>
           </w:p>
-          <w:p>
-            <w:pPr>
-              <w:pStyle w:val="Compact"/>
-              <w:numPr>
-                <w:ilvl w:val="0"/>
-                <w:numId w:val="1011"/>
-              </w:numPr>
-            </w:pPr>
-            <w:hyperlink r:id="rId135">
-              <w:r>
-                <w:rPr>
-                  <w:rStyle w:val="Hyperlink"/>
-                </w:rPr>
-                <w:t xml:space="preserve">Numeric Integration with Python</w:t>
-              </w:r>
-            </w:hyperlink>
-          </w:p>
           <w:p/>
         </w:tc>
       </w:tr>
     </w:tbl>
-    <w:bookmarkEnd w:id="136"/>
-    <w:bookmarkEnd w:id="137"/>
-    <w:bookmarkStart w:id="164" w:name="sec-double-integrals"/>
+    <w:bookmarkEnd w:id="154"/>
+    <w:bookmarkEnd w:id="155"/>
+    <w:bookmarkStart w:id="182" w:name="sec-double-integrals"/>
     <w:p>
       <w:pPr>
         <w:pStyle w:val="Heading2"/>
@@ -33191,7 +34343,7 @@
       <w:r>
         <w:t xml:space="preserve"> </w:t>
       </w:r>
-      <w:hyperlink r:id="rId138">
+      <w:hyperlink r:id="rId156">
         <w:r>
           <w:rPr>
             <w:rStyle w:val="Hyperlink"/>
@@ -33222,7 +34374,7 @@
         <w:t xml:space="preserve">follow from a stated theorem rather than from an aside.</w:t>
       </w:r>
     </w:p>
-    <w:bookmarkStart w:id="139" w:name="def-double-integral"/>
+    <w:bookmarkStart w:id="157" w:name="def-double-integral"/>
     <w:p>
       <w:pPr>
         <w:pStyle w:val="BodyText"/>
@@ -33898,8 +35050,8 @@
         <w:t xml:space="preserve">(Larson and Edwards 2018, sec. 14.2)</w:t>
       </w:r>
     </w:p>
-    <w:bookmarkEnd w:id="139"/>
-    <w:bookmarkStart w:id="140" w:name="exm-double-integral-area"/>
+    <w:bookmarkEnd w:id="157"/>
+    <w:bookmarkStart w:id="158" w:name="exm-double-integral-area"/>
     <w:p>
       <w:pPr>
         <w:pStyle w:val="BodyText"/>
@@ -34189,8 +35341,8 @@
         <w:t xml:space="preserve">.</w:t>
       </w:r>
     </w:p>
-    <w:bookmarkEnd w:id="140"/>
-    <w:bookmarkStart w:id="141" w:name="def-iterated-integral"/>
+    <w:bookmarkEnd w:id="158"/>
+    <w:bookmarkStart w:id="159" w:name="def-iterated-integral"/>
     <w:p>
       <w:pPr>
         <w:pStyle w:val="BodyText"/>
@@ -34864,8 +36016,8 @@
         <w:t xml:space="preserve">swapped.</w:t>
       </w:r>
     </w:p>
-    <w:bookmarkEnd w:id="141"/>
-    <w:bookmarkStart w:id="142" w:name="exm-iterated-integral"/>
+    <w:bookmarkEnd w:id="159"/>
+    <w:bookmarkStart w:id="160" w:name="exm-iterated-integral"/>
     <w:p>
       <w:pPr>
         <w:pStyle w:val="BodyText"/>
@@ -35536,8 +36688,8 @@
         </m:oMath>
       </m:oMathPara>
     </w:p>
-    <w:bookmarkEnd w:id="142"/>
-    <w:bookmarkStart w:id="143" w:name="thm-fubini"/>
+    <w:bookmarkEnd w:id="160"/>
+    <w:bookmarkStart w:id="161" w:name="thm-fubini"/>
     <w:p>
       <w:pPr>
         <w:pStyle w:val="FirstParagraph"/>
@@ -35623,7 +36775,7 @@
       <w:pPr>
         <w:numPr>
           <w:ilvl w:val="0"/>
-          <w:numId w:val="1012"/>
+          <w:numId w:val="1021"/>
         </w:numPr>
       </w:pPr>
       <w:r>
@@ -36071,7 +37223,7 @@
       <w:pPr>
         <w:numPr>
           <w:ilvl w:val="0"/>
-          <w:numId w:val="1012"/>
+          <w:numId w:val="1021"/>
         </w:numPr>
       </w:pPr>
       <w:r>
@@ -36551,8 +37703,8 @@
         <w:t xml:space="preserve">(Larson and Edwards 2018, Theorem 14.2, p. 982)</w:t>
       </w:r>
     </w:p>
-    <w:bookmarkEnd w:id="143"/>
-    <w:bookmarkStart w:id="150" w:name="exm-fubini-nonrect"/>
+    <w:bookmarkEnd w:id="161"/>
+    <w:bookmarkStart w:id="168" w:name="exm-fubini-nonrect"/>
     <w:p>
       <w:pPr>
         <w:pStyle w:val="BodyText"/>
@@ -36653,7 +37805,7 @@
       <w:r>
         <w:t xml:space="preserve"> </w:t>
       </w:r>
-      <w:hyperlink r:id="rId113">
+      <w:hyperlink r:id="rId137">
         <w:r>
           <w:rPr>
             <w:rStyle w:val="Hyperlink"/>
@@ -36673,7 +37825,7 @@
       <w:r>
         <w:t xml:space="preserve"> </w:t>
       </w:r>
-      <w:hyperlink r:id="rId114">
+      <w:hyperlink r:id="rId138">
         <w:r>
           <w:rPr>
             <w:rStyle w:val="Hyperlink"/>
@@ -36894,7 +38046,7 @@
       <w:r>
         <w:t xml:space="preserve"> </w:t>
       </w:r>
-      <w:hyperlink r:id="rId144">
+      <w:hyperlink r:id="rId162">
         <w:r>
           <w:rPr>
             <w:rStyle w:val="Hyperlink"/>
@@ -37697,7 +38849,7 @@
       <w:tr>
         <w:tc>
           <w:tcPr/>
-          <w:bookmarkStart w:id="148" w:name="fig-fubini-nonrect-region"/>
+          <w:bookmarkStart w:id="166" w:name="fig-fubini-nonrect-region"/>
           <w:p>
             <w:pPr>
               <w:pStyle w:val="SourceCode"/>
@@ -39246,18 +40398,18 @@
                 <wp:inline>
                   <wp:extent cx="4620126" cy="3696101"/>
                   <wp:effectExtent b="0" l="0" r="0" t="0"/>
-                  <wp:docPr descr="" title="" id="146" name="Picture"/>
+                  <wp:docPr descr="" title="" id="164" name="Picture"/>
                   <a:graphic>
                     <a:graphicData uri="http://schemas.openxmlformats.org/drawingml/2006/picture">
                       <pic:pic>
                         <pic:nvPicPr>
-                          <pic:cNvPr descr="calculus_files/figure-docx/unnamed-chunk-5-1.png" id="147" name="Picture"/>
+                          <pic:cNvPr descr="calculus_files/figure-docx/unnamed-chunk-5-1.png" id="165" name="Picture"/>
                           <pic:cNvPicPr>
                             <a:picLocks noChangeArrowheads="1" noChangeAspect="1"/>
                           </pic:cNvPicPr>
                         </pic:nvPicPr>
                         <pic:blipFill>
-                          <a:blip r:embed="rId145"/>
+                          <a:blip r:embed="rId163"/>
                           <a:stretch>
                             <a:fillRect/>
                           </a:stretch>
@@ -39497,7 +40649,7 @@
               <w:t xml:space="preserve">.</w:t>
             </w:r>
           </w:p>
-          <w:bookmarkEnd w:id="148"/>
+          <w:bookmarkEnd w:id="166"/>
         </w:tc>
       </w:tr>
     </w:tbl>
@@ -41854,7 +43006,7 @@
       <w:tr>
         <w:tc>
           <w:tcPr/>
-          <w:bookmarkStart w:id="149" w:name="fig-fubini-nonrect"/>
+          <w:bookmarkStart w:id="167" w:name="fig-fubini-nonrect"/>
           <w:p>
             <w:pPr>
               <w:pStyle w:val="Compact"/>
@@ -42201,12 +43353,12 @@
               <w:t xml:space="preserve">.</w:t>
             </w:r>
           </w:p>
-          <w:bookmarkEnd w:id="149"/>
+          <w:bookmarkEnd w:id="167"/>
         </w:tc>
       </w:tr>
     </w:tbl>
-    <w:bookmarkEnd w:id="150"/>
-    <w:bookmarkStart w:id="152" w:name="exm-fubini-fail"/>
+    <w:bookmarkEnd w:id="168"/>
+    <w:bookmarkStart w:id="170" w:name="exm-fubini-fail"/>
     <w:p>
       <w:pPr>
         <w:pStyle w:val="BodyText"/>
@@ -44266,7 +45418,7 @@
       <w:tr>
         <w:tc>
           <w:tcPr/>
-          <w:bookmarkStart w:id="151" w:name="fig-fubini-fail"/>
+          <w:bookmarkStart w:id="169" w:name="fig-fubini-fail"/>
           <w:p>
             <w:pPr>
               <w:pStyle w:val="Compact"/>
@@ -44818,12 +45970,12 @@
               <w:t xml:space="preserve">does not apply.</w:t>
             </w:r>
           </w:p>
-          <w:bookmarkEnd w:id="151"/>
+          <w:bookmarkEnd w:id="169"/>
         </w:tc>
       </w:tr>
     </w:tbl>
-    <w:bookmarkEnd w:id="152"/>
-    <w:bookmarkStart w:id="153" w:name="cor-fubini-rect"/>
+    <w:bookmarkEnd w:id="170"/>
+    <w:bookmarkStart w:id="171" w:name="cor-fubini-rect"/>
     <w:p>
       <w:pPr>
         <w:pStyle w:val="BodyText"/>
@@ -45396,7 +46548,7 @@
         <w:t xml:space="preserve">(Larson and Edwards 2018, Theorem 14.2, p. 982)</w:t>
       </w:r>
     </w:p>
-    <w:bookmarkEnd w:id="153"/>
+    <w:bookmarkEnd w:id="171"/>
     <w:p>
       <w:pPr>
         <w:pStyle w:val="BodyText"/>
@@ -45651,7 +46803,7 @@
         <w:t xml:space="preserve">two iterated forms shown.</w:t>
       </w:r>
     </w:p>
-    <w:bookmarkStart w:id="159" w:name="exm-fubini-rect"/>
+    <w:bookmarkStart w:id="177" w:name="exm-fubini-rect"/>
     <w:p>
       <w:pPr>
         <w:pStyle w:val="BodyText"/>
@@ -45930,7 +47082,7 @@
       <w:r>
         <w:t xml:space="preserve"> </w:t>
       </w:r>
-      <w:hyperlink r:id="rId113">
+      <w:hyperlink r:id="rId137">
         <w:r>
           <w:rPr>
             <w:rStyle w:val="Hyperlink"/>
@@ -45950,7 +47102,7 @@
       <w:r>
         <w:t xml:space="preserve"> </w:t>
       </w:r>
-      <w:hyperlink r:id="rId114">
+      <w:hyperlink r:id="rId138">
         <w:r>
           <w:rPr>
             <w:rStyle w:val="Hyperlink"/>
@@ -46239,7 +47391,7 @@
       <w:r>
         <w:t xml:space="preserve"> </w:t>
       </w:r>
-      <w:hyperlink r:id="rId144">
+      <w:hyperlink r:id="rId162">
         <w:r>
           <w:rPr>
             <w:rStyle w:val="Hyperlink"/>
@@ -46530,7 +47682,7 @@
       <w:tr>
         <w:tc>
           <w:tcPr/>
-          <w:bookmarkStart w:id="157" w:name="fig-fubini-rect-region"/>
+          <w:bookmarkStart w:id="175" w:name="fig-fubini-rect-region"/>
           <w:p>
             <w:pPr>
               <w:pStyle w:val="SourceCode"/>
@@ -47422,18 +48574,18 @@
                 <wp:inline>
                   <wp:extent cx="4620126" cy="3696101"/>
                   <wp:effectExtent b="0" l="0" r="0" t="0"/>
-                  <wp:docPr descr="" title="" id="155" name="Picture"/>
+                  <wp:docPr descr="" title="" id="173" name="Picture"/>
                   <a:graphic>
                     <a:graphicData uri="http://schemas.openxmlformats.org/drawingml/2006/picture">
                       <pic:pic>
                         <pic:nvPicPr>
-                          <pic:cNvPr descr="calculus_files/figure-docx/unnamed-chunk-10-1.png" id="156" name="Picture"/>
+                          <pic:cNvPr descr="calculus_files/figure-docx/unnamed-chunk-10-1.png" id="174" name="Picture"/>
                           <pic:cNvPicPr>
                             <a:picLocks noChangeArrowheads="1" noChangeAspect="1"/>
                           </pic:cNvPicPr>
                         </pic:nvPicPr>
                         <pic:blipFill>
-                          <a:blip r:embed="rId154"/>
+                          <a:blip r:embed="rId172"/>
                           <a:stretch>
                             <a:fillRect/>
                           </a:stretch>
@@ -47523,7 +48675,7 @@
               <w:t xml:space="preserve">, the unit square.</w:t>
             </w:r>
           </w:p>
-          <w:bookmarkEnd w:id="157"/>
+          <w:bookmarkEnd w:id="175"/>
         </w:tc>
       </w:tr>
     </w:tbl>
@@ -49155,7 +50307,7 @@
       <w:tr>
         <w:tc>
           <w:tcPr/>
-          <w:bookmarkStart w:id="158" w:name="fig-fubini-rect"/>
+          <w:bookmarkStart w:id="176" w:name="fig-fubini-rect"/>
           <w:p>
             <w:pPr>
               <w:pStyle w:val="Compact"/>
@@ -49379,12 +50531,12 @@
               <w:t xml:space="preserve">.</w:t>
             </w:r>
           </w:p>
-          <w:bookmarkEnd w:id="158"/>
+          <w:bookmarkEnd w:id="176"/>
         </w:tc>
       </w:tr>
     </w:tbl>
-    <w:bookmarkEnd w:id="159"/>
-    <w:bookmarkStart w:id="160" w:name="thm-fubini-tonelli"/>
+    <w:bookmarkEnd w:id="177"/>
+    <w:bookmarkStart w:id="178" w:name="thm-fubini-tonelli"/>
     <w:p>
       <w:pPr>
         <w:pStyle w:val="BodyText"/>
@@ -49728,7 +50880,7 @@
       <w:pPr>
         <w:numPr>
           <w:ilvl w:val="0"/>
-          <w:numId w:val="1013"/>
+          <w:numId w:val="1022"/>
         </w:numPr>
       </w:pPr>
       <m:oMath>
@@ -49807,7 +50959,7 @@
       <w:pPr>
         <w:numPr>
           <w:ilvl w:val="0"/>
-          <w:numId w:val="1013"/>
+          <w:numId w:val="1022"/>
         </w:numPr>
       </w:pPr>
       <m:oMath>
@@ -50547,8 +51699,8 @@
         <w:t xml:space="preserve">(Billingsley 1995, Theorem 18.3; Gut 2013, Theorem 9.1, p. 65; Fubini 1907; Wikipedia contributors 2024)</w:t>
       </w:r>
     </w:p>
-    <w:bookmarkEnd w:id="160"/>
-    <w:bookmarkStart w:id="161" w:name="rem-fubini-tonelli-probability"/>
+    <w:bookmarkEnd w:id="178"/>
+    <w:bookmarkStart w:id="179" w:name="rem-fubini-tonelli-probability"/>
     <w:p>
       <w:pPr>
         <w:pStyle w:val="BodyText"/>
@@ -50575,7 +51727,7 @@
       <w:r>
         <w:t xml:space="preserve"> </w:t>
       </w:r>
-      <w:hyperlink r:id="rId138">
+      <w:hyperlink r:id="rId156">
         <w:r>
           <w:rPr>
             <w:rStyle w:val="Hyperlink"/>
@@ -50853,8 +52005,8 @@
         <w:t xml:space="preserve">-finiteness alone does not make the iterated integrals agree.</w:t>
       </w:r>
     </w:p>
-    <w:bookmarkEnd w:id="161"/>
-    <w:bookmarkStart w:id="162" w:name="exm-fubini-tonelli-apply"/>
+    <w:bookmarkEnd w:id="179"/>
+    <w:bookmarkStart w:id="180" w:name="exm-fubini-tonelli-apply"/>
     <w:p>
       <w:pPr>
         <w:pStyle w:val="BodyText"/>
@@ -50953,7 +52105,7 @@
       <w:r>
         <w:t xml:space="preserve"> </w:t>
       </w:r>
-      <w:hyperlink r:id="rId113">
+      <w:hyperlink r:id="rId137">
         <w:r>
           <w:rPr>
             <w:rStyle w:val="Hyperlink"/>
@@ -50973,7 +52125,7 @@
       <w:r>
         <w:t xml:space="preserve"> </w:t>
       </w:r>
-      <w:hyperlink r:id="rId114">
+      <w:hyperlink r:id="rId138">
         <w:r>
           <w:rPr>
             <w:rStyle w:val="Hyperlink"/>
@@ -53962,8 +55114,8 @@
         <w:t xml:space="preserve">guarantees when condition (a) holds.</w:t>
       </w:r>
     </w:p>
-    <w:bookmarkEnd w:id="162"/>
-    <w:bookmarkStart w:id="163" w:name="exm-fubini-fail-tonelli"/>
+    <w:bookmarkEnd w:id="180"/>
+    <w:bookmarkStart w:id="181" w:name="exm-fubini-fail-tonelli"/>
     <w:p>
       <w:pPr>
         <w:pStyle w:val="BodyText"/>
@@ -55098,9 +56250,9 @@
         <w:t xml:space="preserve">(Wikipedia contributors 2024)</w:t>
       </w:r>
     </w:p>
-    <w:bookmarkEnd w:id="163"/>
-    <w:bookmarkEnd w:id="164"/>
-    <w:bookmarkStart w:id="167" w:name="sec-additional-resources"/>
+    <w:bookmarkEnd w:id="181"/>
+    <w:bookmarkEnd w:id="182"/>
+    <w:bookmarkStart w:id="185" w:name="sec-additional-resources"/>
     <w:p>
       <w:pPr>
         <w:pStyle w:val="Heading2"/>
@@ -55114,7 +56266,7 @@
         <w:pStyle w:val="Compact"/>
         <w:numPr>
           <w:ilvl w:val="0"/>
-          <w:numId w:val="1014"/>
+          <w:numId w:val="1023"/>
         </w:numPr>
       </w:pPr>
       <w:r>
@@ -55126,7 +56278,7 @@
         <w:pStyle w:val="Compact"/>
         <w:numPr>
           <w:ilvl w:val="0"/>
-          <w:numId w:val="1014"/>
+          <w:numId w:val="1023"/>
         </w:numPr>
       </w:pPr>
       <w:r>
@@ -55138,7 +56290,7 @@
         <w:pStyle w:val="Compact"/>
         <w:numPr>
           <w:ilvl w:val="0"/>
-          <w:numId w:val="1014"/>
+          <w:numId w:val="1023"/>
         </w:numPr>
       </w:pPr>
       <w:r>
@@ -55150,7 +56302,7 @@
         <w:pStyle w:val="Compact"/>
         <w:numPr>
           <w:ilvl w:val="0"/>
-          <w:numId w:val="1014"/>
+          <w:numId w:val="1023"/>
         </w:numPr>
       </w:pPr>
       <w:r>
@@ -55162,7 +56314,7 @@
         <w:pStyle w:val="Compact"/>
         <w:numPr>
           <w:ilvl w:val="0"/>
-          <w:numId w:val="1014"/>
+          <w:numId w:val="1023"/>
         </w:numPr>
       </w:pPr>
       <w:r>
@@ -55174,10 +56326,10 @@
         <w:pStyle w:val="Compact"/>
         <w:numPr>
           <w:ilvl w:val="1"/>
-          <w:numId w:val="1015"/>
+          <w:numId w:val="1024"/>
         </w:numPr>
       </w:pPr>
-      <w:hyperlink r:id="rId165">
+      <w:hyperlink r:id="rId183">
         <w:r>
           <w:rPr>
             <w:rStyle w:val="Hyperlink"/>
@@ -55191,10 +56343,10 @@
         <w:pStyle w:val="Compact"/>
         <w:numPr>
           <w:ilvl w:val="1"/>
-          <w:numId w:val="1015"/>
+          <w:numId w:val="1024"/>
         </w:numPr>
       </w:pPr>
-      <w:hyperlink r:id="rId166">
+      <w:hyperlink r:id="rId184">
         <w:r>
           <w:rPr>
             <w:rStyle w:val="Hyperlink"/>
@@ -55208,7 +56360,7 @@
         <w:pStyle w:val="Compact"/>
         <w:numPr>
           <w:ilvl w:val="0"/>
-          <w:numId w:val="1014"/>
+          <w:numId w:val="1023"/>
         </w:numPr>
       </w:pPr>
       <w:r>
@@ -55221,8 +56373,8 @@
         <w:t xml:space="preserve">(the rigorous foundations behind these results)</w:t>
       </w:r>
     </w:p>
-    <w:bookmarkEnd w:id="167"/>
-    <w:bookmarkStart w:id="190" w:name="references"/>
+    <w:bookmarkEnd w:id="185"/>
+    <w:bookmarkStart w:id="208" w:name="references"/>
     <w:p>
       <w:pPr>
         <w:pStyle w:val="Heading2"/>
@@ -55231,8 +56383,8 @@
         <w:t xml:space="preserve">References</w:t>
       </w:r>
     </w:p>
-    <w:bookmarkStart w:id="189" w:name="refs"/>
-    <w:bookmarkStart w:id="169" w:name="ref-calclifesaver"/>
+    <w:bookmarkStart w:id="207" w:name="refs"/>
+    <w:bookmarkStart w:id="187" w:name="ref-calclifesaver"/>
     <w:p>
       <w:pPr>
         <w:pStyle w:val="Bibliography"/>
@@ -55256,7 +56408,7 @@
       <w:r>
         <w:t xml:space="preserve"> </w:t>
       </w:r>
-      <w:hyperlink r:id="rId168">
+      <w:hyperlink r:id="rId186">
         <w:r>
           <w:rPr>
             <w:rStyle w:val="Hyperlink"/>
@@ -55268,8 +56420,8 @@
         <w:t xml:space="preserve">.</w:t>
       </w:r>
     </w:p>
-    <w:bookmarkEnd w:id="169"/>
-    <w:bookmarkStart w:id="170" w:name="ref-billingsley1995probability"/>
+    <w:bookmarkEnd w:id="187"/>
+    <w:bookmarkStart w:id="188" w:name="ref-billingsley1995probability"/>
     <w:p>
       <w:pPr>
         <w:pStyle w:val="Bibliography"/>
@@ -55291,8 +56443,8 @@
         <w:t xml:space="preserve">. 3rd ed. Wiley Series in Probability and Mathematical Statistics. Wiley.</w:t>
       </w:r>
     </w:p>
-    <w:bookmarkEnd w:id="170"/>
-    <w:bookmarkStart w:id="171" w:name="ref-fubini1907"/>
+    <w:bookmarkEnd w:id="188"/>
+    <w:bookmarkStart w:id="189" w:name="ref-fubini1907"/>
     <w:p>
       <w:pPr>
         <w:pStyle w:val="Bibliography"/>
@@ -55323,8 +56475,8 @@
         <w:t xml:space="preserve">16: 608–14.</w:t>
       </w:r>
     </w:p>
-    <w:bookmarkEnd w:id="171"/>
-    <w:bookmarkStart w:id="173" w:name="ref-realanalysislifesaver"/>
+    <w:bookmarkEnd w:id="189"/>
+    <w:bookmarkStart w:id="191" w:name="ref-realanalysislifesaver"/>
     <w:p>
       <w:pPr>
         <w:pStyle w:val="Bibliography"/>
@@ -55348,7 +56500,7 @@
       <w:r>
         <w:t xml:space="preserve"> </w:t>
       </w:r>
-      <w:hyperlink r:id="rId172">
+      <w:hyperlink r:id="rId190">
         <w:r>
           <w:rPr>
             <w:rStyle w:val="Hyperlink"/>
@@ -55360,8 +56512,8 @@
         <w:t xml:space="preserve">.</w:t>
       </w:r>
     </w:p>
-    <w:bookmarkEnd w:id="173"/>
-    <w:bookmarkStart w:id="175" w:name="ref-gut2013"/>
+    <w:bookmarkEnd w:id="191"/>
+    <w:bookmarkStart w:id="193" w:name="ref-gut2013"/>
     <w:p>
       <w:pPr>
         <w:pStyle w:val="Bibliography"/>
@@ -55385,7 +56537,7 @@
       <w:r>
         <w:t xml:space="preserve"> </w:t>
       </w:r>
-      <w:hyperlink r:id="rId174">
+      <w:hyperlink r:id="rId192">
         <w:r>
           <w:rPr>
             <w:rStyle w:val="Hyperlink"/>
@@ -55397,8 +56549,8 @@
         <w:t xml:space="preserve">.</w:t>
       </w:r>
     </w:p>
-    <w:bookmarkEnd w:id="175"/>
-    <w:bookmarkStart w:id="177" w:name="ref-mosaiccalc"/>
+    <w:bookmarkEnd w:id="193"/>
+    <w:bookmarkStart w:id="195" w:name="ref-mosaiccalc"/>
     <w:p>
       <w:pPr>
         <w:pStyle w:val="Bibliography"/>
@@ -55422,7 +56574,7 @@
       <w:r>
         <w:t xml:space="preserve"> </w:t>
       </w:r>
-      <w:hyperlink r:id="rId176">
+      <w:hyperlink r:id="rId194">
         <w:r>
           <w:rPr>
             <w:rStyle w:val="Hyperlink"/>
@@ -55434,8 +56586,8 @@
         <w:t xml:space="preserve">.</w:t>
       </w:r>
     </w:p>
-    <w:bookmarkEnd w:id="177"/>
-    <w:bookmarkStart w:id="179" w:name="ref-khuri2003advanced"/>
+    <w:bookmarkEnd w:id="195"/>
+    <w:bookmarkStart w:id="197" w:name="ref-khuri2003advanced"/>
     <w:p>
       <w:pPr>
         <w:pStyle w:val="Bibliography"/>
@@ -55459,7 +56611,7 @@
       <w:r>
         <w:t xml:space="preserve"> </w:t>
       </w:r>
-      <w:hyperlink r:id="rId178">
+      <w:hyperlink r:id="rId196">
         <w:r>
           <w:rPr>
             <w:rStyle w:val="Hyperlink"/>
@@ -55471,8 +56623,8 @@
         <w:t xml:space="preserve">.</w:t>
       </w:r>
     </w:p>
-    <w:bookmarkEnd w:id="179"/>
-    <w:bookmarkStart w:id="181" w:name="ref-kleinbaum2012survival"/>
+    <w:bookmarkEnd w:id="197"/>
+    <w:bookmarkStart w:id="199" w:name="ref-kleinbaum2012survival"/>
     <w:p>
       <w:pPr>
         <w:pStyle w:val="Bibliography"/>
@@ -55496,7 +56648,7 @@
       <w:r>
         <w:t xml:space="preserve"> </w:t>
       </w:r>
-      <w:hyperlink r:id="rId180">
+      <w:hyperlink r:id="rId198">
         <w:r>
           <w:rPr>
             <w:rStyle w:val="Hyperlink"/>
@@ -55508,8 +56660,8 @@
         <w:t xml:space="preserve">.</w:t>
       </w:r>
     </w:p>
-    <w:bookmarkEnd w:id="181"/>
-    <w:bookmarkStart w:id="183" w:name="ref-larsonCalc11e"/>
+    <w:bookmarkEnd w:id="199"/>
+    <w:bookmarkStart w:id="201" w:name="ref-larsonCalc11e"/>
     <w:p>
       <w:pPr>
         <w:pStyle w:val="Bibliography"/>
@@ -55533,7 +56685,7 @@
       <w:r>
         <w:t xml:space="preserve"> </w:t>
       </w:r>
-      <w:hyperlink r:id="rId182">
+      <w:hyperlink r:id="rId200">
         <w:r>
           <w:rPr>
             <w:rStyle w:val="Hyperlink"/>
@@ -55545,8 +56697,8 @@
         <w:t xml:space="preserve">.</w:t>
       </w:r>
     </w:p>
-    <w:bookmarkEnd w:id="183"/>
-    <w:bookmarkStart w:id="185" w:name="ref-problifesavercalc"/>
+    <w:bookmarkEnd w:id="201"/>
+    <w:bookmarkStart w:id="203" w:name="ref-problifesavercalc"/>
     <w:p>
       <w:pPr>
         <w:pStyle w:val="Bibliography"/>
@@ -55570,7 +56722,7 @@
       <w:r>
         <w:t xml:space="preserve"> </w:t>
       </w:r>
-      <w:hyperlink r:id="rId184">
+      <w:hyperlink r:id="rId202">
         <w:r>
           <w:rPr>
             <w:rStyle w:val="Hyperlink"/>
@@ -55582,8 +56734,8 @@
         <w:t xml:space="preserve">.</w:t>
       </w:r>
     </w:p>
-    <w:bookmarkEnd w:id="185"/>
-    <w:bookmarkStart w:id="186" w:name="ref-rudin1976principles"/>
+    <w:bookmarkEnd w:id="203"/>
+    <w:bookmarkStart w:id="204" w:name="ref-rudin1976principles"/>
     <w:p>
       <w:pPr>
         <w:pStyle w:val="Bibliography"/>
@@ -55605,8 +56757,8 @@
         <w:t xml:space="preserve">. 3rd ed. International Series in Pure and Applied Mathematics. McGraw-Hill.</w:t>
       </w:r>
     </w:p>
-    <w:bookmarkEnd w:id="186"/>
-    <w:bookmarkStart w:id="188" w:name="ref-wp:fubini"/>
+    <w:bookmarkEnd w:id="204"/>
+    <w:bookmarkStart w:id="206" w:name="ref-wp:fubini"/>
     <w:p>
       <w:pPr>
         <w:pStyle w:val="Bibliography"/>
@@ -55665,7 +56817,7 @@
       <w:r>
         <w:t xml:space="preserve"> </w:t>
       </w:r>
-      <w:hyperlink r:id="rId187">
+      <w:hyperlink r:id="rId205">
         <w:r>
           <w:rPr>
             <w:rStyle w:val="Hyperlink"/>
@@ -55677,9 +56829,9 @@
         <w:t xml:space="preserve">.</w:t>
       </w:r>
     </w:p>
-    <w:bookmarkEnd w:id="188"/>
-    <w:bookmarkEnd w:id="189"/>
-    <w:bookmarkEnd w:id="190"/>
+    <w:bookmarkEnd w:id="206"/>
+    <w:bookmarkEnd w:id="207"/>
+    <w:bookmarkEnd w:id="208"/>
     <w:sectPr>
       <w:footnotePr>
         <w:numRestart w:val="eachSect"/>
@@ -56070,34 +57222,7 @@
     <w:abstractNumId w:val="991"/>
   </w:num>
   <w:num w:numId="1002">
-    <w:abstractNumId w:val="99411"/>
-    <w:lvlOverride w:ilvl="0">
-      <w:startOverride w:val="1"/>
-    </w:lvlOverride>
-    <w:lvlOverride w:ilvl="1">
-      <w:startOverride w:val="1"/>
-    </w:lvlOverride>
-    <w:lvlOverride w:ilvl="2">
-      <w:startOverride w:val="1"/>
-    </w:lvlOverride>
-    <w:lvlOverride w:ilvl="3">
-      <w:startOverride w:val="1"/>
-    </w:lvlOverride>
-    <w:lvlOverride w:ilvl="4">
-      <w:startOverride w:val="1"/>
-    </w:lvlOverride>
-    <w:lvlOverride w:ilvl="5">
-      <w:startOverride w:val="1"/>
-    </w:lvlOverride>
-    <w:lvlOverride w:ilvl="6">
-      <w:startOverride w:val="1"/>
-    </w:lvlOverride>
-    <w:lvlOverride w:ilvl="7">
-      <w:startOverride w:val="1"/>
-    </w:lvlOverride>
-    <w:lvlOverride w:ilvl="8">
-      <w:startOverride w:val="1"/>
-    </w:lvlOverride>
+    <w:abstractNumId w:val="991"/>
   </w:num>
   <w:num w:numId="1003">
     <w:abstractNumId w:val="991"/>
@@ -56109,34 +57234,7 @@
     <w:abstractNumId w:val="991"/>
   </w:num>
   <w:num w:numId="1006">
-    <w:abstractNumId w:val="99411"/>
-    <w:lvlOverride w:ilvl="0">
-      <w:startOverride w:val="1"/>
-    </w:lvlOverride>
-    <w:lvlOverride w:ilvl="1">
-      <w:startOverride w:val="1"/>
-    </w:lvlOverride>
-    <w:lvlOverride w:ilvl="2">
-      <w:startOverride w:val="1"/>
-    </w:lvlOverride>
-    <w:lvlOverride w:ilvl="3">
-      <w:startOverride w:val="1"/>
-    </w:lvlOverride>
-    <w:lvlOverride w:ilvl="4">
-      <w:startOverride w:val="1"/>
-    </w:lvlOverride>
-    <w:lvlOverride w:ilvl="5">
-      <w:startOverride w:val="1"/>
-    </w:lvlOverride>
-    <w:lvlOverride w:ilvl="6">
-      <w:startOverride w:val="1"/>
-    </w:lvlOverride>
-    <w:lvlOverride w:ilvl="7">
-      <w:startOverride w:val="1"/>
-    </w:lvlOverride>
-    <w:lvlOverride w:ilvl="8">
-      <w:startOverride w:val="1"/>
-    </w:lvlOverride>
+    <w:abstractNumId w:val="991"/>
   </w:num>
   <w:num w:numId="1007">
     <w:abstractNumId w:val="991"/>
@@ -56181,6 +57279,12 @@
     <w:abstractNumId w:val="991"/>
   </w:num>
   <w:num w:numId="1012">
+    <w:abstractNumId w:val="991"/>
+  </w:num>
+  <w:num w:numId="1013">
+    <w:abstractNumId w:val="991"/>
+  </w:num>
+  <w:num w:numId="1014">
     <w:abstractNumId w:val="99411"/>
     <w:lvlOverride w:ilvl="0">
       <w:startOverride w:val="1"/>
@@ -56210,7 +57314,82 @@
       <w:startOverride w:val="1"/>
     </w:lvlOverride>
   </w:num>
-  <w:num w:numId="1013">
+  <w:num w:numId="1015">
+    <w:abstractNumId w:val="991"/>
+  </w:num>
+  <w:num w:numId="1016">
+    <w:abstractNumId w:val="99411"/>
+    <w:lvlOverride w:ilvl="0">
+      <w:startOverride w:val="1"/>
+    </w:lvlOverride>
+    <w:lvlOverride w:ilvl="1">
+      <w:startOverride w:val="1"/>
+    </w:lvlOverride>
+    <w:lvlOverride w:ilvl="2">
+      <w:startOverride w:val="1"/>
+    </w:lvlOverride>
+    <w:lvlOverride w:ilvl="3">
+      <w:startOverride w:val="1"/>
+    </w:lvlOverride>
+    <w:lvlOverride w:ilvl="4">
+      <w:startOverride w:val="1"/>
+    </w:lvlOverride>
+    <w:lvlOverride w:ilvl="5">
+      <w:startOverride w:val="1"/>
+    </w:lvlOverride>
+    <w:lvlOverride w:ilvl="6">
+      <w:startOverride w:val="1"/>
+    </w:lvlOverride>
+    <w:lvlOverride w:ilvl="7">
+      <w:startOverride w:val="1"/>
+    </w:lvlOverride>
+    <w:lvlOverride w:ilvl="8">
+      <w:startOverride w:val="1"/>
+    </w:lvlOverride>
+  </w:num>
+  <w:num w:numId="1017">
+    <w:abstractNumId w:val="991"/>
+  </w:num>
+  <w:num w:numId="1018">
+    <w:abstractNumId w:val="991"/>
+  </w:num>
+  <w:num w:numId="1019">
+    <w:abstractNumId w:val="991"/>
+  </w:num>
+  <w:num w:numId="1020">
+    <w:abstractNumId w:val="991"/>
+  </w:num>
+  <w:num w:numId="1021">
+    <w:abstractNumId w:val="99411"/>
+    <w:lvlOverride w:ilvl="0">
+      <w:startOverride w:val="1"/>
+    </w:lvlOverride>
+    <w:lvlOverride w:ilvl="1">
+      <w:startOverride w:val="1"/>
+    </w:lvlOverride>
+    <w:lvlOverride w:ilvl="2">
+      <w:startOverride w:val="1"/>
+    </w:lvlOverride>
+    <w:lvlOverride w:ilvl="3">
+      <w:startOverride w:val="1"/>
+    </w:lvlOverride>
+    <w:lvlOverride w:ilvl="4">
+      <w:startOverride w:val="1"/>
+    </w:lvlOverride>
+    <w:lvlOverride w:ilvl="5">
+      <w:startOverride w:val="1"/>
+    </w:lvlOverride>
+    <w:lvlOverride w:ilvl="6">
+      <w:startOverride w:val="1"/>
+    </w:lvlOverride>
+    <w:lvlOverride w:ilvl="7">
+      <w:startOverride w:val="1"/>
+    </w:lvlOverride>
+    <w:lvlOverride w:ilvl="8">
+      <w:startOverride w:val="1"/>
+    </w:lvlOverride>
+  </w:num>
+  <w:num w:numId="1022">
     <w:abstractNumId w:val="99731"/>
     <w:lvlOverride w:ilvl="0">
       <w:startOverride w:val="1"/>
@@ -56240,10 +57419,10 @@
       <w:startOverride w:val="1"/>
     </w:lvlOverride>
   </w:num>
-  <w:num w:numId="1014">
+  <w:num w:numId="1023">
     <w:abstractNumId w:val="991"/>
   </w:num>
-  <w:num w:numId="1015">
+  <w:num w:numId="1024">
     <w:abstractNumId w:val="991"/>
   </w:num>
 </w:numbering>

</xml_diff>

<commit_message>
Deploying to gh-pages from @ Morrison-Lab/mds@ada845aadb6e3e620ceb535a2a687c4f3d7b6dc3 🚀
</commit_message>
<xml_diff>
--- a/calculus.docx
+++ b/calculus.docx
@@ -15,7 +15,7 @@
         <w:pStyle w:val="Date"/>
       </w:pPr>
       <w:r>
-        <w:t xml:space="preserve">Last modified: 2026-10-05 21:31:10 (PDT)</w:t>
+        <w:t xml:space="preserve">Last modified: 2026-10-05 21:42:33 (PDT)</w:t>
       </w:r>
     </w:p>
     <w:bookmarkStart w:id="75" w:name="sec-derivatives"/>
@@ -38363,7 +38363,7 @@
     </w:tbl>
     <w:bookmarkEnd w:id="179"/>
     <w:bookmarkEnd w:id="180"/>
-    <w:bookmarkStart w:id="208" w:name="sec-double-integrals"/>
+    <w:bookmarkStart w:id="219" w:name="sec-double-integrals"/>
     <w:p>
       <w:pPr>
         <w:pStyle w:val="Heading2"/>
@@ -38439,13 +38439,24 @@
       <w:r>
         <w:t xml:space="preserve"> </w:t>
       </w:r>
-      <m:oMath>
-        <m:r>
-          <m:t>σ</m:t>
-        </m:r>
-      </m:oMath>
-      <w:r>
-        <w:t xml:space="preserve">-finite measure-theoretic version (</w:t>
+      <w:hyperlink r:id="rId181">
+        <m:oMath>
+          <m:r>
+            <m:t>σ</m:t>
+          </m:r>
+        </m:oMath>
+        <w:r>
+          <w:rPr>
+            <w:rStyle w:val="Hyperlink"/>
+          </w:rPr>
+          <w:t xml:space="preserve">-finite</w:t>
+        </w:r>
+      </w:hyperlink>
+      <w:r>
+        <w:t xml:space="preserve"> </w:t>
+      </w:r>
+      <w:r>
+        <w:t xml:space="preserve">measure-theoretic version (</w:t>
       </w:r>
       <w:hyperlink w:anchor="thm-fubini-tonelli">
         <w:r>
@@ -38467,7 +38478,7 @@
       <w:r>
         <w:t xml:space="preserve"> </w:t>
       </w:r>
-      <w:hyperlink r:id="rId181">
+      <w:hyperlink r:id="rId182">
         <w:r>
           <w:rPr>
             <w:rStyle w:val="Hyperlink"/>
@@ -38498,7 +38509,7 @@
         <w:t xml:space="preserve">follow from a stated theorem rather than from an aside.</w:t>
       </w:r>
     </w:p>
-    <w:bookmarkStart w:id="182" w:name="def-double-integral"/>
+    <w:bookmarkStart w:id="183" w:name="def-double-integral"/>
     <w:p>
       <w:pPr>
         <w:pStyle w:val="BodyText"/>
@@ -39174,8 +39185,8 @@
         <w:t xml:space="preserve">(Larson and Edwards 2018, sec. 14.2)</w:t>
       </w:r>
     </w:p>
-    <w:bookmarkEnd w:id="182"/>
-    <w:bookmarkStart w:id="183" w:name="exm-double-integral-area"/>
+    <w:bookmarkEnd w:id="183"/>
+    <w:bookmarkStart w:id="184" w:name="exm-double-integral-area"/>
     <w:p>
       <w:pPr>
         <w:pStyle w:val="BodyText"/>
@@ -39465,8 +39476,8 @@
         <w:t xml:space="preserve">.</w:t>
       </w:r>
     </w:p>
-    <w:bookmarkEnd w:id="183"/>
-    <w:bookmarkStart w:id="184" w:name="def-iterated-integral"/>
+    <w:bookmarkEnd w:id="184"/>
+    <w:bookmarkStart w:id="185" w:name="def-iterated-integral"/>
     <w:p>
       <w:pPr>
         <w:pStyle w:val="BodyText"/>
@@ -40140,8 +40151,8 @@
         <w:t xml:space="preserve">swapped.</w:t>
       </w:r>
     </w:p>
-    <w:bookmarkEnd w:id="184"/>
-    <w:bookmarkStart w:id="185" w:name="exm-iterated-integral"/>
+    <w:bookmarkEnd w:id="185"/>
+    <w:bookmarkStart w:id="186" w:name="exm-iterated-integral"/>
     <w:p>
       <w:pPr>
         <w:pStyle w:val="BodyText"/>
@@ -40812,8 +40823,8 @@
         </m:oMath>
       </m:oMathPara>
     </w:p>
-    <w:bookmarkEnd w:id="185"/>
-    <w:bookmarkStart w:id="186" w:name="thm-fubini"/>
+    <w:bookmarkEnd w:id="186"/>
+    <w:bookmarkStart w:id="187" w:name="thm-fubini"/>
     <w:p>
       <w:pPr>
         <w:pStyle w:val="FirstParagraph"/>
@@ -41827,8 +41838,8 @@
         <w:t xml:space="preserve">(Larson and Edwards 2018, Theorem 14.2, p. 982)</w:t>
       </w:r>
     </w:p>
-    <w:bookmarkEnd w:id="186"/>
-    <w:bookmarkStart w:id="194" w:name="exm-fubini-nonrect"/>
+    <w:bookmarkEnd w:id="187"/>
+    <w:bookmarkStart w:id="195" w:name="exm-fubini-nonrect"/>
     <w:p>
       <w:pPr>
         <w:pStyle w:val="BodyText"/>
@@ -42184,7 +42195,7 @@
       <w:r>
         <w:t xml:space="preserve"> </w:t>
       </w:r>
-      <w:hyperlink r:id="rId187">
+      <w:hyperlink r:id="rId188">
         <w:r>
           <w:rPr>
             <w:rStyle w:val="Hyperlink"/>
@@ -42204,7 +42215,7 @@
       <w:r>
         <w:t xml:space="preserve"> </w:t>
       </w:r>
-      <w:hyperlink r:id="rId188">
+      <w:hyperlink r:id="rId189">
         <w:r>
           <w:rPr>
             <w:rStyle w:val="Hyperlink"/>
@@ -43007,7 +43018,7 @@
       <w:tr>
         <w:tc>
           <w:tcPr/>
-          <w:bookmarkStart w:id="192" w:name="fig-fubini-nonrect-region"/>
+          <w:bookmarkStart w:id="193" w:name="fig-fubini-nonrect-region"/>
           <w:p>
             <w:pPr>
               <w:pStyle w:val="SourceCode"/>
@@ -44556,18 +44567,18 @@
                 <wp:inline>
                   <wp:extent cx="4620126" cy="3696101"/>
                   <wp:effectExtent b="0" l="0" r="0" t="0"/>
-                  <wp:docPr descr="" title="" id="190" name="Picture"/>
+                  <wp:docPr descr="" title="" id="191" name="Picture"/>
                   <a:graphic>
                     <a:graphicData uri="http://schemas.openxmlformats.org/drawingml/2006/picture">
                       <pic:pic>
                         <pic:nvPicPr>
-                          <pic:cNvPr descr="calculus_files/figure-docx/unnamed-chunk-5-1.png" id="191" name="Picture"/>
+                          <pic:cNvPr descr="calculus_files/figure-docx/unnamed-chunk-5-1.png" id="192" name="Picture"/>
                           <pic:cNvPicPr>
                             <a:picLocks noChangeArrowheads="1" noChangeAspect="1"/>
                           </pic:cNvPicPr>
                         </pic:nvPicPr>
                         <pic:blipFill>
-                          <a:blip r:embed="rId189"/>
+                          <a:blip r:embed="rId190"/>
                           <a:stretch>
                             <a:fillRect/>
                           </a:stretch>
@@ -44807,7 +44818,7 @@
               <w:t xml:space="preserve">.</w:t>
             </w:r>
           </w:p>
-          <w:bookmarkEnd w:id="192"/>
+          <w:bookmarkEnd w:id="193"/>
         </w:tc>
       </w:tr>
     </w:tbl>
@@ -47164,7 +47175,7 @@
       <w:tr>
         <w:tc>
           <w:tcPr/>
-          <w:bookmarkStart w:id="193" w:name="fig-fubini-nonrect"/>
+          <w:bookmarkStart w:id="194" w:name="fig-fubini-nonrect"/>
           <w:p>
             <w:pPr>
               <w:pStyle w:val="Compact"/>
@@ -47511,12 +47522,12 @@
               <w:t xml:space="preserve">.</w:t>
             </w:r>
           </w:p>
-          <w:bookmarkEnd w:id="193"/>
+          <w:bookmarkEnd w:id="194"/>
         </w:tc>
       </w:tr>
     </w:tbl>
-    <w:bookmarkEnd w:id="194"/>
-    <w:bookmarkStart w:id="196" w:name="exm-fubini-fail"/>
+    <w:bookmarkEnd w:id="195"/>
+    <w:bookmarkStart w:id="197" w:name="exm-fubini-fail"/>
     <w:p>
       <w:pPr>
         <w:pStyle w:val="BodyText"/>
@@ -49576,7 +49587,7 @@
       <w:tr>
         <w:tc>
           <w:tcPr/>
-          <w:bookmarkStart w:id="195" w:name="fig-fubini-fail"/>
+          <w:bookmarkStart w:id="196" w:name="fig-fubini-fail"/>
           <w:p>
             <w:pPr>
               <w:pStyle w:val="Compact"/>
@@ -50128,12 +50139,12 @@
               <w:t xml:space="preserve">does not apply.</w:t>
             </w:r>
           </w:p>
-          <w:bookmarkEnd w:id="195"/>
+          <w:bookmarkEnd w:id="196"/>
         </w:tc>
       </w:tr>
     </w:tbl>
-    <w:bookmarkEnd w:id="196"/>
-    <w:bookmarkStart w:id="197" w:name="cor-fubini-rect"/>
+    <w:bookmarkEnd w:id="197"/>
+    <w:bookmarkStart w:id="198" w:name="cor-fubini-rect"/>
     <w:p>
       <w:pPr>
         <w:pStyle w:val="BodyText"/>
@@ -50706,7 +50717,7 @@
         <w:t xml:space="preserve">(Larson and Edwards 2018, Theorem 14.2, p. 982)</w:t>
       </w:r>
     </w:p>
-    <w:bookmarkEnd w:id="197"/>
+    <w:bookmarkEnd w:id="198"/>
     <w:p>
       <w:pPr>
         <w:pStyle w:val="BodyText"/>
@@ -50961,7 +50972,7 @@
         <w:t xml:space="preserve">two iterated forms shown.</w:t>
       </w:r>
     </w:p>
-    <w:bookmarkStart w:id="203" w:name="exm-fubini-rect"/>
+    <w:bookmarkStart w:id="204" w:name="exm-fubini-rect"/>
     <w:p>
       <w:pPr>
         <w:pStyle w:val="BodyText"/>
@@ -51549,7 +51560,7 @@
       <w:r>
         <w:t xml:space="preserve"> </w:t>
       </w:r>
-      <w:hyperlink r:id="rId188">
+      <w:hyperlink r:id="rId189">
         <w:r>
           <w:rPr>
             <w:rStyle w:val="Hyperlink"/>
@@ -51840,7 +51851,7 @@
       <w:tr>
         <w:tc>
           <w:tcPr/>
-          <w:bookmarkStart w:id="201" w:name="fig-fubini-rect-region"/>
+          <w:bookmarkStart w:id="202" w:name="fig-fubini-rect-region"/>
           <w:p>
             <w:pPr>
               <w:pStyle w:val="SourceCode"/>
@@ -52732,18 +52743,18 @@
                 <wp:inline>
                   <wp:extent cx="4620126" cy="3696101"/>
                   <wp:effectExtent b="0" l="0" r="0" t="0"/>
-                  <wp:docPr descr="" title="" id="199" name="Picture"/>
+                  <wp:docPr descr="" title="" id="200" name="Picture"/>
                   <a:graphic>
                     <a:graphicData uri="http://schemas.openxmlformats.org/drawingml/2006/picture">
                       <pic:pic>
                         <pic:nvPicPr>
-                          <pic:cNvPr descr="calculus_files/figure-docx/unnamed-chunk-10-1.png" id="200" name="Picture"/>
+                          <pic:cNvPr descr="calculus_files/figure-docx/unnamed-chunk-10-1.png" id="201" name="Picture"/>
                           <pic:cNvPicPr>
                             <a:picLocks noChangeArrowheads="1" noChangeAspect="1"/>
                           </pic:cNvPicPr>
                         </pic:nvPicPr>
                         <pic:blipFill>
-                          <a:blip r:embed="rId198"/>
+                          <a:blip r:embed="rId199"/>
                           <a:stretch>
                             <a:fillRect/>
                           </a:stretch>
@@ -52833,7 +52844,7 @@
               <w:t xml:space="preserve">, the unit square.</w:t>
             </w:r>
           </w:p>
-          <w:bookmarkEnd w:id="201"/>
+          <w:bookmarkEnd w:id="202"/>
         </w:tc>
       </w:tr>
     </w:tbl>
@@ -54465,7 +54476,7 @@
       <w:tr>
         <w:tc>
           <w:tcPr/>
-          <w:bookmarkStart w:id="202" w:name="fig-fubini-rect"/>
+          <w:bookmarkStart w:id="203" w:name="fig-fubini-rect"/>
           <w:p>
             <w:pPr>
               <w:pStyle w:val="Compact"/>
@@ -54689,12 +54700,12 @@
               <w:t xml:space="preserve">.</w:t>
             </w:r>
           </w:p>
-          <w:bookmarkEnd w:id="202"/>
+          <w:bookmarkEnd w:id="203"/>
         </w:tc>
       </w:tr>
     </w:tbl>
-    <w:bookmarkEnd w:id="203"/>
-    <w:bookmarkStart w:id="204" w:name="thm-fubini-tonelli"/>
+    <w:bookmarkEnd w:id="204"/>
+    <w:bookmarkStart w:id="212" w:name="thm-fubini-tonelli"/>
     <w:p>
       <w:pPr>
         <w:pStyle w:val="BodyText"/>
@@ -54871,23 +54882,41 @@
       <w:r>
         <w:t xml:space="preserve"> </w:t>
       </w:r>
-      <m:oMath>
-        <m:r>
-          <m:t>σ</m:t>
-        </m:r>
-      </m:oMath>
-      <w:r>
-        <w:rPr>
-          <w:b/>
-          <w:bCs/>
-        </w:rPr>
-        <w:t xml:space="preserve">-finite</w:t>
-      </w:r>
-      <w:r>
-        <w:t xml:space="preserve"> </w:t>
-      </w:r>
-      <w:r>
-        <w:t xml:space="preserve">measure spaces,</w:t>
+      <w:hyperlink r:id="rId205">
+        <w:r>
+          <w:rPr>
+            <w:rStyle w:val="Hyperlink"/>
+          </w:rPr>
+          <w:t xml:space="preserve">measure spaces</w:t>
+        </w:r>
+      </w:hyperlink>
+      <w:r>
+        <w:t xml:space="preserve"> </w:t>
+      </w:r>
+      <w:r>
+        <w:t xml:space="preserve">with</w:t>
+      </w:r>
+      <w:r>
+        <w:t xml:space="preserve"> </w:t>
+      </w:r>
+      <w:hyperlink r:id="rId181">
+        <m:oMath>
+          <m:r>
+            <m:t>σ</m:t>
+          </m:r>
+        </m:oMath>
+        <w:r>
+          <w:rPr>
+            <w:rStyle w:val="Hyperlink"/>
+          </w:rPr>
+          <w:t xml:space="preserve">-finite</w:t>
+        </w:r>
+      </w:hyperlink>
+      <w:r>
+        <w:t xml:space="preserve"> </w:t>
+      </w:r>
+      <w:r>
+        <w:t xml:space="preserve">measures,</w:t>
       </w:r>
       <w:r>
         <w:t xml:space="preserve"> </w:t>
@@ -54962,25 +54991,53 @@
         <w:t xml:space="preserve"> </w:t>
       </w:r>
       <w:r>
-        <w:t xml:space="preserve">be measurable</w:t>
-      </w:r>
-      <w:r>
-        <w:t xml:space="preserve"> </w:t>
-      </w:r>
-      <w:r>
-        <w:t xml:space="preserve">with respect to the product</w:t>
-      </w:r>
-      <w:r>
-        <w:t xml:space="preserve"> </w:t>
-      </w:r>
-      <m:oMath>
-        <m:r>
-          <m:t>σ</m:t>
-        </m:r>
-      </m:oMath>
-      <w:r>
-        <w:t xml:space="preserve">-algebra</w:t>
-      </w:r>
+        <w:t xml:space="preserve">be</w:t>
+      </w:r>
+      <w:r>
+        <w:t xml:space="preserve"> </w:t>
+      </w:r>
+      <w:hyperlink r:id="rId206">
+        <w:r>
+          <w:rPr>
+            <w:rStyle w:val="Hyperlink"/>
+          </w:rPr>
+          <w:t xml:space="preserve">measurable</w:t>
+        </w:r>
+      </w:hyperlink>
+      <w:r>
+        <w:t xml:space="preserve"> </w:t>
+      </w:r>
+      <w:r>
+        <w:t xml:space="preserve">with respect to the</w:t>
+      </w:r>
+      <w:r>
+        <w:t xml:space="preserve"> </w:t>
+      </w:r>
+      <w:hyperlink r:id="rId207">
+        <w:r>
+          <w:rPr>
+            <w:rStyle w:val="Hyperlink"/>
+          </w:rPr>
+          <w:t xml:space="preserve">product</w:t>
+        </w:r>
+        <w:r>
+          <w:rPr>
+            <w:rStyle w:val="Hyperlink"/>
+          </w:rPr>
+          <w:t xml:space="preserve"> </w:t>
+        </w:r>
+        <m:oMath>
+          <m:r>
+            <m:t>σ</m:t>
+          </m:r>
+        </m:oMath>
+        <w:r>
+          <w:rPr>
+            <w:rStyle w:val="Hyperlink"/>
+          </w:rPr>
+          <w:t xml:space="preserve">-algebra</w:t>
+        </w:r>
+      </w:hyperlink>
       <w:r>
         <w:t xml:space="preserve"> </w:t>
       </w:r>
@@ -55058,9 +55115,31 @@
       <w:r>
         <w:t xml:space="preserve"> </w:t>
       </w:r>
-      <w:r>
-        <w:t xml:space="preserve">almost everywhere with respect to</w:t>
-      </w:r>
+      <w:hyperlink r:id="rId208">
+        <w:r>
+          <w:rPr>
+            <w:rStyle w:val="Hyperlink"/>
+          </w:rPr>
+          <w:t xml:space="preserve">almost everywhere</w:t>
+        </w:r>
+      </w:hyperlink>
+      <w:r>
+        <w:t xml:space="preserve"> </w:t>
+      </w:r>
+      <w:r>
+        <w:t xml:space="preserve">with respect to the</w:t>
+      </w:r>
+      <w:r>
+        <w:t xml:space="preserve"> </w:t>
+      </w:r>
+      <w:hyperlink r:id="rId209">
+        <w:r>
+          <w:rPr>
+            <w:rStyle w:val="Hyperlink"/>
+          </w:rPr>
+          <w:t xml:space="preserve">product measure</w:t>
+        </w:r>
+      </w:hyperlink>
       <w:r>
         <w:t xml:space="preserve"> </w:t>
       </w:r>
@@ -55255,6 +55334,40 @@
         </m:r>
       </m:oMath>
       <w:r>
+        <w:t xml:space="preserve">,</w:t>
+      </w:r>
+      <w:r>
+        <w:t xml:space="preserve"> </w:t>
+      </w:r>
+      <w:r>
+        <w:t xml:space="preserve">that is,</w:t>
+      </w:r>
+      <w:r>
+        <w:t xml:space="preserve"> </w:t>
+      </w:r>
+      <m:oMath>
+        <m:r>
+          <m:t>f</m:t>
+        </m:r>
+      </m:oMath>
+      <w:r>
+        <w:t xml:space="preserve"> </w:t>
+      </w:r>
+      <w:r>
+        <w:t xml:space="preserve">is</w:t>
+      </w:r>
+      <w:r>
+        <w:t xml:space="preserve"> </w:t>
+      </w:r>
+      <w:hyperlink r:id="rId210">
+        <w:r>
+          <w:rPr>
+            <w:rStyle w:val="Hyperlink"/>
+          </w:rPr>
+          <w:t xml:space="preserve">absolutely integrable</w:t>
+        </w:r>
+      </w:hyperlink>
+      <w:r>
         <w:t xml:space="preserve"> </w:t>
       </w:r>
       <w:r>
@@ -55276,7 +55389,24 @@
         <w:pStyle w:val="FirstParagraph"/>
       </w:pPr>
       <w:r>
-        <w:t xml:space="preserve">then both iterated integrals exist, agree with the double integral,</w:t>
+        <w:t xml:space="preserve">then both iterated</w:t>
+      </w:r>
+      <w:r>
+        <w:t xml:space="preserve"> </w:t>
+      </w:r>
+      <w:hyperlink r:id="rId211">
+        <w:r>
+          <w:rPr>
+            <w:rStyle w:val="Hyperlink"/>
+          </w:rPr>
+          <w:t xml:space="preserve">integrals</w:t>
+        </w:r>
+      </w:hyperlink>
+      <w:r>
+        <w:t xml:space="preserve"> </w:t>
+      </w:r>
+      <w:r>
+        <w:t xml:space="preserve">exist, agree with the double integral,</w:t>
       </w:r>
       <w:r>
         <w:t xml:space="preserve"> </w:t>
@@ -55857,8 +55987,8 @@
         <w:t xml:space="preserve">(Billingsley 1995, Theorem 18.3; Gut 2013, Theorem 9.1, p. 65; Fubini 1907; Wikipedia contributors 2024)</w:t>
       </w:r>
     </w:p>
-    <w:bookmarkEnd w:id="204"/>
-    <w:bookmarkStart w:id="205" w:name="rem-fubini-tonelli-probability"/>
+    <w:bookmarkEnd w:id="212"/>
+    <w:bookmarkStart w:id="216" w:name="rem-fubini-tonelli-probability"/>
     <w:p>
       <w:pPr>
         <w:pStyle w:val="BodyText"/>
@@ -55885,7 +56015,7 @@
       <w:r>
         <w:t xml:space="preserve"> </w:t>
       </w:r>
-      <w:hyperlink r:id="rId181">
+      <w:hyperlink r:id="rId182">
         <w:r>
           <w:rPr>
             <w:rStyle w:val="Hyperlink"/>
@@ -55916,15 +56046,96 @@
         <w:t xml:space="preserve"> </w:t>
       </w:r>
       <w:r>
-        <w:t xml:space="preserve">A probability measure gives the whole space measure</w:t>
-      </w:r>
-      <w:r>
-        <w:t xml:space="preserve"> </w:t>
-      </w:r>
-      <m:oMath>
+        <w:t xml:space="preserve">A</w:t>
+      </w:r>
+      <w:r>
+        <w:t xml:space="preserve"> </w:t>
+      </w:r>
+      <w:hyperlink r:id="rId213">
+        <w:r>
+          <w:rPr>
+            <w:rStyle w:val="Hyperlink"/>
+          </w:rPr>
+          <w:t xml:space="preserve">probability measure</w:t>
+        </w:r>
+      </w:hyperlink>
+      <w:r>
+        <w:t xml:space="preserve"> </w:t>
+      </w:r>
+      <m:oMath>
+        <m:r>
+          <m:t>P</m:t>
+        </m:r>
+      </m:oMath>
+      <w:r>
+        <w:t xml:space="preserve"> </w:t>
+      </w:r>
+      <w:r>
+        <w:t xml:space="preserve">on</w:t>
+      </w:r>
+      <w:r>
+        <w:t xml:space="preserve"> </w:t>
+      </w:r>
+      <m:oMath>
+        <m:r>
+          <m:rPr>
+            <m:sty m:val="p"/>
+          </m:rPr>
+          <m:t>Ω</m:t>
+        </m:r>
+      </m:oMath>
+      <w:r>
+        <w:t xml:space="preserve"> </w:t>
+      </w:r>
+      <w:r>
+        <w:t xml:space="preserve">has</w:t>
+      </w:r>
+      <w:r>
+        <w:t xml:space="preserve"> </w:t>
+      </w:r>
+      <m:oMath>
+        <m:r>
+          <m:t>P</m:t>
+        </m:r>
+        <m:r>
+          <m:rPr>
+            <m:sty m:val="p"/>
+          </m:rPr>
+          <m:t>(</m:t>
+        </m:r>
+        <m:r>
+          <m:rPr>
+            <m:sty m:val="p"/>
+          </m:rPr>
+          <m:t>Ω</m:t>
+        </m:r>
+        <m:r>
+          <m:rPr>
+            <m:sty m:val="p"/>
+          </m:rPr>
+          <m:t>)</m:t>
+        </m:r>
+        <m:r>
+          <m:rPr>
+            <m:sty m:val="p"/>
+          </m:rPr>
+          <m:t>=</m:t>
+        </m:r>
         <m:r>
           <m:t>1</m:t>
         </m:r>
+        <m:r>
+          <m:rPr>
+            <m:sty m:val="p"/>
+          </m:rPr>
+          <m:t>&lt;</m:t>
+        </m:r>
+        <m:r>
+          <m:rPr>
+            <m:sty m:val="p"/>
+          </m:rPr>
+          <m:t>∞</m:t>
+        </m:r>
       </m:oMath>
       <w:r>
         <w:t xml:space="preserve">,</w:t>
@@ -55933,7 +56144,21 @@
         <w:t xml:space="preserve"> </w:t>
       </w:r>
       <w:r>
-        <w:t xml:space="preserve">so it is finite, and hence</w:t>
+        <w:t xml:space="preserve">so it is</w:t>
+      </w:r>
+      <w:r>
+        <w:t xml:space="preserve"> </w:t>
+      </w:r>
+      <w:hyperlink r:id="rId181">
+        <w:r>
+          <w:rPr>
+            <w:rStyle w:val="Hyperlink"/>
+          </w:rPr>
+          <w:t xml:space="preserve">finite</w:t>
+        </w:r>
+      </w:hyperlink>
+      <w:r>
+        <w:t xml:space="preserve">, and hence</w:t>
       </w:r>
       <w:r>
         <w:t xml:space="preserve"> </w:t>
@@ -55944,7 +56169,41 @@
         </m:r>
       </m:oMath>
       <w:r>
-        <w:t xml:space="preserve">-finite;</w:t>
+        <w:t xml:space="preserve">-finite</w:t>
+      </w:r>
+      <w:r>
+        <w:t xml:space="preserve"> </w:t>
+      </w:r>
+      <w:r>
+        <w:t xml:space="preserve">(</w:t>
+      </w:r>
+      <w:hyperlink r:id="rId214">
+        <w:r>
+          <w:rPr>
+            <w:rStyle w:val="Hyperlink"/>
+          </w:rPr>
+          <w:t xml:space="preserve">finite and</w:t>
+        </w:r>
+        <w:r>
+          <w:rPr>
+            <w:rStyle w:val="Hyperlink"/>
+          </w:rPr>
+          <w:t xml:space="preserve"> </w:t>
+        </w:r>
+        <m:oMath>
+          <m:r>
+            <m:t>σ</m:t>
+          </m:r>
+        </m:oMath>
+        <w:r>
+          <w:rPr>
+            <w:rStyle w:val="Hyperlink"/>
+          </w:rPr>
+          <w:t xml:space="preserve">-finite measures</w:t>
+        </w:r>
+      </w:hyperlink>
+      <w:r>
+        <w:t xml:space="preserve">);</w:t>
       </w:r>
       <w:r>
         <w:t xml:space="preserve"> </w:t>
@@ -55975,7 +56234,21 @@
         <w:t xml:space="preserve"> </w:t>
       </w:r>
       <w:r>
-        <w:t xml:space="preserve">(nonnegativity or absolute integrability) still need to be verified</w:t>
+        <w:t xml:space="preserve">(nonnegativity or</w:t>
+      </w:r>
+      <w:r>
+        <w:t xml:space="preserve"> </w:t>
+      </w:r>
+      <w:hyperlink r:id="rId210">
+        <w:r>
+          <w:rPr>
+            <w:rStyle w:val="Hyperlink"/>
+          </w:rPr>
+          <w:t xml:space="preserve">absolute integrability</w:t>
+        </w:r>
+      </w:hyperlink>
+      <w:r>
+        <w:t xml:space="preserve">) still need to be verified</w:t>
       </w:r>
       <w:r>
         <w:t xml:space="preserve"> </w:t>
@@ -55987,7 +56260,24 @@
         <w:t xml:space="preserve"> </w:t>
       </w:r>
       <w:r>
-        <w:t xml:space="preserve">For example, Lebesgue measure (ordinary length) on</w:t>
+        <w:t xml:space="preserve">For example,</w:t>
+      </w:r>
+      <w:r>
+        <w:t xml:space="preserve"> </w:t>
+      </w:r>
+      <w:hyperlink r:id="rId215">
+        <w:r>
+          <w:rPr>
+            <w:rStyle w:val="Hyperlink"/>
+          </w:rPr>
+          <w:t xml:space="preserve">Lebesgue measure</w:t>
+        </w:r>
+      </w:hyperlink>
+      <w:r>
+        <w:t xml:space="preserve"> </w:t>
+      </w:r>
+      <w:r>
+        <w:t xml:space="preserve">(ordinary length) on</w:t>
       </w:r>
       <w:r>
         <w:t xml:space="preserve"> </w:t>
@@ -56163,8 +56453,8 @@
         <w:t xml:space="preserve">-finiteness alone does not make the iterated integrals agree.</w:t>
       </w:r>
     </w:p>
-    <w:bookmarkEnd w:id="205"/>
-    <w:bookmarkStart w:id="206" w:name="exm-fubini-tonelli-apply"/>
+    <w:bookmarkEnd w:id="216"/>
+    <w:bookmarkStart w:id="217" w:name="exm-fubini-tonelli-apply"/>
     <w:p>
       <w:pPr>
         <w:pStyle w:val="BodyText"/>
@@ -59272,8 +59562,8 @@
         <w:t xml:space="preserve">guarantees when condition (a) holds.</w:t>
       </w:r>
     </w:p>
-    <w:bookmarkEnd w:id="206"/>
-    <w:bookmarkStart w:id="207" w:name="exm-fubini-fail-tonelli"/>
+    <w:bookmarkEnd w:id="217"/>
+    <w:bookmarkStart w:id="218" w:name="exm-fubini-fail-tonelli"/>
     <w:p>
       <w:pPr>
         <w:pStyle w:val="BodyText"/>
@@ -60408,9 +60698,9 @@
         <w:t xml:space="preserve">(Wikipedia contributors 2024)</w:t>
       </w:r>
     </w:p>
-    <w:bookmarkEnd w:id="207"/>
-    <w:bookmarkEnd w:id="208"/>
-    <w:bookmarkStart w:id="211" w:name="sec-additional-resources"/>
+    <w:bookmarkEnd w:id="218"/>
+    <w:bookmarkEnd w:id="219"/>
+    <w:bookmarkStart w:id="222" w:name="sec-additional-resources"/>
     <w:p>
       <w:pPr>
         <w:pStyle w:val="Heading2"/>
@@ -60487,7 +60777,7 @@
           <w:numId w:val="1026"/>
         </w:numPr>
       </w:pPr>
-      <w:hyperlink r:id="rId209">
+      <w:hyperlink r:id="rId220">
         <w:r>
           <w:rPr>
             <w:rStyle w:val="Hyperlink"/>
@@ -60504,7 +60794,7 @@
           <w:numId w:val="1026"/>
         </w:numPr>
       </w:pPr>
-      <w:hyperlink r:id="rId210">
+      <w:hyperlink r:id="rId221">
         <w:r>
           <w:rPr>
             <w:rStyle w:val="Hyperlink"/>
@@ -60531,8 +60821,8 @@
         <w:t xml:space="preserve">(the rigorous foundations behind these results)</w:t>
       </w:r>
     </w:p>
-    <w:bookmarkEnd w:id="211"/>
-    <w:bookmarkStart w:id="234" w:name="references"/>
+    <w:bookmarkEnd w:id="222"/>
+    <w:bookmarkStart w:id="245" w:name="references"/>
     <w:p>
       <w:pPr>
         <w:pStyle w:val="Heading2"/>
@@ -60541,8 +60831,8 @@
         <w:t xml:space="preserve">References</w:t>
       </w:r>
     </w:p>
-    <w:bookmarkStart w:id="233" w:name="refs"/>
-    <w:bookmarkStart w:id="213" w:name="ref-calclifesaver"/>
+    <w:bookmarkStart w:id="244" w:name="refs"/>
+    <w:bookmarkStart w:id="224" w:name="ref-calclifesaver"/>
     <w:p>
       <w:pPr>
         <w:pStyle w:val="Bibliography"/>
@@ -60566,7 +60856,7 @@
       <w:r>
         <w:t xml:space="preserve"> </w:t>
       </w:r>
-      <w:hyperlink r:id="rId212">
+      <w:hyperlink r:id="rId223">
         <w:r>
           <w:rPr>
             <w:rStyle w:val="Hyperlink"/>
@@ -60578,8 +60868,8 @@
         <w:t xml:space="preserve">.</w:t>
       </w:r>
     </w:p>
-    <w:bookmarkEnd w:id="213"/>
-    <w:bookmarkStart w:id="214" w:name="ref-billingsley1995probability"/>
+    <w:bookmarkEnd w:id="224"/>
+    <w:bookmarkStart w:id="225" w:name="ref-billingsley1995probability"/>
     <w:p>
       <w:pPr>
         <w:pStyle w:val="Bibliography"/>
@@ -60601,8 +60891,8 @@
         <w:t xml:space="preserve">. 3rd ed. Wiley Series in Probability and Mathematical Statistics. Wiley.</w:t>
       </w:r>
     </w:p>
-    <w:bookmarkEnd w:id="214"/>
-    <w:bookmarkStart w:id="215" w:name="ref-fubini1907"/>
+    <w:bookmarkEnd w:id="225"/>
+    <w:bookmarkStart w:id="226" w:name="ref-fubini1907"/>
     <w:p>
       <w:pPr>
         <w:pStyle w:val="Bibliography"/>
@@ -60633,8 +60923,8 @@
         <w:t xml:space="preserve">16: 608–14.</w:t>
       </w:r>
     </w:p>
-    <w:bookmarkEnd w:id="215"/>
-    <w:bookmarkStart w:id="217" w:name="ref-realanalysislifesaver"/>
+    <w:bookmarkEnd w:id="226"/>
+    <w:bookmarkStart w:id="228" w:name="ref-realanalysislifesaver"/>
     <w:p>
       <w:pPr>
         <w:pStyle w:val="Bibliography"/>
@@ -60658,7 +60948,7 @@
       <w:r>
         <w:t xml:space="preserve"> </w:t>
       </w:r>
-      <w:hyperlink r:id="rId216">
+      <w:hyperlink r:id="rId227">
         <w:r>
           <w:rPr>
             <w:rStyle w:val="Hyperlink"/>
@@ -60670,8 +60960,8 @@
         <w:t xml:space="preserve">.</w:t>
       </w:r>
     </w:p>
-    <w:bookmarkEnd w:id="217"/>
-    <w:bookmarkStart w:id="219" w:name="ref-gut2013"/>
+    <w:bookmarkEnd w:id="228"/>
+    <w:bookmarkStart w:id="230" w:name="ref-gut2013"/>
     <w:p>
       <w:pPr>
         <w:pStyle w:val="Bibliography"/>
@@ -60695,7 +60985,7 @@
       <w:r>
         <w:t xml:space="preserve"> </w:t>
       </w:r>
-      <w:hyperlink r:id="rId218">
+      <w:hyperlink r:id="rId229">
         <w:r>
           <w:rPr>
             <w:rStyle w:val="Hyperlink"/>
@@ -60707,8 +60997,8 @@
         <w:t xml:space="preserve">.</w:t>
       </w:r>
     </w:p>
-    <w:bookmarkEnd w:id="219"/>
-    <w:bookmarkStart w:id="221" w:name="ref-mosaiccalc"/>
+    <w:bookmarkEnd w:id="230"/>
+    <w:bookmarkStart w:id="232" w:name="ref-mosaiccalc"/>
     <w:p>
       <w:pPr>
         <w:pStyle w:val="Bibliography"/>
@@ -60732,7 +61022,7 @@
       <w:r>
         <w:t xml:space="preserve"> </w:t>
       </w:r>
-      <w:hyperlink r:id="rId220">
+      <w:hyperlink r:id="rId231">
         <w:r>
           <w:rPr>
             <w:rStyle w:val="Hyperlink"/>
@@ -60744,8 +61034,8 @@
         <w:t xml:space="preserve">.</w:t>
       </w:r>
     </w:p>
-    <w:bookmarkEnd w:id="221"/>
-    <w:bookmarkStart w:id="223" w:name="ref-khuri2003advanced"/>
+    <w:bookmarkEnd w:id="232"/>
+    <w:bookmarkStart w:id="234" w:name="ref-khuri2003advanced"/>
     <w:p>
       <w:pPr>
         <w:pStyle w:val="Bibliography"/>
@@ -60769,7 +61059,7 @@
       <w:r>
         <w:t xml:space="preserve"> </w:t>
       </w:r>
-      <w:hyperlink r:id="rId222">
+      <w:hyperlink r:id="rId233">
         <w:r>
           <w:rPr>
             <w:rStyle w:val="Hyperlink"/>
@@ -60781,8 +61071,8 @@
         <w:t xml:space="preserve">.</w:t>
       </w:r>
     </w:p>
-    <w:bookmarkEnd w:id="223"/>
-    <w:bookmarkStart w:id="225" w:name="ref-kleinbaum2012survival"/>
+    <w:bookmarkEnd w:id="234"/>
+    <w:bookmarkStart w:id="236" w:name="ref-kleinbaum2012survival"/>
     <w:p>
       <w:pPr>
         <w:pStyle w:val="Bibliography"/>
@@ -60806,7 +61096,7 @@
       <w:r>
         <w:t xml:space="preserve"> </w:t>
       </w:r>
-      <w:hyperlink r:id="rId224">
+      <w:hyperlink r:id="rId235">
         <w:r>
           <w:rPr>
             <w:rStyle w:val="Hyperlink"/>
@@ -60818,8 +61108,8 @@
         <w:t xml:space="preserve">.</w:t>
       </w:r>
     </w:p>
-    <w:bookmarkEnd w:id="225"/>
-    <w:bookmarkStart w:id="227" w:name="ref-larsonCalc11e"/>
+    <w:bookmarkEnd w:id="236"/>
+    <w:bookmarkStart w:id="238" w:name="ref-larsonCalc11e"/>
     <w:p>
       <w:pPr>
         <w:pStyle w:val="Bibliography"/>
@@ -60843,7 +61133,7 @@
       <w:r>
         <w:t xml:space="preserve"> </w:t>
       </w:r>
-      <w:hyperlink r:id="rId226">
+      <w:hyperlink r:id="rId237">
         <w:r>
           <w:rPr>
             <w:rStyle w:val="Hyperlink"/>
@@ -60855,8 +61145,8 @@
         <w:t xml:space="preserve">.</w:t>
       </w:r>
     </w:p>
-    <w:bookmarkEnd w:id="227"/>
-    <w:bookmarkStart w:id="229" w:name="ref-problifesavercalc"/>
+    <w:bookmarkEnd w:id="238"/>
+    <w:bookmarkStart w:id="240" w:name="ref-problifesavercalc"/>
     <w:p>
       <w:pPr>
         <w:pStyle w:val="Bibliography"/>
@@ -60880,7 +61170,7 @@
       <w:r>
         <w:t xml:space="preserve"> </w:t>
       </w:r>
-      <w:hyperlink r:id="rId228">
+      <w:hyperlink r:id="rId239">
         <w:r>
           <w:rPr>
             <w:rStyle w:val="Hyperlink"/>
@@ -60892,8 +61182,8 @@
         <w:t xml:space="preserve">.</w:t>
       </w:r>
     </w:p>
-    <w:bookmarkEnd w:id="229"/>
-    <w:bookmarkStart w:id="230" w:name="ref-rudin1976principles"/>
+    <w:bookmarkEnd w:id="240"/>
+    <w:bookmarkStart w:id="241" w:name="ref-rudin1976principles"/>
     <w:p>
       <w:pPr>
         <w:pStyle w:val="Bibliography"/>
@@ -60915,8 +61205,8 @@
         <w:t xml:space="preserve">. 3rd ed. International Series in Pure and Applied Mathematics. McGraw-Hill.</w:t>
       </w:r>
     </w:p>
-    <w:bookmarkEnd w:id="230"/>
-    <w:bookmarkStart w:id="232" w:name="ref-wp:fubini"/>
+    <w:bookmarkEnd w:id="241"/>
+    <w:bookmarkStart w:id="243" w:name="ref-wp:fubini"/>
     <w:p>
       <w:pPr>
         <w:pStyle w:val="Bibliography"/>
@@ -60975,7 +61265,7 @@
       <w:r>
         <w:t xml:space="preserve"> </w:t>
       </w:r>
-      <w:hyperlink r:id="rId231">
+      <w:hyperlink r:id="rId242">
         <w:r>
           <w:rPr>
             <w:rStyle w:val="Hyperlink"/>
@@ -60987,9 +61277,9 @@
         <w:t xml:space="preserve">.</w:t>
       </w:r>
     </w:p>
-    <w:bookmarkEnd w:id="232"/>
-    <w:bookmarkEnd w:id="233"/>
-    <w:bookmarkEnd w:id="234"/>
+    <w:bookmarkEnd w:id="243"/>
+    <w:bookmarkEnd w:id="244"/>
+    <w:bookmarkEnd w:id="245"/>
     <w:sectPr>
       <w:footnotePr>
         <w:numRestart w:val="eachSect"/>

</xml_diff>

<commit_message>
Deploying to gh-pages from @ Morrison-Lab/mds@4a59df4f2f34f436a4a5c9f4c143337c66dd1722 🚀
</commit_message>
<xml_diff>
--- a/calculus.docx
+++ b/calculus.docx
@@ -15,10 +15,10 @@
         <w:pStyle w:val="Date"/>
       </w:pPr>
       <w:r>
-        <w:t xml:space="preserve">Last modified: 2026-10-05 21:42:33 (PDT)</w:t>
+        <w:t xml:space="preserve">Last modified: 2026-10-05 22:39:57 (PDT)</w:t>
       </w:r>
     </w:p>
-    <w:bookmarkStart w:id="75" w:name="sec-derivatives"/>
+    <w:bookmarkStart w:id="80" w:name="sec-derivatives"/>
     <w:p>
       <w:pPr>
         <w:pStyle w:val="Heading2"/>
@@ -8524,7 +8524,7 @@
       </w:tr>
     </w:tbl>
     <w:bookmarkEnd w:id="68"/>
-    <w:bookmarkStart w:id="74" w:name="linear-approximation"/>
+    <w:bookmarkStart w:id="79" w:name="linear-approximation"/>
     <w:p>
       <w:pPr>
         <w:pStyle w:val="Heading3"/>
@@ -8697,7 +8697,7 @@
       </m:oMathPara>
       <w:bookmarkEnd w:id="69"/>
     </w:p>
-    <w:bookmarkStart w:id="70" w:name="def-flat-point"/>
+    <w:bookmarkStart w:id="70" w:name="def-linear-approximation"/>
     <w:p>
       <w:pPr>
         <w:pStyle w:val="FirstParagraph"/>
@@ -8707,7 +8707,681 @@
           <w:b/>
           <w:bCs/>
         </w:rPr>
-        <w:t xml:space="preserve">Definition 5 (Flat point)</w:t>
+        <w:t xml:space="preserve">Definition 5 (Linear approximation)</w:t>
+      </w:r>
+      <w:r>
+        <w:t xml:space="preserve"> </w:t>
+      </w:r>
+      <w:r>
+        <w:t xml:space="preserve">For a function</w:t>
+      </w:r>
+      <w:r>
+        <w:t xml:space="preserve"> </w:t>
+      </w:r>
+      <m:oMath>
+        <m:r>
+          <m:t>f</m:t>
+        </m:r>
+      </m:oMath>
+      <w:r>
+        <w:t xml:space="preserve"> </w:t>
+      </w:r>
+      <w:r>
+        <w:t xml:space="preserve">that is differentiable at</w:t>
+      </w:r>
+      <w:r>
+        <w:t xml:space="preserve"> </w:t>
+      </w:r>
+      <m:oMath>
+        <m:r>
+          <m:t>w</m:t>
+        </m:r>
+      </m:oMath>
+      <w:r>
+        <w:t xml:space="preserve">,</w:t>
+      </w:r>
+      <w:r>
+        <w:t xml:space="preserve"> </w:t>
+      </w:r>
+      <w:r>
+        <w:t xml:space="preserve">the</w:t>
+      </w:r>
+      <w:r>
+        <w:t xml:space="preserve"> </w:t>
+      </w:r>
+      <w:r>
+        <w:rPr>
+          <w:b/>
+          <w:bCs/>
+        </w:rPr>
+        <w:t xml:space="preserve">linear approximation</w:t>
+      </w:r>
+      <w:r>
+        <w:t xml:space="preserve"> </w:t>
+      </w:r>
+      <w:r>
+        <w:t xml:space="preserve">of</w:t>
+      </w:r>
+      <w:r>
+        <w:t xml:space="preserve"> </w:t>
+      </w:r>
+      <m:oMath>
+        <m:r>
+          <m:t>f</m:t>
+        </m:r>
+      </m:oMath>
+      <w:r>
+        <w:t xml:space="preserve"> </w:t>
+      </w:r>
+      <w:r>
+        <w:t xml:space="preserve">at</w:t>
+      </w:r>
+      <w:r>
+        <w:t xml:space="preserve"> </w:t>
+      </w:r>
+      <m:oMath>
+        <m:r>
+          <m:t>w</m:t>
+        </m:r>
+      </m:oMath>
+      <w:r>
+        <w:t xml:space="preserve"> </w:t>
+      </w:r>
+      <w:r>
+        <w:t xml:space="preserve">(also called the</w:t>
+      </w:r>
+      <w:r>
+        <w:t xml:space="preserve"> </w:t>
+      </w:r>
+      <w:r>
+        <w:rPr>
+          <w:b/>
+          <w:bCs/>
+        </w:rPr>
+        <w:t xml:space="preserve">first-order Taylor approximation</w:t>
+      </w:r>
+      <w:r>
+        <w:t xml:space="preserve">)</w:t>
+      </w:r>
+      <w:r>
+        <w:t xml:space="preserve"> </w:t>
+      </w:r>
+      <w:r>
+        <w:t xml:space="preserve">is the function of the step</w:t>
+      </w:r>
+      <w:r>
+        <w:t xml:space="preserve"> </w:t>
+      </w:r>
+      <m:oMath>
+        <m:r>
+          <m:t>ϵ</m:t>
+        </m:r>
+      </m:oMath>
+    </w:p>
+    <w:p>
+      <w:pPr>
+        <w:pStyle w:val="BodyText"/>
+      </w:pPr>
+      <m:oMathPara>
+        <m:oMathParaPr>
+          <m:jc m:val="center"/>
+        </m:oMathParaPr>
+        <m:oMath>
+          <m:sSub>
+            <m:e>
+              <m:acc>
+                <m:accPr>
+                  <m:chr m:val="̂"/>
+                </m:accPr>
+                <m:e>
+                  <m:r>
+                    <m:t>f</m:t>
+                  </m:r>
+                </m:e>
+              </m:acc>
+            </m:e>
+            <m:sub>
+              <m:r>
+                <m:t>w</m:t>
+              </m:r>
+            </m:sub>
+          </m:sSub>
+          <m:r>
+            <m:rPr>
+              <m:sty m:val="p"/>
+            </m:rPr>
+            <m:t>(</m:t>
+          </m:r>
+          <m:r>
+            <m:t>ϵ</m:t>
+          </m:r>
+          <m:r>
+            <m:rPr>
+              <m:sty m:val="p"/>
+            </m:rPr>
+            <m:t>)</m:t>
+          </m:r>
+          <m:r>
+            <m:rPr>
+              <m:sty m:val="p"/>
+            </m:rPr>
+            <m:t>=</m:t>
+          </m:r>
+          <m:r>
+            <m:t>f</m:t>
+          </m:r>
+          <m:r>
+            <m:rPr>
+              <m:sty m:val="p"/>
+            </m:rPr>
+            <m:t>(</m:t>
+          </m:r>
+          <m:r>
+            <m:t>w</m:t>
+          </m:r>
+          <m:r>
+            <m:rPr>
+              <m:sty m:val="p"/>
+            </m:rPr>
+            <m:t>)</m:t>
+          </m:r>
+          <m:r>
+            <m:rPr>
+              <m:sty m:val="p"/>
+            </m:rPr>
+            <m:t>+</m:t>
+          </m:r>
+          <m:r>
+            <m:t>ϵ</m:t>
+          </m:r>
+          <m:r>
+            <m:t> </m:t>
+          </m:r>
+          <m:f>
+            <m:fPr>
+              <m:type m:val="bar"/>
+            </m:fPr>
+            <m:num>
+              <m:r>
+                <m:t>d</m:t>
+              </m:r>
+            </m:num>
+            <m:den>
+              <m:r>
+                <m:t>d</m:t>
+              </m:r>
+              <m:r>
+                <m:t>w</m:t>
+              </m:r>
+            </m:den>
+          </m:f>
+          <m:r>
+            <m:t>f</m:t>
+          </m:r>
+          <m:r>
+            <m:rPr>
+              <m:sty m:val="p"/>
+            </m:rPr>
+            <m:t>(</m:t>
+          </m:r>
+          <m:r>
+            <m:t>w</m:t>
+          </m:r>
+          <m:r>
+            <m:rPr>
+              <m:sty m:val="p"/>
+            </m:rPr>
+            <m:t>)</m:t>
+          </m:r>
+        </m:oMath>
+      </m:oMathPara>
+    </w:p>
+    <w:p>
+      <w:pPr>
+        <w:pStyle w:val="FirstParagraph"/>
+      </w:pPr>
+      <w:r>
+        <w:t xml:space="preserve">so</w:t>
+      </w:r>
+      <w:r>
+        <w:t xml:space="preserve"> </w:t>
+      </w:r>
+      <w:hyperlink w:anchor="eq-linear-approx">
+        <w:r>
+          <w:rPr>
+            <w:rStyle w:val="Hyperlink"/>
+          </w:rPr>
+          <w:t xml:space="preserve">Equation 1</w:t>
+        </w:r>
+      </w:hyperlink>
+      <w:r>
+        <w:t xml:space="preserve"> </w:t>
+      </w:r>
+      <w:r>
+        <w:t xml:space="preserve">says</w:t>
+      </w:r>
+      <w:r>
+        <w:t xml:space="preserve"> </w:t>
+      </w:r>
+      <m:oMath>
+        <m:r>
+          <m:t>f</m:t>
+        </m:r>
+        <m:r>
+          <m:rPr>
+            <m:sty m:val="p"/>
+          </m:rPr>
+          <m:t>(</m:t>
+        </m:r>
+        <m:r>
+          <m:t>w</m:t>
+        </m:r>
+        <m:r>
+          <m:rPr>
+            <m:sty m:val="p"/>
+          </m:rPr>
+          <m:t>+</m:t>
+        </m:r>
+        <m:r>
+          <m:t>ϵ</m:t>
+        </m:r>
+        <m:r>
+          <m:rPr>
+            <m:sty m:val="p"/>
+          </m:rPr>
+          <m:t>)</m:t>
+        </m:r>
+        <m:r>
+          <m:rPr>
+            <m:sty m:val="p"/>
+          </m:rPr>
+          <m:t>≈</m:t>
+        </m:r>
+        <m:sSub>
+          <m:e>
+            <m:acc>
+              <m:accPr>
+                <m:chr m:val="̂"/>
+              </m:accPr>
+              <m:e>
+                <m:r>
+                  <m:t>f</m:t>
+                </m:r>
+              </m:e>
+            </m:acc>
+          </m:e>
+          <m:sub>
+            <m:r>
+              <m:t>w</m:t>
+            </m:r>
+          </m:sub>
+        </m:sSub>
+        <m:r>
+          <m:rPr>
+            <m:sty m:val="p"/>
+          </m:rPr>
+          <m:t>(</m:t>
+        </m:r>
+        <m:r>
+          <m:t>ϵ</m:t>
+        </m:r>
+        <m:r>
+          <m:rPr>
+            <m:sty m:val="p"/>
+          </m:rPr>
+          <m:t>)</m:t>
+        </m:r>
+      </m:oMath>
+      <w:r>
+        <w:t xml:space="preserve"> </w:t>
+      </w:r>
+      <w:r>
+        <w:t xml:space="preserve">for small</w:t>
+      </w:r>
+      <w:r>
+        <w:t xml:space="preserve"> </w:t>
+      </w:r>
+      <m:oMath>
+        <m:r>
+          <m:t>ϵ</m:t>
+        </m:r>
+      </m:oMath>
+      <w:r>
+        <w:t xml:space="preserve">.</w:t>
+      </w:r>
+    </w:p>
+    <w:bookmarkEnd w:id="70"/>
+    <w:bookmarkStart w:id="74" w:name="rem-linear-approx-affine"/>
+    <w:p>
+      <w:pPr>
+        <w:pStyle w:val="BodyText"/>
+      </w:pPr>
+      <w:r>
+        <w:rPr>
+          <w:i/>
+          <w:iCs/>
+        </w:rPr>
+        <w:t xml:space="preserve">Remark 1</w:t>
+      </w:r>
+      <w:r>
+        <w:t xml:space="preserve"> (The</w:t>
+      </w:r>
+      <w:r>
+        <w:t xml:space="preserve"> </w:t>
+      </w:r>
+      <w:r>
+        <w:t xml:space="preserve">“linear”</w:t>
+      </w:r>
+      <w:r>
+        <w:t xml:space="preserve"> </w:t>
+      </w:r>
+      <w:r>
+        <w:t xml:space="preserve">approximation is affine). </w:t>
+      </w:r>
+      <w:r>
+        <w:t xml:space="preserve">The linear approximation</w:t>
+      </w:r>
+      <w:r>
+        <w:t xml:space="preserve"> </w:t>
+      </w:r>
+      <m:oMath>
+        <m:sSub>
+          <m:e>
+            <m:acc>
+              <m:accPr>
+                <m:chr m:val="̂"/>
+              </m:accPr>
+              <m:e>
+                <m:r>
+                  <m:t>f</m:t>
+                </m:r>
+              </m:e>
+            </m:acc>
+          </m:e>
+          <m:sub>
+            <m:r>
+              <m:t>w</m:t>
+            </m:r>
+          </m:sub>
+        </m:sSub>
+      </m:oMath>
+      <w:r>
+        <w:t xml:space="preserve"> </w:t>
+      </w:r>
+      <w:r>
+        <w:t xml:space="preserve">(</w:t>
+      </w:r>
+      <w:hyperlink w:anchor="def-linear-approximation">
+        <w:r>
+          <w:rPr>
+            <w:rStyle w:val="Hyperlink"/>
+          </w:rPr>
+          <w:t xml:space="preserve">Definition 5</w:t>
+        </w:r>
+      </w:hyperlink>
+      <w:r>
+        <w:t xml:space="preserve">)</w:t>
+      </w:r>
+      <w:r>
+        <w:t xml:space="preserve"> </w:t>
+      </w:r>
+      <w:r>
+        <w:t xml:space="preserve">is an</w:t>
+      </w:r>
+      <w:r>
+        <w:t xml:space="preserve"> </w:t>
+      </w:r>
+      <w:hyperlink r:id="rId71">
+        <w:r>
+          <w:rPr>
+            <w:rStyle w:val="Hyperlink"/>
+          </w:rPr>
+          <w:t xml:space="preserve">affine function</w:t>
+        </w:r>
+      </w:hyperlink>
+      <w:r>
+        <w:t xml:space="preserve"> </w:t>
+      </w:r>
+      <w:r>
+        <w:t xml:space="preserve">of the step</w:t>
+      </w:r>
+      <w:r>
+        <w:t xml:space="preserve"> </w:t>
+      </w:r>
+      <m:oMath>
+        <m:r>
+          <m:t>ϵ</m:t>
+        </m:r>
+      </m:oMath>
+      <w:r>
+        <w:t xml:space="preserve">:</w:t>
+      </w:r>
+      <w:r>
+        <w:t xml:space="preserve"> </w:t>
+      </w:r>
+      <w:r>
+        <w:t xml:space="preserve">its slope is</w:t>
+      </w:r>
+      <w:r>
+        <w:t xml:space="preserve"> </w:t>
+      </w:r>
+      <m:oMath>
+        <m:f>
+          <m:fPr>
+            <m:type m:val="bar"/>
+          </m:fPr>
+          <m:num>
+            <m:r>
+              <m:t>d</m:t>
+            </m:r>
+          </m:num>
+          <m:den>
+            <m:r>
+              <m:t>d</m:t>
+            </m:r>
+            <m:r>
+              <m:t>w</m:t>
+            </m:r>
+          </m:den>
+        </m:f>
+        <m:r>
+          <m:t>f</m:t>
+        </m:r>
+        <m:r>
+          <m:rPr>
+            <m:sty m:val="p"/>
+          </m:rPr>
+          <m:t>(</m:t>
+        </m:r>
+        <m:r>
+          <m:t>w</m:t>
+        </m:r>
+        <m:r>
+          <m:rPr>
+            <m:sty m:val="p"/>
+          </m:rPr>
+          <m:t>)</m:t>
+        </m:r>
+      </m:oMath>
+      <w:r>
+        <w:t xml:space="preserve"> </w:t>
+      </w:r>
+      <w:r>
+        <w:t xml:space="preserve">and its intercept is</w:t>
+      </w:r>
+      <w:r>
+        <w:t xml:space="preserve"> </w:t>
+      </w:r>
+      <m:oMath>
+        <m:r>
+          <m:t>f</m:t>
+        </m:r>
+        <m:r>
+          <m:rPr>
+            <m:sty m:val="p"/>
+          </m:rPr>
+          <m:t>(</m:t>
+        </m:r>
+        <m:r>
+          <m:t>w</m:t>
+        </m:r>
+        <m:r>
+          <m:rPr>
+            <m:sty m:val="p"/>
+          </m:rPr>
+          <m:t>)</m:t>
+        </m:r>
+      </m:oMath>
+      <w:r>
+        <w:t xml:space="preserve">.</w:t>
+      </w:r>
+      <w:r>
+        <w:t xml:space="preserve"> </w:t>
+      </w:r>
+      <w:r>
+        <w:t xml:space="preserve">It is</w:t>
+      </w:r>
+      <w:r>
+        <w:t xml:space="preserve"> </w:t>
+      </w:r>
+      <w:hyperlink r:id="rId72">
+        <w:r>
+          <w:rPr>
+            <w:rStyle w:val="Hyperlink"/>
+          </w:rPr>
+          <w:t xml:space="preserve">linear</w:t>
+        </w:r>
+      </w:hyperlink>
+      <w:r>
+        <w:t xml:space="preserve"> </w:t>
+      </w:r>
+      <w:r>
+        <w:t xml:space="preserve">in</w:t>
+      </w:r>
+      <w:r>
+        <w:t xml:space="preserve"> </w:t>
+      </w:r>
+      <m:oMath>
+        <m:r>
+          <m:t>ϵ</m:t>
+        </m:r>
+      </m:oMath>
+      <w:r>
+        <w:t xml:space="preserve"> </w:t>
+      </w:r>
+      <w:r>
+        <w:t xml:space="preserve">only when</w:t>
+      </w:r>
+      <w:r>
+        <w:t xml:space="preserve"> </w:t>
+      </w:r>
+      <m:oMath>
+        <m:r>
+          <m:t>f</m:t>
+        </m:r>
+        <m:r>
+          <m:rPr>
+            <m:sty m:val="p"/>
+          </m:rPr>
+          <m:t>(</m:t>
+        </m:r>
+        <m:r>
+          <m:t>w</m:t>
+        </m:r>
+        <m:r>
+          <m:rPr>
+            <m:sty m:val="p"/>
+          </m:rPr>
+          <m:t>)</m:t>
+        </m:r>
+        <m:r>
+          <m:rPr>
+            <m:sty m:val="p"/>
+          </m:rPr>
+          <m:t>=</m:t>
+        </m:r>
+        <m:r>
+          <m:t>0</m:t>
+        </m:r>
+      </m:oMath>
+      <w:r>
+        <w:t xml:space="preserve">.</w:t>
+      </w:r>
+      <w:r>
+        <w:t xml:space="preserve"> </w:t>
+      </w:r>
+      <w:r>
+        <w:t xml:space="preserve">The name</w:t>
+      </w:r>
+      <w:r>
+        <w:t xml:space="preserve"> </w:t>
+      </w:r>
+      <w:r>
+        <w:t xml:space="preserve">“linear approximation”</w:t>
+      </w:r>
+      <w:r>
+        <w:t xml:space="preserve"> </w:t>
+      </w:r>
+      <w:r>
+        <w:t xml:space="preserve">uses</w:t>
+      </w:r>
+      <w:r>
+        <w:t xml:space="preserve"> </w:t>
+      </w:r>
+      <w:r>
+        <w:t xml:space="preserve">“linear”</w:t>
+      </w:r>
+      <w:r>
+        <w:t xml:space="preserve"> </w:t>
+      </w:r>
+      <w:r>
+        <w:t xml:space="preserve">in the looser sense of elementary algebra</w:t>
+      </w:r>
+      <w:r>
+        <w:t xml:space="preserve"> </w:t>
+      </w:r>
+      <w:r>
+        <w:t xml:space="preserve">(</w:t>
+      </w:r>
+      <w:hyperlink r:id="rId73">
+        <w:r>
+          <w:rPr>
+            <w:rStyle w:val="Hyperlink"/>
+          </w:rPr>
+          <w:t xml:space="preserve">remark</w:t>
+        </w:r>
+      </w:hyperlink>
+      <w:r>
+        <w:t xml:space="preserve">).</w:t>
+      </w:r>
+      <w:r>
+        <w:t xml:space="preserve"> </w:t>
+      </w:r>
+      <w:r>
+        <w:t xml:space="preserve">Boyd and Vandenberghe (2018)</w:t>
+      </w:r>
+      <w:r>
+        <w:t xml:space="preserve">, section 2.2, treats the first-order Taylor approximation</w:t>
+      </w:r>
+      <w:r>
+        <w:t xml:space="preserve"> </w:t>
+      </w:r>
+      <w:r>
+        <w:t xml:space="preserve">as an affine function for functions of several variables as well.</w:t>
+      </w:r>
+    </w:p>
+    <w:bookmarkEnd w:id="74"/>
+    <w:bookmarkStart w:id="75" w:name="def-flat-point"/>
+    <w:p>
+      <w:pPr>
+        <w:pStyle w:val="BodyText"/>
+      </w:pPr>
+      <w:r>
+        <w:rPr>
+          <w:b/>
+          <w:bCs/>
+        </w:rPr>
+        <w:t xml:space="preserve">Definition 6 (Flat point)</w:t>
       </w:r>
       <w:r>
         <w:t xml:space="preserve"> </w:t>
@@ -8764,8 +9438,8 @@
         <w:t xml:space="preserve">.</w:t>
       </w:r>
     </w:p>
-    <w:bookmarkEnd w:id="70"/>
-    <w:bookmarkStart w:id="71" w:name="exm-flat-point"/>
+    <w:bookmarkEnd w:id="75"/>
+    <w:bookmarkStart w:id="76" w:name="exm-flat-point"/>
     <w:p>
       <w:pPr>
         <w:pStyle w:val="BodyText"/>
@@ -9426,8 +10100,8 @@
         <w:t xml:space="preserve">is not a flat point.</w:t>
       </w:r>
     </w:p>
-    <w:bookmarkEnd w:id="71"/>
-    <w:bookmarkStart w:id="72" w:name="exr-flat-point"/>
+    <w:bookmarkEnd w:id="76"/>
+    <w:bookmarkStart w:id="77" w:name="exr-flat-point"/>
     <w:p>
       <w:pPr>
         <w:pStyle w:val="FirstParagraph"/>
@@ -9655,8 +10329,8 @@
         <w:t xml:space="preserve">, and compare that prediction with the exact value.</w:t>
       </w:r>
     </w:p>
-    <w:bookmarkEnd w:id="72"/>
-    <w:bookmarkStart w:id="73" w:name="sol-flat-point"/>
+    <w:bookmarkEnd w:id="77"/>
+    <w:bookmarkStart w:id="78" w:name="sol-flat-point"/>
     <w:p>
       <w:pPr>
         <w:pStyle w:val="FirstParagraph"/>
@@ -10392,10 +11066,10 @@
         <w:t xml:space="preserve">and the recommendation is trustworthy only as far as the step is small.</w:t>
       </w:r>
     </w:p>
-    <w:bookmarkEnd w:id="73"/>
-    <w:bookmarkEnd w:id="74"/>
-    <w:bookmarkEnd w:id="75"/>
-    <w:bookmarkStart w:id="180" w:name="sec-integration"/>
+    <w:bookmarkEnd w:id="78"/>
+    <w:bookmarkEnd w:id="79"/>
+    <w:bookmarkEnd w:id="80"/>
+    <w:bookmarkStart w:id="185" w:name="sec-integration"/>
     <w:p>
       <w:pPr>
         <w:pStyle w:val="Heading2"/>
@@ -10477,12 +11151,12 @@
                 <wp:inline>
                   <wp:extent cx="152400" cy="152400"/>
                   <wp:effectExtent b="0" l="0" r="0" t="0"/>
-                  <wp:docPr descr="" title="" id="76" name="Picture"/>
+                  <wp:docPr descr="" title="" id="81" name="Picture"/>
                   <a:graphic>
                     <a:graphicData uri="http://schemas.openxmlformats.org/drawingml/2006/picture">
                       <pic:pic>
                         <pic:nvPicPr>
-                          <pic:cNvPr descr="/opt/quarto/share/formats/docx/tip.png" id="77" name="Picture"/>
+                          <pic:cNvPr descr="/opt/quarto/share/formats/docx/tip.png" id="82" name="Picture"/>
                           <pic:cNvPicPr>
                             <a:picLocks noChangeArrowheads="1" noChangeAspect="1"/>
                           </pic:cNvPicPr>
@@ -10568,7 +11242,7 @@
                 <w:numId w:val="1013"/>
               </w:numPr>
             </w:pPr>
-            <w:hyperlink r:id="rId78">
+            <w:hyperlink r:id="rId83">
               <w:r>
                 <w:rPr>
                   <w:rStyle w:val="Hyperlink"/>
@@ -10585,7 +11259,7 @@
                 <w:numId w:val="1013"/>
               </w:numPr>
             </w:pPr>
-            <w:hyperlink r:id="rId79">
+            <w:hyperlink r:id="rId84">
               <w:r>
                 <w:rPr>
                   <w:rStyle w:val="Hyperlink"/>
@@ -10598,7 +11272,7 @@
         </w:tc>
       </w:tr>
     </w:tbl>
-    <w:bookmarkStart w:id="98" w:name="antiderivatives"/>
+    <w:bookmarkStart w:id="103" w:name="antiderivatives"/>
     <w:p>
       <w:pPr>
         <w:pStyle w:val="Heading3"/>
@@ -10607,7 +11281,7 @@
         <w:t xml:space="preserve">2.1 Antiderivatives</w:t>
       </w:r>
     </w:p>
-    <w:bookmarkStart w:id="80" w:name="def-antiderivative"/>
+    <w:bookmarkStart w:id="85" w:name="def-antiderivative"/>
     <w:p>
       <w:pPr>
         <w:pStyle w:val="FirstParagraph"/>
@@ -10617,7 +11291,7 @@
           <w:b/>
           <w:bCs/>
         </w:rPr>
-        <w:t xml:space="preserve">Definition 6 (Antiderivative)</w:t>
+        <w:t xml:space="preserve">Definition 7 (Antiderivative)</w:t>
       </w:r>
       <w:r>
         <w:t xml:space="preserve"> </w:t>
@@ -10797,8 +11471,8 @@
         <w:t xml:space="preserve">(Larson and Edwards 2018, sec. 4.1, pp. 248–249)</w:t>
       </w:r>
     </w:p>
-    <w:bookmarkEnd w:id="80"/>
-    <w:bookmarkStart w:id="81" w:name="def-indefinite-integral"/>
+    <w:bookmarkEnd w:id="85"/>
+    <w:bookmarkStart w:id="86" w:name="def-indefinite-integral"/>
     <w:p>
       <w:pPr>
         <w:pStyle w:val="BodyText"/>
@@ -10808,7 +11482,7 @@
           <w:b/>
           <w:bCs/>
         </w:rPr>
-        <w:t xml:space="preserve">Definition 7 (Indefinite integral)</w:t>
+        <w:t xml:space="preserve">Definition 8 (Indefinite integral)</w:t>
       </w:r>
       <w:r>
         <w:t xml:space="preserve"> </w:t>
@@ -10857,7 +11531,7 @@
           <w:rPr>
             <w:rStyle w:val="Hyperlink"/>
           </w:rPr>
-          <w:t xml:space="preserve">Definition 6</w:t>
+          <w:t xml:space="preserve">Definition 7</w:t>
         </w:r>
       </w:hyperlink>
       <w:r>
@@ -11011,8 +11685,8 @@
         <w:t xml:space="preserve">(Larson and Edwards 2018, sec. 4.1, pp. 248–249)</w:t>
       </w:r>
     </w:p>
-    <w:bookmarkEnd w:id="81"/>
-    <w:bookmarkStart w:id="91" w:name="exm-antiderivative-power"/>
+    <w:bookmarkEnd w:id="86"/>
+    <w:bookmarkStart w:id="96" w:name="exm-antiderivative-power"/>
     <w:p>
       <w:pPr>
         <w:pStyle w:val="BodyText"/>
@@ -11596,7 +12270,7 @@
         <w:t xml:space="preserve">.</w:t>
       </w:r>
     </w:p>
-    <w:bookmarkStart w:id="90" w:name="fig-antiderivatives"/>
+    <w:bookmarkStart w:id="95" w:name="fig-antiderivatives"/>
     <w:tbl>
       <w:tblPr>
         <w:tblStyle w:val="Table"/>
@@ -11624,7 +12298,7 @@
             <w:tr>
               <w:tc>
                 <w:tcPr/>
-                <w:bookmarkStart w:id="85" w:name="fig-antiderivatives-f"/>
+                <w:bookmarkStart w:id="90" w:name="fig-antiderivatives-f"/>
                 <w:p>
                   <w:pPr>
                     <w:pStyle w:val="SourceCode"/>
@@ -11891,18 +12565,18 @@
                       <wp:inline>
                         <wp:extent cx="2971800" cy="2377440"/>
                         <wp:effectExtent b="0" l="0" r="0" t="0"/>
-                        <wp:docPr descr="" title="" id="83" name="Picture"/>
+                        <wp:docPr descr="" title="" id="88" name="Picture"/>
                         <a:graphic>
                           <a:graphicData uri="http://schemas.openxmlformats.org/drawingml/2006/picture">
                             <pic:pic>
                               <pic:nvPicPr>
-                                <pic:cNvPr descr="calculus_files/figure-docx/antiderivatives-f-code-1.png" id="84" name="Picture"/>
+                                <pic:cNvPr descr="calculus_files/figure-docx/antiderivatives-f-code-1.png" id="89" name="Picture"/>
                                 <pic:cNvPicPr>
                                   <a:picLocks noChangeArrowheads="1" noChangeAspect="1"/>
                                 </pic:cNvPicPr>
                               </pic:nvPicPr>
                               <pic:blipFill>
-                                <a:blip r:embed="rId82"/>
+                                <a:blip r:embed="rId87"/>
                                 <a:stretch>
                                   <a:fillRect/>
                                 </a:stretch>
@@ -11987,7 +12661,7 @@
                     <w:t xml:space="preserve">.</w:t>
                   </w:r>
                 </w:p>
-                <w:bookmarkEnd w:id="85"/>
+                <w:bookmarkEnd w:id="90"/>
               </w:tc>
             </w:tr>
           </w:tbl>
@@ -12037,7 +12711,7 @@
             <w:tr>
               <w:tc>
                 <w:tcPr/>
-                <w:bookmarkStart w:id="89" w:name="fig-antiderivatives-F"/>
+                <w:bookmarkStart w:id="94" w:name="fig-antiderivatives-F"/>
                 <w:p>
                   <w:pPr>
                     <w:pStyle w:val="SourceCode"/>
@@ -12637,18 +13311,18 @@
                       <wp:inline>
                         <wp:extent cx="2971800" cy="2377440"/>
                         <wp:effectExtent b="0" l="0" r="0" t="0"/>
-                        <wp:docPr descr="" title="" id="87" name="Picture"/>
+                        <wp:docPr descr="" title="" id="92" name="Picture"/>
                         <a:graphic>
                           <a:graphicData uri="http://schemas.openxmlformats.org/drawingml/2006/picture">
                             <pic:pic>
                               <pic:nvPicPr>
-                                <pic:cNvPr descr="calculus_files/figure-docx/antiderivatives-F-code-1.png" id="88" name="Picture"/>
+                                <pic:cNvPr descr="calculus_files/figure-docx/antiderivatives-F-code-1.png" id="93" name="Picture"/>
                                 <pic:cNvPicPr>
                                   <a:picLocks noChangeArrowheads="1" noChangeAspect="1"/>
                                 </pic:cNvPicPr>
                               </pic:nvPicPr>
                               <pic:blipFill>
-                                <a:blip r:embed="rId86"/>
+                                <a:blip r:embed="rId91"/>
                                 <a:stretch>
                                   <a:fillRect/>
                                 </a:stretch>
@@ -12751,7 +13425,7 @@
                     <w:t xml:space="preserve">.</w:t>
                   </w:r>
                 </w:p>
-                <w:bookmarkEnd w:id="89"/>
+                <w:bookmarkEnd w:id="94"/>
               </w:tc>
             </w:tr>
           </w:tbl>
@@ -12980,9 +13654,9 @@
         <w:t xml:space="preserve">; they differ only by a vertical shift.</w:t>
       </w:r>
     </w:p>
-    <w:bookmarkEnd w:id="90"/>
-    <w:bookmarkEnd w:id="91"/>
-    <w:bookmarkStart w:id="92" w:name="thm-integral-rules"/>
+    <w:bookmarkEnd w:id="95"/>
+    <w:bookmarkEnd w:id="96"/>
+    <w:bookmarkStart w:id="97" w:name="thm-integral-rules"/>
     <w:p>
       <w:pPr>
         <w:pStyle w:val="BodyText"/>
@@ -13022,7 +13696,7 @@
           <w:rPr>
             <w:rStyle w:val="Hyperlink"/>
           </w:rPr>
-          <w:t xml:space="preserve">Definition 6</w:t>
+          <w:t xml:space="preserve">Definition 7</w:t>
         </w:r>
       </w:hyperlink>
       <w:r>
@@ -13962,8 +14636,8 @@
         <w:t xml:space="preserve">.</w:t>
       </w:r>
     </w:p>
-    <w:bookmarkEnd w:id="92"/>
-    <w:bookmarkStart w:id="93" w:name="exm-integral-rules-quadratic"/>
+    <w:bookmarkEnd w:id="97"/>
+    <w:bookmarkStart w:id="98" w:name="exm-integral-rules-quadratic"/>
     <w:p>
       <w:pPr>
         <w:pStyle w:val="BodyText"/>
@@ -14359,7 +15033,7 @@
         <w:t xml:space="preserve">, as required.</w:t>
       </w:r>
     </w:p>
-    <w:bookmarkEnd w:id="93"/>
+    <w:bookmarkEnd w:id="98"/>
     <w:tbl>
       <w:tblPr>
         <w:tblStyle w:val="Table"/>
@@ -14401,12 +15075,12 @@
                 <wp:inline>
                   <wp:extent cx="152400" cy="152400"/>
                   <wp:effectExtent b="0" l="0" r="0" t="0"/>
-                  <wp:docPr descr="" title="" id="94" name="Picture"/>
+                  <wp:docPr descr="" title="" id="99" name="Picture"/>
                   <a:graphic>
                     <a:graphicData uri="http://schemas.openxmlformats.org/drawingml/2006/picture">
                       <pic:pic>
                         <pic:nvPicPr>
-                          <pic:cNvPr descr="/opt/quarto/share/formats/docx/tip.png" id="95" name="Picture"/>
+                          <pic:cNvPr descr="/opt/quarto/share/formats/docx/tip.png" id="100" name="Picture"/>
                           <pic:cNvPicPr>
                             <a:picLocks noChangeArrowheads="1" noChangeAspect="1"/>
                           </pic:cNvPicPr>
@@ -14492,7 +15166,7 @@
                 <w:numId w:val="1014"/>
               </w:numPr>
             </w:pPr>
-            <w:hyperlink r:id="rId96">
+            <w:hyperlink r:id="rId101">
               <w:r>
                 <w:rPr>
                   <w:rStyle w:val="Hyperlink"/>
@@ -14509,7 +15183,7 @@
                 <w:numId w:val="1014"/>
               </w:numPr>
             </w:pPr>
-            <w:hyperlink r:id="rId97">
+            <w:hyperlink r:id="rId102">
               <w:r>
                 <w:rPr>
                   <w:rStyle w:val="Hyperlink"/>
@@ -14522,8 +15196,8 @@
         </w:tc>
       </w:tr>
     </w:tbl>
-    <w:bookmarkEnd w:id="98"/>
-    <w:bookmarkStart w:id="144" w:name="regularity-conditions"/>
+    <w:bookmarkEnd w:id="103"/>
+    <w:bookmarkStart w:id="149" w:name="regularity-conditions"/>
     <w:p>
       <w:pPr>
         <w:pStyle w:val="Heading3"/>
@@ -14532,7 +15206,7 @@
         <w:t xml:space="preserve">2.2 Regularity Conditions</w:t>
       </w:r>
     </w:p>
-    <w:bookmarkStart w:id="99" w:name="def-differentiable-on"/>
+    <w:bookmarkStart w:id="104" w:name="def-differentiable-on"/>
     <w:p>
       <w:pPr>
         <w:pStyle w:val="FirstParagraph"/>
@@ -14542,7 +15216,7 @@
           <w:b/>
           <w:bCs/>
         </w:rPr>
-        <w:t xml:space="preserve">Definition 8 (Differentiable on an interval)</w:t>
+        <w:t xml:space="preserve">Definition 9 (Differentiable on an interval)</w:t>
       </w:r>
       <w:r>
         <w:t xml:space="preserve"> </w:t>
@@ -14612,8 +15286,8 @@
         <w:t xml:space="preserve">(Larson and Edwards 2018, sec. 2.1, p. 100)</w:t>
       </w:r>
     </w:p>
-    <w:bookmarkEnd w:id="99"/>
-    <w:bookmarkStart w:id="100" w:name="exm-differentiable-on"/>
+    <w:bookmarkEnd w:id="104"/>
+    <w:bookmarkStart w:id="105" w:name="exm-differentiable-on"/>
     <w:p>
       <w:pPr>
         <w:pStyle w:val="BodyText"/>
@@ -15123,8 +15797,8 @@
         <w:t xml:space="preserve">is not differentiable there.</w:t>
       </w:r>
     </w:p>
-    <w:bookmarkEnd w:id="100"/>
-    <w:bookmarkStart w:id="101" w:name="def-continuous"/>
+    <w:bookmarkEnd w:id="105"/>
+    <w:bookmarkStart w:id="106" w:name="def-continuous"/>
     <w:p>
       <w:pPr>
         <w:pStyle w:val="FirstParagraph"/>
@@ -15134,7 +15808,7 @@
           <w:b/>
           <w:bCs/>
         </w:rPr>
-        <w:t xml:space="preserve">Definition 9 (Continuous function)</w:t>
+        <w:t xml:space="preserve">Definition 10 (Continuous function)</w:t>
       </w:r>
       <w:r>
         <w:t xml:space="preserve"> </w:t>
@@ -15372,8 +16046,8 @@
         <w:t xml:space="preserve">(Larson and Edwards 2018, sec. 1.4, p. 73)</w:t>
       </w:r>
     </w:p>
-    <w:bookmarkEnd w:id="101"/>
-    <w:bookmarkStart w:id="102" w:name="exm-continuous"/>
+    <w:bookmarkEnd w:id="106"/>
+    <w:bookmarkStart w:id="107" w:name="exm-continuous"/>
     <w:p>
       <w:pPr>
         <w:pStyle w:val="BodyText"/>
@@ -16438,8 +17112,8 @@
         <w:t xml:space="preserve">.</w:t>
       </w:r>
     </w:p>
-    <w:bookmarkEnd w:id="102"/>
-    <w:bookmarkStart w:id="103" w:name="def-continuous-on"/>
+    <w:bookmarkEnd w:id="107"/>
+    <w:bookmarkStart w:id="108" w:name="def-continuous-on"/>
     <w:p>
       <w:pPr>
         <w:pStyle w:val="FirstParagraph"/>
@@ -16449,7 +17123,7 @@
           <w:b/>
           <w:bCs/>
         </w:rPr>
-        <w:t xml:space="preserve">Definition 10 (Continuous on a closed interval)</w:t>
+        <w:t xml:space="preserve">Definition 11 (Continuous on a closed interval)</w:t>
       </w:r>
       <w:r>
         <w:t xml:space="preserve"> </w:t>
@@ -16547,7 +17221,7 @@
           <w:rPr>
             <w:rStyle w:val="Hyperlink"/>
           </w:rPr>
-          <w:t xml:space="preserve">Definition 9</w:t>
+          <w:t xml:space="preserve">Definition 10</w:t>
         </w:r>
       </w:hyperlink>
       <w:r>
@@ -16778,8 +17452,8 @@
         <w:t xml:space="preserve">(Larson and Edwards 2018, sec. 1.4, p. 73)</w:t>
       </w:r>
     </w:p>
-    <w:bookmarkEnd w:id="103"/>
-    <w:bookmarkStart w:id="105" w:name="exm-continuous-on-sqrt"/>
+    <w:bookmarkEnd w:id="108"/>
+    <w:bookmarkStart w:id="110" w:name="exm-continuous-on-sqrt"/>
     <w:p>
       <w:pPr>
         <w:pStyle w:val="BodyText"/>
@@ -16890,7 +17564,7 @@
       <w:r>
         <w:t xml:space="preserve"> </w:t>
       </w:r>
-      <w:hyperlink r:id="rId104">
+      <w:hyperlink r:id="rId109">
         <w:r>
           <w:rPr>
             <w:rStyle w:val="Hyperlink"/>
@@ -17009,7 +17683,7 @@
           <w:rPr>
             <w:rStyle w:val="Hyperlink"/>
           </w:rPr>
-          <w:t xml:space="preserve">Definition 10</w:t>
+          <w:t xml:space="preserve">Definition 11</w:t>
         </w:r>
       </w:hyperlink>
       <w:r>
@@ -17323,15 +17997,15 @@
           <w:rPr>
             <w:rStyle w:val="Hyperlink"/>
           </w:rPr>
-          <w:t xml:space="preserve">Definition 10</w:t>
+          <w:t xml:space="preserve">Definition 11</w:t>
         </w:r>
       </w:hyperlink>
       <w:r>
         <w:t xml:space="preserve">).</w:t>
       </w:r>
     </w:p>
-    <w:bookmarkEnd w:id="105"/>
-    <w:bookmarkStart w:id="106" w:name="exm-not-continuous-on"/>
+    <w:bookmarkEnd w:id="110"/>
+    <w:bookmarkStart w:id="111" w:name="exm-not-continuous-on"/>
     <w:p>
       <w:pPr>
         <w:pStyle w:val="BodyText"/>
@@ -17508,7 +18182,7 @@
           <w:rPr>
             <w:rStyle w:val="Hyperlink"/>
           </w:rPr>
-          <w:t xml:space="preserve">Definition 10</w:t>
+          <w:t xml:space="preserve">Definition 11</w:t>
         </w:r>
       </w:hyperlink>
       <w:r>
@@ -17680,8 +18354,8 @@
         <w:t xml:space="preserve">.</w:t>
       </w:r>
     </w:p>
-    <w:bookmarkEnd w:id="106"/>
-    <w:bookmarkStart w:id="107" w:name="def-partition"/>
+    <w:bookmarkEnd w:id="111"/>
+    <w:bookmarkStart w:id="112" w:name="def-partition"/>
     <w:p>
       <w:pPr>
         <w:pStyle w:val="BodyText"/>
@@ -17691,7 +18365,7 @@
           <w:b/>
           <w:bCs/>
         </w:rPr>
-        <w:t xml:space="preserve">Definition 11 (Partition of an interval)</w:t>
+        <w:t xml:space="preserve">Definition 12 (Partition of an interval)</w:t>
       </w:r>
       <w:r>
         <w:t xml:space="preserve"> </w:t>
@@ -18073,8 +18747,8 @@
         <w:t xml:space="preserve">(Larson and Edwards 2018, sec. 4.3)</w:t>
       </w:r>
     </w:p>
-    <w:bookmarkEnd w:id="107"/>
-    <w:bookmarkStart w:id="108" w:name="exm-partition"/>
+    <w:bookmarkEnd w:id="112"/>
+    <w:bookmarkStart w:id="113" w:name="exm-partition"/>
     <w:p>
       <w:pPr>
         <w:pStyle w:val="BodyText"/>
@@ -18343,8 +19017,8 @@
         <w:t xml:space="preserve">.</w:t>
       </w:r>
     </w:p>
-    <w:bookmarkEnd w:id="108"/>
-    <w:bookmarkStart w:id="109" w:name="exm-not-partition"/>
+    <w:bookmarkEnd w:id="113"/>
+    <w:bookmarkStart w:id="114" w:name="exm-not-partition"/>
     <w:p>
       <w:pPr>
         <w:pStyle w:val="BodyText"/>
@@ -18562,8 +19236,8 @@
         <w:t xml:space="preserve">.</w:t>
       </w:r>
     </w:p>
-    <w:bookmarkEnd w:id="109"/>
-    <w:bookmarkStart w:id="110" w:name="def-mesh"/>
+    <w:bookmarkEnd w:id="114"/>
+    <w:bookmarkStart w:id="115" w:name="def-mesh"/>
     <w:p>
       <w:pPr>
         <w:pStyle w:val="FirstParagraph"/>
@@ -18573,7 +19247,7 @@
           <w:b/>
           <w:bCs/>
         </w:rPr>
-        <w:t xml:space="preserve">Definition 12 (Mesh of a partition)</w:t>
+        <w:t xml:space="preserve">Definition 13 (Mesh of a partition)</w:t>
       </w:r>
       <w:r>
         <w:t xml:space="preserve"> </w:t>
@@ -18620,7 +19294,7 @@
           <w:rPr>
             <w:rStyle w:val="Hyperlink"/>
           </w:rPr>
-          <w:t xml:space="preserve">Definition 11</w:t>
+          <w:t xml:space="preserve">Definition 12</w:t>
         </w:r>
       </w:hyperlink>
       <w:r>
@@ -18807,8 +19481,8 @@
         <w:t xml:space="preserve">(Larson and Edwards 2018, sec. 4.3)</w:t>
       </w:r>
     </w:p>
-    <w:bookmarkEnd w:id="110"/>
-    <w:bookmarkStart w:id="111" w:name="exm-mesh"/>
+    <w:bookmarkEnd w:id="115"/>
+    <w:bookmarkStart w:id="116" w:name="exm-mesh"/>
     <w:p>
       <w:pPr>
         <w:pStyle w:val="BodyText"/>
@@ -19069,8 +19743,8 @@
         <w:t xml:space="preserve">.</w:t>
       </w:r>
     </w:p>
-    <w:bookmarkEnd w:id="111"/>
-    <w:bookmarkStart w:id="113" w:name="def-riemann-integral"/>
+    <w:bookmarkEnd w:id="116"/>
+    <w:bookmarkStart w:id="118" w:name="def-riemann-integral"/>
     <w:p>
       <w:pPr>
         <w:pStyle w:val="BodyText"/>
@@ -19080,7 +19754,7 @@
           <w:b/>
           <w:bCs/>
         </w:rPr>
-        <w:t xml:space="preserve">Definition 13 (Riemann integral)</w:t>
+        <w:t xml:space="preserve">Definition 14 (Riemann integral)</w:t>
       </w:r>
       <w:r>
         <w:t xml:space="preserve"> </w:t>
@@ -19105,7 +19779,7 @@
       <w:r>
         <w:t xml:space="preserve"> </w:t>
       </w:r>
-      <w:hyperlink r:id="rId112">
+      <w:hyperlink r:id="rId117">
         <w:r>
           <w:rPr>
             <w:rStyle w:val="Hyperlink"/>
@@ -19215,7 +19889,7 @@
           <w:rPr>
             <w:rStyle w:val="Hyperlink"/>
           </w:rPr>
-          <w:t xml:space="preserve">Definition 11</w:t>
+          <w:t xml:space="preserve">Definition 12</w:t>
         </w:r>
       </w:hyperlink>
       <w:r>
@@ -19393,7 +20067,7 @@
           <w:rPr>
             <w:rStyle w:val="Hyperlink"/>
           </w:rPr>
-          <w:t xml:space="preserve">Definition 12</w:t>
+          <w:t xml:space="preserve">Definition 13</w:t>
         </w:r>
       </w:hyperlink>
       <w:r>
@@ -19659,8 +20333,8 @@
         <w:t xml:space="preserve">(Larson and Edwards 2018, sec. 4.3, p. 272)</w:t>
       </w:r>
     </w:p>
-    <w:bookmarkEnd w:id="113"/>
-    <w:bookmarkStart w:id="114" w:name="def-integrable"/>
+    <w:bookmarkEnd w:id="118"/>
+    <w:bookmarkStart w:id="119" w:name="def-integrable"/>
     <w:p>
       <w:pPr>
         <w:pStyle w:val="BodyText"/>
@@ -19670,7 +20344,7 @@
           <w:b/>
           <w:bCs/>
         </w:rPr>
-        <w:t xml:space="preserve">Definition 14 (Riemann integrable)</w:t>
+        <w:t xml:space="preserve">Definition 15 (Riemann integrable)</w:t>
       </w:r>
       <w:r>
         <w:t xml:space="preserve"> </w:t>
@@ -19894,7 +20568,7 @@
           <w:rPr>
             <w:rStyle w:val="Hyperlink"/>
           </w:rPr>
-          <w:t xml:space="preserve">Definition 11</w:t>
+          <w:t xml:space="preserve">Definition 12</w:t>
         </w:r>
       </w:hyperlink>
       <w:r>
@@ -20037,7 +20711,7 @@
           <w:rPr>
             <w:rStyle w:val="Hyperlink"/>
           </w:rPr>
-          <w:t xml:space="preserve">Definition 12</w:t>
+          <w:t xml:space="preserve">Definition 13</w:t>
         </w:r>
       </w:hyperlink>
       <w:r>
@@ -20064,8 +20738,8 @@
         <w:t xml:space="preserve">(Larson and Edwards 2018, sec. 4.3, p. 272)</w:t>
       </w:r>
     </w:p>
-    <w:bookmarkEnd w:id="114"/>
-    <w:bookmarkStart w:id="115" w:name="exm-integrable-constant"/>
+    <w:bookmarkEnd w:id="119"/>
+    <w:bookmarkStart w:id="120" w:name="exm-integrable-constant"/>
     <w:p>
       <w:pPr>
         <w:pStyle w:val="BodyText"/>
@@ -20623,7 +21297,7 @@
           <w:rPr>
             <w:rStyle w:val="Hyperlink"/>
           </w:rPr>
-          <w:t xml:space="preserve">Definition 14</w:t>
+          <w:t xml:space="preserve">Definition 15</w:t>
         </w:r>
       </w:hyperlink>
       <w:r>
@@ -20692,15 +21366,15 @@
           <w:rPr>
             <w:rStyle w:val="Hyperlink"/>
           </w:rPr>
-          <w:t xml:space="preserve">Definition 13</w:t>
+          <w:t xml:space="preserve">Definition 14</w:t>
         </w:r>
       </w:hyperlink>
       <w:r>
         <w:t xml:space="preserve">).</w:t>
       </w:r>
     </w:p>
-    <w:bookmarkEnd w:id="115"/>
-    <w:bookmarkStart w:id="118" w:name="rem-integrable-integral"/>
+    <w:bookmarkEnd w:id="120"/>
+    <w:bookmarkStart w:id="123" w:name="rem-integrable-integral"/>
     <w:p>
       <w:pPr>
         <w:pStyle w:val="BodyText"/>
@@ -20710,7 +21384,7 @@
           <w:i/>
           <w:iCs/>
         </w:rPr>
-        <w:t xml:space="preserve">Remark 1</w:t>
+        <w:t xml:space="preserve">Remark 2</w:t>
       </w:r>
       <w:r>
         <w:t xml:space="preserve"> (Riemann integrable functions and Riemann integrals). </w:t>
@@ -20830,7 +21504,7 @@
           <w:rPr>
             <w:rStyle w:val="Hyperlink"/>
           </w:rPr>
-          <w:t xml:space="preserve">Definition 13</w:t>
+          <w:t xml:space="preserve">Definition 14</w:t>
         </w:r>
       </w:hyperlink>
       <w:r>
@@ -20903,7 +21577,7 @@
       <w:r>
         <w:t xml:space="preserve"> </w:t>
       </w:r>
-      <w:hyperlink r:id="rId116">
+      <w:hyperlink r:id="rId121">
         <w:r>
           <w:rPr>
             <w:rStyle w:val="Hyperlink"/>
@@ -20972,7 +21646,7 @@
       <w:r>
         <w:t xml:space="preserve"> </w:t>
       </w:r>
-      <w:hyperlink r:id="rId117">
+      <w:hyperlink r:id="rId122">
         <w:r>
           <w:rPr>
             <w:rStyle w:val="Hyperlink"/>
@@ -21410,8 +22084,8 @@
         <w:t xml:space="preserve">does not exist.</w:t>
       </w:r>
     </w:p>
-    <w:bookmarkEnd w:id="118"/>
-    <w:bookmarkStart w:id="119" w:name="def-riemann-sum-equal-width"/>
+    <w:bookmarkEnd w:id="123"/>
+    <w:bookmarkStart w:id="124" w:name="def-riemann-sum-equal-width"/>
     <w:p>
       <w:pPr>
         <w:pStyle w:val="BodyText"/>
@@ -21421,7 +22095,7 @@
           <w:b/>
           <w:bCs/>
         </w:rPr>
-        <w:t xml:space="preserve">Definition 15 (Equal-width Riemann sum)</w:t>
+        <w:t xml:space="preserve">Definition 16 (Equal-width Riemann sum)</w:t>
       </w:r>
       <w:r>
         <w:t xml:space="preserve"> </w:t>
@@ -21809,8 +22483,8 @@
         </m:oMath>
       </m:oMathPara>
     </w:p>
-    <w:bookmarkEnd w:id="119"/>
-    <w:bookmarkStart w:id="120" w:name="exm-equal-width-sum"/>
+    <w:bookmarkEnd w:id="124"/>
+    <w:bookmarkStart w:id="125" w:name="exm-equal-width-sum"/>
     <w:p>
       <w:pPr>
         <w:pStyle w:val="FirstParagraph"/>
@@ -22411,7 +23085,7 @@
         </m:oMath>
       </m:oMathPara>
     </w:p>
-    <w:bookmarkEnd w:id="120"/>
+    <w:bookmarkEnd w:id="125"/>
     <w:tbl>
       <w:tblPr>
         <w:tblStyle w:val="Table"/>
@@ -22453,12 +23127,12 @@
                 <wp:inline>
                   <wp:extent cx="152400" cy="152400"/>
                   <wp:effectExtent b="0" l="0" r="0" t="0"/>
-                  <wp:docPr descr="" title="" id="121" name="Picture"/>
+                  <wp:docPr descr="" title="" id="126" name="Picture"/>
                   <a:graphic>
                     <a:graphicData uri="http://schemas.openxmlformats.org/drawingml/2006/picture">
                       <pic:pic>
                         <pic:nvPicPr>
-                          <pic:cNvPr descr="/opt/quarto/share/formats/docx/tip.png" id="122" name="Picture"/>
+                          <pic:cNvPr descr="/opt/quarto/share/formats/docx/tip.png" id="127" name="Picture"/>
                           <pic:cNvPicPr>
                             <a:picLocks noChangeArrowheads="1" noChangeAspect="1"/>
                           </pic:cNvPicPr>
@@ -22544,7 +23218,7 @@
                 <w:numId w:val="1020"/>
               </w:numPr>
             </w:pPr>
-            <w:hyperlink r:id="rId123">
+            <w:hyperlink r:id="rId128">
               <w:r>
                 <w:rPr>
                   <w:rStyle w:val="Hyperlink"/>
@@ -22561,7 +23235,7 @@
                 <w:numId w:val="1020"/>
               </w:numPr>
             </w:pPr>
-            <w:hyperlink r:id="rId124">
+            <w:hyperlink r:id="rId129">
               <w:r>
                 <w:rPr>
                   <w:rStyle w:val="Hyperlink"/>
@@ -22654,7 +23328,7 @@
       <w:r>
         <w:t xml:space="preserve"> </w:t>
       </w:r>
-      <w:hyperlink r:id="rId125">
+      <w:hyperlink r:id="rId130">
         <w:r>
           <w:rPr>
             <w:rStyle w:val="Hyperlink"/>
@@ -22711,7 +23385,7 @@
         <w:t xml:space="preserve">which says what continuity buys us.</w:t>
       </w:r>
     </w:p>
-    <w:bookmarkStart w:id="126" w:name="thm-diff-implies-cont"/>
+    <w:bookmarkStart w:id="131" w:name="thm-diff-implies-cont"/>
     <w:p>
       <w:pPr>
         <w:pStyle w:val="BodyText"/>
@@ -22806,7 +23480,7 @@
         <w:t xml:space="preserve">(Larson and Edwards 2018, Theorem 2.1, p. 106)</w:t>
       </w:r>
     </w:p>
-    <w:bookmarkEnd w:id="126"/>
+    <w:bookmarkEnd w:id="131"/>
     <w:p>
       <w:pPr>
         <w:pStyle w:val="BodyText"/>
@@ -23674,7 +24348,7 @@
           <w:rPr>
             <w:rStyle w:val="Hyperlink"/>
           </w:rPr>
-          <w:t xml:space="preserve">Definition 9</w:t>
+          <w:t xml:space="preserve">Definition 10</w:t>
         </w:r>
       </w:hyperlink>
       <w:r>
@@ -23684,7 +24358,7 @@
         <w:t xml:space="preserve">hold.</w:t>
       </w:r>
     </w:p>
-    <w:bookmarkStart w:id="127" w:name="exm-diff-implies-cont"/>
+    <w:bookmarkStart w:id="132" w:name="exm-diff-implies-cont"/>
     <w:p>
       <w:pPr>
         <w:pStyle w:val="BodyText"/>
@@ -23887,8 +24561,8 @@
         <w:t xml:space="preserve">it is continuous everywhere.</w:t>
       </w:r>
     </w:p>
-    <w:bookmarkEnd w:id="127"/>
-    <w:bookmarkStart w:id="134" w:name="exm-cont-not-diff"/>
+    <w:bookmarkEnd w:id="132"/>
+    <w:bookmarkStart w:id="139" w:name="exm-cont-not-diff"/>
     <w:p>
       <w:pPr>
         <w:pStyle w:val="BodyText"/>
@@ -24180,7 +24854,7 @@
       <w:r>
         <w:t xml:space="preserve"> </w:t>
       </w:r>
-      <w:hyperlink r:id="rId128">
+      <w:hyperlink r:id="rId133">
         <w:r>
           <w:rPr>
             <w:rStyle w:val="Hyperlink"/>
@@ -24197,7 +24871,7 @@
       <w:r>
         <w:t xml:space="preserve"> </w:t>
       </w:r>
-      <w:hyperlink r:id="rId129">
+      <w:hyperlink r:id="rId134">
         <w:r>
           <w:rPr>
             <w:rStyle w:val="Hyperlink"/>
@@ -24268,7 +24942,7 @@
       <w:tr>
         <w:tc>
           <w:tcPr/>
-          <w:bookmarkStart w:id="133" w:name="fig-abs-value"/>
+          <w:bookmarkStart w:id="138" w:name="fig-abs-value"/>
           <w:p>
             <w:pPr>
               <w:pStyle w:val="SourceCode"/>
@@ -24704,18 +25378,18 @@
                 <wp:inline>
                   <wp:extent cx="4620126" cy="3696101"/>
                   <wp:effectExtent b="0" l="0" r="0" t="0"/>
-                  <wp:docPr descr="" title="" id="131" name="Picture"/>
+                  <wp:docPr descr="" title="" id="136" name="Picture"/>
                   <a:graphic>
                     <a:graphicData uri="http://schemas.openxmlformats.org/drawingml/2006/picture">
                       <pic:pic>
                         <pic:nvPicPr>
-                          <pic:cNvPr descr="calculus_files/figure-docx/abs-value-code-1.png" id="132" name="Picture"/>
+                          <pic:cNvPr descr="calculus_files/figure-docx/abs-value-code-1.png" id="137" name="Picture"/>
                           <pic:cNvPicPr>
                             <a:picLocks noChangeArrowheads="1" noChangeAspect="1"/>
                           </pic:cNvPicPr>
                         </pic:nvPicPr>
                         <pic:blipFill>
-                          <a:blip r:embed="rId130"/>
+                          <a:blip r:embed="rId135"/>
                           <a:stretch>
                             <a:fillRect/>
                           </a:stretch>
@@ -24838,12 +25512,12 @@
               <w:t xml:space="preserve">but is continuous everywhere: no gaps or jumps.</w:t>
             </w:r>
           </w:p>
-          <w:bookmarkEnd w:id="133"/>
+          <w:bookmarkEnd w:id="138"/>
         </w:tc>
       </w:tr>
     </w:tbl>
-    <w:bookmarkEnd w:id="134"/>
-    <w:bookmarkStart w:id="135" w:name="thm-cont-implies-int"/>
+    <w:bookmarkEnd w:id="139"/>
+    <w:bookmarkStart w:id="140" w:name="thm-cont-implies-int"/>
     <w:p>
       <w:pPr>
         <w:pStyle w:val="BodyText"/>
@@ -25029,8 +25703,8 @@
         <w:t xml:space="preserve">(Larson and Edwards 2018, Theorem 4.4, p. 272)</w:t>
       </w:r>
     </w:p>
-    <w:bookmarkEnd w:id="135"/>
-    <w:bookmarkStart w:id="136" w:name="exm-cont-implies-int"/>
+    <w:bookmarkEnd w:id="140"/>
+    <w:bookmarkStart w:id="141" w:name="exm-cont-implies-int"/>
     <w:p>
       <w:pPr>
         <w:pStyle w:val="BodyText"/>
@@ -25125,8 +25799,8 @@
         <w:t xml:space="preserve">.</w:t>
       </w:r>
     </w:p>
-    <w:bookmarkEnd w:id="136"/>
-    <w:bookmarkStart w:id="141" w:name="exm-int-not-cont"/>
+    <w:bookmarkEnd w:id="141"/>
+    <w:bookmarkStart w:id="146" w:name="exm-int-not-cont"/>
     <w:p>
       <w:pPr>
         <w:pStyle w:val="BodyText"/>
@@ -25652,7 +26326,7 @@
       <w:tr>
         <w:tc>
           <w:tcPr/>
-          <w:bookmarkStart w:id="140" w:name="fig-step"/>
+          <w:bookmarkStart w:id="145" w:name="fig-step"/>
           <w:p>
             <w:pPr>
               <w:pStyle w:val="SourceCode"/>
@@ -27024,18 +27698,18 @@
                 <wp:inline>
                   <wp:extent cx="4620126" cy="3696101"/>
                   <wp:effectExtent b="0" l="0" r="0" t="0"/>
-                  <wp:docPr descr="" title="" id="138" name="Picture"/>
+                  <wp:docPr descr="" title="" id="143" name="Picture"/>
                   <a:graphic>
                     <a:graphicData uri="http://schemas.openxmlformats.org/drawingml/2006/picture">
                       <pic:pic>
                         <pic:nvPicPr>
-                          <pic:cNvPr descr="calculus_files/figure-docx/step-code-1.png" id="139" name="Picture"/>
+                          <pic:cNvPr descr="calculus_files/figure-docx/step-code-1.png" id="144" name="Picture"/>
                           <pic:cNvPicPr>
                             <a:picLocks noChangeArrowheads="1" noChangeAspect="1"/>
                           </pic:cNvPicPr>
                         </pic:nvPicPr>
                         <pic:blipFill>
-                          <a:blip r:embed="rId137"/>
+                          <a:blip r:embed="rId142"/>
                           <a:stretch>
                             <a:fillRect/>
                           </a:stretch>
@@ -27300,11 +27974,11 @@
               <w:t xml:space="preserve">.</w:t>
             </w:r>
           </w:p>
-          <w:bookmarkEnd w:id="140"/>
+          <w:bookmarkEnd w:id="145"/>
         </w:tc>
       </w:tr>
     </w:tbl>
-    <w:bookmarkEnd w:id="141"/>
+    <w:bookmarkEnd w:id="146"/>
     <w:p>
       <w:pPr>
         <w:pStyle w:val="BodyText"/>
@@ -27512,7 +28186,7 @@
         <w:t xml:space="preserve">show that neither implication reverses in general.</w:t>
       </w:r>
     </w:p>
-    <w:bookmarkStart w:id="142" w:name="thm-riemann-general"/>
+    <w:bookmarkStart w:id="147" w:name="thm-riemann-general"/>
     <w:p>
       <w:pPr>
         <w:pStyle w:val="BodyText"/>
@@ -27584,7 +28258,7 @@
           <w:rPr>
             <w:rStyle w:val="Hyperlink"/>
           </w:rPr>
-          <w:t xml:space="preserve">Definition 14</w:t>
+          <w:t xml:space="preserve">Definition 15</w:t>
         </w:r>
       </w:hyperlink>
       <w:r>
@@ -27635,7 +28309,7 @@
           <w:rPr>
             <w:rStyle w:val="Hyperlink"/>
           </w:rPr>
-          <w:t xml:space="preserve">Definition 15</w:t>
+          <w:t xml:space="preserve">Definition 16</w:t>
         </w:r>
       </w:hyperlink>
       <w:r>
@@ -27752,7 +28426,7 @@
         </m:oMath>
       </m:oMathPara>
     </w:p>
-    <w:bookmarkEnd w:id="142"/>
+    <w:bookmarkEnd w:id="147"/>
     <w:p>
       <w:pPr>
         <w:pStyle w:val="FirstParagraph"/>
@@ -27820,136 +28494,6 @@
         <w:t xml:space="preserve">whose mesh (</w:t>
       </w:r>
       <w:hyperlink w:anchor="def-mesh">
-        <w:r>
-          <w:rPr>
-            <w:rStyle w:val="Hyperlink"/>
-          </w:rPr>
-          <w:t xml:space="preserve">Definition 12</w:t>
-        </w:r>
-      </w:hyperlink>
-      <w:r>
-        <w:t xml:space="preserve">) is</w:t>
-      </w:r>
-      <w:r>
-        <w:t xml:space="preserve"> </w:t>
-      </w:r>
-      <m:oMath>
-        <m:r>
-          <m:rPr>
-            <m:sty m:val="p"/>
-          </m:rPr>
-          <m:t>(</m:t>
-        </m:r>
-        <m:r>
-          <m:t>b</m:t>
-        </m:r>
-        <m:r>
-          <m:rPr>
-            <m:sty m:val="p"/>
-          </m:rPr>
-          <m:t>−</m:t>
-        </m:r>
-        <m:r>
-          <m:t>a</m:t>
-        </m:r>
-        <m:r>
-          <m:rPr>
-            <m:sty m:val="p"/>
-          </m:rPr>
-          <m:t>)</m:t>
-        </m:r>
-        <m:r>
-          <m:rPr>
-            <m:sty m:val="p"/>
-          </m:rPr>
-          <m:t>/</m:t>
-        </m:r>
-        <m:r>
-          <m:t>n</m:t>
-        </m:r>
-      </m:oMath>
-      <w:r>
-        <w:t xml:space="preserve">,</w:t>
-      </w:r>
-      <w:r>
-        <w:t xml:space="preserve"> </w:t>
-      </w:r>
-      <w:r>
-        <w:t xml:space="preserve">which goes to</w:t>
-      </w:r>
-      <w:r>
-        <w:t xml:space="preserve"> </w:t>
-      </w:r>
-      <m:oMath>
-        <m:r>
-          <m:t>0</m:t>
-        </m:r>
-      </m:oMath>
-      <w:r>
-        <w:t xml:space="preserve"> </w:t>
-      </w:r>
-      <w:r>
-        <w:t xml:space="preserve">as</w:t>
-      </w:r>
-      <w:r>
-        <w:t xml:space="preserve"> </w:t>
-      </w:r>
-      <m:oMath>
-        <m:r>
-          <m:t>n</m:t>
-        </m:r>
-        <m:r>
-          <m:rPr>
-            <m:sty m:val="p"/>
-          </m:rPr>
-          <m:t>→</m:t>
-        </m:r>
-        <m:r>
-          <m:rPr>
-            <m:sty m:val="p"/>
-          </m:rPr>
-          <m:t>∞</m:t>
-        </m:r>
-      </m:oMath>
-      <w:r>
-        <w:t xml:space="preserve">.</w:t>
-      </w:r>
-      <w:r>
-        <w:t xml:space="preserve"> </w:t>
-      </w:r>
-      <w:r>
-        <w:t xml:space="preserve">So</w:t>
-      </w:r>
-      <w:r>
-        <w:t xml:space="preserve"> </w:t>
-      </w:r>
-      <m:oMath>
-        <m:sSub>
-          <m:e>
-            <m:r>
-              <m:t>S</m:t>
-            </m:r>
-          </m:e>
-          <m:sub>
-            <m:r>
-              <m:t>n</m:t>
-            </m:r>
-          </m:sub>
-        </m:sSub>
-      </m:oMath>
-      <w:r>
-        <w:t xml:space="preserve"> </w:t>
-      </w:r>
-      <w:r>
-        <w:t xml:space="preserve">is one of the sums in the limit that defines the integral</w:t>
-      </w:r>
-      <w:r>
-        <w:t xml:space="preserve"> </w:t>
-      </w:r>
-      <w:r>
-        <w:t xml:space="preserve">(</w:t>
-      </w:r>
-      <w:hyperlink w:anchor="def-riemann-integral">
         <w:r>
           <w:rPr>
             <w:rStyle w:val="Hyperlink"/>
@@ -27958,6 +28502,136 @@
         </w:r>
       </w:hyperlink>
       <w:r>
+        <w:t xml:space="preserve">) is</w:t>
+      </w:r>
+      <w:r>
+        <w:t xml:space="preserve"> </w:t>
+      </w:r>
+      <m:oMath>
+        <m:r>
+          <m:rPr>
+            <m:sty m:val="p"/>
+          </m:rPr>
+          <m:t>(</m:t>
+        </m:r>
+        <m:r>
+          <m:t>b</m:t>
+        </m:r>
+        <m:r>
+          <m:rPr>
+            <m:sty m:val="p"/>
+          </m:rPr>
+          <m:t>−</m:t>
+        </m:r>
+        <m:r>
+          <m:t>a</m:t>
+        </m:r>
+        <m:r>
+          <m:rPr>
+            <m:sty m:val="p"/>
+          </m:rPr>
+          <m:t>)</m:t>
+        </m:r>
+        <m:r>
+          <m:rPr>
+            <m:sty m:val="p"/>
+          </m:rPr>
+          <m:t>/</m:t>
+        </m:r>
+        <m:r>
+          <m:t>n</m:t>
+        </m:r>
+      </m:oMath>
+      <w:r>
+        <w:t xml:space="preserve">,</w:t>
+      </w:r>
+      <w:r>
+        <w:t xml:space="preserve"> </w:t>
+      </w:r>
+      <w:r>
+        <w:t xml:space="preserve">which goes to</w:t>
+      </w:r>
+      <w:r>
+        <w:t xml:space="preserve"> </w:t>
+      </w:r>
+      <m:oMath>
+        <m:r>
+          <m:t>0</m:t>
+        </m:r>
+      </m:oMath>
+      <w:r>
+        <w:t xml:space="preserve"> </w:t>
+      </w:r>
+      <w:r>
+        <w:t xml:space="preserve">as</w:t>
+      </w:r>
+      <w:r>
+        <w:t xml:space="preserve"> </w:t>
+      </w:r>
+      <m:oMath>
+        <m:r>
+          <m:t>n</m:t>
+        </m:r>
+        <m:r>
+          <m:rPr>
+            <m:sty m:val="p"/>
+          </m:rPr>
+          <m:t>→</m:t>
+        </m:r>
+        <m:r>
+          <m:rPr>
+            <m:sty m:val="p"/>
+          </m:rPr>
+          <m:t>∞</m:t>
+        </m:r>
+      </m:oMath>
+      <w:r>
+        <w:t xml:space="preserve">.</w:t>
+      </w:r>
+      <w:r>
+        <w:t xml:space="preserve"> </w:t>
+      </w:r>
+      <w:r>
+        <w:t xml:space="preserve">So</w:t>
+      </w:r>
+      <w:r>
+        <w:t xml:space="preserve"> </w:t>
+      </w:r>
+      <m:oMath>
+        <m:sSub>
+          <m:e>
+            <m:r>
+              <m:t>S</m:t>
+            </m:r>
+          </m:e>
+          <m:sub>
+            <m:r>
+              <m:t>n</m:t>
+            </m:r>
+          </m:sub>
+        </m:sSub>
+      </m:oMath>
+      <w:r>
+        <w:t xml:space="preserve"> </w:t>
+      </w:r>
+      <w:r>
+        <w:t xml:space="preserve">is one of the sums in the limit that defines the integral</w:t>
+      </w:r>
+      <w:r>
+        <w:t xml:space="preserve"> </w:t>
+      </w:r>
+      <w:r>
+        <w:t xml:space="preserve">(</w:t>
+      </w:r>
+      <w:hyperlink w:anchor="def-riemann-integral">
+        <w:r>
+          <w:rPr>
+            <w:rStyle w:val="Hyperlink"/>
+          </w:rPr>
+          <w:t xml:space="preserve">Definition 14</w:t>
+        </w:r>
+      </w:hyperlink>
+      <w:r>
         <w:t xml:space="preserve">),</w:t>
       </w:r>
       <w:r>
@@ -27990,7 +28664,7 @@
         <w:t xml:space="preserve">has that value along this sequence too.</w:t>
       </w:r>
     </w:p>
-    <w:bookmarkStart w:id="143" w:name="exm-riemann-equal-width"/>
+    <w:bookmarkStart w:id="148" w:name="exm-riemann-equal-width"/>
     <w:p>
       <w:pPr>
         <w:pStyle w:val="BodyText"/>
@@ -28918,9 +29592,9 @@
         <w:t xml:space="preserve">.</w:t>
       </w:r>
     </w:p>
-    <w:bookmarkEnd w:id="143"/>
-    <w:bookmarkEnd w:id="144"/>
-    <w:bookmarkStart w:id="179" w:name="fundamental-theorem-of-calculus"/>
+    <w:bookmarkEnd w:id="148"/>
+    <w:bookmarkEnd w:id="149"/>
+    <w:bookmarkStart w:id="184" w:name="fundamental-theorem-of-calculus"/>
     <w:p>
       <w:pPr>
         <w:pStyle w:val="Heading3"/>
@@ -28929,7 +29603,7 @@
         <w:t xml:space="preserve">2.3 Fundamental Theorem of Calculus</w:t>
       </w:r>
     </w:p>
-    <w:bookmarkStart w:id="151" w:name="thm-ftc"/>
+    <w:bookmarkStart w:id="156" w:name="thm-ftc"/>
     <w:p>
       <w:pPr>
         <w:pStyle w:val="FirstParagraph"/>
@@ -29159,7 +29833,7 @@
       <w:pPr>
         <w:pStyle w:val="BodyText"/>
       </w:pPr>
-      <w:bookmarkStart w:id="145" w:name="eq-ftc-deriv-of-integral"/>
+      <w:bookmarkStart w:id="150" w:name="eq-ftc-deriv-of-integral"/>
       <m:oMathPara>
         <m:oMathParaPr>
           <m:jc m:val="center"/>
@@ -29280,7 +29954,7 @@
           </m:r>
         </m:oMath>
       </m:oMathPara>
-      <w:bookmarkEnd w:id="145"/>
+      <w:bookmarkEnd w:id="150"/>
     </w:p>
     <w:tbl>
       <w:tblPr>
@@ -29323,18 +29997,18 @@
                 <wp:inline>
                   <wp:extent cx="152400" cy="152400"/>
                   <wp:effectExtent b="0" l="0" r="0" t="0"/>
-                  <wp:docPr descr="" title="" id="147" name="Picture"/>
+                  <wp:docPr descr="" title="" id="152" name="Picture"/>
                   <a:graphic>
                     <a:graphicData uri="http://schemas.openxmlformats.org/drawingml/2006/picture">
                       <pic:pic>
                         <pic:nvPicPr>
-                          <pic:cNvPr descr="/opt/quarto/share/formats/docx/note.png" id="148" name="Picture"/>
+                          <pic:cNvPr descr="/opt/quarto/share/formats/docx/note.png" id="153" name="Picture"/>
                           <pic:cNvPicPr>
                             <a:picLocks noChangeArrowheads="1" noChangeAspect="1"/>
                           </pic:cNvPicPr>
                         </pic:nvPicPr>
                         <pic:blipFill>
-                          <a:blip r:embed="rId146"/>
+                          <a:blip r:embed="rId151"/>
                           <a:stretch>
                             <a:fillRect/>
                           </a:stretch>
@@ -29511,7 +30185,7 @@
                 <w:rPr>
                   <w:rStyle w:val="Hyperlink"/>
                 </w:rPr>
-                <w:t xml:space="preserve">Definition 14</w:t>
+                <w:t xml:space="preserve">Definition 15</w:t>
               </w:r>
             </w:hyperlink>
             <w:r>
@@ -29539,7 +30213,7 @@
                 <w:rPr>
                   <w:rStyle w:val="Hyperlink"/>
                 </w:rPr>
-                <w:t xml:space="preserve">Definition 9</w:t>
+                <w:t xml:space="preserve">Definition 10</w:t>
               </w:r>
             </w:hyperlink>
             <w:r>
@@ -29840,7 +30514,7 @@
       <w:pPr>
         <w:pStyle w:val="BodyText"/>
       </w:pPr>
-      <w:bookmarkStart w:id="149" w:name="eq-ftc-part2"/>
+      <w:bookmarkStart w:id="154" w:name="eq-ftc-part2"/>
       <m:oMathPara>
         <m:oMathParaPr>
           <m:jc m:val="center"/>
@@ -29961,7 +30635,7 @@
           </m:r>
         </m:oMath>
       </m:oMathPara>
-      <w:bookmarkEnd w:id="149"/>
+      <w:bookmarkEnd w:id="154"/>
     </w:p>
     <w:p>
       <w:pPr>
@@ -30031,7 +30705,7 @@
       <w:pPr>
         <w:pStyle w:val="BodyText"/>
       </w:pPr>
-      <w:bookmarkStart w:id="150" w:name="eq-ftc-integral-of-deriv"/>
+      <w:bookmarkStart w:id="155" w:name="eq-ftc-integral-of-deriv"/>
       <m:oMathPara>
         <m:oMathParaPr>
           <m:jc m:val="center"/>
@@ -30164,7 +30838,7 @@
           </m:r>
         </m:oMath>
       </m:oMathPara>
-      <w:bookmarkEnd w:id="150"/>
+      <w:bookmarkEnd w:id="155"/>
     </w:p>
     <w:p>
       <w:pPr>
@@ -30292,7 +30966,7 @@
         <w:t xml:space="preserve">(Banner 2007, chap. 18; Larson and Edwards 2018, Theorem 4.9, p. 282)</w:t>
       </w:r>
     </w:p>
-    <w:bookmarkEnd w:id="151"/>
+    <w:bookmarkEnd w:id="156"/>
     <w:p>
       <w:pPr>
         <w:pStyle w:val="BodyText"/>
@@ -30659,7 +31333,7 @@
         <w:t xml:space="preserve">a common situation in applied statistics.</w:t>
       </w:r>
     </w:p>
-    <w:bookmarkStart w:id="161" w:name="exm-ftc-part1-accumulation"/>
+    <w:bookmarkStart w:id="166" w:name="exm-ftc-part1-accumulation"/>
     <w:p>
       <w:pPr>
         <w:pStyle w:val="BodyText"/>
@@ -31368,7 +32042,7 @@
         <w:t xml:space="preserve">).</w:t>
       </w:r>
     </w:p>
-    <w:bookmarkStart w:id="160" w:name="fig-ftc-part1"/>
+    <w:bookmarkStart w:id="165" w:name="fig-ftc-part1"/>
     <w:tbl>
       <w:tblPr>
         <w:tblStyle w:val="Table"/>
@@ -31396,7 +32070,7 @@
             <w:tr>
               <w:tc>
                 <w:tcPr/>
-                <w:bookmarkStart w:id="155" w:name="fig-ftc-part1-left"/>
+                <w:bookmarkStart w:id="160" w:name="fig-ftc-part1-left"/>
                 <w:p>
                   <w:pPr>
                     <w:pStyle w:val="SourceCode"/>
@@ -32236,18 +32910,18 @@
                       <wp:inline>
                         <wp:extent cx="2971800" cy="2377440"/>
                         <wp:effectExtent b="0" l="0" r="0" t="0"/>
-                        <wp:docPr descr="" title="" id="153" name="Picture"/>
+                        <wp:docPr descr="" title="" id="158" name="Picture"/>
                         <a:graphic>
                           <a:graphicData uri="http://schemas.openxmlformats.org/drawingml/2006/picture">
                             <pic:pic>
                               <pic:nvPicPr>
-                                <pic:cNvPr descr="calculus_files/figure-docx/ftc-part1-left-code-1.png" id="154" name="Picture"/>
+                                <pic:cNvPr descr="calculus_files/figure-docx/ftc-part1-left-code-1.png" id="159" name="Picture"/>
                                 <pic:cNvPicPr>
                                   <a:picLocks noChangeArrowheads="1" noChangeAspect="1"/>
                                 </pic:cNvPicPr>
                               </pic:nvPicPr>
                               <pic:blipFill>
-                                <a:blip r:embed="rId152"/>
+                                <a:blip r:embed="rId157"/>
                                 <a:stretch>
                                   <a:fillRect/>
                                 </a:stretch>
@@ -32411,7 +33085,7 @@
                     <w:t xml:space="preserve">.</w:t>
                   </w:r>
                 </w:p>
-                <w:bookmarkEnd w:id="155"/>
+                <w:bookmarkEnd w:id="160"/>
               </w:tc>
             </w:tr>
           </w:tbl>
@@ -32461,7 +33135,7 @@
             <w:tr>
               <w:tc>
                 <w:tcPr/>
-                <w:bookmarkStart w:id="159" w:name="fig-ftc-part1-right"/>
+                <w:bookmarkStart w:id="164" w:name="fig-ftc-part1-right"/>
                 <w:p>
                   <w:pPr>
                     <w:pStyle w:val="SourceCode"/>
@@ -33535,18 +34209,18 @@
                       <wp:inline>
                         <wp:extent cx="2971800" cy="2377440"/>
                         <wp:effectExtent b="0" l="0" r="0" t="0"/>
-                        <wp:docPr descr="" title="" id="157" name="Picture"/>
+                        <wp:docPr descr="" title="" id="162" name="Picture"/>
                         <a:graphic>
                           <a:graphicData uri="http://schemas.openxmlformats.org/drawingml/2006/picture">
                             <pic:pic>
                               <pic:nvPicPr>
-                                <pic:cNvPr descr="calculus_files/figure-docx/ftc-part1-right-code-1.png" id="158" name="Picture"/>
+                                <pic:cNvPr descr="calculus_files/figure-docx/ftc-part1-right-code-1.png" id="163" name="Picture"/>
                                 <pic:cNvPicPr>
                                   <a:picLocks noChangeArrowheads="1" noChangeAspect="1"/>
                                 </pic:cNvPicPr>
                               </pic:nvPicPr>
                               <pic:blipFill>
-                                <a:blip r:embed="rId156"/>
+                                <a:blip r:embed="rId161"/>
                                 <a:stretch>
                                   <a:fillRect/>
                                 </a:stretch>
@@ -33683,7 +34357,7 @@
                     <w:t xml:space="preserve">.</w:t>
                   </w:r>
                 </w:p>
-                <w:bookmarkEnd w:id="159"/>
+                <w:bookmarkEnd w:id="164"/>
               </w:tc>
             </w:tr>
           </w:tbl>
@@ -33966,9 +34640,9 @@
         <w:t xml:space="preserve">.</w:t>
       </w:r>
     </w:p>
-    <w:bookmarkEnd w:id="160"/>
-    <w:bookmarkEnd w:id="161"/>
-    <w:bookmarkStart w:id="174" w:name="exm-ftc-cdf-pdf"/>
+    <w:bookmarkEnd w:id="165"/>
+    <w:bookmarkEnd w:id="166"/>
+    <w:bookmarkStart w:id="179" w:name="exm-ftc-cdf-pdf"/>
     <w:p>
       <w:pPr>
         <w:pStyle w:val="BodyText"/>
@@ -34028,7 +34702,7 @@
           <w:rPr>
             <w:rStyle w:val="Hyperlink"/>
           </w:rPr>
-          <w:t xml:space="preserve">Definition 6</w:t>
+          <w:t xml:space="preserve">Definition 7</w:t>
         </w:r>
       </w:hyperlink>
       <w:r>
@@ -34090,7 +34764,7 @@
       <w:r>
         <w:t xml:space="preserve"> </w:t>
       </w:r>
-      <w:hyperlink r:id="rId162">
+      <w:hyperlink r:id="rId167">
         <w:r>
           <w:rPr>
             <w:rStyle w:val="Hyperlink"/>
@@ -34133,7 +34807,7 @@
       <w:r>
         <w:t xml:space="preserve"> </w:t>
       </w:r>
-      <w:hyperlink r:id="rId163">
+      <w:hyperlink r:id="rId168">
         <w:r>
           <w:rPr>
             <w:rStyle w:val="Hyperlink"/>
@@ -34277,7 +34951,7 @@
       <w:r>
         <w:t xml:space="preserve"> </w:t>
       </w:r>
-      <w:hyperlink r:id="rId164">
+      <w:hyperlink r:id="rId169">
         <w:r>
           <w:rPr>
             <w:rStyle w:val="Hyperlink"/>
@@ -36174,7 +36848,7 @@
         <w:t xml:space="preserve">.</w:t>
       </w:r>
     </w:p>
-    <w:bookmarkStart w:id="173" w:name="fig-exp-pdf-cdf"/>
+    <w:bookmarkStart w:id="178" w:name="fig-exp-pdf-cdf"/>
     <w:tbl>
       <w:tblPr>
         <w:tblStyle w:val="Table"/>
@@ -36202,7 +36876,7 @@
             <w:tr>
               <w:tc>
                 <w:tcPr/>
-                <w:bookmarkStart w:id="168" w:name="fig-exp-pdf-cdf-pdf"/>
+                <w:bookmarkStart w:id="173" w:name="fig-exp-pdf-cdf-pdf"/>
                 <w:p>
                   <w:pPr>
                     <w:pStyle w:val="SourceCode"/>
@@ -36817,18 +37491,18 @@
                       <wp:inline>
                         <wp:extent cx="2971800" cy="2377440"/>
                         <wp:effectExtent b="0" l="0" r="0" t="0"/>
-                        <wp:docPr descr="" title="" id="166" name="Picture"/>
+                        <wp:docPr descr="" title="" id="171" name="Picture"/>
                         <a:graphic>
                           <a:graphicData uri="http://schemas.openxmlformats.org/drawingml/2006/picture">
                             <pic:pic>
                               <pic:nvPicPr>
-                                <pic:cNvPr descr="calculus_files/figure-docx/exp-pdf-cdf-pdf-code-1.png" id="167" name="Picture"/>
+                                <pic:cNvPr descr="calculus_files/figure-docx/exp-pdf-cdf-pdf-code-1.png" id="172" name="Picture"/>
                                 <pic:cNvPicPr>
                                   <a:picLocks noChangeArrowheads="1" noChangeAspect="1"/>
                                 </pic:cNvPicPr>
                               </pic:nvPicPr>
                               <pic:blipFill>
-                                <a:blip r:embed="rId165"/>
+                                <a:blip r:embed="rId170"/>
                                 <a:stretch>
                                   <a:fillRect/>
                                 </a:stretch>
@@ -36924,7 +37598,7 @@
                     <w:t xml:space="preserve">.</w:t>
                   </w:r>
                 </w:p>
-                <w:bookmarkEnd w:id="168"/>
+                <w:bookmarkEnd w:id="173"/>
               </w:tc>
             </w:tr>
           </w:tbl>
@@ -36974,7 +37648,7 @@
             <w:tr>
               <w:tc>
                 <w:tcPr/>
-                <w:bookmarkStart w:id="172" w:name="fig-exp-pdf-cdf-cdf"/>
+                <w:bookmarkStart w:id="177" w:name="fig-exp-pdf-cdf-cdf"/>
                 <w:p>
                   <w:pPr>
                     <w:pStyle w:val="SourceCode"/>
@@ -37820,18 +38494,18 @@
                       <wp:inline>
                         <wp:extent cx="2971800" cy="2377440"/>
                         <wp:effectExtent b="0" l="0" r="0" t="0"/>
-                        <wp:docPr descr="" title="" id="170" name="Picture"/>
+                        <wp:docPr descr="" title="" id="175" name="Picture"/>
                         <a:graphic>
                           <a:graphicData uri="http://schemas.openxmlformats.org/drawingml/2006/picture">
                             <pic:pic>
                               <pic:nvPicPr>
-                                <pic:cNvPr descr="calculus_files/figure-docx/exp-pdf-cdf-cdf-code-1.png" id="171" name="Picture"/>
+                                <pic:cNvPr descr="calculus_files/figure-docx/exp-pdf-cdf-cdf-code-1.png" id="176" name="Picture"/>
                                 <pic:cNvPicPr>
                                   <a:picLocks noChangeArrowheads="1" noChangeAspect="1"/>
                                 </pic:cNvPicPr>
                               </pic:nvPicPr>
                               <pic:blipFill>
-                                <a:blip r:embed="rId169"/>
+                                <a:blip r:embed="rId174"/>
                                 <a:stretch>
                                   <a:fillRect/>
                                 </a:stretch>
@@ -37927,7 +38601,7 @@
                     <w:t xml:space="preserve">.</w:t>
                   </w:r>
                 </w:p>
-                <w:bookmarkEnd w:id="172"/>
+                <w:bookmarkEnd w:id="177"/>
               </w:tc>
             </w:tr>
           </w:tbl>
@@ -38197,8 +38871,8 @@
         <w:t xml:space="preserve">computed via FTC Part 2.</w:t>
       </w:r>
     </w:p>
-    <w:bookmarkEnd w:id="173"/>
-    <w:bookmarkEnd w:id="174"/>
+    <w:bookmarkEnd w:id="178"/>
+    <w:bookmarkEnd w:id="179"/>
     <w:tbl>
       <w:tblPr>
         <w:tblStyle w:val="Table"/>
@@ -38240,12 +38914,12 @@
                 <wp:inline>
                   <wp:extent cx="152400" cy="152400"/>
                   <wp:effectExtent b="0" l="0" r="0" t="0"/>
-                  <wp:docPr descr="" title="" id="175" name="Picture"/>
+                  <wp:docPr descr="" title="" id="180" name="Picture"/>
                   <a:graphic>
                     <a:graphicData uri="http://schemas.openxmlformats.org/drawingml/2006/picture">
                       <pic:pic>
                         <pic:nvPicPr>
-                          <pic:cNvPr descr="/opt/quarto/share/formats/docx/tip.png" id="176" name="Picture"/>
+                          <pic:cNvPr descr="/opt/quarto/share/formats/docx/tip.png" id="181" name="Picture"/>
                           <pic:cNvPicPr>
                             <a:picLocks noChangeArrowheads="1" noChangeAspect="1"/>
                           </pic:cNvPicPr>
@@ -38331,7 +39005,7 @@
                 <w:numId w:val="1022"/>
               </w:numPr>
             </w:pPr>
-            <w:hyperlink r:id="rId177">
+            <w:hyperlink r:id="rId182">
               <w:r>
                 <w:rPr>
                   <w:rStyle w:val="Hyperlink"/>
@@ -38348,7 +39022,7 @@
                 <w:numId w:val="1022"/>
               </w:numPr>
             </w:pPr>
-            <w:hyperlink r:id="rId178">
+            <w:hyperlink r:id="rId183">
               <w:r>
                 <w:rPr>
                   <w:rStyle w:val="Hyperlink"/>
@@ -38361,9 +39035,9 @@
         </w:tc>
       </w:tr>
     </w:tbl>
-    <w:bookmarkEnd w:id="179"/>
-    <w:bookmarkEnd w:id="180"/>
-    <w:bookmarkStart w:id="219" w:name="sec-double-integrals"/>
+    <w:bookmarkEnd w:id="184"/>
+    <w:bookmarkEnd w:id="185"/>
+    <w:bookmarkStart w:id="224" w:name="sec-double-integrals"/>
     <w:p>
       <w:pPr>
         <w:pStyle w:val="Heading2"/>
@@ -38439,7 +39113,7 @@
       <w:r>
         <w:t xml:space="preserve"> </w:t>
       </w:r>
-      <w:hyperlink r:id="rId181">
+      <w:hyperlink r:id="rId186">
         <m:oMath>
           <m:r>
             <m:t>σ</m:t>
@@ -38478,7 +39152,7 @@
       <w:r>
         <w:t xml:space="preserve"> </w:t>
       </w:r>
-      <w:hyperlink r:id="rId182">
+      <w:hyperlink r:id="rId187">
         <w:r>
           <w:rPr>
             <w:rStyle w:val="Hyperlink"/>
@@ -38509,7 +39183,7 @@
         <w:t xml:space="preserve">follow from a stated theorem rather than from an aside.</w:t>
       </w:r>
     </w:p>
-    <w:bookmarkStart w:id="183" w:name="def-double-integral"/>
+    <w:bookmarkStart w:id="188" w:name="def-double-integral"/>
     <w:p>
       <w:pPr>
         <w:pStyle w:val="BodyText"/>
@@ -38519,7 +39193,7 @@
           <w:b/>
           <w:bCs/>
         </w:rPr>
-        <w:t xml:space="preserve">Definition 16 (Double integral)</w:t>
+        <w:t xml:space="preserve">Definition 17 (Double integral)</w:t>
       </w:r>
       <w:r>
         <w:t xml:space="preserve"> </w:t>
@@ -39185,8 +39859,8 @@
         <w:t xml:space="preserve">(Larson and Edwards 2018, sec. 14.2)</w:t>
       </w:r>
     </w:p>
-    <w:bookmarkEnd w:id="183"/>
-    <w:bookmarkStart w:id="184" w:name="exm-double-integral-area"/>
+    <w:bookmarkEnd w:id="188"/>
+    <w:bookmarkStart w:id="189" w:name="exm-double-integral-area"/>
     <w:p>
       <w:pPr>
         <w:pStyle w:val="BodyText"/>
@@ -39362,7 +40036,7 @@
           <w:rPr>
             <w:rStyle w:val="Hyperlink"/>
           </w:rPr>
-          <w:t xml:space="preserve">Definition 16</w:t>
+          <w:t xml:space="preserve">Definition 17</w:t>
         </w:r>
       </w:hyperlink>
       <w:r>
@@ -39476,8 +40150,8 @@
         <w:t xml:space="preserve">.</w:t>
       </w:r>
     </w:p>
-    <w:bookmarkEnd w:id="184"/>
-    <w:bookmarkStart w:id="185" w:name="def-iterated-integral"/>
+    <w:bookmarkEnd w:id="189"/>
+    <w:bookmarkStart w:id="190" w:name="def-iterated-integral"/>
     <w:p>
       <w:pPr>
         <w:pStyle w:val="BodyText"/>
@@ -39487,7 +40161,7 @@
           <w:b/>
           <w:bCs/>
         </w:rPr>
-        <w:t xml:space="preserve">Definition 17 (Iterated integral)</w:t>
+        <w:t xml:space="preserve">Definition 18 (Iterated integral)</w:t>
       </w:r>
       <w:r>
         <w:t xml:space="preserve"> </w:t>
@@ -40151,8 +40825,8 @@
         <w:t xml:space="preserve">swapped.</w:t>
       </w:r>
     </w:p>
-    <w:bookmarkEnd w:id="185"/>
-    <w:bookmarkStart w:id="186" w:name="exm-iterated-integral"/>
+    <w:bookmarkEnd w:id="190"/>
+    <w:bookmarkStart w:id="191" w:name="exm-iterated-integral"/>
     <w:p>
       <w:pPr>
         <w:pStyle w:val="BodyText"/>
@@ -40823,8 +41497,8 @@
         </m:oMath>
       </m:oMathPara>
     </w:p>
-    <w:bookmarkEnd w:id="186"/>
-    <w:bookmarkStart w:id="187" w:name="thm-fubini"/>
+    <w:bookmarkEnd w:id="191"/>
+    <w:bookmarkStart w:id="192" w:name="thm-fubini"/>
     <w:p>
       <w:pPr>
         <w:pStyle w:val="FirstParagraph"/>
@@ -41838,8 +42512,8 @@
         <w:t xml:space="preserve">(Larson and Edwards 2018, Theorem 14.2, p. 982)</w:t>
       </w:r>
     </w:p>
-    <w:bookmarkEnd w:id="187"/>
-    <w:bookmarkStart w:id="195" w:name="exm-fubini-nonrect"/>
+    <w:bookmarkEnd w:id="192"/>
+    <w:bookmarkStart w:id="200" w:name="exm-fubini-nonrect"/>
     <w:p>
       <w:pPr>
         <w:pStyle w:val="BodyText"/>
@@ -41940,7 +42614,7 @@
       <w:r>
         <w:t xml:space="preserve"> </w:t>
       </w:r>
-      <w:hyperlink r:id="rId162">
+      <w:hyperlink r:id="rId167">
         <w:r>
           <w:rPr>
             <w:rStyle w:val="Hyperlink"/>
@@ -41960,7 +42634,7 @@
       <w:r>
         <w:t xml:space="preserve"> </w:t>
       </w:r>
-      <w:hyperlink r:id="rId163">
+      <w:hyperlink r:id="rId168">
         <w:r>
           <w:rPr>
             <w:rStyle w:val="Hyperlink"/>
@@ -42195,7 +42869,7 @@
       <w:r>
         <w:t xml:space="preserve"> </w:t>
       </w:r>
-      <w:hyperlink r:id="rId188">
+      <w:hyperlink r:id="rId193">
         <w:r>
           <w:rPr>
             <w:rStyle w:val="Hyperlink"/>
@@ -42215,7 +42889,7 @@
       <w:r>
         <w:t xml:space="preserve"> </w:t>
       </w:r>
-      <w:hyperlink r:id="rId189">
+      <w:hyperlink r:id="rId194">
         <w:r>
           <w:rPr>
             <w:rStyle w:val="Hyperlink"/>
@@ -43018,7 +43692,7 @@
       <w:tr>
         <w:tc>
           <w:tcPr/>
-          <w:bookmarkStart w:id="193" w:name="fig-fubini-nonrect-region"/>
+          <w:bookmarkStart w:id="198" w:name="fig-fubini-nonrect-region"/>
           <w:p>
             <w:pPr>
               <w:pStyle w:val="SourceCode"/>
@@ -44567,18 +45241,18 @@
                 <wp:inline>
                   <wp:extent cx="4620126" cy="3696101"/>
                   <wp:effectExtent b="0" l="0" r="0" t="0"/>
-                  <wp:docPr descr="" title="" id="191" name="Picture"/>
+                  <wp:docPr descr="" title="" id="196" name="Picture"/>
                   <a:graphic>
                     <a:graphicData uri="http://schemas.openxmlformats.org/drawingml/2006/picture">
                       <pic:pic>
                         <pic:nvPicPr>
-                          <pic:cNvPr descr="calculus_files/figure-docx/unnamed-chunk-5-1.png" id="192" name="Picture"/>
+                          <pic:cNvPr descr="calculus_files/figure-docx/unnamed-chunk-5-1.png" id="197" name="Picture"/>
                           <pic:cNvPicPr>
                             <a:picLocks noChangeArrowheads="1" noChangeAspect="1"/>
                           </pic:cNvPicPr>
                         </pic:nvPicPr>
                         <pic:blipFill>
-                          <a:blip r:embed="rId190"/>
+                          <a:blip r:embed="rId195"/>
                           <a:stretch>
                             <a:fillRect/>
                           </a:stretch>
@@ -44818,7 +45492,7 @@
               <w:t xml:space="preserve">.</w:t>
             </w:r>
           </w:p>
-          <w:bookmarkEnd w:id="193"/>
+          <w:bookmarkEnd w:id="198"/>
         </w:tc>
       </w:tr>
     </w:tbl>
@@ -47175,7 +47849,7 @@
       <w:tr>
         <w:tc>
           <w:tcPr/>
-          <w:bookmarkStart w:id="194" w:name="fig-fubini-nonrect"/>
+          <w:bookmarkStart w:id="199" w:name="fig-fubini-nonrect"/>
           <w:p>
             <w:pPr>
               <w:pStyle w:val="Compact"/>
@@ -47522,12 +48196,12 @@
               <w:t xml:space="preserve">.</w:t>
             </w:r>
           </w:p>
-          <w:bookmarkEnd w:id="194"/>
+          <w:bookmarkEnd w:id="199"/>
         </w:tc>
       </w:tr>
     </w:tbl>
-    <w:bookmarkEnd w:id="195"/>
-    <w:bookmarkStart w:id="197" w:name="exm-fubini-fail"/>
+    <w:bookmarkEnd w:id="200"/>
+    <w:bookmarkStart w:id="202" w:name="exm-fubini-fail"/>
     <w:p>
       <w:pPr>
         <w:pStyle w:val="BodyText"/>
@@ -49587,7 +50261,7 @@
       <w:tr>
         <w:tc>
           <w:tcPr/>
-          <w:bookmarkStart w:id="196" w:name="fig-fubini-fail"/>
+          <w:bookmarkStart w:id="201" w:name="fig-fubini-fail"/>
           <w:p>
             <w:pPr>
               <w:pStyle w:val="Compact"/>
@@ -50139,12 +50813,12 @@
               <w:t xml:space="preserve">does not apply.</w:t>
             </w:r>
           </w:p>
-          <w:bookmarkEnd w:id="196"/>
+          <w:bookmarkEnd w:id="201"/>
         </w:tc>
       </w:tr>
     </w:tbl>
-    <w:bookmarkEnd w:id="197"/>
-    <w:bookmarkStart w:id="198" w:name="cor-fubini-rect"/>
+    <w:bookmarkEnd w:id="202"/>
+    <w:bookmarkStart w:id="203" w:name="cor-fubini-rect"/>
     <w:p>
       <w:pPr>
         <w:pStyle w:val="BodyText"/>
@@ -50717,7 +51391,7 @@
         <w:t xml:space="preserve">(Larson and Edwards 2018, Theorem 14.2, p. 982)</w:t>
       </w:r>
     </w:p>
-    <w:bookmarkEnd w:id="198"/>
+    <w:bookmarkEnd w:id="203"/>
     <w:p>
       <w:pPr>
         <w:pStyle w:val="BodyText"/>
@@ -50972,7 +51646,7 @@
         <w:t xml:space="preserve">two iterated forms shown.</w:t>
       </w:r>
     </w:p>
-    <w:bookmarkStart w:id="204" w:name="exm-fubini-rect"/>
+    <w:bookmarkStart w:id="209" w:name="exm-fubini-rect"/>
     <w:p>
       <w:pPr>
         <w:pStyle w:val="BodyText"/>
@@ -51251,7 +51925,7 @@
       <w:r>
         <w:t xml:space="preserve"> </w:t>
       </w:r>
-      <w:hyperlink r:id="rId162">
+      <w:hyperlink r:id="rId167">
         <w:r>
           <w:rPr>
             <w:rStyle w:val="Hyperlink"/>
@@ -51271,7 +51945,7 @@
       <w:r>
         <w:t xml:space="preserve"> </w:t>
       </w:r>
-      <w:hyperlink r:id="rId163">
+      <w:hyperlink r:id="rId168">
         <w:r>
           <w:rPr>
             <w:rStyle w:val="Hyperlink"/>
@@ -51560,7 +52234,7 @@
       <w:r>
         <w:t xml:space="preserve"> </w:t>
       </w:r>
-      <w:hyperlink r:id="rId189">
+      <w:hyperlink r:id="rId194">
         <w:r>
           <w:rPr>
             <w:rStyle w:val="Hyperlink"/>
@@ -51851,7 +52525,7 @@
       <w:tr>
         <w:tc>
           <w:tcPr/>
-          <w:bookmarkStart w:id="202" w:name="fig-fubini-rect-region"/>
+          <w:bookmarkStart w:id="207" w:name="fig-fubini-rect-region"/>
           <w:p>
             <w:pPr>
               <w:pStyle w:val="SourceCode"/>
@@ -52743,18 +53417,18 @@
                 <wp:inline>
                   <wp:extent cx="4620126" cy="3696101"/>
                   <wp:effectExtent b="0" l="0" r="0" t="0"/>
-                  <wp:docPr descr="" title="" id="200" name="Picture"/>
+                  <wp:docPr descr="" title="" id="205" name="Picture"/>
                   <a:graphic>
                     <a:graphicData uri="http://schemas.openxmlformats.org/drawingml/2006/picture">
                       <pic:pic>
                         <pic:nvPicPr>
-                          <pic:cNvPr descr="calculus_files/figure-docx/unnamed-chunk-10-1.png" id="201" name="Picture"/>
+                          <pic:cNvPr descr="calculus_files/figure-docx/unnamed-chunk-10-1.png" id="206" name="Picture"/>
                           <pic:cNvPicPr>
                             <a:picLocks noChangeArrowheads="1" noChangeAspect="1"/>
                           </pic:cNvPicPr>
                         </pic:nvPicPr>
                         <pic:blipFill>
-                          <a:blip r:embed="rId199"/>
+                          <a:blip r:embed="rId204"/>
                           <a:stretch>
                             <a:fillRect/>
                           </a:stretch>
@@ -52844,7 +53518,7 @@
               <w:t xml:space="preserve">, the unit square.</w:t>
             </w:r>
           </w:p>
-          <w:bookmarkEnd w:id="202"/>
+          <w:bookmarkEnd w:id="207"/>
         </w:tc>
       </w:tr>
     </w:tbl>
@@ -54476,7 +55150,7 @@
       <w:tr>
         <w:tc>
           <w:tcPr/>
-          <w:bookmarkStart w:id="203" w:name="fig-fubini-rect"/>
+          <w:bookmarkStart w:id="208" w:name="fig-fubini-rect"/>
           <w:p>
             <w:pPr>
               <w:pStyle w:val="Compact"/>
@@ -54700,12 +55374,12 @@
               <w:t xml:space="preserve">.</w:t>
             </w:r>
           </w:p>
-          <w:bookmarkEnd w:id="203"/>
+          <w:bookmarkEnd w:id="208"/>
         </w:tc>
       </w:tr>
     </w:tbl>
-    <w:bookmarkEnd w:id="204"/>
-    <w:bookmarkStart w:id="212" w:name="thm-fubini-tonelli"/>
+    <w:bookmarkEnd w:id="209"/>
+    <w:bookmarkStart w:id="217" w:name="thm-fubini-tonelli"/>
     <w:p>
       <w:pPr>
         <w:pStyle w:val="BodyText"/>
@@ -54882,7 +55556,7 @@
       <w:r>
         <w:t xml:space="preserve"> </w:t>
       </w:r>
-      <w:hyperlink r:id="rId205">
+      <w:hyperlink r:id="rId210">
         <w:r>
           <w:rPr>
             <w:rStyle w:val="Hyperlink"/>
@@ -54899,7 +55573,7 @@
       <w:r>
         <w:t xml:space="preserve"> </w:t>
       </w:r>
-      <w:hyperlink r:id="rId181">
+      <w:hyperlink r:id="rId186">
         <m:oMath>
           <m:r>
             <m:t>σ</m:t>
@@ -54996,7 +55670,7 @@
       <w:r>
         <w:t xml:space="preserve"> </w:t>
       </w:r>
-      <w:hyperlink r:id="rId206">
+      <w:hyperlink r:id="rId211">
         <w:r>
           <w:rPr>
             <w:rStyle w:val="Hyperlink"/>
@@ -55013,7 +55687,7 @@
       <w:r>
         <w:t xml:space="preserve"> </w:t>
       </w:r>
-      <w:hyperlink r:id="rId207">
+      <w:hyperlink r:id="rId212">
         <w:r>
           <w:rPr>
             <w:rStyle w:val="Hyperlink"/>
@@ -55115,7 +55789,7 @@
       <w:r>
         <w:t xml:space="preserve"> </w:t>
       </w:r>
-      <w:hyperlink r:id="rId208">
+      <w:hyperlink r:id="rId213">
         <w:r>
           <w:rPr>
             <w:rStyle w:val="Hyperlink"/>
@@ -55132,7 +55806,7 @@
       <w:r>
         <w:t xml:space="preserve"> </w:t>
       </w:r>
-      <w:hyperlink r:id="rId209">
+      <w:hyperlink r:id="rId214">
         <w:r>
           <w:rPr>
             <w:rStyle w:val="Hyperlink"/>
@@ -55359,7 +56033,7 @@
       <w:r>
         <w:t xml:space="preserve"> </w:t>
       </w:r>
-      <w:hyperlink r:id="rId210">
+      <w:hyperlink r:id="rId215">
         <w:r>
           <w:rPr>
             <w:rStyle w:val="Hyperlink"/>
@@ -55394,7 +56068,7 @@
       <w:r>
         <w:t xml:space="preserve"> </w:t>
       </w:r>
-      <w:hyperlink r:id="rId211">
+      <w:hyperlink r:id="rId216">
         <w:r>
           <w:rPr>
             <w:rStyle w:val="Hyperlink"/>
@@ -55987,8 +56661,8 @@
         <w:t xml:space="preserve">(Billingsley 1995, Theorem 18.3; Gut 2013, Theorem 9.1, p. 65; Fubini 1907; Wikipedia contributors 2024)</w:t>
       </w:r>
     </w:p>
-    <w:bookmarkEnd w:id="212"/>
-    <w:bookmarkStart w:id="216" w:name="rem-fubini-tonelli-probability"/>
+    <w:bookmarkEnd w:id="217"/>
+    <w:bookmarkStart w:id="221" w:name="rem-fubini-tonelli-probability"/>
     <w:p>
       <w:pPr>
         <w:pStyle w:val="BodyText"/>
@@ -55998,7 +56672,7 @@
           <w:i/>
           <w:iCs/>
         </w:rPr>
-        <w:t xml:space="preserve">Remark 2</w:t>
+        <w:t xml:space="preserve">Remark 3</w:t>
       </w:r>
       <w:r>
         <w:t xml:space="preserve"> (Fubini–Tonelli for probability measures). </w:t>
@@ -56015,7 +56689,7 @@
       <w:r>
         <w:t xml:space="preserve"> </w:t>
       </w:r>
-      <w:hyperlink r:id="rId182">
+      <w:hyperlink r:id="rId187">
         <w:r>
           <w:rPr>
             <w:rStyle w:val="Hyperlink"/>
@@ -56051,7 +56725,7 @@
       <w:r>
         <w:t xml:space="preserve"> </w:t>
       </w:r>
-      <w:hyperlink r:id="rId213">
+      <w:hyperlink r:id="rId218">
         <w:r>
           <w:rPr>
             <w:rStyle w:val="Hyperlink"/>
@@ -56149,7 +56823,7 @@
       <w:r>
         <w:t xml:space="preserve"> </w:t>
       </w:r>
-      <w:hyperlink r:id="rId181">
+      <w:hyperlink r:id="rId186">
         <w:r>
           <w:rPr>
             <w:rStyle w:val="Hyperlink"/>
@@ -56177,7 +56851,7 @@
       <w:r>
         <w:t xml:space="preserve">(</w:t>
       </w:r>
-      <w:hyperlink r:id="rId214">
+      <w:hyperlink r:id="rId219">
         <w:r>
           <w:rPr>
             <w:rStyle w:val="Hyperlink"/>
@@ -56239,7 +56913,7 @@
       <w:r>
         <w:t xml:space="preserve"> </w:t>
       </w:r>
-      <w:hyperlink r:id="rId210">
+      <w:hyperlink r:id="rId215">
         <w:r>
           <w:rPr>
             <w:rStyle w:val="Hyperlink"/>
@@ -56265,7 +56939,7 @@
       <w:r>
         <w:t xml:space="preserve"> </w:t>
       </w:r>
-      <w:hyperlink r:id="rId215">
+      <w:hyperlink r:id="rId220">
         <w:r>
           <w:rPr>
             <w:rStyle w:val="Hyperlink"/>
@@ -56453,8 +57127,8 @@
         <w:t xml:space="preserve">-finiteness alone does not make the iterated integrals agree.</w:t>
       </w:r>
     </w:p>
-    <w:bookmarkEnd w:id="216"/>
-    <w:bookmarkStart w:id="217" w:name="exm-fubini-tonelli-apply"/>
+    <w:bookmarkEnd w:id="221"/>
+    <w:bookmarkStart w:id="222" w:name="exm-fubini-tonelli-apply"/>
     <w:p>
       <w:pPr>
         <w:pStyle w:val="BodyText"/>
@@ -56553,7 +57227,7 @@
       <w:r>
         <w:t xml:space="preserve"> </w:t>
       </w:r>
-      <w:hyperlink r:id="rId162">
+      <w:hyperlink r:id="rId167">
         <w:r>
           <w:rPr>
             <w:rStyle w:val="Hyperlink"/>
@@ -56573,7 +57247,7 @@
       <w:r>
         <w:t xml:space="preserve"> </w:t>
       </w:r>
-      <w:hyperlink r:id="rId163">
+      <w:hyperlink r:id="rId168">
         <w:r>
           <w:rPr>
             <w:rStyle w:val="Hyperlink"/>
@@ -59562,8 +60236,8 @@
         <w:t xml:space="preserve">guarantees when condition (a) holds.</w:t>
       </w:r>
     </w:p>
-    <w:bookmarkEnd w:id="217"/>
-    <w:bookmarkStart w:id="218" w:name="exm-fubini-fail-tonelli"/>
+    <w:bookmarkEnd w:id="222"/>
+    <w:bookmarkStart w:id="223" w:name="exm-fubini-fail-tonelli"/>
     <w:p>
       <w:pPr>
         <w:pStyle w:val="BodyText"/>
@@ -60698,9 +61372,9 @@
         <w:t xml:space="preserve">(Wikipedia contributors 2024)</w:t>
       </w:r>
     </w:p>
-    <w:bookmarkEnd w:id="218"/>
-    <w:bookmarkEnd w:id="219"/>
-    <w:bookmarkStart w:id="222" w:name="sec-additional-resources"/>
+    <w:bookmarkEnd w:id="223"/>
+    <w:bookmarkEnd w:id="224"/>
+    <w:bookmarkStart w:id="227" w:name="sec-additional-resources"/>
     <w:p>
       <w:pPr>
         <w:pStyle w:val="Heading2"/>
@@ -60777,7 +61451,7 @@
           <w:numId w:val="1026"/>
         </w:numPr>
       </w:pPr>
-      <w:hyperlink r:id="rId220">
+      <w:hyperlink r:id="rId225">
         <w:r>
           <w:rPr>
             <w:rStyle w:val="Hyperlink"/>
@@ -60794,7 +61468,7 @@
           <w:numId w:val="1026"/>
         </w:numPr>
       </w:pPr>
-      <w:hyperlink r:id="rId221">
+      <w:hyperlink r:id="rId226">
         <w:r>
           <w:rPr>
             <w:rStyle w:val="Hyperlink"/>
@@ -60821,8 +61495,8 @@
         <w:t xml:space="preserve">(the rigorous foundations behind these results)</w:t>
       </w:r>
     </w:p>
-    <w:bookmarkEnd w:id="222"/>
-    <w:bookmarkStart w:id="245" w:name="references"/>
+    <w:bookmarkEnd w:id="227"/>
+    <w:bookmarkStart w:id="252" w:name="references"/>
     <w:p>
       <w:pPr>
         <w:pStyle w:val="Heading2"/>
@@ -60831,8 +61505,8 @@
         <w:t xml:space="preserve">References</w:t>
       </w:r>
     </w:p>
-    <w:bookmarkStart w:id="244" w:name="refs"/>
-    <w:bookmarkStart w:id="224" w:name="ref-calclifesaver"/>
+    <w:bookmarkStart w:id="251" w:name="refs"/>
+    <w:bookmarkStart w:id="229" w:name="ref-calclifesaver"/>
     <w:p>
       <w:pPr>
         <w:pStyle w:val="Bibliography"/>
@@ -60856,7 +61530,7 @@
       <w:r>
         <w:t xml:space="preserve"> </w:t>
       </w:r>
-      <w:hyperlink r:id="rId223">
+      <w:hyperlink r:id="rId228">
         <w:r>
           <w:rPr>
             <w:rStyle w:val="Hyperlink"/>
@@ -60868,8 +61542,8 @@
         <w:t xml:space="preserve">.</w:t>
       </w:r>
     </w:p>
-    <w:bookmarkEnd w:id="224"/>
-    <w:bookmarkStart w:id="225" w:name="ref-billingsley1995probability"/>
+    <w:bookmarkEnd w:id="229"/>
+    <w:bookmarkStart w:id="230" w:name="ref-billingsley1995probability"/>
     <w:p>
       <w:pPr>
         <w:pStyle w:val="Bibliography"/>
@@ -60891,8 +61565,45 @@
         <w:t xml:space="preserve">. 3rd ed. Wiley Series in Probability and Mathematical Statistics. Wiley.</w:t>
       </w:r>
     </w:p>
-    <w:bookmarkEnd w:id="225"/>
-    <w:bookmarkStart w:id="226" w:name="ref-fubini1907"/>
+    <w:bookmarkEnd w:id="230"/>
+    <w:bookmarkStart w:id="232" w:name="ref-boyd2018vmls"/>
+    <w:p>
+      <w:pPr>
+        <w:pStyle w:val="Bibliography"/>
+      </w:pPr>
+      <w:r>
+        <w:t xml:space="preserve">Boyd, Stephen, and Lieven Vandenberghe. 2018.</w:t>
+      </w:r>
+      <w:r>
+        <w:t xml:space="preserve"> </w:t>
+      </w:r>
+      <w:r>
+        <w:rPr>
+          <w:i/>
+          <w:iCs/>
+        </w:rPr>
+        <w:t xml:space="preserve">Introduction to Applied Linear Algebra: Vectors, Matrices, and Least Squares</w:t>
+      </w:r>
+      <w:r>
+        <w:t xml:space="preserve">. Cambridge University Press.</w:t>
+      </w:r>
+      <w:r>
+        <w:t xml:space="preserve"> </w:t>
+      </w:r>
+      <w:hyperlink r:id="rId231">
+        <w:r>
+          <w:rPr>
+            <w:rStyle w:val="Hyperlink"/>
+          </w:rPr>
+          <w:t xml:space="preserve">https://doi.org/10.1017/9781108583664</w:t>
+        </w:r>
+      </w:hyperlink>
+      <w:r>
+        <w:t xml:space="preserve">.</w:t>
+      </w:r>
+    </w:p>
+    <w:bookmarkEnd w:id="232"/>
+    <w:bookmarkStart w:id="233" w:name="ref-fubini1907"/>
     <w:p>
       <w:pPr>
         <w:pStyle w:val="Bibliography"/>
@@ -60923,8 +61634,8 @@
         <w:t xml:space="preserve">16: 608–14.</w:t>
       </w:r>
     </w:p>
-    <w:bookmarkEnd w:id="226"/>
-    <w:bookmarkStart w:id="228" w:name="ref-realanalysislifesaver"/>
+    <w:bookmarkEnd w:id="233"/>
+    <w:bookmarkStart w:id="235" w:name="ref-realanalysislifesaver"/>
     <w:p>
       <w:pPr>
         <w:pStyle w:val="Bibliography"/>
@@ -60948,7 +61659,7 @@
       <w:r>
         <w:t xml:space="preserve"> </w:t>
       </w:r>
-      <w:hyperlink r:id="rId227">
+      <w:hyperlink r:id="rId234">
         <w:r>
           <w:rPr>
             <w:rStyle w:val="Hyperlink"/>
@@ -60960,8 +61671,8 @@
         <w:t xml:space="preserve">.</w:t>
       </w:r>
     </w:p>
-    <w:bookmarkEnd w:id="228"/>
-    <w:bookmarkStart w:id="230" w:name="ref-gut2013"/>
+    <w:bookmarkEnd w:id="235"/>
+    <w:bookmarkStart w:id="237" w:name="ref-gut2013"/>
     <w:p>
       <w:pPr>
         <w:pStyle w:val="Bibliography"/>
@@ -60985,7 +61696,7 @@
       <w:r>
         <w:t xml:space="preserve"> </w:t>
       </w:r>
-      <w:hyperlink r:id="rId229">
+      <w:hyperlink r:id="rId236">
         <w:r>
           <w:rPr>
             <w:rStyle w:val="Hyperlink"/>
@@ -60997,8 +61708,8 @@
         <w:t xml:space="preserve">.</w:t>
       </w:r>
     </w:p>
-    <w:bookmarkEnd w:id="230"/>
-    <w:bookmarkStart w:id="232" w:name="ref-mosaiccalc"/>
+    <w:bookmarkEnd w:id="237"/>
+    <w:bookmarkStart w:id="239" w:name="ref-mosaiccalc"/>
     <w:p>
       <w:pPr>
         <w:pStyle w:val="Bibliography"/>
@@ -61022,7 +61733,7 @@
       <w:r>
         <w:t xml:space="preserve"> </w:t>
       </w:r>
-      <w:hyperlink r:id="rId231">
+      <w:hyperlink r:id="rId238">
         <w:r>
           <w:rPr>
             <w:rStyle w:val="Hyperlink"/>
@@ -61034,8 +61745,8 @@
         <w:t xml:space="preserve">.</w:t>
       </w:r>
     </w:p>
-    <w:bookmarkEnd w:id="232"/>
-    <w:bookmarkStart w:id="234" w:name="ref-khuri2003advanced"/>
+    <w:bookmarkEnd w:id="239"/>
+    <w:bookmarkStart w:id="241" w:name="ref-khuri2003advanced"/>
     <w:p>
       <w:pPr>
         <w:pStyle w:val="Bibliography"/>
@@ -61059,7 +61770,7 @@
       <w:r>
         <w:t xml:space="preserve"> </w:t>
       </w:r>
-      <w:hyperlink r:id="rId233">
+      <w:hyperlink r:id="rId240">
         <w:r>
           <w:rPr>
             <w:rStyle w:val="Hyperlink"/>
@@ -61071,8 +61782,8 @@
         <w:t xml:space="preserve">.</w:t>
       </w:r>
     </w:p>
-    <w:bookmarkEnd w:id="234"/>
-    <w:bookmarkStart w:id="236" w:name="ref-kleinbaum2012survival"/>
+    <w:bookmarkEnd w:id="241"/>
+    <w:bookmarkStart w:id="243" w:name="ref-kleinbaum2012survival"/>
     <w:p>
       <w:pPr>
         <w:pStyle w:val="Bibliography"/>
@@ -61096,7 +61807,7 @@
       <w:r>
         <w:t xml:space="preserve"> </w:t>
       </w:r>
-      <w:hyperlink r:id="rId235">
+      <w:hyperlink r:id="rId242">
         <w:r>
           <w:rPr>
             <w:rStyle w:val="Hyperlink"/>
@@ -61108,8 +61819,8 @@
         <w:t xml:space="preserve">.</w:t>
       </w:r>
     </w:p>
-    <w:bookmarkEnd w:id="236"/>
-    <w:bookmarkStart w:id="238" w:name="ref-larsonCalc11e"/>
+    <w:bookmarkEnd w:id="243"/>
+    <w:bookmarkStart w:id="245" w:name="ref-larsonCalc11e"/>
     <w:p>
       <w:pPr>
         <w:pStyle w:val="Bibliography"/>
@@ -61133,7 +61844,7 @@
       <w:r>
         <w:t xml:space="preserve"> </w:t>
       </w:r>
-      <w:hyperlink r:id="rId237">
+      <w:hyperlink r:id="rId244">
         <w:r>
           <w:rPr>
             <w:rStyle w:val="Hyperlink"/>
@@ -61145,8 +61856,8 @@
         <w:t xml:space="preserve">.</w:t>
       </w:r>
     </w:p>
-    <w:bookmarkEnd w:id="238"/>
-    <w:bookmarkStart w:id="240" w:name="ref-problifesavercalc"/>
+    <w:bookmarkEnd w:id="245"/>
+    <w:bookmarkStart w:id="247" w:name="ref-problifesavercalc"/>
     <w:p>
       <w:pPr>
         <w:pStyle w:val="Bibliography"/>
@@ -61170,7 +61881,7 @@
       <w:r>
         <w:t xml:space="preserve"> </w:t>
       </w:r>
-      <w:hyperlink r:id="rId239">
+      <w:hyperlink r:id="rId246">
         <w:r>
           <w:rPr>
             <w:rStyle w:val="Hyperlink"/>
@@ -61182,8 +61893,8 @@
         <w:t xml:space="preserve">.</w:t>
       </w:r>
     </w:p>
-    <w:bookmarkEnd w:id="240"/>
-    <w:bookmarkStart w:id="241" w:name="ref-rudin1976principles"/>
+    <w:bookmarkEnd w:id="247"/>
+    <w:bookmarkStart w:id="248" w:name="ref-rudin1976principles"/>
     <w:p>
       <w:pPr>
         <w:pStyle w:val="Bibliography"/>
@@ -61205,8 +61916,8 @@
         <w:t xml:space="preserve">. 3rd ed. International Series in Pure and Applied Mathematics. McGraw-Hill.</w:t>
       </w:r>
     </w:p>
-    <w:bookmarkEnd w:id="241"/>
-    <w:bookmarkStart w:id="243" w:name="ref-wp:fubini"/>
+    <w:bookmarkEnd w:id="248"/>
+    <w:bookmarkStart w:id="250" w:name="ref-wp:fubini"/>
     <w:p>
       <w:pPr>
         <w:pStyle w:val="Bibliography"/>
@@ -61265,7 +61976,7 @@
       <w:r>
         <w:t xml:space="preserve"> </w:t>
       </w:r>
-      <w:hyperlink r:id="rId242">
+      <w:hyperlink r:id="rId249">
         <w:r>
           <w:rPr>
             <w:rStyle w:val="Hyperlink"/>
@@ -61277,9 +61988,9 @@
         <w:t xml:space="preserve">.</w:t>
       </w:r>
     </w:p>
-    <w:bookmarkEnd w:id="243"/>
-    <w:bookmarkEnd w:id="244"/>
-    <w:bookmarkEnd w:id="245"/>
+    <w:bookmarkEnd w:id="250"/>
+    <w:bookmarkEnd w:id="251"/>
+    <w:bookmarkEnd w:id="252"/>
     <w:sectPr>
       <w:footnotePr>
         <w:numRestart w:val="eachSect"/>

</xml_diff>